<commit_message>
Add Khmer abstract page (មូលដ្ឋានទេច) to front matter
ITC requires Khmer summary as page II between ACKNOWLEDGMENT and ABSTRACT.
Heading uses Khmer OS font (16pt bold). Body placeholder in Khmer prompts
the student to paste their own Khmer-language summary text.
</commit_message>
<xml_diff>
--- a/THESIS_VAPT_WORD.docx
+++ b/THESIS_VAPT_WORD.docx
@@ -395,6 +395,35 @@
           <w:sz w:val="24"/>
         </w:rPr>
         <w:t>I also extend my appreciation to all colleagues and peers who provided feedback during the preparation of this report.</w:t>
+      </w:r>
+    </w:p>
+    <w:p>
+      <w:pPr>
+        <w:pStyle w:val="Heading1"/>
+        <w:jc w:val="center"/>
+      </w:pPr>
+      <w:r>
+        <w:rPr>
+          <w:rFonts w:ascii="Khmer OS" w:hAnsi="Khmer OS"/>
+          <w:b/>
+          <w:color w:val="000000"/>
+          <w:sz w:val="32"/>
+        </w:rPr>
+        <w:t>មូលដ្ឋានទេច</w:t>
+      </w:r>
+    </w:p>
+    <w:p>
+      <w:pPr>
+        <w:spacing w:line="360" w:lineRule="auto" w:after="120"/>
+        <w:ind w:firstLine="720"/>
+        <w:jc w:val="both"/>
+      </w:pPr>
+      <w:r>
+        <w:rPr>
+          <w:rFonts w:ascii="Khmer OS" w:hAnsi="Khmer OS"/>
+          <w:sz w:val="24"/>
+        </w:rPr>
+        <w:t>[បញ្ចូលសរុបខ្លឹមសារជាភាសាខ្មែររបស់អ្នកនៅទីនេះ។ ចម្លងអត្ថបទខ្មែររបស់អ្នកហើយជំនួសអត្ថបទក្នុងតង្កៀបនេះ។]</w:t>
       </w:r>
     </w:p>
     <w:p>

</xml_diff>

<commit_message>
Strip markdown stars from table cells — render bold/italic properly in tables
</commit_message>
<xml_diff>
--- a/THESIS_VAPT_WORD.docx
+++ b/THESIS_VAPT_WORD.docx
@@ -3231,11 +3231,10 @@
               <w:rPr>
                 <w:rFonts w:ascii="Times New Roman" w:hAnsi="Times New Roman"/>
                 <w:b/>
-                <w:i w:val="0"/>
                 <w:color w:val="FFFFFF"/>
                 <w:sz w:val="22"/>
               </w:rPr>
-              <w:t>**Asset**</w:t>
+              <w:t>Asset</w:t>
             </w:r>
           </w:p>
         </w:tc>
@@ -3253,11 +3252,10 @@
               <w:rPr>
                 <w:rFonts w:ascii="Times New Roman" w:hAnsi="Times New Roman"/>
                 <w:b/>
-                <w:i w:val="0"/>
                 <w:color w:val="FFFFFF"/>
                 <w:sz w:val="22"/>
               </w:rPr>
-              <w:t>**Type**</w:t>
+              <w:t>Type</w:t>
             </w:r>
           </w:p>
         </w:tc>
@@ -3275,11 +3273,10 @@
               <w:rPr>
                 <w:rFonts w:ascii="Times New Roman" w:hAnsi="Times New Roman"/>
                 <w:b/>
-                <w:i w:val="0"/>
                 <w:color w:val="FFFFFF"/>
                 <w:sz w:val="22"/>
               </w:rPr>
-              <w:t>**Description**</w:t>
+              <w:t>Description</w:t>
             </w:r>
           </w:p>
         </w:tc>
@@ -3296,12 +3293,10 @@
             </w:pPr>
             <w:r>
               <w:rPr>
-                <w:rFonts w:ascii="Times New Roman" w:hAnsi="Times New Roman"/>
-                <w:b w:val="0"/>
-                <w:i w:val="0"/>
+                <w:rFonts w:ascii="Courier New" w:hAnsi="Courier New"/>
                 <w:sz w:val="22"/>
               </w:rPr>
-              <w:t>`neuralsh.com`</w:t>
+              <w:t>neuralsh.com</w:t>
             </w:r>
           </w:p>
         </w:tc>
@@ -3317,8 +3312,6 @@
             <w:r>
               <w:rPr>
                 <w:rFonts w:ascii="Times New Roman" w:hAnsi="Times New Roman"/>
-                <w:b w:val="0"/>
-                <w:i w:val="0"/>
                 <w:sz w:val="22"/>
               </w:rPr>
               <w:t>Web Application</w:t>
@@ -3337,8 +3330,6 @@
             <w:r>
               <w:rPr>
                 <w:rFonts w:ascii="Times New Roman" w:hAnsi="Times New Roman"/>
-                <w:b w:val="0"/>
-                <w:i w:val="0"/>
                 <w:sz w:val="22"/>
               </w:rPr>
               <w:t>Primary target — Nuxt.js frontend, protected by Cloudflare WAF</w:t>
@@ -3358,12 +3349,10 @@
             </w:pPr>
             <w:r>
               <w:rPr>
-                <w:rFonts w:ascii="Times New Roman" w:hAnsi="Times New Roman"/>
-                <w:b w:val="0"/>
-                <w:i w:val="0"/>
+                <w:rFonts w:ascii="Courier New" w:hAnsi="Courier New"/>
                 <w:sz w:val="22"/>
               </w:rPr>
-              <w:t>`*.neuralsh.com`</w:t>
+              <w:t>*.neuralsh.com</w:t>
             </w:r>
           </w:p>
         </w:tc>
@@ -3379,8 +3368,6 @@
             <w:r>
               <w:rPr>
                 <w:rFonts w:ascii="Times New Roman" w:hAnsi="Times New Roman"/>
-                <w:b w:val="0"/>
-                <w:i w:val="0"/>
                 <w:sz w:val="22"/>
               </w:rPr>
               <w:t>Subdomains</w:t>
@@ -3399,8 +3386,6 @@
             <w:r>
               <w:rPr>
                 <w:rFonts w:ascii="Times New Roman" w:hAnsi="Times New Roman"/>
-                <w:b w:val="0"/>
-                <w:i w:val="0"/>
                 <w:sz w:val="22"/>
               </w:rPr>
               <w:t>All subdomains discoverable via DNS enumeration or certificate transparency</w:t>
@@ -3420,12 +3405,10 @@
             </w:pPr>
             <w:r>
               <w:rPr>
-                <w:rFonts w:ascii="Times New Roman" w:hAnsi="Times New Roman"/>
-                <w:b w:val="0"/>
-                <w:i w:val="0"/>
+                <w:rFonts w:ascii="Courier New" w:hAnsi="Courier New"/>
                 <w:sz w:val="22"/>
               </w:rPr>
-              <w:t>`mail.neuralsh.com`</w:t>
+              <w:t>mail.neuralsh.com</w:t>
             </w:r>
           </w:p>
         </w:tc>
@@ -3441,8 +3424,6 @@
             <w:r>
               <w:rPr>
                 <w:rFonts w:ascii="Times New Roman" w:hAnsi="Times New Roman"/>
-                <w:b w:val="0"/>
-                <w:i w:val="0"/>
                 <w:sz w:val="22"/>
               </w:rPr>
               <w:t>Mail Server</w:t>
@@ -3461,8 +3442,6 @@
             <w:r>
               <w:rPr>
                 <w:rFonts w:ascii="Times New Roman" w:hAnsi="Times New Roman"/>
-                <w:b w:val="0"/>
-                <w:i w:val="0"/>
                 <w:sz w:val="22"/>
               </w:rPr>
               <w:t>Origin server entry point — resolves directly to 103.16.62.217</w:t>
@@ -3482,12 +3461,10 @@
             </w:pPr>
             <w:r>
               <w:rPr>
-                <w:rFonts w:ascii="Times New Roman" w:hAnsi="Times New Roman"/>
-                <w:b w:val="0"/>
-                <w:i w:val="0"/>
+                <w:rFonts w:ascii="Courier New" w:hAnsi="Courier New"/>
                 <w:sz w:val="22"/>
               </w:rPr>
-              <w:t>`103.16.62.217`</w:t>
+              <w:t>103.16.62.217</w:t>
             </w:r>
           </w:p>
         </w:tc>
@@ -3503,8 +3480,6 @@
             <w:r>
               <w:rPr>
                 <w:rFonts w:ascii="Times New Roman" w:hAnsi="Times New Roman"/>
-                <w:b w:val="0"/>
-                <w:i w:val="0"/>
                 <w:sz w:val="22"/>
               </w:rPr>
               <w:t>Origin Server</w:t>
@@ -3523,8 +3498,6 @@
             <w:r>
               <w:rPr>
                 <w:rFonts w:ascii="Times New Roman" w:hAnsi="Times New Roman"/>
-                <w:b w:val="0"/>
-                <w:i w:val="0"/>
                 <w:sz w:val="22"/>
               </w:rPr>
               <w:t>Backend infrastructure hosting the application, database, mail stack, and admin panels</w:t>
@@ -9941,11 +9914,10 @@
               <w:rPr>
                 <w:rFonts w:ascii="Times New Roman" w:hAnsi="Times New Roman"/>
                 <w:b/>
-                <w:i w:val="0"/>
                 <w:color w:val="FFFFFF"/>
                 <w:sz w:val="22"/>
               </w:rPr>
-              <w:t>**Rank**</w:t>
+              <w:t>Rank</w:t>
             </w:r>
           </w:p>
         </w:tc>
@@ -9963,11 +9935,10 @@
               <w:rPr>
                 <w:rFonts w:ascii="Times New Roman" w:hAnsi="Times New Roman"/>
                 <w:b/>
-                <w:i w:val="0"/>
                 <w:color w:val="FFFFFF"/>
                 <w:sz w:val="22"/>
               </w:rPr>
-              <w:t>**Category**</w:t>
+              <w:t>Category</w:t>
             </w:r>
           </w:p>
         </w:tc>
@@ -9985,11 +9956,10 @@
               <w:rPr>
                 <w:rFonts w:ascii="Times New Roman" w:hAnsi="Times New Roman"/>
                 <w:b/>
-                <w:i w:val="0"/>
                 <w:color w:val="FFFFFF"/>
                 <w:sz w:val="22"/>
               </w:rPr>
-              <w:t>**Description**</w:t>
+              <w:t>Description</w:t>
             </w:r>
           </w:p>
         </w:tc>
@@ -10007,8 +9977,6 @@
             <w:r>
               <w:rPr>
                 <w:rFonts w:ascii="Times New Roman" w:hAnsi="Times New Roman"/>
-                <w:b w:val="0"/>
-                <w:i w:val="0"/>
                 <w:sz w:val="22"/>
               </w:rPr>
               <w:t>A01</w:t>
@@ -10027,8 +9995,6 @@
             <w:r>
               <w:rPr>
                 <w:rFonts w:ascii="Times New Roman" w:hAnsi="Times New Roman"/>
-                <w:b w:val="0"/>
-                <w:i w:val="0"/>
                 <w:sz w:val="22"/>
               </w:rPr>
               <w:t>Broken Access Control</w:t>
@@ -10047,8 +10013,6 @@
             <w:r>
               <w:rPr>
                 <w:rFonts w:ascii="Times New Roman" w:hAnsi="Times New Roman"/>
-                <w:b w:val="0"/>
-                <w:i w:val="0"/>
                 <w:sz w:val="22"/>
               </w:rPr>
               <w:t>Failures in enforcing restrictions on what authenticated users are allowed to do</w:t>
@@ -10069,8 +10033,6 @@
             <w:r>
               <w:rPr>
                 <w:rFonts w:ascii="Times New Roman" w:hAnsi="Times New Roman"/>
-                <w:b w:val="0"/>
-                <w:i w:val="0"/>
                 <w:sz w:val="22"/>
               </w:rPr>
               <w:t>A02</w:t>
@@ -10089,8 +10051,6 @@
             <w:r>
               <w:rPr>
                 <w:rFonts w:ascii="Times New Roman" w:hAnsi="Times New Roman"/>
-                <w:b w:val="0"/>
-                <w:i w:val="0"/>
                 <w:sz w:val="22"/>
               </w:rPr>
               <w:t>Cryptographic Failures</w:t>
@@ -10109,8 +10069,6 @@
             <w:r>
               <w:rPr>
                 <w:rFonts w:ascii="Times New Roman" w:hAnsi="Times New Roman"/>
-                <w:b w:val="0"/>
-                <w:i w:val="0"/>
                 <w:sz w:val="22"/>
               </w:rPr>
               <w:t>Weaknesses in how data is protected in transit or at rest</w:t>
@@ -10131,8 +10089,6 @@
             <w:r>
               <w:rPr>
                 <w:rFonts w:ascii="Times New Roman" w:hAnsi="Times New Roman"/>
-                <w:b w:val="0"/>
-                <w:i w:val="0"/>
                 <w:sz w:val="22"/>
               </w:rPr>
               <w:t>A03</w:t>
@@ -10151,8 +10107,6 @@
             <w:r>
               <w:rPr>
                 <w:rFonts w:ascii="Times New Roman" w:hAnsi="Times New Roman"/>
-                <w:b w:val="0"/>
-                <w:i w:val="0"/>
                 <w:sz w:val="22"/>
               </w:rPr>
               <w:t>Injection</w:t>
@@ -10171,8 +10125,6 @@
             <w:r>
               <w:rPr>
                 <w:rFonts w:ascii="Times New Roman" w:hAnsi="Times New Roman"/>
-                <w:b w:val="0"/>
-                <w:i w:val="0"/>
                 <w:sz w:val="22"/>
               </w:rPr>
               <w:t>Untrusted data sent to an interpreter as part of a command or query</w:t>
@@ -10193,8 +10145,6 @@
             <w:r>
               <w:rPr>
                 <w:rFonts w:ascii="Times New Roman" w:hAnsi="Times New Roman"/>
-                <w:b w:val="0"/>
-                <w:i w:val="0"/>
                 <w:sz w:val="22"/>
               </w:rPr>
               <w:t>A04</w:t>
@@ -10213,8 +10163,6 @@
             <w:r>
               <w:rPr>
                 <w:rFonts w:ascii="Times New Roman" w:hAnsi="Times New Roman"/>
-                <w:b w:val="0"/>
-                <w:i w:val="0"/>
                 <w:sz w:val="22"/>
               </w:rPr>
               <w:t>Insecure Design</w:t>
@@ -10233,8 +10181,6 @@
             <w:r>
               <w:rPr>
                 <w:rFonts w:ascii="Times New Roman" w:hAnsi="Times New Roman"/>
-                <w:b w:val="0"/>
-                <w:i w:val="0"/>
                 <w:sz w:val="22"/>
               </w:rPr>
               <w:t>Architectural flaws where security was not considered during the design phase</w:t>
@@ -10255,8 +10201,6 @@
             <w:r>
               <w:rPr>
                 <w:rFonts w:ascii="Times New Roman" w:hAnsi="Times New Roman"/>
-                <w:b w:val="0"/>
-                <w:i w:val="0"/>
                 <w:sz w:val="22"/>
               </w:rPr>
               <w:t>A05</w:t>
@@ -10275,8 +10219,6 @@
             <w:r>
               <w:rPr>
                 <w:rFonts w:ascii="Times New Roman" w:hAnsi="Times New Roman"/>
-                <w:b w:val="0"/>
-                <w:i w:val="0"/>
                 <w:sz w:val="22"/>
               </w:rPr>
               <w:t>Security Misconfiguration</w:t>
@@ -10295,8 +10237,6 @@
             <w:r>
               <w:rPr>
                 <w:rFonts w:ascii="Times New Roman" w:hAnsi="Times New Roman"/>
-                <w:b w:val="0"/>
-                <w:i w:val="0"/>
                 <w:sz w:val="22"/>
               </w:rPr>
               <w:t>Improperly configured permissions, unnecessary features enabled, default credentials</w:t>
@@ -10317,8 +10257,6 @@
             <w:r>
               <w:rPr>
                 <w:rFonts w:ascii="Times New Roman" w:hAnsi="Times New Roman"/>
-                <w:b w:val="0"/>
-                <w:i w:val="0"/>
                 <w:sz w:val="22"/>
               </w:rPr>
               <w:t>A06</w:t>
@@ -10337,8 +10275,6 @@
             <w:r>
               <w:rPr>
                 <w:rFonts w:ascii="Times New Roman" w:hAnsi="Times New Roman"/>
-                <w:b w:val="0"/>
-                <w:i w:val="0"/>
                 <w:sz w:val="22"/>
               </w:rPr>
               <w:t>Vulnerable and Outdated Components</w:t>
@@ -10357,8 +10293,6 @@
             <w:r>
               <w:rPr>
                 <w:rFonts w:ascii="Times New Roman" w:hAnsi="Times New Roman"/>
-                <w:b w:val="0"/>
-                <w:i w:val="0"/>
                 <w:sz w:val="22"/>
               </w:rPr>
               <w:t>Use of components with known vulnerabilities that have not been patched</w:t>
@@ -10379,8 +10313,6 @@
             <w:r>
               <w:rPr>
                 <w:rFonts w:ascii="Times New Roman" w:hAnsi="Times New Roman"/>
-                <w:b w:val="0"/>
-                <w:i w:val="0"/>
                 <w:sz w:val="22"/>
               </w:rPr>
               <w:t>A07</w:t>
@@ -10399,8 +10331,6 @@
             <w:r>
               <w:rPr>
                 <w:rFonts w:ascii="Times New Roman" w:hAnsi="Times New Roman"/>
-                <w:b w:val="0"/>
-                <w:i w:val="0"/>
                 <w:sz w:val="22"/>
               </w:rPr>
               <w:t>Identification and Authentication Failures</w:t>
@@ -10419,8 +10349,6 @@
             <w:r>
               <w:rPr>
                 <w:rFonts w:ascii="Times New Roman" w:hAnsi="Times New Roman"/>
-                <w:b w:val="0"/>
-                <w:i w:val="0"/>
                 <w:sz w:val="22"/>
               </w:rPr>
               <w:t>Weaknesses in authentication — missing rate limiting, weak session management</w:t>
@@ -10441,8 +10369,6 @@
             <w:r>
               <w:rPr>
                 <w:rFonts w:ascii="Times New Roman" w:hAnsi="Times New Roman"/>
-                <w:b w:val="0"/>
-                <w:i w:val="0"/>
                 <w:sz w:val="22"/>
               </w:rPr>
               <w:t>A08</w:t>
@@ -10461,8 +10387,6 @@
             <w:r>
               <w:rPr>
                 <w:rFonts w:ascii="Times New Roman" w:hAnsi="Times New Roman"/>
-                <w:b w:val="0"/>
-                <w:i w:val="0"/>
                 <w:sz w:val="22"/>
               </w:rPr>
               <w:t>Software and Data Integrity Failures</w:t>
@@ -10481,8 +10405,6 @@
             <w:r>
               <w:rPr>
                 <w:rFonts w:ascii="Times New Roman" w:hAnsi="Times New Roman"/>
-                <w:b w:val="0"/>
-                <w:i w:val="0"/>
                 <w:sz w:val="22"/>
               </w:rPr>
               <w:t>Code and infrastructure that does not verify integrity of updates or pipelines</w:t>
@@ -10503,8 +10425,6 @@
             <w:r>
               <w:rPr>
                 <w:rFonts w:ascii="Times New Roman" w:hAnsi="Times New Roman"/>
-                <w:b w:val="0"/>
-                <w:i w:val="0"/>
                 <w:sz w:val="22"/>
               </w:rPr>
               <w:t>A09</w:t>
@@ -10523,8 +10443,6 @@
             <w:r>
               <w:rPr>
                 <w:rFonts w:ascii="Times New Roman" w:hAnsi="Times New Roman"/>
-                <w:b w:val="0"/>
-                <w:i w:val="0"/>
                 <w:sz w:val="22"/>
               </w:rPr>
               <w:t>Security Logging and Monitoring Failures</w:t>
@@ -10543,8 +10461,6 @@
             <w:r>
               <w:rPr>
                 <w:rFonts w:ascii="Times New Roman" w:hAnsi="Times New Roman"/>
-                <w:b w:val="0"/>
-                <w:i w:val="0"/>
                 <w:sz w:val="22"/>
               </w:rPr>
               <w:t>Insufficient logging and alerting — allowing attacks to proceed undetected</w:t>
@@ -10565,8 +10481,6 @@
             <w:r>
               <w:rPr>
                 <w:rFonts w:ascii="Times New Roman" w:hAnsi="Times New Roman"/>
-                <w:b w:val="0"/>
-                <w:i w:val="0"/>
                 <w:sz w:val="22"/>
               </w:rPr>
               <w:t>A10</w:t>
@@ -10585,8 +10499,6 @@
             <w:r>
               <w:rPr>
                 <w:rFonts w:ascii="Times New Roman" w:hAnsi="Times New Roman"/>
-                <w:b w:val="0"/>
-                <w:i w:val="0"/>
                 <w:sz w:val="22"/>
               </w:rPr>
               <w:t>Server-Side Request Forgery (SSRF)</w:t>
@@ -10605,8 +10517,6 @@
             <w:r>
               <w:rPr>
                 <w:rFonts w:ascii="Times New Roman" w:hAnsi="Times New Roman"/>
-                <w:b w:val="0"/>
-                <w:i w:val="0"/>
                 <w:sz w:val="22"/>
               </w:rPr>
               <w:t>Application fetches remote resources based on user-supplied input without validation</w:t>
@@ -10865,11 +10775,10 @@
               <w:rPr>
                 <w:rFonts w:ascii="Times New Roman" w:hAnsi="Times New Roman"/>
                 <w:b/>
-                <w:i w:val="0"/>
                 <w:color w:val="FFFFFF"/>
                 <w:sz w:val="22"/>
               </w:rPr>
-              <w:t>**Score Range**</w:t>
+              <w:t>Score Range</w:t>
             </w:r>
           </w:p>
         </w:tc>
@@ -10887,11 +10796,10 @@
               <w:rPr>
                 <w:rFonts w:ascii="Times New Roman" w:hAnsi="Times New Roman"/>
                 <w:b/>
-                <w:i w:val="0"/>
                 <w:color w:val="FFFFFF"/>
                 <w:sz w:val="22"/>
               </w:rPr>
-              <w:t>**Severity**</w:t>
+              <w:t>Severity</w:t>
             </w:r>
           </w:p>
         </w:tc>
@@ -10909,11 +10817,10 @@
               <w:rPr>
                 <w:rFonts w:ascii="Times New Roman" w:hAnsi="Times New Roman"/>
                 <w:b/>
-                <w:i w:val="0"/>
                 <w:color w:val="FFFFFF"/>
                 <w:sz w:val="22"/>
               </w:rPr>
-              <w:t>**Meaning**</w:t>
+              <w:t>Meaning</w:t>
             </w:r>
           </w:p>
         </w:tc>
@@ -10931,8 +10838,6 @@
             <w:r>
               <w:rPr>
                 <w:rFonts w:ascii="Times New Roman" w:hAnsi="Times New Roman"/>
-                <w:b w:val="0"/>
-                <w:i w:val="0"/>
                 <w:sz w:val="22"/>
               </w:rPr>
               <w:t>9.0 – 10.0</w:t>
@@ -10953,7 +10858,6 @@
               <w:rPr>
                 <w:rFonts w:ascii="Times New Roman" w:hAnsi="Times New Roman"/>
                 <w:b/>
-                <w:i w:val="0"/>
                 <w:color w:val="FFFFFF"/>
                 <w:sz w:val="22"/>
               </w:rPr>
@@ -10973,8 +10877,6 @@
             <w:r>
               <w:rPr>
                 <w:rFonts w:ascii="Times New Roman" w:hAnsi="Times New Roman"/>
-                <w:b w:val="0"/>
-                <w:i w:val="0"/>
                 <w:sz w:val="22"/>
               </w:rPr>
               <w:t>Exploitable remotely with no authentication; maximum business impact</w:t>
@@ -10995,8 +10897,6 @@
             <w:r>
               <w:rPr>
                 <w:rFonts w:ascii="Times New Roman" w:hAnsi="Times New Roman"/>
-                <w:b w:val="0"/>
-                <w:i w:val="0"/>
                 <w:sz w:val="22"/>
               </w:rPr>
               <w:t>7.0 – 8.9</w:t>
@@ -11017,7 +10917,6 @@
               <w:rPr>
                 <w:rFonts w:ascii="Times New Roman" w:hAnsi="Times New Roman"/>
                 <w:b/>
-                <w:i w:val="0"/>
                 <w:color w:val="FFFFFF"/>
                 <w:sz w:val="22"/>
               </w:rPr>
@@ -11037,8 +10936,6 @@
             <w:r>
               <w:rPr>
                 <w:rFonts w:ascii="Times New Roman" w:hAnsi="Times New Roman"/>
-                <w:b w:val="0"/>
-                <w:i w:val="0"/>
                 <w:sz w:val="22"/>
               </w:rPr>
               <w:t>Significant risk; exploitable with minimal conditions</w:t>
@@ -11059,8 +10956,6 @@
             <w:r>
               <w:rPr>
                 <w:rFonts w:ascii="Times New Roman" w:hAnsi="Times New Roman"/>
-                <w:b w:val="0"/>
-                <w:i w:val="0"/>
                 <w:sz w:val="22"/>
               </w:rPr>
               <w:t>4.0 – 6.9</w:t>
@@ -11080,8 +10975,6 @@
             <w:r>
               <w:rPr>
                 <w:rFonts w:ascii="Times New Roman" w:hAnsi="Times New Roman"/>
-                <w:b/>
-                <w:i w:val="0"/>
                 <w:sz w:val="22"/>
               </w:rPr>
               <w:t>Medium</w:t>
@@ -11100,8 +10993,6 @@
             <w:r>
               <w:rPr>
                 <w:rFonts w:ascii="Times New Roman" w:hAnsi="Times New Roman"/>
-                <w:b w:val="0"/>
-                <w:i w:val="0"/>
                 <w:sz w:val="22"/>
               </w:rPr>
               <w:t>Moderate risk; requires specific conditions or limited impact</w:t>
@@ -11122,8 +11013,6 @@
             <w:r>
               <w:rPr>
                 <w:rFonts w:ascii="Times New Roman" w:hAnsi="Times New Roman"/>
-                <w:b w:val="0"/>
-                <w:i w:val="0"/>
                 <w:sz w:val="22"/>
               </w:rPr>
               <w:t>0.1 – 3.9</w:t>
@@ -11144,7 +11033,6 @@
               <w:rPr>
                 <w:rFonts w:ascii="Times New Roman" w:hAnsi="Times New Roman"/>
                 <w:b/>
-                <w:i w:val="0"/>
                 <w:color w:val="FFFFFF"/>
                 <w:sz w:val="22"/>
               </w:rPr>
@@ -11164,8 +11052,6 @@
             <w:r>
               <w:rPr>
                 <w:rFonts w:ascii="Times New Roman" w:hAnsi="Times New Roman"/>
-                <w:b w:val="0"/>
-                <w:i w:val="0"/>
                 <w:sz w:val="22"/>
               </w:rPr>
               <w:t>Minimal direct impact; informational or requires chaining</w:t>
@@ -11319,11 +11205,10 @@
               <w:rPr>
                 <w:rFonts w:ascii="Times New Roman" w:hAnsi="Times New Roman"/>
                 <w:b/>
-                <w:i w:val="0"/>
                 <w:color w:val="FFFFFF"/>
                 <w:sz w:val="22"/>
               </w:rPr>
-              <w:t>**Tool**</w:t>
+              <w:t>Tool</w:t>
             </w:r>
           </w:p>
         </w:tc>
@@ -11341,11 +11226,10 @@
               <w:rPr>
                 <w:rFonts w:ascii="Times New Roman" w:hAnsi="Times New Roman"/>
                 <w:b/>
-                <w:i w:val="0"/>
                 <w:color w:val="FFFFFF"/>
                 <w:sz w:val="22"/>
               </w:rPr>
-              <w:t>**Type**</w:t>
+              <w:t>Type</w:t>
             </w:r>
           </w:p>
         </w:tc>
@@ -11363,11 +11247,10 @@
               <w:rPr>
                 <w:rFonts w:ascii="Times New Roman" w:hAnsi="Times New Roman"/>
                 <w:b/>
-                <w:i w:val="0"/>
                 <w:color w:val="FFFFFF"/>
                 <w:sz w:val="22"/>
               </w:rPr>
-              <w:t>**Role in This Engagement**</w:t>
+              <w:t>Role in This Engagement</w:t>
             </w:r>
           </w:p>
         </w:tc>
@@ -11385,11 +11268,10 @@
             <w:r>
               <w:rPr>
                 <w:rFonts w:ascii="Times New Roman" w:hAnsi="Times New Roman"/>
-                <w:b w:val="0"/>
-                <w:i w:val="0"/>
+                <w:b/>
                 <w:sz w:val="22"/>
               </w:rPr>
-              <w:t>**Nmap**</w:t>
+              <w:t>Nmap</w:t>
             </w:r>
           </w:p>
         </w:tc>
@@ -11405,8 +11287,6 @@
             <w:r>
               <w:rPr>
                 <w:rFonts w:ascii="Times New Roman" w:hAnsi="Times New Roman"/>
-                <w:b w:val="0"/>
-                <w:i w:val="0"/>
                 <w:sz w:val="22"/>
               </w:rPr>
               <w:t>Network scanner</w:t>
@@ -11425,8 +11305,6 @@
             <w:r>
               <w:rPr>
                 <w:rFonts w:ascii="Times New Roman" w:hAnsi="Times New Roman"/>
-                <w:b w:val="0"/>
-                <w:i w:val="0"/>
                 <w:sz w:val="22"/>
               </w:rPr>
               <w:t>Full TCP port scan on 103.16.62.217 — discovered 23 open ports</w:t>
@@ -11447,11 +11325,10 @@
             <w:r>
               <w:rPr>
                 <w:rFonts w:ascii="Times New Roman" w:hAnsi="Times New Roman"/>
-                <w:b w:val="0"/>
-                <w:i w:val="0"/>
+                <w:b/>
                 <w:sz w:val="22"/>
               </w:rPr>
-              <w:t>**Nikto**</w:t>
+              <w:t>Nikto</w:t>
             </w:r>
           </w:p>
         </w:tc>
@@ -11467,8 +11344,6 @@
             <w:r>
               <w:rPr>
                 <w:rFonts w:ascii="Times New Roman" w:hAnsi="Times New Roman"/>
-                <w:b w:val="0"/>
-                <w:i w:val="0"/>
                 <w:sz w:val="22"/>
               </w:rPr>
               <w:t>Web scanner</w:t>
@@ -11487,8 +11362,6 @@
             <w:r>
               <w:rPr>
                 <w:rFonts w:ascii="Times New Roman" w:hAnsi="Times New Roman"/>
-                <w:b w:val="0"/>
-                <w:i w:val="0"/>
                 <w:sz w:val="22"/>
               </w:rPr>
               <w:t>Automated web server scan — flagged missing headers, server version disclosure, directory listing</w:t>
@@ -11509,11 +11382,10 @@
             <w:r>
               <w:rPr>
                 <w:rFonts w:ascii="Times New Roman" w:hAnsi="Times New Roman"/>
-                <w:b w:val="0"/>
-                <w:i w:val="0"/>
+                <w:b/>
                 <w:sz w:val="22"/>
               </w:rPr>
-              <w:t>**Dirb**</w:t>
+              <w:t>Dirb</w:t>
             </w:r>
           </w:p>
         </w:tc>
@@ -11529,8 +11401,6 @@
             <w:r>
               <w:rPr>
                 <w:rFonts w:ascii="Times New Roman" w:hAnsi="Times New Roman"/>
-                <w:b w:val="0"/>
-                <w:i w:val="0"/>
                 <w:sz w:val="22"/>
               </w:rPr>
               <w:t>Directory fuzzer</w:t>
@@ -11549,8 +11419,6 @@
             <w:r>
               <w:rPr>
                 <w:rFonts w:ascii="Times New Roman" w:hAnsi="Times New Roman"/>
-                <w:b w:val="0"/>
-                <w:i w:val="0"/>
                 <w:sz w:val="22"/>
               </w:rPr>
               <w:t>Enumerated hidden directories and files on the web application</w:t>
@@ -11571,11 +11439,10 @@
             <w:r>
               <w:rPr>
                 <w:rFonts w:ascii="Times New Roman" w:hAnsi="Times New Roman"/>
-                <w:b w:val="0"/>
-                <w:i w:val="0"/>
+                <w:b/>
                 <w:sz w:val="22"/>
               </w:rPr>
-              <w:t>**Nuclei**</w:t>
+              <w:t>Nuclei</w:t>
             </w:r>
           </w:p>
         </w:tc>
@@ -11591,8 +11458,6 @@
             <w:r>
               <w:rPr>
                 <w:rFonts w:ascii="Times New Roman" w:hAnsi="Times New Roman"/>
-                <w:b w:val="0"/>
-                <w:i w:val="0"/>
                 <w:sz w:val="22"/>
               </w:rPr>
               <w:t>Template scanner</w:t>
@@ -11611,8 +11476,6 @@
             <w:r>
               <w:rPr>
                 <w:rFonts w:ascii="Times New Roman" w:hAnsi="Times New Roman"/>
-                <w:b w:val="0"/>
-                <w:i w:val="0"/>
                 <w:sz w:val="22"/>
               </w:rPr>
               <w:t>Identified known vulnerability patterns across web services</w:t>
@@ -11633,11 +11496,10 @@
             <w:r>
               <w:rPr>
                 <w:rFonts w:ascii="Times New Roman" w:hAnsi="Times New Roman"/>
-                <w:b w:val="0"/>
-                <w:i w:val="0"/>
+                <w:b/>
                 <w:sz w:val="22"/>
               </w:rPr>
-              <w:t>**subfinder**</w:t>
+              <w:t>subfinder</w:t>
             </w:r>
           </w:p>
         </w:tc>
@@ -11653,8 +11515,6 @@
             <w:r>
               <w:rPr>
                 <w:rFonts w:ascii="Times New Roman" w:hAnsi="Times New Roman"/>
-                <w:b w:val="0"/>
-                <w:i w:val="0"/>
                 <w:sz w:val="22"/>
               </w:rPr>
               <w:t>Subdomain enumerator</w:t>
@@ -11673,8 +11533,6 @@
             <w:r>
               <w:rPr>
                 <w:rFonts w:ascii="Times New Roman" w:hAnsi="Times New Roman"/>
-                <w:b w:val="0"/>
-                <w:i w:val="0"/>
                 <w:sz w:val="22"/>
               </w:rPr>
               <w:t>Passive subdomain discovery via certificate transparency and public DNS sources</w:t>
@@ -11695,11 +11553,10 @@
             <w:r>
               <w:rPr>
                 <w:rFonts w:ascii="Times New Roman" w:hAnsi="Times New Roman"/>
-                <w:b w:val="0"/>
-                <w:i w:val="0"/>
+                <w:b/>
                 <w:sz w:val="22"/>
               </w:rPr>
-              <w:t>**mysql-client**</w:t>
+              <w:t>mysql-client</w:t>
             </w:r>
           </w:p>
         </w:tc>
@@ -11715,8 +11572,6 @@
             <w:r>
               <w:rPr>
                 <w:rFonts w:ascii="Times New Roman" w:hAnsi="Times New Roman"/>
-                <w:b w:val="0"/>
-                <w:i w:val="0"/>
                 <w:sz w:val="22"/>
               </w:rPr>
               <w:t>Database connector</w:t>
@@ -11735,8 +11590,6 @@
             <w:r>
               <w:rPr>
                 <w:rFonts w:ascii="Times New Roman" w:hAnsi="Times New Roman"/>
-                <w:b w:val="0"/>
-                <w:i w:val="0"/>
                 <w:sz w:val="22"/>
               </w:rPr>
               <w:t>Verified MySQL port 3306 accepted unauthenticated connection attempts</w:t>
@@ -12051,11 +11904,10 @@
               <w:rPr>
                 <w:rFonts w:ascii="Times New Roman" w:hAnsi="Times New Roman"/>
                 <w:b/>
-                <w:i w:val="0"/>
                 <w:color w:val="FFFFFF"/>
                 <w:sz w:val="22"/>
               </w:rPr>
-              <w:t>**Tool**</w:t>
+              <w:t>Tool</w:t>
             </w:r>
           </w:p>
         </w:tc>
@@ -12073,11 +11925,10 @@
               <w:rPr>
                 <w:rFonts w:ascii="Times New Roman" w:hAnsi="Times New Roman"/>
                 <w:b/>
-                <w:i w:val="0"/>
                 <w:color w:val="FFFFFF"/>
                 <w:sz w:val="22"/>
               </w:rPr>
-              <w:t>**Type**</w:t>
+              <w:t>Type</w:t>
             </w:r>
           </w:p>
         </w:tc>
@@ -12095,11 +11946,10 @@
               <w:rPr>
                 <w:rFonts w:ascii="Times New Roman" w:hAnsi="Times New Roman"/>
                 <w:b/>
-                <w:i w:val="0"/>
                 <w:color w:val="FFFFFF"/>
                 <w:sz w:val="22"/>
               </w:rPr>
-              <w:t>**Role in This Engagement**</w:t>
+              <w:t>Role in This Engagement</w:t>
             </w:r>
           </w:p>
         </w:tc>
@@ -12117,11 +11967,10 @@
             <w:r>
               <w:rPr>
                 <w:rFonts w:ascii="Times New Roman" w:hAnsi="Times New Roman"/>
-                <w:b w:val="0"/>
-                <w:i w:val="0"/>
+                <w:b/>
                 <w:sz w:val="22"/>
               </w:rPr>
-              <w:t>**Burp Suite Community**</w:t>
+              <w:t>Burp Suite Community</w:t>
             </w:r>
           </w:p>
         </w:tc>
@@ -12137,8 +11986,6 @@
             <w:r>
               <w:rPr>
                 <w:rFonts w:ascii="Times New Roman" w:hAnsi="Times New Roman"/>
-                <w:b w:val="0"/>
-                <w:i w:val="0"/>
                 <w:sz w:val="22"/>
               </w:rPr>
               <w:t>Web proxy</w:t>
@@ -12157,8 +12004,6 @@
             <w:r>
               <w:rPr>
                 <w:rFonts w:ascii="Times New Roman" w:hAnsi="Times New Roman"/>
-                <w:b w:val="0"/>
-                <w:i w:val="0"/>
                 <w:sz w:val="22"/>
               </w:rPr>
               <w:t>Intercepted HTTP/S traffic, replayed requests, demonstrated rate-limit bypass and JWT farming</w:t>
@@ -12179,11 +12024,10 @@
             <w:r>
               <w:rPr>
                 <w:rFonts w:ascii="Times New Roman" w:hAnsi="Times New Roman"/>
-                <w:b w:val="0"/>
-                <w:i w:val="0"/>
+                <w:b/>
                 <w:sz w:val="22"/>
               </w:rPr>
-              <w:t>**curl**</w:t>
+              <w:t>curl</w:t>
             </w:r>
           </w:p>
         </w:tc>
@@ -12199,8 +12043,6 @@
             <w:r>
               <w:rPr>
                 <w:rFonts w:ascii="Times New Roman" w:hAnsi="Times New Roman"/>
-                <w:b w:val="0"/>
-                <w:i w:val="0"/>
                 <w:sz w:val="22"/>
               </w:rPr>
               <w:t>HTTP client</w:t>
@@ -12219,8 +12061,6 @@
             <w:r>
               <w:rPr>
                 <w:rFonts w:ascii="Times New Roman" w:hAnsi="Times New Roman"/>
-                <w:b w:val="0"/>
-                <w:i w:val="0"/>
                 <w:sz w:val="22"/>
               </w:rPr>
               <w:t>Crafted raw HTTP requests with custom headers for PoC exploitation</w:t>
@@ -12241,11 +12081,10 @@
             <w:r>
               <w:rPr>
                 <w:rFonts w:ascii="Times New Roman" w:hAnsi="Times New Roman"/>
-                <w:b w:val="0"/>
-                <w:i w:val="0"/>
+                <w:b/>
                 <w:sz w:val="22"/>
               </w:rPr>
-              <w:t>**CyberChef**</w:t>
+              <w:t>CyberChef</w:t>
             </w:r>
           </w:p>
         </w:tc>
@@ -12261,8 +12100,6 @@
             <w:r>
               <w:rPr>
                 <w:rFonts w:ascii="Times New Roman" w:hAnsi="Times New Roman"/>
-                <w:b w:val="0"/>
-                <w:i w:val="0"/>
                 <w:sz w:val="22"/>
               </w:rPr>
               <w:t>Data analysis</w:t>
@@ -12281,8 +12118,6 @@
             <w:r>
               <w:rPr>
                 <w:rFonts w:ascii="Times New Roman" w:hAnsi="Times New Roman"/>
-                <w:b w:val="0"/>
-                <w:i w:val="0"/>
                 <w:sz w:val="22"/>
               </w:rPr>
               <w:t>Decoded and inspected JWT token payloads</w:t>
@@ -12303,11 +12138,10 @@
             <w:r>
               <w:rPr>
                 <w:rFonts w:ascii="Times New Roman" w:hAnsi="Times New Roman"/>
-                <w:b w:val="0"/>
-                <w:i w:val="0"/>
+                <w:b/>
                 <w:sz w:val="22"/>
               </w:rPr>
-              <w:t>**dig / whois**</w:t>
+              <w:t>dig / whois</w:t>
             </w:r>
           </w:p>
         </w:tc>
@@ -12323,8 +12157,6 @@
             <w:r>
               <w:rPr>
                 <w:rFonts w:ascii="Times New Roman" w:hAnsi="Times New Roman"/>
-                <w:b w:val="0"/>
-                <w:i w:val="0"/>
                 <w:sz w:val="22"/>
               </w:rPr>
               <w:t>DNS tools</w:t>
@@ -12343,8 +12175,6 @@
             <w:r>
               <w:rPr>
                 <w:rFonts w:ascii="Times New Roman" w:hAnsi="Times New Roman"/>
-                <w:b w:val="0"/>
-                <w:i w:val="0"/>
                 <w:sz w:val="22"/>
               </w:rPr>
               <w:t>Manual DNS record enumeration — identified origin IP via MX record</w:t>
@@ -12365,11 +12195,10 @@
             <w:r>
               <w:rPr>
                 <w:rFonts w:ascii="Times New Roman" w:hAnsi="Times New Roman"/>
-                <w:b w:val="0"/>
-                <w:i w:val="0"/>
+                <w:b/>
                 <w:sz w:val="22"/>
               </w:rPr>
-              <w:t>**openssl**</w:t>
+              <w:t>openssl</w:t>
             </w:r>
           </w:p>
         </w:tc>
@@ -12385,8 +12214,6 @@
             <w:r>
               <w:rPr>
                 <w:rFonts w:ascii="Times New Roman" w:hAnsi="Times New Roman"/>
-                <w:b w:val="0"/>
-                <w:i w:val="0"/>
                 <w:sz w:val="22"/>
               </w:rPr>
               <w:t>TLS inspector</w:t>
@@ -12405,8 +12232,6 @@
             <w:r>
               <w:rPr>
                 <w:rFonts w:ascii="Times New Roman" w:hAnsi="Times New Roman"/>
-                <w:b w:val="0"/>
-                <w:i w:val="0"/>
                 <w:sz w:val="22"/>
               </w:rPr>
               <w:t>Inspected SSL certificate details — confirmed hostname and infrastructure leakage</w:t>
@@ -12427,11 +12252,10 @@
             <w:r>
               <w:rPr>
                 <w:rFonts w:ascii="Times New Roman" w:hAnsi="Times New Roman"/>
-                <w:b w:val="0"/>
-                <w:i w:val="0"/>
+                <w:b/>
                 <w:sz w:val="22"/>
               </w:rPr>
-              <w:t>**hashcat**</w:t>
+              <w:t>hashcat</w:t>
             </w:r>
           </w:p>
         </w:tc>
@@ -12447,8 +12271,6 @@
             <w:r>
               <w:rPr>
                 <w:rFonts w:ascii="Times New Roman" w:hAnsi="Times New Roman"/>
-                <w:b w:val="0"/>
-                <w:i w:val="0"/>
                 <w:sz w:val="22"/>
               </w:rPr>
               <w:t>Password cracker</w:t>
@@ -12467,8 +12289,6 @@
             <w:r>
               <w:rPr>
                 <w:rFonts w:ascii="Times New Roman" w:hAnsi="Times New Roman"/>
-                <w:b w:val="0"/>
-                <w:i w:val="0"/>
                 <w:sz w:val="22"/>
               </w:rPr>
               <w:t>Attempted JWT secret key brute-force against the rockyou.txt wordlist</w:t>
@@ -12489,11 +12309,10 @@
             <w:r>
               <w:rPr>
                 <w:rFonts w:ascii="Times New Roman" w:hAnsi="Times New Roman"/>
-                <w:b w:val="0"/>
-                <w:i w:val="0"/>
+                <w:b/>
                 <w:sz w:val="22"/>
               </w:rPr>
-              <w:t>**Metasploit Framework**</w:t>
+              <w:t>Metasploit Framework</w:t>
             </w:r>
           </w:p>
         </w:tc>
@@ -12509,8 +12328,6 @@
             <w:r>
               <w:rPr>
                 <w:rFonts w:ascii="Times New Roman" w:hAnsi="Times New Roman"/>
-                <w:b w:val="0"/>
-                <w:i w:val="0"/>
                 <w:sz w:val="22"/>
               </w:rPr>
               <w:t>Exploitation framework</w:t>
@@ -12529,8 +12346,6 @@
             <w:r>
               <w:rPr>
                 <w:rFonts w:ascii="Times New Roman" w:hAnsi="Times New Roman"/>
-                <w:b w:val="0"/>
-                <w:i w:val="0"/>
                 <w:sz w:val="22"/>
               </w:rPr>
               <w:t>Used for controlled exploitation in the alternative testing environment</w:t>
@@ -13072,7 +12887,6 @@
               <w:rPr>
                 <w:rFonts w:ascii="Times New Roman" w:hAnsi="Times New Roman"/>
                 <w:b/>
-                <w:i w:val="0"/>
                 <w:color w:val="FFFFFF"/>
                 <w:sz w:val="22"/>
               </w:rPr>
@@ -13094,7 +12908,6 @@
               <w:rPr>
                 <w:rFonts w:ascii="Times New Roman" w:hAnsi="Times New Roman"/>
                 <w:b/>
-                <w:i w:val="0"/>
                 <w:color w:val="FFFFFF"/>
                 <w:sz w:val="22"/>
               </w:rPr>
@@ -13116,8 +12929,6 @@
             <w:r>
               <w:rPr>
                 <w:rFonts w:ascii="Times New Roman" w:hAnsi="Times New Roman"/>
-                <w:b w:val="0"/>
-                <w:i w:val="0"/>
                 <w:sz w:val="22"/>
               </w:rPr>
               <w:t>Host OS</w:t>
@@ -13136,8 +12947,6 @@
             <w:r>
               <w:rPr>
                 <w:rFonts w:ascii="Times New Roman" w:hAnsi="Times New Roman"/>
-                <w:b w:val="0"/>
-                <w:i w:val="0"/>
                 <w:sz w:val="22"/>
               </w:rPr>
               <w:t>Linux Mint 22.1 (host machine)</w:t>
@@ -13158,8 +12967,6 @@
             <w:r>
               <w:rPr>
                 <w:rFonts w:ascii="Times New Roman" w:hAnsi="Times New Roman"/>
-                <w:b w:val="0"/>
-                <w:i w:val="0"/>
                 <w:sz w:val="22"/>
               </w:rPr>
               <w:t>Virtualization</w:t>
@@ -13178,8 +12985,6 @@
             <w:r>
               <w:rPr>
                 <w:rFonts w:ascii="Times New Roman" w:hAnsi="Times New Roman"/>
-                <w:b w:val="0"/>
-                <w:i w:val="0"/>
                 <w:sz w:val="22"/>
               </w:rPr>
               <w:t>Oracle VirtualBox 7.0</w:t>
@@ -13200,8 +13005,6 @@
             <w:r>
               <w:rPr>
                 <w:rFonts w:ascii="Times New Roman" w:hAnsi="Times New Roman"/>
-                <w:b w:val="0"/>
-                <w:i w:val="0"/>
                 <w:sz w:val="22"/>
               </w:rPr>
               <w:t>Guest OS</w:t>
@@ -13220,8 +13023,6 @@
             <w:r>
               <w:rPr>
                 <w:rFonts w:ascii="Times New Roman" w:hAnsi="Times New Roman"/>
-                <w:b w:val="0"/>
-                <w:i w:val="0"/>
                 <w:sz w:val="22"/>
               </w:rPr>
               <w:t>Kali Linux 2024.x (64-bit)</w:t>
@@ -13242,8 +13043,6 @@
             <w:r>
               <w:rPr>
                 <w:rFonts w:ascii="Times New Roman" w:hAnsi="Times New Roman"/>
-                <w:b w:val="0"/>
-                <w:i w:val="0"/>
                 <w:sz w:val="22"/>
               </w:rPr>
               <w:t>RAM</w:t>
@@ -13262,8 +13061,6 @@
             <w:r>
               <w:rPr>
                 <w:rFonts w:ascii="Times New Roman" w:hAnsi="Times New Roman"/>
-                <w:b w:val="0"/>
-                <w:i w:val="0"/>
                 <w:sz w:val="22"/>
               </w:rPr>
               <w:t>4 GB allocated</w:t>
@@ -13284,8 +13081,6 @@
             <w:r>
               <w:rPr>
                 <w:rFonts w:ascii="Times New Roman" w:hAnsi="Times New Roman"/>
-                <w:b w:val="0"/>
-                <w:i w:val="0"/>
                 <w:sz w:val="22"/>
               </w:rPr>
               <w:t>Storage</w:t>
@@ -13304,8 +13099,6 @@
             <w:r>
               <w:rPr>
                 <w:rFonts w:ascii="Times New Roman" w:hAnsi="Times New Roman"/>
-                <w:b w:val="0"/>
-                <w:i w:val="0"/>
                 <w:sz w:val="22"/>
               </w:rPr>
               <w:t>40 GB virtual disk</w:t>
@@ -13326,8 +13119,6 @@
             <w:r>
               <w:rPr>
                 <w:rFonts w:ascii="Times New Roman" w:hAnsi="Times New Roman"/>
-                <w:b w:val="0"/>
-                <w:i w:val="0"/>
                 <w:sz w:val="22"/>
               </w:rPr>
               <w:t>Network Adapter</w:t>
@@ -13346,8 +13137,6 @@
             <w:r>
               <w:rPr>
                 <w:rFonts w:ascii="Times New Roman" w:hAnsi="Times New Roman"/>
-                <w:b w:val="0"/>
-                <w:i w:val="0"/>
                 <w:sz w:val="22"/>
               </w:rPr>
               <w:t>Bridged (enp0s31f6) — shares host network</w:t>
@@ -13841,7 +13630,6 @@
               <w:rPr>
                 <w:rFonts w:ascii="Times New Roman" w:hAnsi="Times New Roman"/>
                 <w:b/>
-                <w:i w:val="0"/>
                 <w:color w:val="FFFFFF"/>
                 <w:sz w:val="22"/>
               </w:rPr>
@@ -13863,7 +13651,6 @@
               <w:rPr>
                 <w:rFonts w:ascii="Times New Roman" w:hAnsi="Times New Roman"/>
                 <w:b/>
-                <w:i w:val="0"/>
                 <w:color w:val="FFFFFF"/>
                 <w:sz w:val="22"/>
               </w:rPr>
@@ -13885,8 +13672,6 @@
             <w:r>
               <w:rPr>
                 <w:rFonts w:ascii="Times New Roman" w:hAnsi="Times New Roman"/>
-                <w:b w:val="0"/>
-                <w:i w:val="0"/>
                 <w:sz w:val="22"/>
               </w:rPr>
               <w:t>Frontend</w:t>
@@ -13905,8 +13690,6 @@
             <w:r>
               <w:rPr>
                 <w:rFonts w:ascii="Times New Roman" w:hAnsi="Times New Roman"/>
-                <w:b w:val="0"/>
-                <w:i w:val="0"/>
                 <w:sz w:val="22"/>
               </w:rPr>
               <w:t>Nuxt.js (Vue.js SSR)</w:t>
@@ -13927,8 +13710,6 @@
             <w:r>
               <w:rPr>
                 <w:rFonts w:ascii="Times New Roman" w:hAnsi="Times New Roman"/>
-                <w:b w:val="0"/>
-                <w:i w:val="0"/>
                 <w:sz w:val="22"/>
               </w:rPr>
               <w:t>CDN / WAF</w:t>
@@ -13947,8 +13728,6 @@
             <w:r>
               <w:rPr>
                 <w:rFonts w:ascii="Times New Roman" w:hAnsi="Times New Roman"/>
-                <w:b w:val="0"/>
-                <w:i w:val="0"/>
                 <w:sz w:val="22"/>
               </w:rPr>
               <w:t>Cloudflare</w:t>
@@ -13969,8 +13748,6 @@
             <w:r>
               <w:rPr>
                 <w:rFonts w:ascii="Times New Roman" w:hAnsi="Times New Roman"/>
-                <w:b w:val="0"/>
-                <w:i w:val="0"/>
                 <w:sz w:val="22"/>
               </w:rPr>
               <w:t>Backend Hosting</w:t>
@@ -13989,8 +13766,6 @@
             <w:r>
               <w:rPr>
                 <w:rFonts w:ascii="Times New Roman" w:hAnsi="Times New Roman"/>
-                <w:b w:val="0"/>
-                <w:i w:val="0"/>
                 <w:sz w:val="22"/>
               </w:rPr>
               <w:t>Shared cPanel hosting (Cloudways / cprapid.com)</w:t>
@@ -14011,8 +13786,6 @@
             <w:r>
               <w:rPr>
                 <w:rFonts w:ascii="Times New Roman" w:hAnsi="Times New Roman"/>
-                <w:b w:val="0"/>
-                <w:i w:val="0"/>
                 <w:sz w:val="22"/>
               </w:rPr>
               <w:t>Network Equipment</w:t>
@@ -14031,8 +13804,6 @@
             <w:r>
               <w:rPr>
                 <w:rFonts w:ascii="Times New Roman" w:hAnsi="Times New Roman"/>
-                <w:b w:val="0"/>
-                <w:i w:val="0"/>
                 <w:sz w:val="22"/>
               </w:rPr>
               <w:t>MikroTik RouterOS</w:t>
@@ -14053,8 +13824,6 @@
             <w:r>
               <w:rPr>
                 <w:rFonts w:ascii="Times New Roman" w:hAnsi="Times New Roman"/>
-                <w:b w:val="0"/>
-                <w:i w:val="0"/>
                 <w:sz w:val="22"/>
               </w:rPr>
               <w:t>Database</w:t>
@@ -14073,8 +13842,6 @@
             <w:r>
               <w:rPr>
                 <w:rFonts w:ascii="Times New Roman" w:hAnsi="Times New Roman"/>
-                <w:b w:val="0"/>
-                <w:i w:val="0"/>
                 <w:sz w:val="22"/>
               </w:rPr>
               <w:t>MySQL 8.0.43</w:t>
@@ -14095,8 +13862,6 @@
             <w:r>
               <w:rPr>
                 <w:rFonts w:ascii="Times New Roman" w:hAnsi="Times New Roman"/>
-                <w:b w:val="0"/>
-                <w:i w:val="0"/>
                 <w:sz w:val="22"/>
               </w:rPr>
               <w:t>Web Server (Backend)</w:t>
@@ -14115,8 +13880,6 @@
             <w:r>
               <w:rPr>
                 <w:rFonts w:ascii="Times New Roman" w:hAnsi="Times New Roman"/>
-                <w:b w:val="0"/>
-                <w:i w:val="0"/>
                 <w:sz w:val="22"/>
               </w:rPr>
               <w:t>Apache httpd</w:t>
@@ -14137,8 +13900,6 @@
             <w:r>
               <w:rPr>
                 <w:rFonts w:ascii="Times New Roman" w:hAnsi="Times New Roman"/>
-                <w:b w:val="0"/>
-                <w:i w:val="0"/>
                 <w:sz w:val="22"/>
               </w:rPr>
               <w:t>Mail Transfer Agent</w:t>
@@ -14157,8 +13918,6 @@
             <w:r>
               <w:rPr>
                 <w:rFonts w:ascii="Times New Roman" w:hAnsi="Times New Roman"/>
-                <w:b w:val="0"/>
-                <w:i w:val="0"/>
                 <w:sz w:val="22"/>
               </w:rPr>
               <w:t>Exim 4.99.2</w:t>
@@ -14179,8 +13938,6 @@
             <w:r>
               <w:rPr>
                 <w:rFonts w:ascii="Times New Roman" w:hAnsi="Times New Roman"/>
-                <w:b w:val="0"/>
-                <w:i w:val="0"/>
                 <w:sz w:val="22"/>
               </w:rPr>
               <w:t>Mail Delivery Agent</w:t>
@@ -14199,8 +13956,6 @@
             <w:r>
               <w:rPr>
                 <w:rFonts w:ascii="Times New Roman" w:hAnsi="Times New Roman"/>
-                <w:b w:val="0"/>
-                <w:i w:val="0"/>
                 <w:sz w:val="22"/>
               </w:rPr>
               <w:t>Dovecot</w:t>
@@ -14221,8 +13976,6 @@
             <w:r>
               <w:rPr>
                 <w:rFonts w:ascii="Times New Roman" w:hAnsi="Times New Roman"/>
-                <w:b w:val="0"/>
-                <w:i w:val="0"/>
                 <w:sz w:val="22"/>
               </w:rPr>
               <w:t>DNS Server</w:t>
@@ -14241,8 +13994,6 @@
             <w:r>
               <w:rPr>
                 <w:rFonts w:ascii="Times New Roman" w:hAnsi="Times New Roman"/>
-                <w:b w:val="0"/>
-                <w:i w:val="0"/>
                 <w:sz w:val="22"/>
               </w:rPr>
               <w:t>PowerDNS</w:t>
@@ -14263,8 +14014,6 @@
             <w:r>
               <w:rPr>
                 <w:rFonts w:ascii="Times New Roman" w:hAnsi="Times New Roman"/>
-                <w:b w:val="0"/>
-                <w:i w:val="0"/>
                 <w:sz w:val="22"/>
               </w:rPr>
               <w:t>Registrar</w:t>
@@ -14283,8 +14032,6 @@
             <w:r>
               <w:rPr>
                 <w:rFonts w:ascii="Times New Roman" w:hAnsi="Times New Roman"/>
-                <w:b w:val="0"/>
-                <w:i w:val="0"/>
                 <w:sz w:val="22"/>
               </w:rPr>
               <w:t>GoDaddy (privacy via Domains By Proxy)</w:t>
@@ -14305,8 +14052,6 @@
             <w:r>
               <w:rPr>
                 <w:rFonts w:ascii="Times New Roman" w:hAnsi="Times New Roman"/>
-                <w:b w:val="0"/>
-                <w:i w:val="0"/>
                 <w:sz w:val="22"/>
               </w:rPr>
               <w:t>DNS Provider</w:t>
@@ -14325,8 +14070,6 @@
             <w:r>
               <w:rPr>
                 <w:rFonts w:ascii="Times New Roman" w:hAnsi="Times New Roman"/>
-                <w:b w:val="0"/>
-                <w:i w:val="0"/>
                 <w:sz w:val="22"/>
               </w:rPr>
               <w:t>Cloudflare nameservers</w:t>
@@ -14393,7 +14136,6 @@
               <w:rPr>
                 <w:rFonts w:ascii="Times New Roman" w:hAnsi="Times New Roman"/>
                 <w:b/>
-                <w:i w:val="0"/>
                 <w:color w:val="FFFFFF"/>
                 <w:sz w:val="22"/>
               </w:rPr>
@@ -14415,7 +14157,6 @@
               <w:rPr>
                 <w:rFonts w:ascii="Times New Roman" w:hAnsi="Times New Roman"/>
                 <w:b/>
-                <w:i w:val="0"/>
                 <w:color w:val="FFFFFF"/>
                 <w:sz w:val="22"/>
               </w:rPr>
@@ -14437,7 +14178,6 @@
               <w:rPr>
                 <w:rFonts w:ascii="Times New Roman" w:hAnsi="Times New Roman"/>
                 <w:b/>
-                <w:i w:val="0"/>
                 <w:color w:val="FFFFFF"/>
                 <w:sz w:val="22"/>
               </w:rPr>
@@ -14459,8 +14199,6 @@
             <w:r>
               <w:rPr>
                 <w:rFonts w:ascii="Times New Roman" w:hAnsi="Times New Roman"/>
-                <w:b w:val="0"/>
-                <w:i w:val="0"/>
                 <w:sz w:val="22"/>
               </w:rPr>
               <w:t>neuralsh.com</w:t>
@@ -14479,8 +14217,6 @@
             <w:r>
               <w:rPr>
                 <w:rFonts w:ascii="Times New Roman" w:hAnsi="Times New Roman"/>
-                <w:b w:val="0"/>
-                <w:i w:val="0"/>
                 <w:sz w:val="22"/>
               </w:rPr>
               <w:t>104.21.91.198</w:t>
@@ -14499,8 +14235,6 @@
             <w:r>
               <w:rPr>
                 <w:rFonts w:ascii="Times New Roman" w:hAnsi="Times New Roman"/>
-                <w:b w:val="0"/>
-                <w:i w:val="0"/>
                 <w:sz w:val="22"/>
               </w:rPr>
               <w:t>Main application — Cloudflare CDN edge</w:t>
@@ -14521,8 +14255,6 @@
             <w:r>
               <w:rPr>
                 <w:rFonts w:ascii="Times New Roman" w:hAnsi="Times New Roman"/>
-                <w:b w:val="0"/>
-                <w:i w:val="0"/>
                 <w:sz w:val="22"/>
               </w:rPr>
               <w:t>mail.neuralsh.com</w:t>
@@ -14541,8 +14273,6 @@
             <w:r>
               <w:rPr>
                 <w:rFonts w:ascii="Times New Roman" w:hAnsi="Times New Roman"/>
-                <w:b w:val="0"/>
-                <w:i w:val="0"/>
                 <w:sz w:val="22"/>
               </w:rPr>
               <w:t>103.16.62.217</w:t>
@@ -14561,8 +14291,6 @@
             <w:r>
               <w:rPr>
                 <w:rFonts w:ascii="Times New Roman" w:hAnsi="Times New Roman"/>
-                <w:b w:val="0"/>
-                <w:i w:val="0"/>
                 <w:sz w:val="22"/>
               </w:rPr>
               <w:t>Mail + backend server — cPanel shared hosting</w:t>
@@ -14583,8 +14311,6 @@
             <w:r>
               <w:rPr>
                 <w:rFonts w:ascii="Times New Roman" w:hAnsi="Times New Roman"/>
-                <w:b w:val="0"/>
-                <w:i w:val="0"/>
                 <w:sz w:val="22"/>
               </w:rPr>
               <w:t>103.16.62.217 (direct)</w:t>
@@ -14603,8 +14329,6 @@
             <w:r>
               <w:rPr>
                 <w:rFonts w:ascii="Times New Roman" w:hAnsi="Times New Roman"/>
-                <w:b w:val="0"/>
-                <w:i w:val="0"/>
                 <w:sz w:val="22"/>
               </w:rPr>
               <w:t>Same</w:t>
@@ -14623,8 +14347,6 @@
             <w:r>
               <w:rPr>
                 <w:rFonts w:ascii="Times New Roman" w:hAnsi="Times New Roman"/>
-                <w:b w:val="0"/>
-                <w:i w:val="0"/>
                 <w:sz w:val="22"/>
               </w:rPr>
               <w:t>Admin panels, database, MikroTik — 20+ exposed services</w:t>
@@ -16316,7 +16038,6 @@
               <w:rPr>
                 <w:rFonts w:ascii="Times New Roman" w:hAnsi="Times New Roman"/>
                 <w:b/>
-                <w:i w:val="0"/>
                 <w:color w:val="FFFFFF"/>
                 <w:sz w:val="22"/>
               </w:rPr>
@@ -16338,7 +16059,6 @@
               <w:rPr>
                 <w:rFonts w:ascii="Times New Roman" w:hAnsi="Times New Roman"/>
                 <w:b/>
-                <w:i w:val="0"/>
                 <w:color w:val="FFFFFF"/>
                 <w:sz w:val="22"/>
               </w:rPr>
@@ -16360,7 +16080,6 @@
               <w:rPr>
                 <w:rFonts w:ascii="Times New Roman" w:hAnsi="Times New Roman"/>
                 <w:b/>
-                <w:i w:val="0"/>
                 <w:color w:val="FFFFFF"/>
                 <w:sz w:val="22"/>
               </w:rPr>
@@ -16381,12 +16100,10 @@
             </w:pPr>
             <w:r>
               <w:rPr>
-                <w:rFonts w:ascii="Times New Roman" w:hAnsi="Times New Roman"/>
-                <w:b w:val="0"/>
-                <w:i w:val="0"/>
+                <w:rFonts w:ascii="Courier New" w:hAnsi="Courier New"/>
                 <w:sz w:val="22"/>
               </w:rPr>
-              <w:t>`Strict-Transport-Security`</w:t>
+              <w:t>Strict-Transport-Security</w:t>
             </w:r>
           </w:p>
         </w:tc>
@@ -16402,8 +16119,6 @@
             <w:r>
               <w:rPr>
                 <w:rFonts w:ascii="Times New Roman" w:hAnsi="Times New Roman"/>
-                <w:b w:val="0"/>
-                <w:i w:val="0"/>
                 <w:sz w:val="22"/>
               </w:rPr>
               <w:t>max-age=15552000; includeSubDomains; preload</w:t>
@@ -16422,8 +16137,6 @@
             <w:r>
               <w:rPr>
                 <w:rFonts w:ascii="Times New Roman" w:hAnsi="Times New Roman"/>
-                <w:b w:val="0"/>
-                <w:i w:val="0"/>
                 <w:sz w:val="22"/>
               </w:rPr>
               <w:t>Good</w:t>
@@ -16443,12 +16156,10 @@
             </w:pPr>
             <w:r>
               <w:rPr>
-                <w:rFonts w:ascii="Times New Roman" w:hAnsi="Times New Roman"/>
-                <w:b w:val="0"/>
-                <w:i w:val="0"/>
+                <w:rFonts w:ascii="Courier New" w:hAnsi="Courier New"/>
                 <w:sz w:val="22"/>
               </w:rPr>
-              <w:t>`X-Frame-Options`</w:t>
+              <w:t>X-Frame-Options</w:t>
             </w:r>
           </w:p>
         </w:tc>
@@ -16464,8 +16175,6 @@
             <w:r>
               <w:rPr>
                 <w:rFonts w:ascii="Times New Roman" w:hAnsi="Times New Roman"/>
-                <w:b w:val="0"/>
-                <w:i w:val="0"/>
                 <w:sz w:val="22"/>
               </w:rPr>
               <w:t>DENY</w:t>
@@ -16484,8 +16193,6 @@
             <w:r>
               <w:rPr>
                 <w:rFonts w:ascii="Times New Roman" w:hAnsi="Times New Roman"/>
-                <w:b w:val="0"/>
-                <w:i w:val="0"/>
                 <w:sz w:val="22"/>
               </w:rPr>
               <w:t>Good</w:t>
@@ -16505,12 +16212,10 @@
             </w:pPr>
             <w:r>
               <w:rPr>
-                <w:rFonts w:ascii="Times New Roman" w:hAnsi="Times New Roman"/>
-                <w:b w:val="0"/>
-                <w:i w:val="0"/>
+                <w:rFonts w:ascii="Courier New" w:hAnsi="Courier New"/>
                 <w:sz w:val="22"/>
               </w:rPr>
-              <w:t>`X-Content-Type-Options`</w:t>
+              <w:t>X-Content-Type-Options</w:t>
             </w:r>
           </w:p>
         </w:tc>
@@ -16526,8 +16231,6 @@
             <w:r>
               <w:rPr>
                 <w:rFonts w:ascii="Times New Roman" w:hAnsi="Times New Roman"/>
-                <w:b w:val="0"/>
-                <w:i w:val="0"/>
                 <w:sz w:val="22"/>
               </w:rPr>
               <w:t>nosniff</w:t>
@@ -16546,8 +16249,6 @@
             <w:r>
               <w:rPr>
                 <w:rFonts w:ascii="Times New Roman" w:hAnsi="Times New Roman"/>
-                <w:b w:val="0"/>
-                <w:i w:val="0"/>
                 <w:sz w:val="22"/>
               </w:rPr>
               <w:t>Good</w:t>
@@ -16567,12 +16268,10 @@
             </w:pPr>
             <w:r>
               <w:rPr>
-                <w:rFonts w:ascii="Times New Roman" w:hAnsi="Times New Roman"/>
-                <w:b w:val="0"/>
-                <w:i w:val="0"/>
+                <w:rFonts w:ascii="Courier New" w:hAnsi="Courier New"/>
                 <w:sz w:val="22"/>
               </w:rPr>
-              <w:t>`X-XSS-Protection`</w:t>
+              <w:t>X-XSS-Protection</w:t>
             </w:r>
           </w:p>
         </w:tc>
@@ -16588,8 +16287,6 @@
             <w:r>
               <w:rPr>
                 <w:rFonts w:ascii="Times New Roman" w:hAnsi="Times New Roman"/>
-                <w:b w:val="0"/>
-                <w:i w:val="0"/>
                 <w:sz w:val="22"/>
               </w:rPr>
               <w:t>1; mode=block</w:t>
@@ -16608,8 +16305,6 @@
             <w:r>
               <w:rPr>
                 <w:rFonts w:ascii="Times New Roman" w:hAnsi="Times New Roman"/>
-                <w:b w:val="0"/>
-                <w:i w:val="0"/>
                 <w:sz w:val="22"/>
               </w:rPr>
               <w:t>Good</w:t>
@@ -16629,12 +16324,10 @@
             </w:pPr>
             <w:r>
               <w:rPr>
-                <w:rFonts w:ascii="Times New Roman" w:hAnsi="Times New Roman"/>
-                <w:b w:val="0"/>
-                <w:i w:val="0"/>
+                <w:rFonts w:ascii="Courier New" w:hAnsi="Courier New"/>
                 <w:sz w:val="22"/>
               </w:rPr>
-              <w:t>`Referrer-Policy`</w:t>
+              <w:t>Referrer-Policy</w:t>
             </w:r>
           </w:p>
         </w:tc>
@@ -16650,8 +16343,6 @@
             <w:r>
               <w:rPr>
                 <w:rFonts w:ascii="Times New Roman" w:hAnsi="Times New Roman"/>
-                <w:b w:val="0"/>
-                <w:i w:val="0"/>
                 <w:sz w:val="22"/>
               </w:rPr>
               <w:t>strict-origin-when-cross-origin</w:t>
@@ -16670,8 +16361,6 @@
             <w:r>
               <w:rPr>
                 <w:rFonts w:ascii="Times New Roman" w:hAnsi="Times New Roman"/>
-                <w:b w:val="0"/>
-                <w:i w:val="0"/>
                 <w:sz w:val="22"/>
               </w:rPr>
               <w:t>Good</w:t>
@@ -16691,12 +16380,10 @@
             </w:pPr>
             <w:r>
               <w:rPr>
-                <w:rFonts w:ascii="Times New Roman" w:hAnsi="Times New Roman"/>
-                <w:b w:val="0"/>
-                <w:i w:val="0"/>
+                <w:rFonts w:ascii="Courier New" w:hAnsi="Courier New"/>
                 <w:sz w:val="22"/>
               </w:rPr>
-              <w:t>`Content-Security-Policy`</w:t>
+              <w:t>Content-Security-Policy</w:t>
             </w:r>
           </w:p>
         </w:tc>
@@ -16712,11 +16399,17 @@
             <w:r>
               <w:rPr>
                 <w:rFonts w:ascii="Times New Roman" w:hAnsi="Times New Roman"/>
-                <w:b w:val="0"/>
-                <w:i w:val="0"/>
                 <w:sz w:val="22"/>
               </w:rPr>
-              <w:t>script-src 'self' **'unsafe-inline'**</w:t>
+              <w:t xml:space="preserve">script-src 'self' </w:t>
+            </w:r>
+            <w:r>
+              <w:rPr>
+                <w:rFonts w:ascii="Times New Roman" w:hAnsi="Times New Roman"/>
+                <w:b/>
+                <w:sz w:val="22"/>
+              </w:rPr>
+              <w:t>'unsafe-inline'</w:t>
             </w:r>
           </w:p>
         </w:tc>
@@ -16732,8 +16425,6 @@
             <w:r>
               <w:rPr>
                 <w:rFonts w:ascii="Times New Roman" w:hAnsi="Times New Roman"/>
-                <w:b w:val="0"/>
-                <w:i w:val="0"/>
                 <w:sz w:val="22"/>
               </w:rPr>
               <w:t>Weak — N-009</w:t>
@@ -17082,7 +16773,6 @@
               <w:rPr>
                 <w:rFonts w:ascii="Times New Roman" w:hAnsi="Times New Roman"/>
                 <w:b/>
-                <w:i w:val="0"/>
                 <w:color w:val="FFFFFF"/>
                 <w:sz w:val="22"/>
               </w:rPr>
@@ -17104,7 +16794,6 @@
               <w:rPr>
                 <w:rFonts w:ascii="Times New Roman" w:hAnsi="Times New Roman"/>
                 <w:b/>
-                <w:i w:val="0"/>
                 <w:color w:val="FFFFFF"/>
                 <w:sz w:val="22"/>
               </w:rPr>
@@ -17126,7 +16815,6 @@
               <w:rPr>
                 <w:rFonts w:ascii="Times New Roman" w:hAnsi="Times New Roman"/>
                 <w:b/>
-                <w:i w:val="0"/>
                 <w:color w:val="FFFFFF"/>
                 <w:sz w:val="22"/>
               </w:rPr>
@@ -17148,8 +16836,6 @@
             <w:r>
               <w:rPr>
                 <w:rFonts w:ascii="Times New Roman" w:hAnsi="Times New Roman"/>
-                <w:b w:val="0"/>
-                <w:i w:val="0"/>
                 <w:sz w:val="22"/>
               </w:rPr>
               <w:t>Without bypass</w:t>
@@ -17168,8 +16854,6 @@
             <w:r>
               <w:rPr>
                 <w:rFonts w:ascii="Times New Roman" w:hAnsi="Times New Roman"/>
-                <w:b w:val="0"/>
-                <w:i w:val="0"/>
                 <w:sz w:val="22"/>
               </w:rPr>
               <w:t>18 / 50</w:t>
@@ -17188,8 +16872,6 @@
             <w:r>
               <w:rPr>
                 <w:rFonts w:ascii="Times New Roman" w:hAnsi="Times New Roman"/>
-                <w:b w:val="0"/>
-                <w:i w:val="0"/>
                 <w:sz w:val="22"/>
               </w:rPr>
               <w:t>Yes — request 19</w:t>
@@ -17210,8 +16892,6 @@
             <w:r>
               <w:rPr>
                 <w:rFonts w:ascii="Times New Roman" w:hAnsi="Times New Roman"/>
-                <w:b w:val="0"/>
-                <w:i w:val="0"/>
                 <w:sz w:val="22"/>
               </w:rPr>
               <w:t>With X-Forwarded-For</w:t>
@@ -17230,11 +16910,10 @@
             <w:r>
               <w:rPr>
                 <w:rFonts w:ascii="Times New Roman" w:hAnsi="Times New Roman"/>
-                <w:b w:val="0"/>
-                <w:i w:val="0"/>
+                <w:b/>
                 <w:sz w:val="22"/>
               </w:rPr>
-              <w:t>**50 / 50**</w:t>
+              <w:t>50 / 50</w:t>
             </w:r>
           </w:p>
         </w:tc>
@@ -17250,11 +16929,10 @@
             <w:r>
               <w:rPr>
                 <w:rFonts w:ascii="Times New Roman" w:hAnsi="Times New Roman"/>
-                <w:b w:val="0"/>
-                <w:i w:val="0"/>
+                <w:b/>
                 <w:sz w:val="22"/>
               </w:rPr>
-              <w:t>**None — 100% bypass**</w:t>
+              <w:t>None — 100% bypass</w:t>
             </w:r>
           </w:p>
         </w:tc>
@@ -17637,7 +17315,6 @@
               <w:rPr>
                 <w:rFonts w:ascii="Times New Roman" w:hAnsi="Times New Roman"/>
                 <w:b/>
-                <w:i w:val="0"/>
                 <w:color w:val="FFFFFF"/>
                 <w:sz w:val="22"/>
               </w:rPr>
@@ -17659,7 +17336,6 @@
               <w:rPr>
                 <w:rFonts w:ascii="Times New Roman" w:hAnsi="Times New Roman"/>
                 <w:b/>
-                <w:i w:val="0"/>
                 <w:color w:val="FFFFFF"/>
                 <w:sz w:val="22"/>
               </w:rPr>
@@ -17681,7 +17357,6 @@
               <w:rPr>
                 <w:rFonts w:ascii="Times New Roman" w:hAnsi="Times New Roman"/>
                 <w:b/>
-                <w:i w:val="0"/>
                 <w:color w:val="FFFFFF"/>
                 <w:sz w:val="22"/>
               </w:rPr>
@@ -17703,8 +17378,6 @@
             <w:r>
               <w:rPr>
                 <w:rFonts w:ascii="Times New Roman" w:hAnsi="Times New Roman"/>
-                <w:b w:val="0"/>
-                <w:i w:val="0"/>
                 <w:sz w:val="22"/>
               </w:rPr>
               <w:t>WHM root access</w:t>
@@ -17723,8 +17396,6 @@
             <w:r>
               <w:rPr>
                 <w:rFonts w:ascii="Times New Roman" w:hAnsi="Times New Roman"/>
-                <w:b w:val="0"/>
-                <w:i w:val="0"/>
                 <w:sz w:val="22"/>
               </w:rPr>
               <w:t>WHM credentials obtained</w:t>
@@ -17743,8 +17414,6 @@
             <w:r>
               <w:rPr>
                 <w:rFonts w:ascii="Times New Roman" w:hAnsi="Times New Roman"/>
-                <w:b w:val="0"/>
-                <w:i w:val="0"/>
                 <w:sz w:val="22"/>
               </w:rPr>
               <w:t>Full control of ALL hosted accounts on server</w:t>
@@ -17765,8 +17434,6 @@
             <w:r>
               <w:rPr>
                 <w:rFonts w:ascii="Times New Roman" w:hAnsi="Times New Roman"/>
-                <w:b w:val="0"/>
-                <w:i w:val="0"/>
                 <w:sz w:val="22"/>
               </w:rPr>
               <w:t>MySQL root access</w:t>
@@ -17785,8 +17452,6 @@
             <w:r>
               <w:rPr>
                 <w:rFonts w:ascii="Times New Roman" w:hAnsi="Times New Roman"/>
-                <w:b w:val="0"/>
-                <w:i w:val="0"/>
                 <w:sz w:val="22"/>
               </w:rPr>
               <w:t>Root MySQL credentials obtained</w:t>
@@ -17805,8 +17470,6 @@
             <w:r>
               <w:rPr>
                 <w:rFonts w:ascii="Times New Roman" w:hAnsi="Times New Roman"/>
-                <w:b w:val="0"/>
-                <w:i w:val="0"/>
                 <w:sz w:val="22"/>
               </w:rPr>
               <w:t>ALL databases on server accessible</w:t>
@@ -17827,8 +17490,6 @@
             <w:r>
               <w:rPr>
                 <w:rFonts w:ascii="Times New Roman" w:hAnsi="Times New Roman"/>
-                <w:b w:val="0"/>
-                <w:i w:val="0"/>
                 <w:sz w:val="22"/>
               </w:rPr>
               <w:t>File system traversal</w:t>
@@ -17847,8 +17508,6 @@
             <w:r>
               <w:rPr>
                 <w:rFonts w:ascii="Times New Roman" w:hAnsi="Times New Roman"/>
-                <w:b w:val="0"/>
-                <w:i w:val="0"/>
                 <w:sz w:val="22"/>
               </w:rPr>
               <w:t>Web server misconfiguration</w:t>
@@ -17867,8 +17526,6 @@
             <w:r>
               <w:rPr>
                 <w:rFonts w:ascii="Times New Roman" w:hAnsi="Times New Roman"/>
-                <w:b w:val="0"/>
-                <w:i w:val="0"/>
                 <w:sz w:val="22"/>
               </w:rPr>
               <w:t>Read files from other tenant accounts</w:t>
@@ -17889,8 +17546,6 @@
             <w:r>
               <w:rPr>
                 <w:rFonts w:ascii="Times New Roman" w:hAnsi="Times New Roman"/>
-                <w:b w:val="0"/>
-                <w:i w:val="0"/>
                 <w:sz w:val="22"/>
               </w:rPr>
               <w:t>Email interception</w:t>
@@ -17909,8 +17564,6 @@
             <w:r>
               <w:rPr>
                 <w:rFonts w:ascii="Times New Roman" w:hAnsi="Times New Roman"/>
-                <w:b w:val="0"/>
-                <w:i w:val="0"/>
                 <w:sz w:val="22"/>
               </w:rPr>
               <w:t>Mail server access</w:t>
@@ -17929,8 +17582,6 @@
             <w:r>
               <w:rPr>
                 <w:rFonts w:ascii="Times New Roman" w:hAnsi="Times New Roman"/>
-                <w:b w:val="0"/>
-                <w:i w:val="0"/>
                 <w:sz w:val="22"/>
               </w:rPr>
               <w:t>Read all mail for all hosted domains</w:t>
@@ -18859,7 +18510,6 @@
               <w:rPr>
                 <w:rFonts w:ascii="Times New Roman" w:hAnsi="Times New Roman"/>
                 <w:b/>
-                <w:i w:val="0"/>
                 <w:color w:val="FFFFFF"/>
                 <w:sz w:val="22"/>
               </w:rPr>
@@ -18881,7 +18531,6 @@
               <w:rPr>
                 <w:rFonts w:ascii="Times New Roman" w:hAnsi="Times New Roman"/>
                 <w:b/>
-                <w:i w:val="0"/>
                 <w:color w:val="FFFFFF"/>
                 <w:sz w:val="22"/>
               </w:rPr>
@@ -18903,7 +18552,6 @@
               <w:rPr>
                 <w:rFonts w:ascii="Times New Roman" w:hAnsi="Times New Roman"/>
                 <w:b/>
-                <w:i w:val="0"/>
                 <w:color w:val="FFFFFF"/>
                 <w:sz w:val="22"/>
               </w:rPr>
@@ -18925,7 +18573,6 @@
               <w:rPr>
                 <w:rFonts w:ascii="Times New Roman" w:hAnsi="Times New Roman"/>
                 <w:b/>
-                <w:i w:val="0"/>
                 <w:color w:val="FFFFFF"/>
                 <w:sz w:val="22"/>
               </w:rPr>
@@ -18947,7 +18594,6 @@
               <w:rPr>
                 <w:rFonts w:ascii="Times New Roman" w:hAnsi="Times New Roman"/>
                 <w:b/>
-                <w:i w:val="0"/>
                 <w:color w:val="FFFFFF"/>
                 <w:sz w:val="22"/>
               </w:rPr>
@@ -18969,8 +18615,6 @@
             <w:r>
               <w:rPr>
                 <w:rFonts w:ascii="Times New Roman" w:hAnsi="Times New Roman"/>
-                <w:b w:val="0"/>
-                <w:i w:val="0"/>
                 <w:sz w:val="22"/>
               </w:rPr>
               <w:t>N-001</w:t>
@@ -18989,8 +18633,6 @@
             <w:r>
               <w:rPr>
                 <w:rFonts w:ascii="Times New Roman" w:hAnsi="Times New Roman"/>
-                <w:b w:val="0"/>
-                <w:i w:val="0"/>
                 <w:sz w:val="22"/>
               </w:rPr>
               <w:t>MySQL Port 3306 Exposed to Internet</w:t>
@@ -19009,11 +18651,10 @@
             <w:r>
               <w:rPr>
                 <w:rFonts w:ascii="Times New Roman" w:hAnsi="Times New Roman"/>
-                <w:b w:val="0"/>
-                <w:i w:val="0"/>
+                <w:b/>
                 <w:sz w:val="22"/>
               </w:rPr>
-              <w:t>**Critical**</w:t>
+              <w:t>Critical</w:t>
             </w:r>
           </w:p>
         </w:tc>
@@ -19029,8 +18670,6 @@
             <w:r>
               <w:rPr>
                 <w:rFonts w:ascii="Times New Roman" w:hAnsi="Times New Roman"/>
-                <w:b w:val="0"/>
-                <w:i w:val="0"/>
                 <w:sz w:val="22"/>
               </w:rPr>
               <w:t>9.8</w:t>
@@ -19049,8 +18688,6 @@
             <w:r>
               <w:rPr>
                 <w:rFonts w:ascii="Times New Roman" w:hAnsi="Times New Roman"/>
-                <w:b w:val="0"/>
-                <w:i w:val="0"/>
                 <w:sz w:val="22"/>
               </w:rPr>
               <w:t>Confirmed</w:t>
@@ -19071,8 +18708,6 @@
             <w:r>
               <w:rPr>
                 <w:rFonts w:ascii="Times New Roman" w:hAnsi="Times New Roman"/>
-                <w:b w:val="0"/>
-                <w:i w:val="0"/>
                 <w:sz w:val="22"/>
               </w:rPr>
               <w:t>N-002</w:t>
@@ -19091,8 +18726,6 @@
             <w:r>
               <w:rPr>
                 <w:rFonts w:ascii="Times New Roman" w:hAnsi="Times New Roman"/>
-                <w:b w:val="0"/>
-                <w:i w:val="0"/>
                 <w:sz w:val="22"/>
               </w:rPr>
               <w:t>MikroTik Admin Panel Exposed (Port 9001)</w:t>
@@ -19111,11 +18744,10 @@
             <w:r>
               <w:rPr>
                 <w:rFonts w:ascii="Times New Roman" w:hAnsi="Times New Roman"/>
-                <w:b w:val="0"/>
-                <w:i w:val="0"/>
+                <w:b/>
                 <w:sz w:val="22"/>
               </w:rPr>
-              <w:t>**Critical**</w:t>
+              <w:t>Critical</w:t>
             </w:r>
           </w:p>
         </w:tc>
@@ -19131,8 +18763,6 @@
             <w:r>
               <w:rPr>
                 <w:rFonts w:ascii="Times New Roman" w:hAnsi="Times New Roman"/>
-                <w:b w:val="0"/>
-                <w:i w:val="0"/>
                 <w:sz w:val="22"/>
               </w:rPr>
               <w:t>9.1</w:t>
@@ -19151,8 +18781,6 @@
             <w:r>
               <w:rPr>
                 <w:rFonts w:ascii="Times New Roman" w:hAnsi="Times New Roman"/>
-                <w:b w:val="0"/>
-                <w:i w:val="0"/>
                 <w:sz w:val="22"/>
               </w:rPr>
               <w:t>Confirmed</w:t>
@@ -19173,8 +18801,6 @@
             <w:r>
               <w:rPr>
                 <w:rFonts w:ascii="Times New Roman" w:hAnsi="Times New Roman"/>
-                <w:b w:val="0"/>
-                <w:i w:val="0"/>
                 <w:sz w:val="22"/>
               </w:rPr>
               <w:t>N-013</w:t>
@@ -19193,8 +18819,6 @@
             <w:r>
               <w:rPr>
                 <w:rFonts w:ascii="Times New Roman" w:hAnsi="Times New Roman"/>
-                <w:b w:val="0"/>
-                <w:i w:val="0"/>
                 <w:sz w:val="22"/>
               </w:rPr>
               <w:t>cPanel Admin Panel Exposed (Port 2083)</w:t>
@@ -19213,11 +18837,10 @@
             <w:r>
               <w:rPr>
                 <w:rFonts w:ascii="Times New Roman" w:hAnsi="Times New Roman"/>
-                <w:b w:val="0"/>
-                <w:i w:val="0"/>
+                <w:b/>
                 <w:sz w:val="22"/>
               </w:rPr>
-              <w:t>**Critical**</w:t>
+              <w:t>Critical</w:t>
             </w:r>
           </w:p>
         </w:tc>
@@ -19233,8 +18856,6 @@
             <w:r>
               <w:rPr>
                 <w:rFonts w:ascii="Times New Roman" w:hAnsi="Times New Roman"/>
-                <w:b w:val="0"/>
-                <w:i w:val="0"/>
                 <w:sz w:val="22"/>
               </w:rPr>
               <w:t>9.8</w:t>
@@ -19253,8 +18874,6 @@
             <w:r>
               <w:rPr>
                 <w:rFonts w:ascii="Times New Roman" w:hAnsi="Times New Roman"/>
-                <w:b w:val="0"/>
-                <w:i w:val="0"/>
                 <w:sz w:val="22"/>
               </w:rPr>
               <w:t>Confirmed</w:t>
@@ -19275,8 +18894,6 @@
             <w:r>
               <w:rPr>
                 <w:rFonts w:ascii="Times New Roman" w:hAnsi="Times New Roman"/>
-                <w:b w:val="0"/>
-                <w:i w:val="0"/>
                 <w:sz w:val="22"/>
               </w:rPr>
               <w:t>N-014</w:t>
@@ -19295,8 +18912,6 @@
             <w:r>
               <w:rPr>
                 <w:rFonts w:ascii="Times New Roman" w:hAnsi="Times New Roman"/>
-                <w:b w:val="0"/>
-                <w:i w:val="0"/>
                 <w:sz w:val="22"/>
               </w:rPr>
               <w:t>WHM Root Panel Exposed (Port 2087)</w:t>
@@ -19315,11 +18930,10 @@
             <w:r>
               <w:rPr>
                 <w:rFonts w:ascii="Times New Roman" w:hAnsi="Times New Roman"/>
-                <w:b w:val="0"/>
-                <w:i w:val="0"/>
+                <w:b/>
                 <w:sz w:val="22"/>
               </w:rPr>
-              <w:t>**Critical**</w:t>
+              <w:t>Critical</w:t>
             </w:r>
           </w:p>
         </w:tc>
@@ -19335,8 +18949,6 @@
             <w:r>
               <w:rPr>
                 <w:rFonts w:ascii="Times New Roman" w:hAnsi="Times New Roman"/>
-                <w:b w:val="0"/>
-                <w:i w:val="0"/>
                 <w:sz w:val="22"/>
               </w:rPr>
               <w:t>10.0</w:t>
@@ -19355,8 +18967,6 @@
             <w:r>
               <w:rPr>
                 <w:rFonts w:ascii="Times New Roman" w:hAnsi="Times New Roman"/>
-                <w:b w:val="0"/>
-                <w:i w:val="0"/>
                 <w:sz w:val="22"/>
               </w:rPr>
               <w:t>Confirmed</w:t>
@@ -19377,8 +18987,6 @@
             <w:r>
               <w:rPr>
                 <w:rFonts w:ascii="Times New Roman" w:hAnsi="Times New Roman"/>
-                <w:b w:val="0"/>
-                <w:i w:val="0"/>
                 <w:sz w:val="22"/>
               </w:rPr>
               <w:t>N-003</w:t>
@@ -19397,8 +19005,6 @@
             <w:r>
               <w:rPr>
                 <w:rFonts w:ascii="Times New Roman" w:hAnsi="Times New Roman"/>
-                <w:b w:val="0"/>
-                <w:i w:val="0"/>
                 <w:sz w:val="22"/>
               </w:rPr>
               <w:t>SSH Port 22 Publicly Accessible</w:t>
@@ -19419,7 +19025,6 @@
               <w:rPr>
                 <w:rFonts w:ascii="Times New Roman" w:hAnsi="Times New Roman"/>
                 <w:b/>
-                <w:i w:val="0"/>
                 <w:color w:val="FFFFFF"/>
                 <w:sz w:val="22"/>
               </w:rPr>
@@ -19439,8 +19044,6 @@
             <w:r>
               <w:rPr>
                 <w:rFonts w:ascii="Times New Roman" w:hAnsi="Times New Roman"/>
-                <w:b w:val="0"/>
-                <w:i w:val="0"/>
                 <w:sz w:val="22"/>
               </w:rPr>
               <w:t>7.2</w:t>
@@ -19459,8 +19062,6 @@
             <w:r>
               <w:rPr>
                 <w:rFonts w:ascii="Times New Roman" w:hAnsi="Times New Roman"/>
-                <w:b w:val="0"/>
-                <w:i w:val="0"/>
                 <w:sz w:val="22"/>
               </w:rPr>
               <w:t>Confirmed</w:t>
@@ -19481,8 +19082,6 @@
             <w:r>
               <w:rPr>
                 <w:rFonts w:ascii="Times New Roman" w:hAnsi="Times New Roman"/>
-                <w:b w:val="0"/>
-                <w:i w:val="0"/>
                 <w:sz w:val="22"/>
               </w:rPr>
               <w:t>N-004</w:t>
@@ -19501,8 +19100,6 @@
             <w:r>
               <w:rPr>
                 <w:rFonts w:ascii="Times New Roman" w:hAnsi="Times New Roman"/>
-                <w:b w:val="0"/>
-                <w:i w:val="0"/>
                 <w:sz w:val="22"/>
               </w:rPr>
               <w:t>Shared Hosting Lateral Movement Risk</w:t>
@@ -19523,7 +19120,6 @@
               <w:rPr>
                 <w:rFonts w:ascii="Times New Roman" w:hAnsi="Times New Roman"/>
                 <w:b/>
-                <w:i w:val="0"/>
                 <w:color w:val="FFFFFF"/>
                 <w:sz w:val="22"/>
               </w:rPr>
@@ -19543,8 +19139,6 @@
             <w:r>
               <w:rPr>
                 <w:rFonts w:ascii="Times New Roman" w:hAnsi="Times New Roman"/>
-                <w:b w:val="0"/>
-                <w:i w:val="0"/>
                 <w:sz w:val="22"/>
               </w:rPr>
               <w:t>7.5</w:t>
@@ -19563,8 +19157,6 @@
             <w:r>
               <w:rPr>
                 <w:rFonts w:ascii="Times New Roman" w:hAnsi="Times New Roman"/>
-                <w:b w:val="0"/>
-                <w:i w:val="0"/>
                 <w:sz w:val="22"/>
               </w:rPr>
               <w:t>Confirmed</w:t>
@@ -19585,8 +19177,6 @@
             <w:r>
               <w:rPr>
                 <w:rFonts w:ascii="Times New Roman" w:hAnsi="Times New Roman"/>
-                <w:b w:val="0"/>
-                <w:i w:val="0"/>
                 <w:sz w:val="22"/>
               </w:rPr>
               <w:t>N-005</w:t>
@@ -19605,8 +19195,6 @@
             <w:r>
               <w:rPr>
                 <w:rFonts w:ascii="Times New Roman" w:hAnsi="Times New Roman"/>
-                <w:b w:val="0"/>
-                <w:i w:val="0"/>
                 <w:sz w:val="22"/>
               </w:rPr>
               <w:t>Rate Limit Bypass via X-Forwarded-For</w:t>
@@ -19627,7 +19215,6 @@
               <w:rPr>
                 <w:rFonts w:ascii="Times New Roman" w:hAnsi="Times New Roman"/>
                 <w:b/>
-                <w:i w:val="0"/>
                 <w:color w:val="FFFFFF"/>
                 <w:sz w:val="22"/>
               </w:rPr>
@@ -19647,8 +19234,6 @@
             <w:r>
               <w:rPr>
                 <w:rFonts w:ascii="Times New Roman" w:hAnsi="Times New Roman"/>
-                <w:b w:val="0"/>
-                <w:i w:val="0"/>
                 <w:sz w:val="22"/>
               </w:rPr>
               <w:t>9.1</w:t>
@@ -19667,11 +19252,10 @@
             <w:r>
               <w:rPr>
                 <w:rFonts w:ascii="Times New Roman" w:hAnsi="Times New Roman"/>
-                <w:b w:val="0"/>
-                <w:i w:val="0"/>
+                <w:b/>
                 <w:sz w:val="22"/>
               </w:rPr>
-              <w:t>**Exploited**</w:t>
+              <w:t>Exploited</w:t>
             </w:r>
           </w:p>
         </w:tc>
@@ -19689,8 +19273,6 @@
             <w:r>
               <w:rPr>
                 <w:rFonts w:ascii="Times New Roman" w:hAnsi="Times New Roman"/>
-                <w:b w:val="0"/>
-                <w:i w:val="0"/>
                 <w:sz w:val="22"/>
               </w:rPr>
               <w:t>N-015</w:t>
@@ -19709,8 +19291,6 @@
             <w:r>
               <w:rPr>
                 <w:rFonts w:ascii="Times New Roman" w:hAnsi="Times New Roman"/>
-                <w:b w:val="0"/>
-                <w:i w:val="0"/>
                 <w:sz w:val="22"/>
               </w:rPr>
               <w:t>Webmail Interface Exposed (Port 2096)</w:t>
@@ -19731,7 +19311,6 @@
               <w:rPr>
                 <w:rFonts w:ascii="Times New Roman" w:hAnsi="Times New Roman"/>
                 <w:b/>
-                <w:i w:val="0"/>
                 <w:color w:val="FFFFFF"/>
                 <w:sz w:val="22"/>
               </w:rPr>
@@ -19751,8 +19330,6 @@
             <w:r>
               <w:rPr>
                 <w:rFonts w:ascii="Times New Roman" w:hAnsi="Times New Roman"/>
-                <w:b w:val="0"/>
-                <w:i w:val="0"/>
                 <w:sz w:val="22"/>
               </w:rPr>
               <w:t>7.5</w:t>
@@ -19771,8 +19348,6 @@
             <w:r>
               <w:rPr>
                 <w:rFonts w:ascii="Times New Roman" w:hAnsi="Times New Roman"/>
-                <w:b w:val="0"/>
-                <w:i w:val="0"/>
                 <w:sz w:val="22"/>
               </w:rPr>
               <w:t>Confirmed</w:t>
@@ -19793,8 +19368,6 @@
             <w:r>
               <w:rPr>
                 <w:rFonts w:ascii="Times New Roman" w:hAnsi="Times New Roman"/>
-                <w:b w:val="0"/>
-                <w:i w:val="0"/>
                 <w:sz w:val="22"/>
               </w:rPr>
               <w:t>N-018</w:t>
@@ -19813,8 +19386,6 @@
             <w:r>
               <w:rPr>
                 <w:rFonts w:ascii="Times New Roman" w:hAnsi="Times New Roman"/>
-                <w:b w:val="0"/>
-                <w:i w:val="0"/>
                 <w:sz w:val="22"/>
               </w:rPr>
               <w:t>Additional cPanel Interfaces Exposed (2078, 2091)</w:t>
@@ -19835,7 +19406,6 @@
               <w:rPr>
                 <w:rFonts w:ascii="Times New Roman" w:hAnsi="Times New Roman"/>
                 <w:b/>
-                <w:i w:val="0"/>
                 <w:color w:val="FFFFFF"/>
                 <w:sz w:val="22"/>
               </w:rPr>
@@ -19855,8 +19425,6 @@
             <w:r>
               <w:rPr>
                 <w:rFonts w:ascii="Times New Roman" w:hAnsi="Times New Roman"/>
-                <w:b w:val="0"/>
-                <w:i w:val="0"/>
                 <w:sz w:val="22"/>
               </w:rPr>
               <w:t>7.5</w:t>
@@ -19875,8 +19443,6 @@
             <w:r>
               <w:rPr>
                 <w:rFonts w:ascii="Times New Roman" w:hAnsi="Times New Roman"/>
-                <w:b w:val="0"/>
-                <w:i w:val="0"/>
                 <w:sz w:val="22"/>
               </w:rPr>
               <w:t>Confirmed</w:t>
@@ -19897,8 +19463,6 @@
             <w:r>
               <w:rPr>
                 <w:rFonts w:ascii="Times New Roman" w:hAnsi="Times New Roman"/>
-                <w:b w:val="0"/>
-                <w:i w:val="0"/>
                 <w:sz w:val="22"/>
               </w:rPr>
               <w:t>N-006</w:t>
@@ -19917,8 +19481,6 @@
             <w:r>
               <w:rPr>
                 <w:rFonts w:ascii="Times New Roman" w:hAnsi="Times New Roman"/>
-                <w:b w:val="0"/>
-                <w:i w:val="0"/>
                 <w:sz w:val="22"/>
               </w:rPr>
               <w:t>API Routes Exposed in Client-Side JavaScript</w:t>
@@ -19938,8 +19500,6 @@
             <w:r>
               <w:rPr>
                 <w:rFonts w:ascii="Times New Roman" w:hAnsi="Times New Roman"/>
-                <w:b/>
-                <w:i w:val="0"/>
                 <w:sz w:val="22"/>
               </w:rPr>
               <w:t>Medium</w:t>
@@ -19958,8 +19518,6 @@
             <w:r>
               <w:rPr>
                 <w:rFonts w:ascii="Times New Roman" w:hAnsi="Times New Roman"/>
-                <w:b w:val="0"/>
-                <w:i w:val="0"/>
                 <w:sz w:val="22"/>
               </w:rPr>
               <w:t>5.3</w:t>
@@ -19978,8 +19536,6 @@
             <w:r>
               <w:rPr>
                 <w:rFonts w:ascii="Times New Roman" w:hAnsi="Times New Roman"/>
-                <w:b w:val="0"/>
-                <w:i w:val="0"/>
                 <w:sz w:val="22"/>
               </w:rPr>
               <w:t>Confirmed</w:t>
@@ -20000,8 +19556,6 @@
             <w:r>
               <w:rPr>
                 <w:rFonts w:ascii="Times New Roman" w:hAnsi="Times New Roman"/>
-                <w:b w:val="0"/>
-                <w:i w:val="0"/>
                 <w:sz w:val="22"/>
               </w:rPr>
               <w:t>N-007</w:t>
@@ -20020,8 +19574,6 @@
             <w:r>
               <w:rPr>
                 <w:rFonts w:ascii="Times New Roman" w:hAnsi="Times New Roman"/>
-                <w:b w:val="0"/>
-                <w:i w:val="0"/>
                 <w:sz w:val="22"/>
               </w:rPr>
               <w:t>Unauthenticated JWT Token Issuance</w:t>
@@ -20041,51 +19593,53 @@
             <w:r>
               <w:rPr>
                 <w:rFonts w:ascii="Times New Roman" w:hAnsi="Times New Roman"/>
+                <w:sz w:val="22"/>
+              </w:rPr>
+              <w:t>Medium</w:t>
+            </w:r>
+          </w:p>
+        </w:tc>
+        <w:tc>
+          <w:tcPr>
+            <w:tcW w:type="dxa" w:w="1814"/>
+          </w:tcPr>
+          <w:p>
+            <w:pPr>
+              <w:ind w:firstLine="0"/>
+              <w:jc w:val="center"/>
+            </w:pPr>
+            <w:r>
+              <w:rPr>
+                <w:rFonts w:ascii="Times New Roman" w:hAnsi="Times New Roman"/>
+                <w:sz w:val="22"/>
+              </w:rPr>
+              <w:t>5.3</w:t>
+            </w:r>
+          </w:p>
+        </w:tc>
+        <w:tc>
+          <w:tcPr>
+            <w:tcW w:type="dxa" w:w="1814"/>
+          </w:tcPr>
+          <w:p>
+            <w:pPr>
+              <w:ind w:firstLine="0"/>
+              <w:jc w:val="center"/>
+            </w:pPr>
+            <w:r>
+              <w:rPr>
+                <w:rFonts w:ascii="Times New Roman" w:hAnsi="Times New Roman"/>
+                <w:sz w:val="22"/>
+              </w:rPr>
+              <w:t xml:space="preserve">Confirmed + </w:t>
+            </w:r>
+            <w:r>
+              <w:rPr>
+                <w:rFonts w:ascii="Times New Roman" w:hAnsi="Times New Roman"/>
                 <w:b/>
-                <w:i w:val="0"/>
                 <w:sz w:val="22"/>
               </w:rPr>
-              <w:t>Medium</w:t>
-            </w:r>
-          </w:p>
-        </w:tc>
-        <w:tc>
-          <w:tcPr>
-            <w:tcW w:type="dxa" w:w="1814"/>
-          </w:tcPr>
-          <w:p>
-            <w:pPr>
-              <w:ind w:firstLine="0"/>
-              <w:jc w:val="center"/>
-            </w:pPr>
-            <w:r>
-              <w:rPr>
-                <w:rFonts w:ascii="Times New Roman" w:hAnsi="Times New Roman"/>
-                <w:b w:val="0"/>
-                <w:i w:val="0"/>
-                <w:sz w:val="22"/>
-              </w:rPr>
-              <w:t>5.3</w:t>
-            </w:r>
-          </w:p>
-        </w:tc>
-        <w:tc>
-          <w:tcPr>
-            <w:tcW w:type="dxa" w:w="1814"/>
-          </w:tcPr>
-          <w:p>
-            <w:pPr>
-              <w:ind w:firstLine="0"/>
-              <w:jc w:val="center"/>
-            </w:pPr>
-            <w:r>
-              <w:rPr>
-                <w:rFonts w:ascii="Times New Roman" w:hAnsi="Times New Roman"/>
-                <w:b w:val="0"/>
-                <w:i w:val="0"/>
-                <w:sz w:val="22"/>
-              </w:rPr>
-              <w:t>Confirmed + **Exploited**</w:t>
+              <w:t>Exploited</w:t>
             </w:r>
           </w:p>
         </w:tc>
@@ -20103,8 +19657,6 @@
             <w:r>
               <w:rPr>
                 <w:rFonts w:ascii="Times New Roman" w:hAnsi="Times New Roman"/>
-                <w:b w:val="0"/>
-                <w:i w:val="0"/>
                 <w:sz w:val="22"/>
               </w:rPr>
               <w:t>N-008</w:t>
@@ -20123,8 +19675,6 @@
             <w:r>
               <w:rPr>
                 <w:rFonts w:ascii="Times New Roman" w:hAnsi="Times New Roman"/>
-                <w:b w:val="0"/>
-                <w:i w:val="0"/>
                 <w:sz w:val="22"/>
               </w:rPr>
               <w:t>SSL Certificate Mismatch (Backend Server)</w:t>
@@ -20144,8 +19694,6 @@
             <w:r>
               <w:rPr>
                 <w:rFonts w:ascii="Times New Roman" w:hAnsi="Times New Roman"/>
-                <w:b/>
-                <w:i w:val="0"/>
                 <w:sz w:val="22"/>
               </w:rPr>
               <w:t>Medium</w:t>
@@ -20164,8 +19712,6 @@
             <w:r>
               <w:rPr>
                 <w:rFonts w:ascii="Times New Roman" w:hAnsi="Times New Roman"/>
-                <w:b w:val="0"/>
-                <w:i w:val="0"/>
                 <w:sz w:val="22"/>
               </w:rPr>
               <w:t>5.9</w:t>
@@ -20184,8 +19730,6 @@
             <w:r>
               <w:rPr>
                 <w:rFonts w:ascii="Times New Roman" w:hAnsi="Times New Roman"/>
-                <w:b w:val="0"/>
-                <w:i w:val="0"/>
                 <w:sz w:val="22"/>
               </w:rPr>
               <w:t>Confirmed</w:t>
@@ -20206,8 +19750,6 @@
             <w:r>
               <w:rPr>
                 <w:rFonts w:ascii="Times New Roman" w:hAnsi="Times New Roman"/>
-                <w:b w:val="0"/>
-                <w:i w:val="0"/>
                 <w:sz w:val="22"/>
               </w:rPr>
               <w:t>N-009</w:t>
@@ -20226,8 +19768,6 @@
             <w:r>
               <w:rPr>
                 <w:rFonts w:ascii="Times New Roman" w:hAnsi="Times New Roman"/>
-                <w:b w:val="0"/>
-                <w:i w:val="0"/>
                 <w:sz w:val="22"/>
               </w:rPr>
               <w:t>CSP Allows unsafe-inline Scripts</w:t>
@@ -20247,8 +19787,6 @@
             <w:r>
               <w:rPr>
                 <w:rFonts w:ascii="Times New Roman" w:hAnsi="Times New Roman"/>
-                <w:b/>
-                <w:i w:val="0"/>
                 <w:sz w:val="22"/>
               </w:rPr>
               <w:t>Medium</w:t>
@@ -20267,8 +19805,6 @@
             <w:r>
               <w:rPr>
                 <w:rFonts w:ascii="Times New Roman" w:hAnsi="Times New Roman"/>
-                <w:b w:val="0"/>
-                <w:i w:val="0"/>
                 <w:sz w:val="22"/>
               </w:rPr>
               <w:t>5.4</w:t>
@@ -20287,8 +19823,6 @@
             <w:r>
               <w:rPr>
                 <w:rFonts w:ascii="Times New Roman" w:hAnsi="Times New Roman"/>
-                <w:b w:val="0"/>
-                <w:i w:val="0"/>
                 <w:sz w:val="22"/>
               </w:rPr>
               <w:t>Confirmed</w:t>
@@ -20309,8 +19843,6 @@
             <w:r>
               <w:rPr>
                 <w:rFonts w:ascii="Times New Roman" w:hAnsi="Times New Roman"/>
-                <w:b w:val="0"/>
-                <w:i w:val="0"/>
                 <w:sz w:val="22"/>
               </w:rPr>
               <w:t>N-010</w:t>
@@ -20329,8 +19861,6 @@
             <w:r>
               <w:rPr>
                 <w:rFonts w:ascii="Times New Roman" w:hAnsi="Times New Roman"/>
-                <w:b w:val="0"/>
-                <w:i w:val="0"/>
                 <w:sz w:val="22"/>
               </w:rPr>
               <w:t>Wildcard DNS Configured</w:t>
@@ -20350,8 +19880,6 @@
             <w:r>
               <w:rPr>
                 <w:rFonts w:ascii="Times New Roman" w:hAnsi="Times New Roman"/>
-                <w:b/>
-                <w:i w:val="0"/>
                 <w:sz w:val="22"/>
               </w:rPr>
               <w:t>Medium</w:t>
@@ -20370,8 +19898,6 @@
             <w:r>
               <w:rPr>
                 <w:rFonts w:ascii="Times New Roman" w:hAnsi="Times New Roman"/>
-                <w:b w:val="0"/>
-                <w:i w:val="0"/>
                 <w:sz w:val="22"/>
               </w:rPr>
               <w:t>4.3</w:t>
@@ -20390,8 +19916,6 @@
             <w:r>
               <w:rPr>
                 <w:rFonts w:ascii="Times New Roman" w:hAnsi="Times New Roman"/>
-                <w:b w:val="0"/>
-                <w:i w:val="0"/>
                 <w:sz w:val="22"/>
               </w:rPr>
               <w:t>Confirmed</w:t>
@@ -20412,8 +19936,6 @@
             <w:r>
               <w:rPr>
                 <w:rFonts w:ascii="Times New Roman" w:hAnsi="Times New Roman"/>
-                <w:b w:val="0"/>
-                <w:i w:val="0"/>
                 <w:sz w:val="22"/>
               </w:rPr>
               <w:t>N-016</w:t>
@@ -20432,8 +19954,6 @@
             <w:r>
               <w:rPr>
                 <w:rFonts w:ascii="Times New Roman" w:hAnsi="Times New Roman"/>
-                <w:b w:val="0"/>
-                <w:i w:val="0"/>
                 <w:sz w:val="22"/>
               </w:rPr>
               <w:t>Directory Listing Enabled on Apache</w:t>
@@ -20453,8 +19973,6 @@
             <w:r>
               <w:rPr>
                 <w:rFonts w:ascii="Times New Roman" w:hAnsi="Times New Roman"/>
-                <w:b/>
-                <w:i w:val="0"/>
                 <w:sz w:val="22"/>
               </w:rPr>
               <w:t>Medium</w:t>
@@ -20473,8 +19991,6 @@
             <w:r>
               <w:rPr>
                 <w:rFonts w:ascii="Times New Roman" w:hAnsi="Times New Roman"/>
-                <w:b w:val="0"/>
-                <w:i w:val="0"/>
                 <w:sz w:val="22"/>
               </w:rPr>
               <w:t>5.3</w:t>
@@ -20493,8 +20009,6 @@
             <w:r>
               <w:rPr>
                 <w:rFonts w:ascii="Times New Roman" w:hAnsi="Times New Roman"/>
-                <w:b w:val="0"/>
-                <w:i w:val="0"/>
                 <w:sz w:val="22"/>
               </w:rPr>
               <w:t>Confirmed</w:t>
@@ -20515,8 +20029,6 @@
             <w:r>
               <w:rPr>
                 <w:rFonts w:ascii="Times New Roman" w:hAnsi="Times New Roman"/>
-                <w:b w:val="0"/>
-                <w:i w:val="0"/>
                 <w:sz w:val="22"/>
               </w:rPr>
               <w:t>N-020</w:t>
@@ -20535,8 +20047,6 @@
             <w:r>
               <w:rPr>
                 <w:rFonts w:ascii="Times New Roman" w:hAnsi="Times New Roman"/>
-                <w:b w:val="0"/>
-                <w:i w:val="0"/>
                 <w:sz w:val="22"/>
               </w:rPr>
               <w:t>Shared Hosting Co-Tenant: onesala.com</w:t>
@@ -20556,8 +20066,6 @@
             <w:r>
               <w:rPr>
                 <w:rFonts w:ascii="Times New Roman" w:hAnsi="Times New Roman"/>
-                <w:b/>
-                <w:i w:val="0"/>
                 <w:sz w:val="22"/>
               </w:rPr>
               <w:t>Medium</w:t>
@@ -20576,8 +20084,6 @@
             <w:r>
               <w:rPr>
                 <w:rFonts w:ascii="Times New Roman" w:hAnsi="Times New Roman"/>
-                <w:b w:val="0"/>
-                <w:i w:val="0"/>
                 <w:sz w:val="22"/>
               </w:rPr>
               <w:t>6.1</w:t>
@@ -20596,8 +20102,6 @@
             <w:r>
               <w:rPr>
                 <w:rFonts w:ascii="Times New Roman" w:hAnsi="Times New Roman"/>
-                <w:b w:val="0"/>
-                <w:i w:val="0"/>
                 <w:sz w:val="22"/>
               </w:rPr>
               <w:t>Confirmed</w:t>
@@ -20618,8 +20122,6 @@
             <w:r>
               <w:rPr>
                 <w:rFonts w:ascii="Times New Roman" w:hAnsi="Times New Roman"/>
-                <w:b w:val="0"/>
-                <w:i w:val="0"/>
                 <w:sz w:val="22"/>
               </w:rPr>
               <w:t>N-011</w:t>
@@ -20638,8 +20140,6 @@
             <w:r>
               <w:rPr>
                 <w:rFonts w:ascii="Times New Roman" w:hAnsi="Times New Roman"/>
-                <w:b w:val="0"/>
-                <w:i w:val="0"/>
                 <w:sz w:val="22"/>
               </w:rPr>
               <w:t>Information Disclosure via Error Messages</w:t>
@@ -20660,7 +20160,6 @@
               <w:rPr>
                 <w:rFonts w:ascii="Times New Roman" w:hAnsi="Times New Roman"/>
                 <w:b/>
-                <w:i w:val="0"/>
                 <w:color w:val="FFFFFF"/>
                 <w:sz w:val="22"/>
               </w:rPr>
@@ -20680,8 +20179,6 @@
             <w:r>
               <w:rPr>
                 <w:rFonts w:ascii="Times New Roman" w:hAnsi="Times New Roman"/>
-                <w:b w:val="0"/>
-                <w:i w:val="0"/>
                 <w:sz w:val="22"/>
               </w:rPr>
               <w:t>3.7</w:t>
@@ -20700,8 +20197,6 @@
             <w:r>
               <w:rPr>
                 <w:rFonts w:ascii="Times New Roman" w:hAnsi="Times New Roman"/>
-                <w:b w:val="0"/>
-                <w:i w:val="0"/>
                 <w:sz w:val="22"/>
               </w:rPr>
               <w:t>Confirmed</w:t>
@@ -20722,8 +20217,6 @@
             <w:r>
               <w:rPr>
                 <w:rFonts w:ascii="Times New Roman" w:hAnsi="Times New Roman"/>
-                <w:b w:val="0"/>
-                <w:i w:val="0"/>
                 <w:sz w:val="22"/>
               </w:rPr>
               <w:t>N-012</w:t>
@@ -20742,8 +20235,6 @@
             <w:r>
               <w:rPr>
                 <w:rFonts w:ascii="Times New Roman" w:hAnsi="Times New Roman"/>
-                <w:b w:val="0"/>
-                <w:i w:val="0"/>
                 <w:sz w:val="22"/>
               </w:rPr>
               <w:t>SPF Softfail / DMARC Quarantine</w:t>
@@ -20764,7 +20255,6 @@
               <w:rPr>
                 <w:rFonts w:ascii="Times New Roman" w:hAnsi="Times New Roman"/>
                 <w:b/>
-                <w:i w:val="0"/>
                 <w:color w:val="FFFFFF"/>
                 <w:sz w:val="22"/>
               </w:rPr>
@@ -20784,8 +20274,6 @@
             <w:r>
               <w:rPr>
                 <w:rFonts w:ascii="Times New Roman" w:hAnsi="Times New Roman"/>
-                <w:b w:val="0"/>
-                <w:i w:val="0"/>
                 <w:sz w:val="22"/>
               </w:rPr>
               <w:t>3.1</w:t>
@@ -20804,8 +20292,6 @@
             <w:r>
               <w:rPr>
                 <w:rFonts w:ascii="Times New Roman" w:hAnsi="Times New Roman"/>
-                <w:b w:val="0"/>
-                <w:i w:val="0"/>
                 <w:sz w:val="22"/>
               </w:rPr>
               <w:t>Confirmed</w:t>
@@ -20826,8 +20312,6 @@
             <w:r>
               <w:rPr>
                 <w:rFonts w:ascii="Times New Roman" w:hAnsi="Times New Roman"/>
-                <w:b w:val="0"/>
-                <w:i w:val="0"/>
                 <w:sz w:val="22"/>
               </w:rPr>
               <w:t>N-017</w:t>
@@ -20846,8 +20330,6 @@
             <w:r>
               <w:rPr>
                 <w:rFonts w:ascii="Times New Roman" w:hAnsi="Times New Roman"/>
-                <w:b w:val="0"/>
-                <w:i w:val="0"/>
                 <w:sz w:val="22"/>
               </w:rPr>
               <w:t>cPanel Version Disclosure</w:t>
@@ -20868,7 +20350,6 @@
               <w:rPr>
                 <w:rFonts w:ascii="Times New Roman" w:hAnsi="Times New Roman"/>
                 <w:b/>
-                <w:i w:val="0"/>
                 <w:color w:val="FFFFFF"/>
                 <w:sz w:val="22"/>
               </w:rPr>
@@ -20888,8 +20369,6 @@
             <w:r>
               <w:rPr>
                 <w:rFonts w:ascii="Times New Roman" w:hAnsi="Times New Roman"/>
-                <w:b w:val="0"/>
-                <w:i w:val="0"/>
                 <w:sz w:val="22"/>
               </w:rPr>
               <w:t>3.1</w:t>
@@ -20908,8 +20387,6 @@
             <w:r>
               <w:rPr>
                 <w:rFonts w:ascii="Times New Roman" w:hAnsi="Times New Roman"/>
-                <w:b w:val="0"/>
-                <w:i w:val="0"/>
                 <w:sz w:val="22"/>
               </w:rPr>
               <w:t>Confirmed</w:t>
@@ -20930,8 +20407,6 @@
             <w:r>
               <w:rPr>
                 <w:rFonts w:ascii="Times New Roman" w:hAnsi="Times New Roman"/>
-                <w:b w:val="0"/>
-                <w:i w:val="0"/>
                 <w:sz w:val="22"/>
               </w:rPr>
               <w:t>N-019</w:t>
@@ -20950,8 +20425,6 @@
             <w:r>
               <w:rPr>
                 <w:rFonts w:ascii="Times New Roman" w:hAnsi="Times New Roman"/>
-                <w:b w:val="0"/>
-                <w:i w:val="0"/>
                 <w:sz w:val="22"/>
               </w:rPr>
               <w:t>SMTP Port 25 Transitioned from Filtered to Open</w:t>
@@ -20972,7 +20445,6 @@
               <w:rPr>
                 <w:rFonts w:ascii="Times New Roman" w:hAnsi="Times New Roman"/>
                 <w:b/>
-                <w:i w:val="0"/>
                 <w:color w:val="FFFFFF"/>
                 <w:sz w:val="22"/>
               </w:rPr>
@@ -20992,8 +20464,6 @@
             <w:r>
               <w:rPr>
                 <w:rFonts w:ascii="Times New Roman" w:hAnsi="Times New Roman"/>
-                <w:b w:val="0"/>
-                <w:i w:val="0"/>
                 <w:sz w:val="22"/>
               </w:rPr>
               <w:t>3.5</w:t>
@@ -21012,8 +20482,6 @@
             <w:r>
               <w:rPr>
                 <w:rFonts w:ascii="Times New Roman" w:hAnsi="Times New Roman"/>
-                <w:b w:val="0"/>
-                <w:i w:val="0"/>
                 <w:sz w:val="22"/>
               </w:rPr>
               <w:t>Confirmed</w:t>
@@ -21081,7 +20549,6 @@
               <w:rPr>
                 <w:rFonts w:ascii="Times New Roman" w:hAnsi="Times New Roman"/>
                 <w:b/>
-                <w:i w:val="0"/>
                 <w:color w:val="FFFFFF"/>
                 <w:sz w:val="22"/>
               </w:rPr>
@@ -21103,7 +20570,6 @@
               <w:rPr>
                 <w:rFonts w:ascii="Times New Roman" w:hAnsi="Times New Roman"/>
                 <w:b/>
-                <w:i w:val="0"/>
                 <w:color w:val="FFFFFF"/>
                 <w:sz w:val="22"/>
               </w:rPr>
@@ -21125,7 +20591,6 @@
               <w:rPr>
                 <w:rFonts w:ascii="Times New Roman" w:hAnsi="Times New Roman"/>
                 <w:b/>
-                <w:i w:val="0"/>
                 <w:color w:val="FFFFFF"/>
                 <w:sz w:val="22"/>
               </w:rPr>
@@ -21147,7 +20612,6 @@
               <w:rPr>
                 <w:rFonts w:ascii="Times New Roman" w:hAnsi="Times New Roman"/>
                 <w:b/>
-                <w:i w:val="0"/>
                 <w:color w:val="FFFFFF"/>
                 <w:sz w:val="22"/>
               </w:rPr>
@@ -21171,7 +20635,6 @@
               <w:rPr>
                 <w:rFonts w:ascii="Times New Roman" w:hAnsi="Times New Roman"/>
                 <w:b/>
-                <w:i w:val="0"/>
                 <w:color w:val="FFFFFF"/>
                 <w:sz w:val="22"/>
               </w:rPr>
@@ -21191,8 +20654,6 @@
             <w:r>
               <w:rPr>
                 <w:rFonts w:ascii="Times New Roman" w:hAnsi="Times New Roman"/>
-                <w:b w:val="0"/>
-                <w:i w:val="0"/>
                 <w:sz w:val="22"/>
               </w:rPr>
               <w:t>4</w:t>
@@ -21211,8 +20672,6 @@
             <w:r>
               <w:rPr>
                 <w:rFonts w:ascii="Times New Roman" w:hAnsi="Times New Roman"/>
-                <w:b w:val="0"/>
-                <w:i w:val="0"/>
                 <w:sz w:val="22"/>
               </w:rPr>
               <w:t>20%</w:t>
@@ -21231,8 +20690,6 @@
             <w:r>
               <w:rPr>
                 <w:rFonts w:ascii="Times New Roman" w:hAnsi="Times New Roman"/>
-                <w:b w:val="0"/>
-                <w:i w:val="0"/>
                 <w:sz w:val="22"/>
               </w:rPr>
               <w:t>9.68</w:t>
@@ -21255,7 +20712,6 @@
               <w:rPr>
                 <w:rFonts w:ascii="Times New Roman" w:hAnsi="Times New Roman"/>
                 <w:b/>
-                <w:i w:val="0"/>
                 <w:color w:val="FFFFFF"/>
                 <w:sz w:val="22"/>
               </w:rPr>
@@ -21275,8 +20731,6 @@
             <w:r>
               <w:rPr>
                 <w:rFonts w:ascii="Times New Roman" w:hAnsi="Times New Roman"/>
-                <w:b w:val="0"/>
-                <w:i w:val="0"/>
                 <w:sz w:val="22"/>
               </w:rPr>
               <w:t>5</w:t>
@@ -21295,8 +20749,6 @@
             <w:r>
               <w:rPr>
                 <w:rFonts w:ascii="Times New Roman" w:hAnsi="Times New Roman"/>
-                <w:b w:val="0"/>
-                <w:i w:val="0"/>
                 <w:sz w:val="22"/>
               </w:rPr>
               <w:t>25%</w:t>
@@ -21315,8 +20767,6 @@
             <w:r>
               <w:rPr>
                 <w:rFonts w:ascii="Times New Roman" w:hAnsi="Times New Roman"/>
-                <w:b w:val="0"/>
-                <w:i w:val="0"/>
                 <w:sz w:val="22"/>
               </w:rPr>
               <w:t>7.82</w:t>
@@ -21338,8 +20788,6 @@
             <w:r>
               <w:rPr>
                 <w:rFonts w:ascii="Times New Roman" w:hAnsi="Times New Roman"/>
-                <w:b/>
-                <w:i w:val="0"/>
                 <w:sz w:val="22"/>
               </w:rPr>
               <w:t>Medium</w:t>
@@ -21358,8 +20806,6 @@
             <w:r>
               <w:rPr>
                 <w:rFonts w:ascii="Times New Roman" w:hAnsi="Times New Roman"/>
-                <w:b w:val="0"/>
-                <w:i w:val="0"/>
                 <w:sz w:val="22"/>
               </w:rPr>
               <w:t>7</w:t>
@@ -21378,8 +20824,6 @@
             <w:r>
               <w:rPr>
                 <w:rFonts w:ascii="Times New Roman" w:hAnsi="Times New Roman"/>
-                <w:b w:val="0"/>
-                <w:i w:val="0"/>
                 <w:sz w:val="22"/>
               </w:rPr>
               <w:t>35%</w:t>
@@ -21398,8 +20842,6 @@
             <w:r>
               <w:rPr>
                 <w:rFonts w:ascii="Times New Roman" w:hAnsi="Times New Roman"/>
-                <w:b w:val="0"/>
-                <w:i w:val="0"/>
                 <w:sz w:val="22"/>
               </w:rPr>
               <w:t>5.37</w:t>
@@ -21422,7 +20864,6 @@
               <w:rPr>
                 <w:rFonts w:ascii="Times New Roman" w:hAnsi="Times New Roman"/>
                 <w:b/>
-                <w:i w:val="0"/>
                 <w:color w:val="FFFFFF"/>
                 <w:sz w:val="22"/>
               </w:rPr>
@@ -21442,8 +20883,6 @@
             <w:r>
               <w:rPr>
                 <w:rFonts w:ascii="Times New Roman" w:hAnsi="Times New Roman"/>
-                <w:b w:val="0"/>
-                <w:i w:val="0"/>
                 <w:sz w:val="22"/>
               </w:rPr>
               <w:t>4</w:t>
@@ -21462,8 +20901,6 @@
             <w:r>
               <w:rPr>
                 <w:rFonts w:ascii="Times New Roman" w:hAnsi="Times New Roman"/>
-                <w:b w:val="0"/>
-                <w:i w:val="0"/>
                 <w:sz w:val="22"/>
               </w:rPr>
               <w:t>20%</w:t>
@@ -21482,8 +20919,6 @@
             <w:r>
               <w:rPr>
                 <w:rFonts w:ascii="Times New Roman" w:hAnsi="Times New Roman"/>
-                <w:b w:val="0"/>
-                <w:i w:val="0"/>
                 <w:sz w:val="22"/>
               </w:rPr>
               <w:t>3.35</w:t>
@@ -21504,11 +20939,10 @@
             <w:r>
               <w:rPr>
                 <w:rFonts w:ascii="Times New Roman" w:hAnsi="Times New Roman"/>
-                <w:b w:val="0"/>
-                <w:i w:val="0"/>
+                <w:b/>
                 <w:sz w:val="22"/>
               </w:rPr>
-              <w:t>**Total**</w:t>
+              <w:t>Total</w:t>
             </w:r>
           </w:p>
         </w:tc>
@@ -21524,11 +20958,10 @@
             <w:r>
               <w:rPr>
                 <w:rFonts w:ascii="Times New Roman" w:hAnsi="Times New Roman"/>
-                <w:b w:val="0"/>
-                <w:i w:val="0"/>
+                <w:b/>
                 <w:sz w:val="22"/>
               </w:rPr>
-              <w:t>**20**</w:t>
+              <w:t>20</w:t>
             </w:r>
           </w:p>
         </w:tc>
@@ -21544,8 +20977,6 @@
             <w:r>
               <w:rPr>
                 <w:rFonts w:ascii="Times New Roman" w:hAnsi="Times New Roman"/>
-                <w:b w:val="0"/>
-                <w:i w:val="0"/>
                 <w:sz w:val="22"/>
               </w:rPr>
               <w:t>100%</w:t>
@@ -21564,11 +20995,10 @@
             <w:r>
               <w:rPr>
                 <w:rFonts w:ascii="Times New Roman" w:hAnsi="Times New Roman"/>
-                <w:b w:val="0"/>
-                <w:i w:val="0"/>
+                <w:b/>
                 <w:sz w:val="22"/>
               </w:rPr>
-              <w:t>**6.6**</w:t>
+              <w:t>6.6</w:t>
             </w:r>
           </w:p>
         </w:tc>
@@ -21659,7 +21089,6 @@
               <w:rPr>
                 <w:rFonts w:ascii="Times New Roman" w:hAnsi="Times New Roman"/>
                 <w:b/>
-                <w:i w:val="0"/>
                 <w:color w:val="FFFFFF"/>
                 <w:sz w:val="22"/>
               </w:rPr>
@@ -21681,7 +21110,6 @@
               <w:rPr>
                 <w:rFonts w:ascii="Times New Roman" w:hAnsi="Times New Roman"/>
                 <w:b/>
-                <w:i w:val="0"/>
                 <w:color w:val="FFFFFF"/>
                 <w:sz w:val="22"/>
               </w:rPr>
@@ -21703,8 +21131,6 @@
             <w:r>
               <w:rPr>
                 <w:rFonts w:ascii="Times New Roman" w:hAnsi="Times New Roman"/>
-                <w:b w:val="0"/>
-                <w:i w:val="0"/>
                 <w:sz w:val="22"/>
               </w:rPr>
               <w:t>Cloudflare WAF on main site</w:t>
@@ -21723,8 +21149,6 @@
             <w:r>
               <w:rPr>
                 <w:rFonts w:ascii="Times New Roman" w:hAnsi="Times New Roman"/>
-                <w:b w:val="0"/>
-                <w:i w:val="0"/>
                 <w:sz w:val="22"/>
               </w:rPr>
               <w:t>Active — blocks automated scanners</w:t>
@@ -21745,8 +21169,6 @@
             <w:r>
               <w:rPr>
                 <w:rFonts w:ascii="Times New Roman" w:hAnsi="Times New Roman"/>
-                <w:b w:val="0"/>
-                <w:i w:val="0"/>
                 <w:sz w:val="22"/>
               </w:rPr>
               <w:t>HSTS with preload (max-age=15552000)</w:t>
@@ -21765,8 +21187,6 @@
             <w:r>
               <w:rPr>
                 <w:rFonts w:ascii="Times New Roman" w:hAnsi="Times New Roman"/>
-                <w:b w:val="0"/>
-                <w:i w:val="0"/>
                 <w:sz w:val="22"/>
               </w:rPr>
               <w:t>Enforced — prevents SSL stripping</w:t>
@@ -21787,8 +21207,6 @@
             <w:r>
               <w:rPr>
                 <w:rFonts w:ascii="Times New Roman" w:hAnsi="Times New Roman"/>
-                <w:b w:val="0"/>
-                <w:i w:val="0"/>
                 <w:sz w:val="22"/>
               </w:rPr>
               <w:t>X-Frame-Options: DENY</w:t>
@@ -21807,8 +21225,6 @@
             <w:r>
               <w:rPr>
                 <w:rFonts w:ascii="Times New Roman" w:hAnsi="Times New Roman"/>
-                <w:b w:val="0"/>
-                <w:i w:val="0"/>
                 <w:sz w:val="22"/>
               </w:rPr>
               <w:t>Active — prevents clickjacking</w:t>
@@ -21829,8 +21245,6 @@
             <w:r>
               <w:rPr>
                 <w:rFonts w:ascii="Times New Roman" w:hAnsi="Times New Roman"/>
-                <w:b w:val="0"/>
-                <w:i w:val="0"/>
                 <w:sz w:val="22"/>
               </w:rPr>
               <w:t>X-Content-Type-Options: nosniff</w:t>
@@ -21849,8 +21263,6 @@
             <w:r>
               <w:rPr>
                 <w:rFonts w:ascii="Times New Roman" w:hAnsi="Times New Roman"/>
-                <w:b w:val="0"/>
-                <w:i w:val="0"/>
                 <w:sz w:val="22"/>
               </w:rPr>
               <w:t>Active — prevents MIME confusion</w:t>
@@ -21871,8 +21283,6 @@
             <w:r>
               <w:rPr>
                 <w:rFonts w:ascii="Times New Roman" w:hAnsi="Times New Roman"/>
-                <w:b w:val="0"/>
-                <w:i w:val="0"/>
                 <w:sz w:val="22"/>
               </w:rPr>
               <w:t>TLS 1.0 and 1.1 disabled</w:t>
@@ -21891,8 +21301,6 @@
             <w:r>
               <w:rPr>
                 <w:rFonts w:ascii="Times New Roman" w:hAnsi="Times New Roman"/>
-                <w:b w:val="0"/>
-                <w:i w:val="0"/>
                 <w:sz w:val="22"/>
               </w:rPr>
               <w:t>Only TLS 1.2 and 1.3 accepted</w:t>
@@ -21913,8 +21321,6 @@
             <w:r>
               <w:rPr>
                 <w:rFonts w:ascii="Times New Roman" w:hAnsi="Times New Roman"/>
-                <w:b w:val="0"/>
-                <w:i w:val="0"/>
                 <w:sz w:val="22"/>
               </w:rPr>
               <w:t>JWT uses UUID for tid</w:t>
@@ -21933,8 +21339,6 @@
             <w:r>
               <w:rPr>
                 <w:rFonts w:ascii="Times New Roman" w:hAnsi="Times New Roman"/>
-                <w:b w:val="0"/>
-                <w:i w:val="0"/>
                 <w:sz w:val="22"/>
               </w:rPr>
               <w:t>Token IDs are not sequential or predictable</w:t>
@@ -21955,8 +21359,6 @@
             <w:r>
               <w:rPr>
                 <w:rFonts w:ascii="Times New Roman" w:hAnsi="Times New Roman"/>
-                <w:b w:val="0"/>
-                <w:i w:val="0"/>
                 <w:sz w:val="22"/>
               </w:rPr>
               <w:t>alg:none JWT attack blocked</w:t>
@@ -21975,8 +21377,6 @@
             <w:r>
               <w:rPr>
                 <w:rFonts w:ascii="Times New Roman" w:hAnsi="Times New Roman"/>
-                <w:b w:val="0"/>
-                <w:i w:val="0"/>
                 <w:sz w:val="22"/>
               </w:rPr>
               <w:t>JWT validation is implemented</w:t>
@@ -21997,8 +21397,6 @@
             <w:r>
               <w:rPr>
                 <w:rFonts w:ascii="Times New Roman" w:hAnsi="Times New Roman"/>
-                <w:b w:val="0"/>
-                <w:i w:val="0"/>
                 <w:sz w:val="22"/>
               </w:rPr>
               <w:t>Zone transfer blocked</w:t>
@@ -22017,8 +21415,6 @@
             <w:r>
               <w:rPr>
                 <w:rFonts w:ascii="Times New Roman" w:hAnsi="Times New Roman"/>
-                <w:b w:val="0"/>
-                <w:i w:val="0"/>
                 <w:sz w:val="22"/>
               </w:rPr>
               <w:t>DNS zone is not publicly exposed</w:t>
@@ -24845,7 +24241,6 @@
               <w:rPr>
                 <w:rFonts w:ascii="Times New Roman" w:hAnsi="Times New Roman"/>
                 <w:b/>
-                <w:i w:val="0"/>
                 <w:color w:val="FFFFFF"/>
                 <w:sz w:val="22"/>
               </w:rPr>
@@ -24867,7 +24262,6 @@
               <w:rPr>
                 <w:rFonts w:ascii="Times New Roman" w:hAnsi="Times New Roman"/>
                 <w:b/>
-                <w:i w:val="0"/>
                 <w:color w:val="FFFFFF"/>
                 <w:sz w:val="22"/>
               </w:rPr>
@@ -24889,7 +24283,6 @@
               <w:rPr>
                 <w:rFonts w:ascii="Times New Roman" w:hAnsi="Times New Roman"/>
                 <w:b/>
-                <w:i w:val="0"/>
                 <w:color w:val="FFFFFF"/>
                 <w:sz w:val="22"/>
               </w:rPr>
@@ -24911,7 +24304,6 @@
               <w:rPr>
                 <w:rFonts w:ascii="Times New Roman" w:hAnsi="Times New Roman"/>
                 <w:b/>
-                <w:i w:val="0"/>
                 <w:color w:val="FFFFFF"/>
                 <w:sz w:val="22"/>
               </w:rPr>
@@ -24933,11 +24325,10 @@
             <w:r>
               <w:rPr>
                 <w:rFonts w:ascii="Times New Roman" w:hAnsi="Times New Roman"/>
-                <w:b w:val="0"/>
-                <w:i w:val="0"/>
+                <w:b/>
                 <w:sz w:val="22"/>
               </w:rPr>
-              <w:t>**P0 — Immediate**</w:t>
+              <w:t>P0 — Immediate</w:t>
             </w:r>
           </w:p>
         </w:tc>
@@ -24953,8 +24344,6 @@
             <w:r>
               <w:rPr>
                 <w:rFonts w:ascii="Times New Roman" w:hAnsi="Times New Roman"/>
-                <w:b w:val="0"/>
-                <w:i w:val="0"/>
                 <w:sz w:val="22"/>
               </w:rPr>
               <w:t>N-014 WHM</w:t>
@@ -24973,8 +24362,6 @@
             <w:r>
               <w:rPr>
                 <w:rFonts w:ascii="Times New Roman" w:hAnsi="Times New Roman"/>
-                <w:b w:val="0"/>
-                <w:i w:val="0"/>
                 <w:sz w:val="22"/>
               </w:rPr>
               <w:t>Firewall port 2087 to trusted IPs only</w:t>
@@ -24993,8 +24380,6 @@
             <w:r>
               <w:rPr>
                 <w:rFonts w:ascii="Times New Roman" w:hAnsi="Times New Roman"/>
-                <w:b w:val="0"/>
-                <w:i w:val="0"/>
                 <w:sz w:val="22"/>
               </w:rPr>
               <w:t>15 min</w:t>
@@ -25015,11 +24400,10 @@
             <w:r>
               <w:rPr>
                 <w:rFonts w:ascii="Times New Roman" w:hAnsi="Times New Roman"/>
-                <w:b w:val="0"/>
-                <w:i w:val="0"/>
+                <w:b/>
                 <w:sz w:val="22"/>
               </w:rPr>
-              <w:t>**P0 — Immediate**</w:t>
+              <w:t>P0 — Immediate</w:t>
             </w:r>
           </w:p>
         </w:tc>
@@ -25035,8 +24419,6 @@
             <w:r>
               <w:rPr>
                 <w:rFonts w:ascii="Times New Roman" w:hAnsi="Times New Roman"/>
-                <w:b w:val="0"/>
-                <w:i w:val="0"/>
                 <w:sz w:val="22"/>
               </w:rPr>
               <w:t>N-013 cPanel</w:t>
@@ -25055,8 +24437,6 @@
             <w:r>
               <w:rPr>
                 <w:rFonts w:ascii="Times New Roman" w:hAnsi="Times New Roman"/>
-                <w:b w:val="0"/>
-                <w:i w:val="0"/>
                 <w:sz w:val="22"/>
               </w:rPr>
               <w:t>Firewall port 2083 to trusted IPs only</w:t>
@@ -25075,8 +24455,6 @@
             <w:r>
               <w:rPr>
                 <w:rFonts w:ascii="Times New Roman" w:hAnsi="Times New Roman"/>
-                <w:b w:val="0"/>
-                <w:i w:val="0"/>
                 <w:sz w:val="22"/>
               </w:rPr>
               <w:t>15 min</w:t>
@@ -25097,11 +24475,10 @@
             <w:r>
               <w:rPr>
                 <w:rFonts w:ascii="Times New Roman" w:hAnsi="Times New Roman"/>
-                <w:b w:val="0"/>
-                <w:i w:val="0"/>
+                <w:b/>
                 <w:sz w:val="22"/>
               </w:rPr>
-              <w:t>**P0 — Immediate**</w:t>
+              <w:t>P0 — Immediate</w:t>
             </w:r>
           </w:p>
         </w:tc>
@@ -25117,8 +24494,6 @@
             <w:r>
               <w:rPr>
                 <w:rFonts w:ascii="Times New Roman" w:hAnsi="Times New Roman"/>
-                <w:b w:val="0"/>
-                <w:i w:val="0"/>
                 <w:sz w:val="22"/>
               </w:rPr>
               <w:t>N-001 MySQL</w:t>
@@ -25137,8 +24512,6 @@
             <w:r>
               <w:rPr>
                 <w:rFonts w:ascii="Times New Roman" w:hAnsi="Times New Roman"/>
-                <w:b w:val="0"/>
-                <w:i w:val="0"/>
                 <w:sz w:val="22"/>
               </w:rPr>
               <w:t>Firewall port 3306 to localhost only</w:t>
@@ -25157,8 +24530,6 @@
             <w:r>
               <w:rPr>
                 <w:rFonts w:ascii="Times New Roman" w:hAnsi="Times New Roman"/>
-                <w:b w:val="0"/>
-                <w:i w:val="0"/>
                 <w:sz w:val="22"/>
               </w:rPr>
               <w:t>15 min</w:t>
@@ -25179,11 +24550,10 @@
             <w:r>
               <w:rPr>
                 <w:rFonts w:ascii="Times New Roman" w:hAnsi="Times New Roman"/>
-                <w:b w:val="0"/>
-                <w:i w:val="0"/>
+                <w:b/>
                 <w:sz w:val="22"/>
               </w:rPr>
-              <w:t>**P0 — Immediate**</w:t>
+              <w:t>P0 — Immediate</w:t>
             </w:r>
           </w:p>
         </w:tc>
@@ -25199,8 +24569,6 @@
             <w:r>
               <w:rPr>
                 <w:rFonts w:ascii="Times New Roman" w:hAnsi="Times New Roman"/>
-                <w:b w:val="0"/>
-                <w:i w:val="0"/>
                 <w:sz w:val="22"/>
               </w:rPr>
               <w:t>N-002 MikroTik</w:t>
@@ -25219,8 +24587,6 @@
             <w:r>
               <w:rPr>
                 <w:rFonts w:ascii="Times New Roman" w:hAnsi="Times New Roman"/>
-                <w:b w:val="0"/>
-                <w:i w:val="0"/>
                 <w:sz w:val="22"/>
               </w:rPr>
               <w:t>Firewall port 9001, change default credentials</w:t>
@@ -25239,8 +24605,6 @@
             <w:r>
               <w:rPr>
                 <w:rFonts w:ascii="Times New Roman" w:hAnsi="Times New Roman"/>
-                <w:b w:val="0"/>
-                <w:i w:val="0"/>
                 <w:sz w:val="22"/>
               </w:rPr>
               <w:t>30 min</w:t>
@@ -25261,11 +24625,10 @@
             <w:r>
               <w:rPr>
                 <w:rFonts w:ascii="Times New Roman" w:hAnsi="Times New Roman"/>
-                <w:b w:val="0"/>
-                <w:i w:val="0"/>
+                <w:b/>
                 <w:sz w:val="22"/>
               </w:rPr>
-              <w:t>**P1 — 24 hours**</w:t>
+              <w:t>P1 — 24 hours</w:t>
             </w:r>
           </w:p>
         </w:tc>
@@ -25281,8 +24644,6 @@
             <w:r>
               <w:rPr>
                 <w:rFonts w:ascii="Times New Roman" w:hAnsi="Times New Roman"/>
-                <w:b w:val="0"/>
-                <w:i w:val="0"/>
                 <w:sz w:val="22"/>
               </w:rPr>
               <w:t>N-005 Rate Limit</w:t>
@@ -25301,8 +24662,6 @@
             <w:r>
               <w:rPr>
                 <w:rFonts w:ascii="Times New Roman" w:hAnsi="Times New Roman"/>
-                <w:b w:val="0"/>
-                <w:i w:val="0"/>
                 <w:sz w:val="22"/>
               </w:rPr>
               <w:t>Replace X-Forwarded-For with CF-Connecting-IP</w:t>
@@ -25321,8 +24680,6 @@
             <w:r>
               <w:rPr>
                 <w:rFonts w:ascii="Times New Roman" w:hAnsi="Times New Roman"/>
-                <w:b w:val="0"/>
-                <w:i w:val="0"/>
                 <w:sz w:val="22"/>
               </w:rPr>
               <w:t>2 hours</w:t>
@@ -25343,11 +24700,10 @@
             <w:r>
               <w:rPr>
                 <w:rFonts w:ascii="Times New Roman" w:hAnsi="Times New Roman"/>
-                <w:b w:val="0"/>
-                <w:i w:val="0"/>
+                <w:b/>
                 <w:sz w:val="22"/>
               </w:rPr>
-              <w:t>**P1 — 24 hours**</w:t>
+              <w:t>P1 — 24 hours</w:t>
             </w:r>
           </w:p>
         </w:tc>
@@ -25363,8 +24719,6 @@
             <w:r>
               <w:rPr>
                 <w:rFonts w:ascii="Times New Roman" w:hAnsi="Times New Roman"/>
-                <w:b w:val="0"/>
-                <w:i w:val="0"/>
                 <w:sz w:val="22"/>
               </w:rPr>
               <w:t>N-015 Webmail</w:t>
@@ -25383,8 +24737,6 @@
             <w:r>
               <w:rPr>
                 <w:rFonts w:ascii="Times New Roman" w:hAnsi="Times New Roman"/>
-                <w:b w:val="0"/>
-                <w:i w:val="0"/>
                 <w:sz w:val="22"/>
               </w:rPr>
               <w:t>Firewall port 2096 to trusted IPs</w:t>
@@ -25403,8 +24755,6 @@
             <w:r>
               <w:rPr>
                 <w:rFonts w:ascii="Times New Roman" w:hAnsi="Times New Roman"/>
-                <w:b w:val="0"/>
-                <w:i w:val="0"/>
                 <w:sz w:val="22"/>
               </w:rPr>
               <w:t>15 min</w:t>
@@ -25425,11 +24775,10 @@
             <w:r>
               <w:rPr>
                 <w:rFonts w:ascii="Times New Roman" w:hAnsi="Times New Roman"/>
-                <w:b w:val="0"/>
-                <w:i w:val="0"/>
+                <w:b/>
                 <w:sz w:val="22"/>
               </w:rPr>
-              <w:t>**P1 — 24 hours**</w:t>
+              <w:t>P1 — 24 hours</w:t>
             </w:r>
           </w:p>
         </w:tc>
@@ -25445,8 +24794,6 @@
             <w:r>
               <w:rPr>
                 <w:rFonts w:ascii="Times New Roman" w:hAnsi="Times New Roman"/>
-                <w:b w:val="0"/>
-                <w:i w:val="0"/>
                 <w:sz w:val="22"/>
               </w:rPr>
               <w:t>N-018 cPanel ports</w:t>
@@ -25465,8 +24812,6 @@
             <w:r>
               <w:rPr>
                 <w:rFonts w:ascii="Times New Roman" w:hAnsi="Times New Roman"/>
-                <w:b w:val="0"/>
-                <w:i w:val="0"/>
                 <w:sz w:val="22"/>
               </w:rPr>
               <w:t>Firewall ports 2078, 2091</w:t>
@@ -25485,8 +24830,6 @@
             <w:r>
               <w:rPr>
                 <w:rFonts w:ascii="Times New Roman" w:hAnsi="Times New Roman"/>
-                <w:b w:val="0"/>
-                <w:i w:val="0"/>
                 <w:sz w:val="22"/>
               </w:rPr>
               <w:t>15 min</w:t>
@@ -25507,11 +24850,10 @@
             <w:r>
               <w:rPr>
                 <w:rFonts w:ascii="Times New Roman" w:hAnsi="Times New Roman"/>
-                <w:b w:val="0"/>
-                <w:i w:val="0"/>
+                <w:b/>
                 <w:sz w:val="22"/>
               </w:rPr>
-              <w:t>**P1 — 24 hours**</w:t>
+              <w:t>P1 — 24 hours</w:t>
             </w:r>
           </w:p>
         </w:tc>
@@ -25527,8 +24869,6 @@
             <w:r>
               <w:rPr>
                 <w:rFonts w:ascii="Times New Roman" w:hAnsi="Times New Roman"/>
-                <w:b w:val="0"/>
-                <w:i w:val="0"/>
                 <w:sz w:val="22"/>
               </w:rPr>
               <w:t>N-013/014 2FA</w:t>
@@ -25547,8 +24887,6 @@
             <w:r>
               <w:rPr>
                 <w:rFonts w:ascii="Times New Roman" w:hAnsi="Times New Roman"/>
-                <w:b w:val="0"/>
-                <w:i w:val="0"/>
                 <w:sz w:val="22"/>
               </w:rPr>
               <w:t>Enable two-factor authentication on cPanel + WHM</w:t>
@@ -25567,8 +24905,6 @@
             <w:r>
               <w:rPr>
                 <w:rFonts w:ascii="Times New Roman" w:hAnsi="Times New Roman"/>
-                <w:b w:val="0"/>
-                <w:i w:val="0"/>
                 <w:sz w:val="22"/>
               </w:rPr>
               <w:t>30 min</w:t>
@@ -25589,11 +24925,10 @@
             <w:r>
               <w:rPr>
                 <w:rFonts w:ascii="Times New Roman" w:hAnsi="Times New Roman"/>
-                <w:b w:val="0"/>
-                <w:i w:val="0"/>
+                <w:b/>
                 <w:sz w:val="22"/>
               </w:rPr>
-              <w:t>**P2 — 1 week**</w:t>
+              <w:t>P2 — 1 week</w:t>
             </w:r>
           </w:p>
         </w:tc>
@@ -25609,8 +24944,6 @@
             <w:r>
               <w:rPr>
                 <w:rFonts w:ascii="Times New Roman" w:hAnsi="Times New Roman"/>
-                <w:b w:val="0"/>
-                <w:i w:val="0"/>
                 <w:sz w:val="22"/>
               </w:rPr>
               <w:t>N-010 Wildcard DNS</w:t>
@@ -25629,8 +24962,6 @@
             <w:r>
               <w:rPr>
                 <w:rFonts w:ascii="Times New Roman" w:hAnsi="Times New Roman"/>
-                <w:b w:val="0"/>
-                <w:i w:val="0"/>
                 <w:sz w:val="22"/>
               </w:rPr>
               <w:t>Remove wildcard DNS record</w:t>
@@ -25649,8 +24980,6 @@
             <w:r>
               <w:rPr>
                 <w:rFonts w:ascii="Times New Roman" w:hAnsi="Times New Roman"/>
-                <w:b w:val="0"/>
-                <w:i w:val="0"/>
                 <w:sz w:val="22"/>
               </w:rPr>
               <w:t>15 min</w:t>
@@ -25671,11 +25000,10 @@
             <w:r>
               <w:rPr>
                 <w:rFonts w:ascii="Times New Roman" w:hAnsi="Times New Roman"/>
-                <w:b w:val="0"/>
-                <w:i w:val="0"/>
+                <w:b/>
                 <w:sz w:val="22"/>
               </w:rPr>
-              <w:t>**P2 — 1 week**</w:t>
+              <w:t>P2 — 1 week</w:t>
             </w:r>
           </w:p>
         </w:tc>
@@ -25691,8 +25019,6 @@
             <w:r>
               <w:rPr>
                 <w:rFonts w:ascii="Times New Roman" w:hAnsi="Times New Roman"/>
-                <w:b w:val="0"/>
-                <w:i w:val="0"/>
                 <w:sz w:val="22"/>
               </w:rPr>
               <w:t>N-016 Dir listing</w:t>
@@ -25711,11 +25037,23 @@
             <w:r>
               <w:rPr>
                 <w:rFonts w:ascii="Times New Roman" w:hAnsi="Times New Roman"/>
-                <w:b w:val="0"/>
-                <w:i w:val="0"/>
                 <w:sz w:val="22"/>
               </w:rPr>
-              <w:t>Add `Options -Indexes` to Apache config</w:t>
+              <w:t xml:space="preserve">Add </w:t>
+            </w:r>
+            <w:r>
+              <w:rPr>
+                <w:rFonts w:ascii="Courier New" w:hAnsi="Courier New"/>
+                <w:sz w:val="22"/>
+              </w:rPr>
+              <w:t>Options -Indexes</w:t>
+            </w:r>
+            <w:r>
+              <w:rPr>
+                <w:rFonts w:ascii="Times New Roman" w:hAnsi="Times New Roman"/>
+                <w:sz w:val="22"/>
+              </w:rPr>
+              <w:t xml:space="preserve"> to Apache config</w:t>
             </w:r>
           </w:p>
         </w:tc>
@@ -25731,8 +25069,6 @@
             <w:r>
               <w:rPr>
                 <w:rFonts w:ascii="Times New Roman" w:hAnsi="Times New Roman"/>
-                <w:b w:val="0"/>
-                <w:i w:val="0"/>
                 <w:sz w:val="22"/>
               </w:rPr>
               <w:t>15 min</w:t>
@@ -25753,11 +25089,10 @@
             <w:r>
               <w:rPr>
                 <w:rFonts w:ascii="Times New Roman" w:hAnsi="Times New Roman"/>
-                <w:b w:val="0"/>
-                <w:i w:val="0"/>
+                <w:b/>
                 <w:sz w:val="22"/>
               </w:rPr>
-              <w:t>**P2 — 1 week**</w:t>
+              <w:t>P2 — 1 week</w:t>
             </w:r>
           </w:p>
         </w:tc>
@@ -25773,8 +25108,6 @@
             <w:r>
               <w:rPr>
                 <w:rFonts w:ascii="Times New Roman" w:hAnsi="Times New Roman"/>
-                <w:b w:val="0"/>
-                <w:i w:val="0"/>
                 <w:sz w:val="22"/>
               </w:rPr>
               <w:t>N-009 CSP</w:t>
@@ -25793,8 +25126,6 @@
             <w:r>
               <w:rPr>
                 <w:rFonts w:ascii="Times New Roman" w:hAnsi="Times New Roman"/>
-                <w:b w:val="0"/>
-                <w:i w:val="0"/>
                 <w:sz w:val="22"/>
               </w:rPr>
               <w:t>Remove unsafe-inline from script-src</w:t>
@@ -25813,8 +25144,6 @@
             <w:r>
               <w:rPr>
                 <w:rFonts w:ascii="Times New Roman" w:hAnsi="Times New Roman"/>
-                <w:b w:val="0"/>
-                <w:i w:val="0"/>
                 <w:sz w:val="22"/>
               </w:rPr>
               <w:t>4 hours</w:t>
@@ -25835,11 +25164,10 @@
             <w:r>
               <w:rPr>
                 <w:rFonts w:ascii="Times New Roman" w:hAnsi="Times New Roman"/>
-                <w:b w:val="0"/>
-                <w:i w:val="0"/>
+                <w:b/>
                 <w:sz w:val="22"/>
               </w:rPr>
-              <w:t>**P3 — 1 month**</w:t>
+              <w:t>P3 — 1 month</w:t>
             </w:r>
           </w:p>
         </w:tc>
@@ -25855,8 +25183,6 @@
             <w:r>
               <w:rPr>
                 <w:rFonts w:ascii="Times New Roman" w:hAnsi="Times New Roman"/>
-                <w:b w:val="0"/>
-                <w:i w:val="0"/>
                 <w:sz w:val="22"/>
               </w:rPr>
               <w:t>N-012 SPF/DMARC</w:t>
@@ -25875,11 +25201,30 @@
             <w:r>
               <w:rPr>
                 <w:rFonts w:ascii="Times New Roman" w:hAnsi="Times New Roman"/>
-                <w:b w:val="0"/>
-                <w:i w:val="0"/>
                 <w:sz w:val="22"/>
               </w:rPr>
-              <w:t>Set SPF to `-all`, DMARC to `p=reject`</w:t>
+              <w:t xml:space="preserve">Set SPF to </w:t>
+            </w:r>
+            <w:r>
+              <w:rPr>
+                <w:rFonts w:ascii="Courier New" w:hAnsi="Courier New"/>
+                <w:sz w:val="22"/>
+              </w:rPr>
+              <w:t>-all</w:t>
+            </w:r>
+            <w:r>
+              <w:rPr>
+                <w:rFonts w:ascii="Times New Roman" w:hAnsi="Times New Roman"/>
+                <w:sz w:val="22"/>
+              </w:rPr>
+              <w:t xml:space="preserve">, DMARC to </w:t>
+            </w:r>
+            <w:r>
+              <w:rPr>
+                <w:rFonts w:ascii="Courier New" w:hAnsi="Courier New"/>
+                <w:sz w:val="22"/>
+              </w:rPr>
+              <w:t>p=reject</w:t>
             </w:r>
           </w:p>
         </w:tc>
@@ -25895,8 +25240,6 @@
             <w:r>
               <w:rPr>
                 <w:rFonts w:ascii="Times New Roman" w:hAnsi="Times New Roman"/>
-                <w:b w:val="0"/>
-                <w:i w:val="0"/>
                 <w:sz w:val="22"/>
               </w:rPr>
               <w:t>30 min</w:t>
@@ -25917,11 +25260,10 @@
             <w:r>
               <w:rPr>
                 <w:rFonts w:ascii="Times New Roman" w:hAnsi="Times New Roman"/>
-                <w:b w:val="0"/>
-                <w:i w:val="0"/>
+                <w:b/>
                 <w:sz w:val="22"/>
               </w:rPr>
-              <w:t>**P3 — 1 month**</w:t>
+              <w:t>P3 — 1 month</w:t>
             </w:r>
           </w:p>
         </w:tc>
@@ -25937,8 +25279,6 @@
             <w:r>
               <w:rPr>
                 <w:rFonts w:ascii="Times New Roman" w:hAnsi="Times New Roman"/>
-                <w:b w:val="0"/>
-                <w:i w:val="0"/>
                 <w:sz w:val="22"/>
               </w:rPr>
               <w:t>N-007 JWT</w:t>
@@ -25957,8 +25297,6 @@
             <w:r>
               <w:rPr>
                 <w:rFonts w:ascii="Times New Roman" w:hAnsi="Times New Roman"/>
-                <w:b w:val="0"/>
-                <w:i w:val="0"/>
                 <w:sz w:val="22"/>
               </w:rPr>
               <w:t>Add device fingerprint or Turnstile to token endpoint</w:t>
@@ -25977,8 +25315,6 @@
             <w:r>
               <w:rPr>
                 <w:rFonts w:ascii="Times New Roman" w:hAnsi="Times New Roman"/>
-                <w:b w:val="0"/>
-                <w:i w:val="0"/>
                 <w:sz w:val="22"/>
               </w:rPr>
               <w:t>1 day</w:t>
@@ -25999,11 +25335,10 @@
             <w:r>
               <w:rPr>
                 <w:rFonts w:ascii="Times New Roman" w:hAnsi="Times New Roman"/>
-                <w:b w:val="0"/>
-                <w:i w:val="0"/>
+                <w:b/>
                 <w:sz w:val="22"/>
               </w:rPr>
-              <w:t>**P3 — 1 month**</w:t>
+              <w:t>P3 — 1 month</w:t>
             </w:r>
           </w:p>
         </w:tc>
@@ -26019,8 +25354,6 @@
             <w:r>
               <w:rPr>
                 <w:rFonts w:ascii="Times New Roman" w:hAnsi="Times New Roman"/>
-                <w:b w:val="0"/>
-                <w:i w:val="0"/>
                 <w:sz w:val="22"/>
               </w:rPr>
               <w:t>N-004 Hosting</w:t>
@@ -26039,8 +25372,6 @@
             <w:r>
               <w:rPr>
                 <w:rFonts w:ascii="Times New Roman" w:hAnsi="Times New Roman"/>
-                <w:b w:val="0"/>
-                <w:i w:val="0"/>
                 <w:sz w:val="22"/>
               </w:rPr>
               <w:t>Plan migration to dedicated isolated infrastructure</w:t>
@@ -26059,8 +25390,6 @@
             <w:r>
               <w:rPr>
                 <w:rFonts w:ascii="Times New Roman" w:hAnsi="Times New Roman"/>
-                <w:b w:val="0"/>
-                <w:i w:val="0"/>
                 <w:sz w:val="22"/>
               </w:rPr>
               <w:t>Ongoing</w:t>
@@ -26593,7 +25922,6 @@
               <w:rPr>
                 <w:rFonts w:ascii="Times New Roman" w:hAnsi="Times New Roman"/>
                 <w:b/>
-                <w:i w:val="0"/>
                 <w:color w:val="FFFFFF"/>
                 <w:sz w:val="22"/>
               </w:rPr>
@@ -26615,7 +25943,6 @@
               <w:rPr>
                 <w:rFonts w:ascii="Times New Roman" w:hAnsi="Times New Roman"/>
                 <w:b/>
-                <w:i w:val="0"/>
                 <w:color w:val="FFFFFF"/>
                 <w:sz w:val="22"/>
               </w:rPr>
@@ -26637,7 +25964,6 @@
               <w:rPr>
                 <w:rFonts w:ascii="Times New Roman" w:hAnsi="Times New Roman"/>
                 <w:b/>
-                <w:i w:val="0"/>
                 <w:color w:val="FFFFFF"/>
                 <w:sz w:val="22"/>
               </w:rPr>
@@ -26659,8 +25985,6 @@
             <w:r>
               <w:rPr>
                 <w:rFonts w:ascii="Times New Roman" w:hAnsi="Times New Roman"/>
-                <w:b w:val="0"/>
-                <w:i w:val="0"/>
                 <w:sz w:val="22"/>
               </w:rPr>
               <w:t>EXPLOIT-001: Rate Limit Bypass</w:t>
@@ -26679,11 +26003,10 @@
             <w:r>
               <w:rPr>
                 <w:rFonts w:ascii="Times New Roman" w:hAnsi="Times New Roman"/>
-                <w:b w:val="0"/>
-                <w:i w:val="0"/>
+                <w:b/>
                 <w:sz w:val="22"/>
               </w:rPr>
-              <w:t>**50/50 tokens — 0 rate limits**</w:t>
+              <w:t>50/50 tokens — 0 rate limits</w:t>
             </w:r>
           </w:p>
         </w:tc>
@@ -26699,8 +26022,6 @@
             <w:r>
               <w:rPr>
                 <w:rFonts w:ascii="Times New Roman" w:hAnsi="Times New Roman"/>
-                <w:b w:val="0"/>
-                <w:i w:val="0"/>
                 <w:sz w:val="22"/>
               </w:rPr>
               <w:t>master_report.txt; Figure 4.15</w:t>
@@ -26721,8 +26042,6 @@
             <w:r>
               <w:rPr>
                 <w:rFonts w:ascii="Times New Roman" w:hAnsi="Times New Roman"/>
-                <w:b w:val="0"/>
-                <w:i w:val="0"/>
                 <w:sz w:val="22"/>
               </w:rPr>
               <w:t>EXPLOIT-002: JWT Token Farming</w:t>
@@ -26741,8 +26060,6 @@
             <w:r>
               <w:rPr>
                 <w:rFonts w:ascii="Times New Roman" w:hAnsi="Times New Roman"/>
-                <w:b w:val="0"/>
-                <w:i w:val="0"/>
                 <w:sz w:val="22"/>
               </w:rPr>
               <w:t>50 valid tokens in 3 seconds</w:t>
@@ -26761,8 +26078,6 @@
             <w:r>
               <w:rPr>
                 <w:rFonts w:ascii="Times New Roman" w:hAnsi="Times New Roman"/>
-                <w:b w:val="0"/>
-                <w:i w:val="0"/>
                 <w:sz w:val="22"/>
               </w:rPr>
               <w:t>Burp Suite repeater + curl</w:t>
@@ -26783,8 +26098,6 @@
             <w:r>
               <w:rPr>
                 <w:rFonts w:ascii="Times New Roman" w:hAnsi="Times New Roman"/>
-                <w:b w:val="0"/>
-                <w:i w:val="0"/>
                 <w:sz w:val="22"/>
               </w:rPr>
               <w:t>EXPLOIT-003: Admin Panel Access</w:t>
@@ -26803,8 +26116,6 @@
             <w:r>
               <w:rPr>
                 <w:rFonts w:ascii="Times New Roman" w:hAnsi="Times New Roman"/>
-                <w:b w:val="0"/>
-                <w:i w:val="0"/>
                 <w:sz w:val="22"/>
               </w:rPr>
               <w:t>WHM, cPanel, MikroTik all confirmed</w:t>
@@ -26823,8 +26134,6 @@
             <w:r>
               <w:rPr>
                 <w:rFonts w:ascii="Times New Roman" w:hAnsi="Times New Roman"/>
-                <w:b w:val="0"/>
-                <w:i w:val="0"/>
                 <w:sz w:val="22"/>
               </w:rPr>
               <w:t>Figure 4.10, 4.11</w:t>
@@ -26845,8 +26154,6 @@
             <w:r>
               <w:rPr>
                 <w:rFonts w:ascii="Times New Roman" w:hAnsi="Times New Roman"/>
-                <w:b w:val="0"/>
-                <w:i w:val="0"/>
                 <w:sz w:val="22"/>
               </w:rPr>
               <w:t>EXPLOIT-004: MySQL Public Access</w:t>
@@ -26865,8 +26172,6 @@
             <w:r>
               <w:rPr>
                 <w:rFonts w:ascii="Times New Roman" w:hAnsi="Times New Roman"/>
-                <w:b w:val="0"/>
-                <w:i w:val="0"/>
                 <w:sz w:val="22"/>
               </w:rPr>
               <w:t>Full TCP handshake from external IP</w:t>
@@ -26885,8 +26190,6 @@
             <w:r>
               <w:rPr>
                 <w:rFonts w:ascii="Times New Roman" w:hAnsi="Times New Roman"/>
-                <w:b w:val="0"/>
-                <w:i w:val="0"/>
                 <w:sz w:val="22"/>
               </w:rPr>
               <w:t>Nmap mysql-info script</w:t>
@@ -26907,8 +26210,6 @@
             <w:r>
               <w:rPr>
                 <w:rFonts w:ascii="Times New Roman" w:hAnsi="Times New Roman"/>
-                <w:b w:val="0"/>
-                <w:i w:val="0"/>
                 <w:sz w:val="22"/>
               </w:rPr>
               <w:t>DVWA File Upload: Meterpreter</w:t>
@@ -26927,8 +26228,6 @@
             <w:r>
               <w:rPr>
                 <w:rFonts w:ascii="Times New Roman" w:hAnsi="Times New Roman"/>
-                <w:b w:val="0"/>
-                <w:i w:val="0"/>
                 <w:sz w:val="22"/>
               </w:rPr>
               <w:t>Shell as www-data confirmed</w:t>
@@ -26947,8 +26246,6 @@
             <w:r>
               <w:rPr>
                 <w:rFonts w:ascii="Times New Roman" w:hAnsi="Times New Roman"/>
-                <w:b w:val="0"/>
-                <w:i w:val="0"/>
                 <w:sz w:val="22"/>
               </w:rPr>
               <w:t>Figure 4.20, 4.21</w:t>
@@ -27159,7 +26456,6 @@
               <w:rPr>
                 <w:rFonts w:ascii="Times New Roman" w:hAnsi="Times New Roman"/>
                 <w:b/>
-                <w:i w:val="0"/>
                 <w:color w:val="FFFFFF"/>
                 <w:sz w:val="22"/>
               </w:rPr>
@@ -27181,7 +26477,6 @@
               <w:rPr>
                 <w:rFonts w:ascii="Times New Roman" w:hAnsi="Times New Roman"/>
                 <w:b/>
-                <w:i w:val="0"/>
                 <w:color w:val="FFFFFF"/>
                 <w:sz w:val="22"/>
               </w:rPr>
@@ -27203,8 +26498,6 @@
             <w:r>
               <w:rPr>
                 <w:rFonts w:ascii="Times New Roman" w:hAnsi="Times New Roman"/>
-                <w:b w:val="0"/>
-                <w:i w:val="0"/>
                 <w:sz w:val="22"/>
               </w:rPr>
               <w:t>Perform vulnerability scanning on neuralsh.com</w:t>
@@ -27223,8 +26516,6 @@
             <w:r>
               <w:rPr>
                 <w:rFonts w:ascii="Times New Roman" w:hAnsi="Times New Roman"/>
-                <w:b w:val="0"/>
-                <w:i w:val="0"/>
                 <w:sz w:val="22"/>
               </w:rPr>
               <w:t>Completed</w:t>
@@ -27245,8 +26536,6 @@
             <w:r>
               <w:rPr>
                 <w:rFonts w:ascii="Times New Roman" w:hAnsi="Times New Roman"/>
-                <w:b w:val="0"/>
-                <w:i w:val="0"/>
                 <w:sz w:val="22"/>
               </w:rPr>
               <w:t>Analyze vulnerabilities and propose solutions</w:t>
@@ -27265,8 +26554,6 @@
             <w:r>
               <w:rPr>
                 <w:rFonts w:ascii="Times New Roman" w:hAnsi="Times New Roman"/>
-                <w:b w:val="0"/>
-                <w:i w:val="0"/>
                 <w:sz w:val="22"/>
               </w:rPr>
               <w:t>Completed</w:t>
@@ -27287,8 +26574,6 @@
             <w:r>
               <w:rPr>
                 <w:rFonts w:ascii="Times New Roman" w:hAnsi="Times New Roman"/>
-                <w:b w:val="0"/>
-                <w:i w:val="0"/>
                 <w:sz w:val="22"/>
               </w:rPr>
               <w:t>Set up testing environment (VirtualBox + Kali)</w:t>
@@ -27307,8 +26592,6 @@
             <w:r>
               <w:rPr>
                 <w:rFonts w:ascii="Times New Roman" w:hAnsi="Times New Roman"/>
-                <w:b w:val="0"/>
-                <w:i w:val="0"/>
                 <w:sz w:val="22"/>
               </w:rPr>
               <w:t>Completed</w:t>
@@ -27329,8 +26612,6 @@
             <w:r>
               <w:rPr>
                 <w:rFonts w:ascii="Times New Roman" w:hAnsi="Times New Roman"/>
-                <w:b w:val="0"/>
-                <w:i w:val="0"/>
                 <w:sz w:val="22"/>
               </w:rPr>
               <w:t>Perform penetration testing on authorized target</w:t>
@@ -27349,8 +26630,6 @@
             <w:r>
               <w:rPr>
                 <w:rFonts w:ascii="Times New Roman" w:hAnsi="Times New Roman"/>
-                <w:b w:val="0"/>
-                <w:i w:val="0"/>
                 <w:sz w:val="22"/>
               </w:rPr>
               <w:t>Completed</w:t>
@@ -27371,8 +26650,6 @@
             <w:r>
               <w:rPr>
                 <w:rFonts w:ascii="Times New Roman" w:hAnsi="Times New Roman"/>
-                <w:b w:val="0"/>
-                <w:i w:val="0"/>
                 <w:sz w:val="22"/>
               </w:rPr>
               <w:t>Demonstrate exploitation on misconfigured systems</w:t>
@@ -27391,8 +26668,6 @@
             <w:r>
               <w:rPr>
                 <w:rFonts w:ascii="Times New Roman" w:hAnsi="Times New Roman"/>
-                <w:b w:val="0"/>
-                <w:i w:val="0"/>
                 <w:sz w:val="22"/>
               </w:rPr>
               <w:t>Completed</w:t>
@@ -27413,8 +26688,6 @@
             <w:r>
               <w:rPr>
                 <w:rFonts w:ascii="Times New Roman" w:hAnsi="Times New Roman"/>
-                <w:b w:val="0"/>
-                <w:i w:val="0"/>
                 <w:sz w:val="22"/>
               </w:rPr>
               <w:t>Analyze post-exploitation lateral movement risk</w:t>
@@ -27433,8 +26706,6 @@
             <w:r>
               <w:rPr>
                 <w:rFonts w:ascii="Times New Roman" w:hAnsi="Times New Roman"/>
-                <w:b w:val="0"/>
-                <w:i w:val="0"/>
                 <w:sz w:val="22"/>
               </w:rPr>
               <w:t>Completed</w:t>
@@ -27455,8 +26726,6 @@
             <w:r>
               <w:rPr>
                 <w:rFonts w:ascii="Times New Roman" w:hAnsi="Times New Roman"/>
-                <w:b w:val="0"/>
-                <w:i w:val="0"/>
                 <w:sz w:val="22"/>
               </w:rPr>
               <w:t>Create official VAPT report for stakeholder</w:t>
@@ -27475,8 +26744,6 @@
             <w:r>
               <w:rPr>
                 <w:rFonts w:ascii="Times New Roman" w:hAnsi="Times New Roman"/>
-                <w:b w:val="0"/>
-                <w:i w:val="0"/>
                 <w:sz w:val="22"/>
               </w:rPr>
               <w:t>Completed</w:t>
@@ -27497,8 +26764,6 @@
             <w:r>
               <w:rPr>
                 <w:rFonts w:ascii="Times New Roman" w:hAnsi="Times New Roman"/>
-                <w:b w:val="0"/>
-                <w:i w:val="0"/>
                 <w:sz w:val="22"/>
               </w:rPr>
               <w:t>Demonstrate web app exploitation on alternative environment</w:t>
@@ -27517,8 +26782,6 @@
             <w:r>
               <w:rPr>
                 <w:rFonts w:ascii="Times New Roman" w:hAnsi="Times New Roman"/>
-                <w:b w:val="0"/>
-                <w:i w:val="0"/>
                 <w:sz w:val="22"/>
               </w:rPr>
               <w:t>Completed</w:t>
@@ -27539,8 +26802,6 @@
             <w:r>
               <w:rPr>
                 <w:rFonts w:ascii="Times New Roman" w:hAnsi="Times New Roman"/>
-                <w:b w:val="0"/>
-                <w:i w:val="0"/>
                 <w:sz w:val="22"/>
               </w:rPr>
               <w:t>Stakeholder implementation of remediation steps</w:t>
@@ -27559,8 +26820,6 @@
             <w:r>
               <w:rPr>
                 <w:rFonts w:ascii="Times New Roman" w:hAnsi="Times New Roman"/>
-                <w:b w:val="0"/>
-                <w:i w:val="0"/>
                 <w:sz w:val="22"/>
               </w:rPr>
               <w:t>Incomplete — pending</w:t>
@@ -27581,8 +26840,6 @@
             <w:r>
               <w:rPr>
                 <w:rFonts w:ascii="Times New Roman" w:hAnsi="Times New Roman"/>
-                <w:b w:val="0"/>
-                <w:i w:val="0"/>
                 <w:sz w:val="22"/>
               </w:rPr>
               <w:t>Follow-up verification of remediation</w:t>
@@ -27601,8 +26858,6 @@
             <w:r>
               <w:rPr>
                 <w:rFonts w:ascii="Times New Roman" w:hAnsi="Times New Roman"/>
-                <w:b w:val="0"/>
-                <w:i w:val="0"/>
                 <w:sz w:val="22"/>
               </w:rPr>
               <w:t>Incomplete — pending</w:t>

</xml_diff>

<commit_message>
Use all relevant screenshots: fig414a burp, fig48b onesala SSL, fig415b JWT in appendix
</commit_message>
<xml_diff>
--- a/THESIS_VAPT_WORD.docx
+++ b/THESIS_VAPT_WORD.docx
@@ -16499,7 +16499,7 @@
       <w:r>
         <w:drawing>
           <wp:inline xmlns:a="http://schemas.openxmlformats.org/drawingml/2006/main" xmlns:pic="http://schemas.openxmlformats.org/drawingml/2006/picture">
-            <wp:extent cx="5040000" cy="553017"/>
+            <wp:extent cx="5040000" cy="2665321"/>
             <wp:docPr id="29" name="Picture 29"/>
             <wp:cNvGraphicFramePr>
               <a:graphicFrameLocks noChangeAspect="1"/>
@@ -16508,7 +16508,7 @@
               <a:graphicData uri="http://schemas.openxmlformats.org/drawingml/2006/picture">
                 <pic:pic>
                   <pic:nvPicPr>
-                    <pic:cNvPr id="0" name="fig414_waf_bypass.png"/>
+                    <pic:cNvPr id="0" name="fig414a_burp_cloudflare.png"/>
                     <pic:cNvPicPr/>
                   </pic:nvPicPr>
                   <pic:blipFill>
@@ -16520,7 +16520,7 @@
                   <pic:spPr>
                     <a:xfrm>
                       <a:off x="0" y="0"/>
-                      <a:ext cx="5040000" cy="553017"/>
+                      <a:ext cx="5040000" cy="2665321"/>
                     </a:xfrm>
                     <a:prstGeom prst="rect"/>
                   </pic:spPr>
@@ -27717,6 +27717,62 @@
     </w:p>
     <w:p>
       <w:pPr>
+        <w:ind w:firstLine="0"/>
+        <w:jc w:val="center"/>
+      </w:pPr>
+      <w:r>
+        <w:drawing>
+          <wp:inline xmlns:a="http://schemas.openxmlformats.org/drawingml/2006/main" xmlns:pic="http://schemas.openxmlformats.org/drawingml/2006/picture">
+            <wp:extent cx="5040000" cy="959680"/>
+            <wp:docPr id="39" name="Picture 39"/>
+            <wp:cNvGraphicFramePr>
+              <a:graphicFrameLocks noChangeAspect="1"/>
+            </wp:cNvGraphicFramePr>
+            <a:graphic>
+              <a:graphicData uri="http://schemas.openxmlformats.org/drawingml/2006/picture">
+                <pic:pic>
+                  <pic:nvPicPr>
+                    <pic:cNvPr id="0" name="fig48b_ssl_onesala.png"/>
+                    <pic:cNvPicPr/>
+                  </pic:nvPicPr>
+                  <pic:blipFill>
+                    <a:blip r:embed="rId46"/>
+                    <a:stretch>
+                      <a:fillRect/>
+                    </a:stretch>
+                  </pic:blipFill>
+                  <pic:spPr>
+                    <a:xfrm>
+                      <a:off x="0" y="0"/>
+                      <a:ext cx="5040000" cy="959680"/>
+                    </a:xfrm>
+                    <a:prstGeom prst="rect"/>
+                  </pic:spPr>
+                </pic:pic>
+              </a:graphicData>
+            </a:graphic>
+          </wp:inline>
+        </w:drawing>
+      </w:r>
+    </w:p>
+    <w:p>
+      <w:pPr>
+        <w:spacing w:after="240"/>
+        <w:ind w:firstLine="0"/>
+        <w:jc w:val="center"/>
+      </w:pPr>
+      <w:r>
+        <w:rPr>
+          <w:rFonts w:ascii="Times New Roman" w:hAnsi="Times New Roman"/>
+          <w:b w:val="0"/>
+          <w:i/>
+          <w:sz w:val="20"/>
+        </w:rPr>
+        <w:t>Figure B.1: SSL certificate showing onesala.com on same origin server — shared hosting confirmed</w:t>
+      </w:r>
+    </w:p>
+    <w:p>
+      <w:pPr>
         <w:spacing w:before="80" w:after="80"/>
         <w:ind w:left="720" w:right="283" w:firstLine="0"/>
       </w:pPr>
@@ -27772,7 +27828,7 @@
         <w:drawing>
           <wp:inline xmlns:a="http://schemas.openxmlformats.org/drawingml/2006/main" xmlns:pic="http://schemas.openxmlformats.org/drawingml/2006/picture">
             <wp:extent cx="5040000" cy="2583063"/>
-            <wp:docPr id="39" name="Picture 39"/>
+            <wp:docPr id="40" name="Picture 40"/>
             <wp:cNvGraphicFramePr>
               <a:graphicFrameLocks noChangeAspect="1"/>
             </wp:cNvGraphicFramePr>
@@ -27828,7 +27884,7 @@
         <w:drawing>
           <wp:inline xmlns:a="http://schemas.openxmlformats.org/drawingml/2006/main" xmlns:pic="http://schemas.openxmlformats.org/drawingml/2006/picture">
             <wp:extent cx="5040000" cy="2168250"/>
-            <wp:docPr id="40" name="Picture 40"/>
+            <wp:docPr id="41" name="Picture 41"/>
             <wp:cNvGraphicFramePr>
               <a:graphicFrameLocks noChangeAspect="1"/>
             </wp:cNvGraphicFramePr>
@@ -27939,7 +27995,7 @@
         <w:drawing>
           <wp:inline xmlns:a="http://schemas.openxmlformats.org/drawingml/2006/main" xmlns:pic="http://schemas.openxmlformats.org/drawingml/2006/picture">
             <wp:extent cx="5040000" cy="2313134"/>
-            <wp:docPr id="41" name="Picture 41"/>
+            <wp:docPr id="42" name="Picture 42"/>
             <wp:cNvGraphicFramePr>
               <a:graphicFrameLocks noChangeAspect="1"/>
             </wp:cNvGraphicFramePr>
@@ -27994,8 +28050,64 @@
       <w:r>
         <w:drawing>
           <wp:inline xmlns:a="http://schemas.openxmlformats.org/drawingml/2006/main" xmlns:pic="http://schemas.openxmlformats.org/drawingml/2006/picture">
+            <wp:extent cx="5040000" cy="533199"/>
+            <wp:docPr id="43" name="Picture 43"/>
+            <wp:cNvGraphicFramePr>
+              <a:graphicFrameLocks noChangeAspect="1"/>
+            </wp:cNvGraphicFramePr>
+            <a:graphic>
+              <a:graphicData uri="http://schemas.openxmlformats.org/drawingml/2006/picture">
+                <pic:pic>
+                  <pic:nvPicPr>
+                    <pic:cNvPr id="0" name="fig415b_jwt_token.png"/>
+                    <pic:cNvPicPr/>
+                  </pic:nvPicPr>
+                  <pic:blipFill>
+                    <a:blip r:embed="rId47"/>
+                    <a:stretch>
+                      <a:fillRect/>
+                    </a:stretch>
+                  </pic:blipFill>
+                  <pic:spPr>
+                    <a:xfrm>
+                      <a:off x="0" y="0"/>
+                      <a:ext cx="5040000" cy="533199"/>
+                    </a:xfrm>
+                    <a:prstGeom prst="rect"/>
+                  </pic:spPr>
+                </pic:pic>
+              </a:graphicData>
+            </a:graphic>
+          </wp:inline>
+        </w:drawing>
+      </w:r>
+    </w:p>
+    <w:p>
+      <w:pPr>
+        <w:spacing w:after="240"/>
+        <w:ind w:firstLine="0"/>
+        <w:jc w:val="center"/>
+      </w:pPr>
+      <w:r>
+        <w:rPr>
+          <w:rFonts w:ascii="Times New Roman" w:hAnsi="Times New Roman"/>
+          <w:b w:val="0"/>
+          <w:i/>
+          <w:sz w:val="20"/>
+        </w:rPr>
+        <w:t>Figure D.2: JWT token decoded — header and payload structure</w:t>
+      </w:r>
+    </w:p>
+    <w:p>
+      <w:pPr>
+        <w:ind w:firstLine="0"/>
+        <w:jc w:val="center"/>
+      </w:pPr>
+      <w:r>
+        <w:drawing>
+          <wp:inline xmlns:a="http://schemas.openxmlformats.org/drawingml/2006/main" xmlns:pic="http://schemas.openxmlformats.org/drawingml/2006/picture">
             <wp:extent cx="5040000" cy="998595"/>
-            <wp:docPr id="42" name="Picture 42"/>
+            <wp:docPr id="44" name="Picture 44"/>
             <wp:cNvGraphicFramePr>
               <a:graphicFrameLocks noChangeAspect="1"/>
             </wp:cNvGraphicFramePr>
@@ -28039,7 +28151,7 @@
           <w:i/>
           <w:sz w:val="20"/>
         </w:rPr>
-        <w:t>Figure D.2: JWT endpoint returning HTTP 200 — confirmed unpatched as of eleven June 2026</w:t>
+        <w:t>Figure D.3: JWT endpoint returning HTTP 200 — confirmed unpatched as of eleven June 2026</w:t>
       </w:r>
     </w:p>
     <w:p>

</xml_diff>

<commit_message>
Add architecture drawio, firewall screenshot placeholder, fix numbered list font to match body
</commit_message>
<xml_diff>
--- a/THESIS_VAPT_WORD.docx
+++ b/THESIS_VAPT_WORD.docx
@@ -2535,10 +2535,19 @@
     </w:p>
     <w:p>
       <w:pPr>
-        <w:pStyle w:val="ListNumber"/>
-        <w:spacing w:after="60"/>
+        <w:spacing w:line="360" w:lineRule="auto" w:after="80"/>
         <w:ind w:left="720" w:firstLine="0"/>
-      </w:pPr>
+        <w:jc w:val="both"/>
+      </w:pPr>
+      <w:r>
+        <w:rPr>
+          <w:rFonts w:ascii="Times New Roman" w:hAnsi="Times New Roman"/>
+          <w:b w:val="0"/>
+          <w:i w:val="0"/>
+          <w:sz w:val="24"/>
+        </w:rPr>
+        <w:t xml:space="preserve">1.  </w:t>
+      </w:r>
       <w:r>
         <w:rPr>
           <w:rFonts w:ascii="Times New Roman" w:hAnsi="Times New Roman"/>
@@ -2549,10 +2558,19 @@
     </w:p>
     <w:p>
       <w:pPr>
-        <w:pStyle w:val="ListNumber"/>
-        <w:spacing w:after="60"/>
+        <w:spacing w:line="360" w:lineRule="auto" w:after="80"/>
         <w:ind w:left="720" w:firstLine="0"/>
-      </w:pPr>
+        <w:jc w:val="both"/>
+      </w:pPr>
+      <w:r>
+        <w:rPr>
+          <w:rFonts w:ascii="Times New Roman" w:hAnsi="Times New Roman"/>
+          <w:b w:val="0"/>
+          <w:i w:val="0"/>
+          <w:sz w:val="24"/>
+        </w:rPr>
+        <w:t xml:space="preserve">2.  </w:t>
+      </w:r>
       <w:r>
         <w:rPr>
           <w:rFonts w:ascii="Times New Roman" w:hAnsi="Times New Roman"/>
@@ -2563,10 +2581,19 @@
     </w:p>
     <w:p>
       <w:pPr>
-        <w:pStyle w:val="ListNumber"/>
-        <w:spacing w:after="60"/>
+        <w:spacing w:line="360" w:lineRule="auto" w:after="80"/>
         <w:ind w:left="720" w:firstLine="0"/>
-      </w:pPr>
+        <w:jc w:val="both"/>
+      </w:pPr>
+      <w:r>
+        <w:rPr>
+          <w:rFonts w:ascii="Times New Roman" w:hAnsi="Times New Roman"/>
+          <w:b w:val="0"/>
+          <w:i w:val="0"/>
+          <w:sz w:val="24"/>
+        </w:rPr>
+        <w:t xml:space="preserve">3.  </w:t>
+      </w:r>
       <w:r>
         <w:rPr>
           <w:rFonts w:ascii="Times New Roman" w:hAnsi="Times New Roman"/>
@@ -2577,10 +2604,19 @@
     </w:p>
     <w:p>
       <w:pPr>
-        <w:pStyle w:val="ListNumber"/>
-        <w:spacing w:after="60"/>
+        <w:spacing w:line="360" w:lineRule="auto" w:after="80"/>
         <w:ind w:left="720" w:firstLine="0"/>
-      </w:pPr>
+        <w:jc w:val="both"/>
+      </w:pPr>
+      <w:r>
+        <w:rPr>
+          <w:rFonts w:ascii="Times New Roman" w:hAnsi="Times New Roman"/>
+          <w:b w:val="0"/>
+          <w:i w:val="0"/>
+          <w:sz w:val="24"/>
+        </w:rPr>
+        <w:t xml:space="preserve">4.  </w:t>
+      </w:r>
       <w:r>
         <w:rPr>
           <w:rFonts w:ascii="Times New Roman" w:hAnsi="Times New Roman"/>
@@ -2591,10 +2627,19 @@
     </w:p>
     <w:p>
       <w:pPr>
-        <w:pStyle w:val="ListNumber"/>
-        <w:spacing w:after="60"/>
+        <w:spacing w:line="360" w:lineRule="auto" w:after="80"/>
         <w:ind w:left="720" w:firstLine="0"/>
-      </w:pPr>
+        <w:jc w:val="both"/>
+      </w:pPr>
+      <w:r>
+        <w:rPr>
+          <w:rFonts w:ascii="Times New Roman" w:hAnsi="Times New Roman"/>
+          <w:b w:val="0"/>
+          <w:i w:val="0"/>
+          <w:sz w:val="24"/>
+        </w:rPr>
+        <w:t xml:space="preserve">5.  </w:t>
+      </w:r>
       <w:r>
         <w:rPr>
           <w:rFonts w:ascii="Times New Roman" w:hAnsi="Times New Roman"/>
@@ -2605,10 +2650,19 @@
     </w:p>
     <w:p>
       <w:pPr>
-        <w:pStyle w:val="ListNumber"/>
-        <w:spacing w:after="60"/>
+        <w:spacing w:line="360" w:lineRule="auto" w:after="80"/>
         <w:ind w:left="720" w:firstLine="0"/>
-      </w:pPr>
+        <w:jc w:val="both"/>
+      </w:pPr>
+      <w:r>
+        <w:rPr>
+          <w:rFonts w:ascii="Times New Roman" w:hAnsi="Times New Roman"/>
+          <w:b w:val="0"/>
+          <w:i w:val="0"/>
+          <w:sz w:val="24"/>
+        </w:rPr>
+        <w:t xml:space="preserve">6.  </w:t>
+      </w:r>
       <w:r>
         <w:rPr>
           <w:rFonts w:ascii="Times New Roman" w:hAnsi="Times New Roman"/>
@@ -3061,10 +3115,19 @@
     </w:p>
     <w:p>
       <w:pPr>
-        <w:pStyle w:val="ListNumber"/>
-        <w:spacing w:after="60"/>
+        <w:spacing w:line="360" w:lineRule="auto" w:after="80"/>
         <w:ind w:left="720" w:firstLine="0"/>
-      </w:pPr>
+        <w:jc w:val="both"/>
+      </w:pPr>
+      <w:r>
+        <w:rPr>
+          <w:rFonts w:ascii="Times New Roman" w:hAnsi="Times New Roman"/>
+          <w:b w:val="0"/>
+          <w:i w:val="0"/>
+          <w:sz w:val="24"/>
+        </w:rPr>
+        <w:t xml:space="preserve">1.  </w:t>
+      </w:r>
       <w:r>
         <w:rPr>
           <w:rFonts w:ascii="Times New Roman" w:hAnsi="Times New Roman"/>
@@ -3083,10 +3146,19 @@
     </w:p>
     <w:p>
       <w:pPr>
-        <w:pStyle w:val="ListNumber"/>
-        <w:spacing w:after="60"/>
+        <w:spacing w:line="360" w:lineRule="auto" w:after="80"/>
         <w:ind w:left="720" w:firstLine="0"/>
-      </w:pPr>
+        <w:jc w:val="both"/>
+      </w:pPr>
+      <w:r>
+        <w:rPr>
+          <w:rFonts w:ascii="Times New Roman" w:hAnsi="Times New Roman"/>
+          <w:b w:val="0"/>
+          <w:i w:val="0"/>
+          <w:sz w:val="24"/>
+        </w:rPr>
+        <w:t xml:space="preserve">2.  </w:t>
+      </w:r>
       <w:r>
         <w:rPr>
           <w:rFonts w:ascii="Times New Roman" w:hAnsi="Times New Roman"/>
@@ -3105,10 +3177,19 @@
     </w:p>
     <w:p>
       <w:pPr>
-        <w:pStyle w:val="ListNumber"/>
-        <w:spacing w:after="60"/>
+        <w:spacing w:line="360" w:lineRule="auto" w:after="80"/>
         <w:ind w:left="720" w:firstLine="0"/>
-      </w:pPr>
+        <w:jc w:val="both"/>
+      </w:pPr>
+      <w:r>
+        <w:rPr>
+          <w:rFonts w:ascii="Times New Roman" w:hAnsi="Times New Roman"/>
+          <w:b w:val="0"/>
+          <w:i w:val="0"/>
+          <w:sz w:val="24"/>
+        </w:rPr>
+        <w:t xml:space="preserve">3.  </w:t>
+      </w:r>
       <w:r>
         <w:rPr>
           <w:rFonts w:ascii="Times New Roman" w:hAnsi="Times New Roman"/>
@@ -3127,10 +3208,19 @@
     </w:p>
     <w:p>
       <w:pPr>
-        <w:pStyle w:val="ListNumber"/>
-        <w:spacing w:after="60"/>
+        <w:spacing w:line="360" w:lineRule="auto" w:after="80"/>
         <w:ind w:left="720" w:firstLine="0"/>
-      </w:pPr>
+        <w:jc w:val="both"/>
+      </w:pPr>
+      <w:r>
+        <w:rPr>
+          <w:rFonts w:ascii="Times New Roman" w:hAnsi="Times New Roman"/>
+          <w:b w:val="0"/>
+          <w:i w:val="0"/>
+          <w:sz w:val="24"/>
+        </w:rPr>
+        <w:t xml:space="preserve">4.  </w:t>
+      </w:r>
       <w:r>
         <w:rPr>
           <w:rFonts w:ascii="Times New Roman" w:hAnsi="Times New Roman"/>
@@ -11416,10 +11506,19 @@
     </w:p>
     <w:p>
       <w:pPr>
-        <w:pStyle w:val="ListNumber"/>
-        <w:spacing w:after="60"/>
+        <w:spacing w:line="360" w:lineRule="auto" w:after="80"/>
         <w:ind w:left="720" w:firstLine="0"/>
-      </w:pPr>
+        <w:jc w:val="both"/>
+      </w:pPr>
+      <w:r>
+        <w:rPr>
+          <w:rFonts w:ascii="Times New Roman" w:hAnsi="Times New Roman"/>
+          <w:b w:val="0"/>
+          <w:i w:val="0"/>
+          <w:sz w:val="24"/>
+        </w:rPr>
+        <w:t xml:space="preserve">1.  </w:t>
+      </w:r>
       <w:r>
         <w:rPr>
           <w:rFonts w:ascii="Times New Roman" w:hAnsi="Times New Roman"/>
@@ -11430,10 +11529,19 @@
     </w:p>
     <w:p>
       <w:pPr>
-        <w:pStyle w:val="ListNumber"/>
-        <w:spacing w:after="60"/>
+        <w:spacing w:line="360" w:lineRule="auto" w:after="80"/>
         <w:ind w:left="720" w:firstLine="0"/>
-      </w:pPr>
+        <w:jc w:val="both"/>
+      </w:pPr>
+      <w:r>
+        <w:rPr>
+          <w:rFonts w:ascii="Times New Roman" w:hAnsi="Times New Roman"/>
+          <w:b w:val="0"/>
+          <w:i w:val="0"/>
+          <w:sz w:val="24"/>
+        </w:rPr>
+        <w:t xml:space="preserve">2.  </w:t>
+      </w:r>
       <w:r>
         <w:rPr>
           <w:rFonts w:ascii="Times New Roman" w:hAnsi="Times New Roman"/>
@@ -11444,10 +11552,19 @@
     </w:p>
     <w:p>
       <w:pPr>
-        <w:pStyle w:val="ListNumber"/>
-        <w:spacing w:after="60"/>
+        <w:spacing w:line="360" w:lineRule="auto" w:after="80"/>
         <w:ind w:left="720" w:firstLine="0"/>
-      </w:pPr>
+        <w:jc w:val="both"/>
+      </w:pPr>
+      <w:r>
+        <w:rPr>
+          <w:rFonts w:ascii="Times New Roman" w:hAnsi="Times New Roman"/>
+          <w:b w:val="0"/>
+          <w:i w:val="0"/>
+          <w:sz w:val="24"/>
+        </w:rPr>
+        <w:t xml:space="preserve">3.  </w:t>
+      </w:r>
       <w:r>
         <w:rPr>
           <w:rFonts w:ascii="Times New Roman" w:hAnsi="Times New Roman"/>
@@ -11458,10 +11575,19 @@
     </w:p>
     <w:p>
       <w:pPr>
-        <w:pStyle w:val="ListNumber"/>
-        <w:spacing w:after="60"/>
+        <w:spacing w:line="360" w:lineRule="auto" w:after="80"/>
         <w:ind w:left="720" w:firstLine="0"/>
-      </w:pPr>
+        <w:jc w:val="both"/>
+      </w:pPr>
+      <w:r>
+        <w:rPr>
+          <w:rFonts w:ascii="Times New Roman" w:hAnsi="Times New Roman"/>
+          <w:b w:val="0"/>
+          <w:i w:val="0"/>
+          <w:sz w:val="24"/>
+        </w:rPr>
+        <w:t xml:space="preserve">4.  </w:t>
+      </w:r>
       <w:r>
         <w:rPr>
           <w:rFonts w:ascii="Times New Roman" w:hAnsi="Times New Roman"/>
@@ -11472,10 +11598,19 @@
     </w:p>
     <w:p>
       <w:pPr>
-        <w:pStyle w:val="ListNumber"/>
-        <w:spacing w:after="60"/>
+        <w:spacing w:line="360" w:lineRule="auto" w:after="80"/>
         <w:ind w:left="720" w:firstLine="0"/>
-      </w:pPr>
+        <w:jc w:val="both"/>
+      </w:pPr>
+      <w:r>
+        <w:rPr>
+          <w:rFonts w:ascii="Times New Roman" w:hAnsi="Times New Roman"/>
+          <w:b w:val="0"/>
+          <w:i w:val="0"/>
+          <w:sz w:val="24"/>
+        </w:rPr>
+        <w:t xml:space="preserve">5.  </w:t>
+      </w:r>
       <w:r>
         <w:rPr>
           <w:rFonts w:ascii="Times New Roman" w:hAnsi="Times New Roman"/>
@@ -11486,10 +11621,19 @@
     </w:p>
     <w:p>
       <w:pPr>
-        <w:pStyle w:val="ListNumber"/>
-        <w:spacing w:after="60"/>
+        <w:spacing w:line="360" w:lineRule="auto" w:after="80"/>
         <w:ind w:left="720" w:firstLine="0"/>
-      </w:pPr>
+        <w:jc w:val="both"/>
+      </w:pPr>
+      <w:r>
+        <w:rPr>
+          <w:rFonts w:ascii="Times New Roman" w:hAnsi="Times New Roman"/>
+          <w:b w:val="0"/>
+          <w:i w:val="0"/>
+          <w:sz w:val="24"/>
+        </w:rPr>
+        <w:t xml:space="preserve">6.  </w:t>
+      </w:r>
       <w:r>
         <w:rPr>
           <w:rFonts w:ascii="Times New Roman" w:hAnsi="Times New Roman"/>
@@ -24228,6 +24372,38 @@
     </w:p>
     <w:p>
       <w:pPr>
+        <w:ind w:firstLine="0"/>
+        <w:jc w:val="center"/>
+      </w:pPr>
+      <w:r>
+        <w:rPr>
+          <w:rFonts w:ascii="Times New Roman" w:hAnsi="Times New Roman"/>
+          <w:b w:val="0"/>
+          <w:i/>
+          <w:color w:val="808080"/>
+          <w:sz w:val="22"/>
+        </w:rPr>
+        <w:t>[PLACEHOLDER — Figure 5.1: Cloudways IP Whitelist firewall rules configuration]</w:t>
+      </w:r>
+    </w:p>
+    <w:p>
+      <w:pPr>
+        <w:spacing w:after="240"/>
+        <w:ind w:firstLine="0"/>
+        <w:jc w:val="center"/>
+      </w:pPr>
+      <w:r>
+        <w:rPr>
+          <w:rFonts w:ascii="Times New Roman" w:hAnsi="Times New Roman"/>
+          <w:b w:val="0"/>
+          <w:i/>
+          <w:sz w:val="20"/>
+        </w:rPr>
+        <w:t>Figure 5.1: Cloudways IP Whitelist firewall rules configuration</w:t>
+      </w:r>
+    </w:p>
+    <w:p>
+      <w:pPr>
         <w:pStyle w:val="Heading3"/>
         <w:jc w:val="left"/>
       </w:pPr>
@@ -24367,23 +24543,34 @@
     </w:p>
     <w:p>
       <w:pPr>
-        <w:spacing w:before="80" w:after="80"/>
-        <w:ind w:left="720" w:right="283" w:firstLine="0"/>
-      </w:pPr>
-      <w:r>
-        <w:rPr>
-          <w:rFonts w:ascii="Courier New" w:hAnsi="Courier New"/>
-          <w:sz w:val="18"/>
-        </w:rPr>
-        <w:t>Recommended architecture:</w:t>
-        <w:br/>
-        <w:t xml:space="preserve">  Internet → [Cloudflare WAF] → DMZ: Web servers (80/443 only)</w:t>
-        <w:br/>
-        <w:t xml:space="preserve">  DMZ → [Internal firewall] → Application Layer: API servers</w:t>
-        <w:br/>
-        <w:t xml:space="preserve">  Application → [Strict firewall] → Data Layer: MySQL (no external access)</w:t>
-        <w:br/>
-        <w:t xml:space="preserve">  Management: cPanel, WHM, SSH → VPN ONLY (no public internet access)</w:t>
+        <w:ind w:firstLine="0"/>
+        <w:jc w:val="center"/>
+      </w:pPr>
+      <w:r>
+        <w:rPr>
+          <w:rFonts w:ascii="Times New Roman" w:hAnsi="Times New Roman"/>
+          <w:b w:val="0"/>
+          <w:i/>
+          <w:color w:val="808080"/>
+          <w:sz w:val="22"/>
+        </w:rPr>
+        <w:t>[PLACEHOLDER — Figure 5.2: Recommended network security architecture]</w:t>
+      </w:r>
+    </w:p>
+    <w:p>
+      <w:pPr>
+        <w:spacing w:after="240"/>
+        <w:ind w:firstLine="0"/>
+        <w:jc w:val="center"/>
+      </w:pPr>
+      <w:r>
+        <w:rPr>
+          <w:rFonts w:ascii="Times New Roman" w:hAnsi="Times New Roman"/>
+          <w:b w:val="0"/>
+          <w:i/>
+          <w:sz w:val="20"/>
+        </w:rPr>
+        <w:t>Figure 5.2: Recommended network security architecture</w:t>
       </w:r>
     </w:p>
     <w:p>
@@ -24504,10 +24691,19 @@
     </w:p>
     <w:p>
       <w:pPr>
-        <w:pStyle w:val="ListNumber"/>
-        <w:spacing w:after="60"/>
+        <w:spacing w:line="360" w:lineRule="auto" w:after="80"/>
         <w:ind w:left="720" w:firstLine="0"/>
-      </w:pPr>
+        <w:jc w:val="both"/>
+      </w:pPr>
+      <w:r>
+        <w:rPr>
+          <w:rFonts w:ascii="Times New Roman" w:hAnsi="Times New Roman"/>
+          <w:b w:val="0"/>
+          <w:i w:val="0"/>
+          <w:sz w:val="24"/>
+        </w:rPr>
+        <w:t xml:space="preserve">1.  </w:t>
+      </w:r>
       <w:r>
         <w:rPr>
           <w:rFonts w:ascii="Times New Roman" w:hAnsi="Times New Roman"/>
@@ -24526,10 +24722,19 @@
     </w:p>
     <w:p>
       <w:pPr>
-        <w:pStyle w:val="ListNumber"/>
-        <w:spacing w:after="60"/>
+        <w:spacing w:line="360" w:lineRule="auto" w:after="80"/>
         <w:ind w:left="720" w:firstLine="0"/>
-      </w:pPr>
+        <w:jc w:val="both"/>
+      </w:pPr>
+      <w:r>
+        <w:rPr>
+          <w:rFonts w:ascii="Times New Roman" w:hAnsi="Times New Roman"/>
+          <w:b w:val="0"/>
+          <w:i w:val="0"/>
+          <w:sz w:val="24"/>
+        </w:rPr>
+        <w:t xml:space="preserve">2.  </w:t>
+      </w:r>
       <w:r>
         <w:rPr>
           <w:rFonts w:ascii="Times New Roman" w:hAnsi="Times New Roman"/>
@@ -24548,10 +24753,19 @@
     </w:p>
     <w:p>
       <w:pPr>
-        <w:pStyle w:val="ListNumber"/>
-        <w:spacing w:after="60"/>
+        <w:spacing w:line="360" w:lineRule="auto" w:after="80"/>
         <w:ind w:left="720" w:firstLine="0"/>
-      </w:pPr>
+        <w:jc w:val="both"/>
+      </w:pPr>
+      <w:r>
+        <w:rPr>
+          <w:rFonts w:ascii="Times New Roman" w:hAnsi="Times New Roman"/>
+          <w:b w:val="0"/>
+          <w:i w:val="0"/>
+          <w:sz w:val="24"/>
+        </w:rPr>
+        <w:t xml:space="preserve">3.  </w:t>
+      </w:r>
       <w:r>
         <w:rPr>
           <w:rFonts w:ascii="Times New Roman" w:hAnsi="Times New Roman"/>
@@ -24570,10 +24784,19 @@
     </w:p>
     <w:p>
       <w:pPr>
-        <w:pStyle w:val="ListNumber"/>
-        <w:spacing w:after="60"/>
+        <w:spacing w:line="360" w:lineRule="auto" w:after="80"/>
         <w:ind w:left="720" w:firstLine="0"/>
-      </w:pPr>
+        <w:jc w:val="both"/>
+      </w:pPr>
+      <w:r>
+        <w:rPr>
+          <w:rFonts w:ascii="Times New Roman" w:hAnsi="Times New Roman"/>
+          <w:b w:val="0"/>
+          <w:i w:val="0"/>
+          <w:sz w:val="24"/>
+        </w:rPr>
+        <w:t xml:space="preserve">4.  </w:t>
+      </w:r>
       <w:r>
         <w:rPr>
           <w:rFonts w:ascii="Times New Roman" w:hAnsi="Times New Roman"/>
@@ -25761,10 +25984,19 @@
     </w:p>
     <w:p>
       <w:pPr>
-        <w:pStyle w:val="ListNumber"/>
-        <w:spacing w:after="60"/>
+        <w:spacing w:line="360" w:lineRule="auto" w:after="80"/>
         <w:ind w:left="720" w:firstLine="0"/>
-      </w:pPr>
+        <w:jc w:val="both"/>
+      </w:pPr>
+      <w:r>
+        <w:rPr>
+          <w:rFonts w:ascii="Times New Roman" w:hAnsi="Times New Roman"/>
+          <w:b w:val="0"/>
+          <w:i w:val="0"/>
+          <w:sz w:val="24"/>
+        </w:rPr>
+        <w:t xml:space="preserve">1.  </w:t>
+      </w:r>
       <w:r>
         <w:rPr>
           <w:rFonts w:ascii="Times New Roman" w:hAnsi="Times New Roman"/>
@@ -25790,10 +26022,19 @@
     </w:p>
     <w:p>
       <w:pPr>
-        <w:pStyle w:val="ListNumber"/>
-        <w:spacing w:after="60"/>
+        <w:spacing w:line="360" w:lineRule="auto" w:after="80"/>
         <w:ind w:left="720" w:firstLine="0"/>
-      </w:pPr>
+        <w:jc w:val="both"/>
+      </w:pPr>
+      <w:r>
+        <w:rPr>
+          <w:rFonts w:ascii="Times New Roman" w:hAnsi="Times New Roman"/>
+          <w:b w:val="0"/>
+          <w:i w:val="0"/>
+          <w:sz w:val="24"/>
+        </w:rPr>
+        <w:t xml:space="preserve">2.  </w:t>
+      </w:r>
       <w:r>
         <w:rPr>
           <w:rFonts w:ascii="Times New Roman" w:hAnsi="Times New Roman"/>
@@ -25819,10 +26060,19 @@
     </w:p>
     <w:p>
       <w:pPr>
-        <w:pStyle w:val="ListNumber"/>
-        <w:spacing w:after="60"/>
+        <w:spacing w:line="360" w:lineRule="auto" w:after="80"/>
         <w:ind w:left="720" w:firstLine="0"/>
-      </w:pPr>
+        <w:jc w:val="both"/>
+      </w:pPr>
+      <w:r>
+        <w:rPr>
+          <w:rFonts w:ascii="Times New Roman" w:hAnsi="Times New Roman"/>
+          <w:b w:val="0"/>
+          <w:i w:val="0"/>
+          <w:sz w:val="24"/>
+        </w:rPr>
+        <w:t xml:space="preserve">3.  </w:t>
+      </w:r>
       <w:r>
         <w:rPr>
           <w:rFonts w:ascii="Times New Roman" w:hAnsi="Times New Roman"/>
@@ -25848,10 +26098,19 @@
     </w:p>
     <w:p>
       <w:pPr>
-        <w:pStyle w:val="ListNumber"/>
-        <w:spacing w:after="60"/>
+        <w:spacing w:line="360" w:lineRule="auto" w:after="80"/>
         <w:ind w:left="720" w:firstLine="0"/>
-      </w:pPr>
+        <w:jc w:val="both"/>
+      </w:pPr>
+      <w:r>
+        <w:rPr>
+          <w:rFonts w:ascii="Times New Roman" w:hAnsi="Times New Roman"/>
+          <w:b w:val="0"/>
+          <w:i w:val="0"/>
+          <w:sz w:val="24"/>
+        </w:rPr>
+        <w:t xml:space="preserve">4.  </w:t>
+      </w:r>
       <w:r>
         <w:rPr>
           <w:rFonts w:ascii="Times New Roman" w:hAnsi="Times New Roman"/>
@@ -25877,10 +26136,19 @@
     </w:p>
     <w:p>
       <w:pPr>
-        <w:pStyle w:val="ListNumber"/>
-        <w:spacing w:after="60"/>
+        <w:spacing w:line="360" w:lineRule="auto" w:after="80"/>
         <w:ind w:left="720" w:firstLine="0"/>
-      </w:pPr>
+        <w:jc w:val="both"/>
+      </w:pPr>
+      <w:r>
+        <w:rPr>
+          <w:rFonts w:ascii="Times New Roman" w:hAnsi="Times New Roman"/>
+          <w:b w:val="0"/>
+          <w:i w:val="0"/>
+          <w:sz w:val="24"/>
+        </w:rPr>
+        <w:t xml:space="preserve">5.  </w:t>
+      </w:r>
       <w:r>
         <w:rPr>
           <w:rFonts w:ascii="Times New Roman" w:hAnsi="Times New Roman"/>
@@ -25906,10 +26174,19 @@
     </w:p>
     <w:p>
       <w:pPr>
-        <w:pStyle w:val="ListNumber"/>
-        <w:spacing w:after="60"/>
+        <w:spacing w:line="360" w:lineRule="auto" w:after="80"/>
         <w:ind w:left="720" w:firstLine="0"/>
-      </w:pPr>
+        <w:jc w:val="both"/>
+      </w:pPr>
+      <w:r>
+        <w:rPr>
+          <w:rFonts w:ascii="Times New Roman" w:hAnsi="Times New Roman"/>
+          <w:b w:val="0"/>
+          <w:i w:val="0"/>
+          <w:sz w:val="24"/>
+        </w:rPr>
+        <w:t xml:space="preserve">6.  </w:t>
+      </w:r>
       <w:r>
         <w:rPr>
           <w:rFonts w:ascii="Times New Roman" w:hAnsi="Times New Roman"/>
@@ -25935,10 +26212,19 @@
     </w:p>
     <w:p>
       <w:pPr>
-        <w:pStyle w:val="ListNumber"/>
-        <w:spacing w:after="60"/>
+        <w:spacing w:line="360" w:lineRule="auto" w:after="80"/>
         <w:ind w:left="720" w:firstLine="0"/>
-      </w:pPr>
+        <w:jc w:val="both"/>
+      </w:pPr>
+      <w:r>
+        <w:rPr>
+          <w:rFonts w:ascii="Times New Roman" w:hAnsi="Times New Roman"/>
+          <w:b w:val="0"/>
+          <w:i w:val="0"/>
+          <w:sz w:val="24"/>
+        </w:rPr>
+        <w:t xml:space="preserve">7.  </w:t>
+      </w:r>
       <w:r>
         <w:rPr>
           <w:rFonts w:ascii="Times New Roman" w:hAnsi="Times New Roman"/>
@@ -25964,10 +26250,19 @@
     </w:p>
     <w:p>
       <w:pPr>
-        <w:pStyle w:val="ListNumber"/>
-        <w:spacing w:after="60"/>
+        <w:spacing w:line="360" w:lineRule="auto" w:after="80"/>
         <w:ind w:left="720" w:firstLine="0"/>
-      </w:pPr>
+        <w:jc w:val="both"/>
+      </w:pPr>
+      <w:r>
+        <w:rPr>
+          <w:rFonts w:ascii="Times New Roman" w:hAnsi="Times New Roman"/>
+          <w:b w:val="0"/>
+          <w:i w:val="0"/>
+          <w:sz w:val="24"/>
+        </w:rPr>
+        <w:t xml:space="preserve">8.  </w:t>
+      </w:r>
       <w:r>
         <w:rPr>
           <w:rFonts w:ascii="Times New Roman" w:hAnsi="Times New Roman"/>
@@ -25993,10 +26288,19 @@
     </w:p>
     <w:p>
       <w:pPr>
-        <w:pStyle w:val="ListNumber"/>
-        <w:spacing w:after="60"/>
+        <w:spacing w:line="360" w:lineRule="auto" w:after="80"/>
         <w:ind w:left="720" w:firstLine="0"/>
-      </w:pPr>
+        <w:jc w:val="both"/>
+      </w:pPr>
+      <w:r>
+        <w:rPr>
+          <w:rFonts w:ascii="Times New Roman" w:hAnsi="Times New Roman"/>
+          <w:b w:val="0"/>
+          <w:i w:val="0"/>
+          <w:sz w:val="24"/>
+        </w:rPr>
+        <w:t xml:space="preserve">9.  </w:t>
+      </w:r>
       <w:r>
         <w:rPr>
           <w:rFonts w:ascii="Times New Roman" w:hAnsi="Times New Roman"/>
@@ -26022,10 +26326,19 @@
     </w:p>
     <w:p>
       <w:pPr>
-        <w:pStyle w:val="ListNumber"/>
-        <w:spacing w:after="60"/>
+        <w:spacing w:line="360" w:lineRule="auto" w:after="80"/>
         <w:ind w:left="720" w:firstLine="0"/>
-      </w:pPr>
+        <w:jc w:val="both"/>
+      </w:pPr>
+      <w:r>
+        <w:rPr>
+          <w:rFonts w:ascii="Times New Roman" w:hAnsi="Times New Roman"/>
+          <w:b w:val="0"/>
+          <w:i w:val="0"/>
+          <w:sz w:val="24"/>
+        </w:rPr>
+        <w:t xml:space="preserve">10.  </w:t>
+      </w:r>
       <w:r>
         <w:rPr>
           <w:rFonts w:ascii="Times New Roman" w:hAnsi="Times New Roman"/>
@@ -26051,10 +26364,19 @@
     </w:p>
     <w:p>
       <w:pPr>
-        <w:pStyle w:val="ListNumber"/>
-        <w:spacing w:after="60"/>
+        <w:spacing w:line="360" w:lineRule="auto" w:after="80"/>
         <w:ind w:left="720" w:firstLine="0"/>
-      </w:pPr>
+        <w:jc w:val="both"/>
+      </w:pPr>
+      <w:r>
+        <w:rPr>
+          <w:rFonts w:ascii="Times New Roman" w:hAnsi="Times New Roman"/>
+          <w:b w:val="0"/>
+          <w:i w:val="0"/>
+          <w:sz w:val="24"/>
+        </w:rPr>
+        <w:t xml:space="preserve">11.  </w:t>
+      </w:r>
       <w:r>
         <w:rPr>
           <w:rFonts w:ascii="Times New Roman" w:hAnsi="Times New Roman"/>
@@ -26080,10 +26402,19 @@
     </w:p>
     <w:p>
       <w:pPr>
-        <w:pStyle w:val="ListNumber"/>
-        <w:spacing w:after="60"/>
+        <w:spacing w:line="360" w:lineRule="auto" w:after="80"/>
         <w:ind w:left="720" w:firstLine="0"/>
-      </w:pPr>
+        <w:jc w:val="both"/>
+      </w:pPr>
+      <w:r>
+        <w:rPr>
+          <w:rFonts w:ascii="Times New Roman" w:hAnsi="Times New Roman"/>
+          <w:b w:val="0"/>
+          <w:i w:val="0"/>
+          <w:sz w:val="24"/>
+        </w:rPr>
+        <w:t xml:space="preserve">12.  </w:t>
+      </w:r>
       <w:r>
         <w:rPr>
           <w:rFonts w:ascii="Times New Roman" w:hAnsi="Times New Roman"/>
@@ -26109,10 +26440,19 @@
     </w:p>
     <w:p>
       <w:pPr>
-        <w:pStyle w:val="ListNumber"/>
-        <w:spacing w:after="60"/>
+        <w:spacing w:line="360" w:lineRule="auto" w:after="80"/>
         <w:ind w:left="720" w:firstLine="0"/>
-      </w:pPr>
+        <w:jc w:val="both"/>
+      </w:pPr>
+      <w:r>
+        <w:rPr>
+          <w:rFonts w:ascii="Times New Roman" w:hAnsi="Times New Roman"/>
+          <w:b w:val="0"/>
+          <w:i w:val="0"/>
+          <w:sz w:val="24"/>
+        </w:rPr>
+        <w:t xml:space="preserve">13.  </w:t>
+      </w:r>
       <w:r>
         <w:rPr>
           <w:rFonts w:ascii="Times New Roman" w:hAnsi="Times New Roman"/>
@@ -26138,10 +26478,19 @@
     </w:p>
     <w:p>
       <w:pPr>
-        <w:pStyle w:val="ListNumber"/>
-        <w:spacing w:after="60"/>
+        <w:spacing w:line="360" w:lineRule="auto" w:after="80"/>
         <w:ind w:left="720" w:firstLine="0"/>
-      </w:pPr>
+        <w:jc w:val="both"/>
+      </w:pPr>
+      <w:r>
+        <w:rPr>
+          <w:rFonts w:ascii="Times New Roman" w:hAnsi="Times New Roman"/>
+          <w:b w:val="0"/>
+          <w:i w:val="0"/>
+          <w:sz w:val="24"/>
+        </w:rPr>
+        <w:t xml:space="preserve">14.  </w:t>
+      </w:r>
       <w:r>
         <w:rPr>
           <w:rFonts w:ascii="Times New Roman" w:hAnsi="Times New Roman"/>
@@ -26167,10 +26516,19 @@
     </w:p>
     <w:p>
       <w:pPr>
-        <w:pStyle w:val="ListNumber"/>
-        <w:spacing w:after="60"/>
+        <w:spacing w:line="360" w:lineRule="auto" w:after="80"/>
         <w:ind w:left="720" w:firstLine="0"/>
-      </w:pPr>
+        <w:jc w:val="both"/>
+      </w:pPr>
+      <w:r>
+        <w:rPr>
+          <w:rFonts w:ascii="Times New Roman" w:hAnsi="Times New Roman"/>
+          <w:b w:val="0"/>
+          <w:i w:val="0"/>
+          <w:sz w:val="24"/>
+        </w:rPr>
+        <w:t xml:space="preserve">15.  </w:t>
+      </w:r>
       <w:r>
         <w:rPr>
           <w:rFonts w:ascii="Times New Roman" w:hAnsi="Times New Roman"/>
@@ -26196,10 +26554,19 @@
     </w:p>
     <w:p>
       <w:pPr>
-        <w:pStyle w:val="ListNumber"/>
-        <w:spacing w:after="60"/>
+        <w:spacing w:line="360" w:lineRule="auto" w:after="80"/>
         <w:ind w:left="720" w:firstLine="0"/>
-      </w:pPr>
+        <w:jc w:val="both"/>
+      </w:pPr>
+      <w:r>
+        <w:rPr>
+          <w:rFonts w:ascii="Times New Roman" w:hAnsi="Times New Roman"/>
+          <w:b w:val="0"/>
+          <w:i w:val="0"/>
+          <w:sz w:val="24"/>
+        </w:rPr>
+        <w:t xml:space="preserve">16.  </w:t>
+      </w:r>
       <w:r>
         <w:rPr>
           <w:rFonts w:ascii="Times New Roman" w:hAnsi="Times New Roman"/>
@@ -26225,10 +26592,19 @@
     </w:p>
     <w:p>
       <w:pPr>
-        <w:pStyle w:val="ListNumber"/>
-        <w:spacing w:after="60"/>
+        <w:spacing w:line="360" w:lineRule="auto" w:after="80"/>
         <w:ind w:left="720" w:firstLine="0"/>
-      </w:pPr>
+        <w:jc w:val="both"/>
+      </w:pPr>
+      <w:r>
+        <w:rPr>
+          <w:rFonts w:ascii="Times New Roman" w:hAnsi="Times New Roman"/>
+          <w:b w:val="0"/>
+          <w:i w:val="0"/>
+          <w:sz w:val="24"/>
+        </w:rPr>
+        <w:t xml:space="preserve">17.  </w:t>
+      </w:r>
       <w:r>
         <w:rPr>
           <w:rFonts w:ascii="Times New Roman" w:hAnsi="Times New Roman"/>
@@ -26254,10 +26630,19 @@
     </w:p>
     <w:p>
       <w:pPr>
-        <w:pStyle w:val="ListNumber"/>
-        <w:spacing w:after="60"/>
+        <w:spacing w:line="360" w:lineRule="auto" w:after="80"/>
         <w:ind w:left="720" w:firstLine="0"/>
-      </w:pPr>
+        <w:jc w:val="both"/>
+      </w:pPr>
+      <w:r>
+        <w:rPr>
+          <w:rFonts w:ascii="Times New Roman" w:hAnsi="Times New Roman"/>
+          <w:b w:val="0"/>
+          <w:i w:val="0"/>
+          <w:sz w:val="24"/>
+        </w:rPr>
+        <w:t xml:space="preserve">18.  </w:t>
+      </w:r>
       <w:r>
         <w:rPr>
           <w:rFonts w:ascii="Times New Roman" w:hAnsi="Times New Roman"/>

</xml_diff>

<commit_message>
Remove fig5.1 firewall screenshot; renumber architecture figure to 5.1
</commit_message>
<xml_diff>
--- a/THESIS_VAPT_WORD.docx
+++ b/THESIS_VAPT_WORD.docx
@@ -24372,38 +24372,6 @@
     </w:p>
     <w:p>
       <w:pPr>
-        <w:ind w:firstLine="0"/>
-        <w:jc w:val="center"/>
-      </w:pPr>
-      <w:r>
-        <w:rPr>
-          <w:rFonts w:ascii="Times New Roman" w:hAnsi="Times New Roman"/>
-          <w:b w:val="0"/>
-          <w:i/>
-          <w:color w:val="808080"/>
-          <w:sz w:val="22"/>
-        </w:rPr>
-        <w:t>[PLACEHOLDER — Figure 5.1: Cloudways IP Whitelist firewall rules configuration]</w:t>
-      </w:r>
-    </w:p>
-    <w:p>
-      <w:pPr>
-        <w:spacing w:after="240"/>
-        <w:ind w:firstLine="0"/>
-        <w:jc w:val="center"/>
-      </w:pPr>
-      <w:r>
-        <w:rPr>
-          <w:rFonts w:ascii="Times New Roman" w:hAnsi="Times New Roman"/>
-          <w:b w:val="0"/>
-          <w:i/>
-          <w:sz w:val="20"/>
-        </w:rPr>
-        <w:t>Figure 5.1: Cloudways IP Whitelist firewall rules configuration</w:t>
-      </w:r>
-    </w:p>
-    <w:p>
-      <w:pPr>
         <w:pStyle w:val="Heading3"/>
         <w:jc w:val="left"/>
       </w:pPr>
@@ -24547,14 +24515,38 @@
         <w:jc w:val="center"/>
       </w:pPr>
       <w:r>
-        <w:rPr>
-          <w:rFonts w:ascii="Times New Roman" w:hAnsi="Times New Roman"/>
-          <w:b w:val="0"/>
-          <w:i/>
-          <w:color w:val="808080"/>
-          <w:sz w:val="22"/>
-        </w:rPr>
-        <w:t>[PLACEHOLDER — Figure 5.2: Recommended network security architecture]</w:t>
+        <w:drawing>
+          <wp:inline xmlns:a="http://schemas.openxmlformats.org/drawingml/2006/main" xmlns:pic="http://schemas.openxmlformats.org/drawingml/2006/picture">
+            <wp:extent cx="5040000" cy="4421977"/>
+            <wp:docPr id="38" name="Picture 38"/>
+            <wp:cNvGraphicFramePr>
+              <a:graphicFrameLocks noChangeAspect="1"/>
+            </wp:cNvGraphicFramePr>
+            <a:graphic>
+              <a:graphicData uri="http://schemas.openxmlformats.org/drawingml/2006/picture">
+                <pic:pic>
+                  <pic:nvPicPr>
+                    <pic:cNvPr id="0" name="recommended_architecture.png"/>
+                    <pic:cNvPicPr/>
+                  </pic:nvPicPr>
+                  <pic:blipFill>
+                    <a:blip r:embed="rId46"/>
+                    <a:stretch>
+                      <a:fillRect/>
+                    </a:stretch>
+                  </pic:blipFill>
+                  <pic:spPr>
+                    <a:xfrm>
+                      <a:off x="0" y="0"/>
+                      <a:ext cx="5040000" cy="4421977"/>
+                    </a:xfrm>
+                    <a:prstGeom prst="rect"/>
+                  </pic:spPr>
+                </pic:pic>
+              </a:graphicData>
+            </a:graphic>
+          </wp:inline>
+        </w:drawing>
       </w:r>
     </w:p>
     <w:p>
@@ -24570,7 +24562,7 @@
           <w:i/>
           <w:sz w:val="20"/>
         </w:rPr>
-        <w:t>Figure 5.2: Recommended network security architecture</w:t>
+        <w:t>Figure 5.1: Recommended network security architecture</w:t>
       </w:r>
     </w:p>
     <w:p>
@@ -26705,7 +26697,7 @@
         <w:drawing>
           <wp:inline xmlns:a="http://schemas.openxmlformats.org/drawingml/2006/main" xmlns:pic="http://schemas.openxmlformats.org/drawingml/2006/picture">
             <wp:extent cx="5040000" cy="3908898"/>
-            <wp:docPr id="38" name="Picture 38"/>
+            <wp:docPr id="39" name="Picture 39"/>
             <wp:cNvGraphicFramePr>
               <a:graphicFrameLocks noChangeAspect="1"/>
             </wp:cNvGraphicFramePr>
@@ -26833,7 +26825,7 @@
         <w:drawing>
           <wp:inline xmlns:a="http://schemas.openxmlformats.org/drawingml/2006/main" xmlns:pic="http://schemas.openxmlformats.org/drawingml/2006/picture">
             <wp:extent cx="5040000" cy="959680"/>
-            <wp:docPr id="39" name="Picture 39"/>
+            <wp:docPr id="40" name="Picture 40"/>
             <wp:cNvGraphicFramePr>
               <a:graphicFrameLocks noChangeAspect="1"/>
             </wp:cNvGraphicFramePr>
@@ -26845,7 +26837,7 @@
                     <pic:cNvPicPr/>
                   </pic:nvPicPr>
                   <pic:blipFill>
-                    <a:blip r:embed="rId46"/>
+                    <a:blip r:embed="rId47"/>
                     <a:stretch>
                       <a:fillRect/>
                     </a:stretch>
@@ -26937,7 +26929,7 @@
         <w:drawing>
           <wp:inline xmlns:a="http://schemas.openxmlformats.org/drawingml/2006/main" xmlns:pic="http://schemas.openxmlformats.org/drawingml/2006/picture">
             <wp:extent cx="5040000" cy="2583063"/>
-            <wp:docPr id="40" name="Picture 40"/>
+            <wp:docPr id="41" name="Picture 41"/>
             <wp:cNvGraphicFramePr>
               <a:graphicFrameLocks noChangeAspect="1"/>
             </wp:cNvGraphicFramePr>
@@ -26993,7 +26985,7 @@
         <w:drawing>
           <wp:inline xmlns:a="http://schemas.openxmlformats.org/drawingml/2006/main" xmlns:pic="http://schemas.openxmlformats.org/drawingml/2006/picture">
             <wp:extent cx="5040000" cy="2168250"/>
-            <wp:docPr id="41" name="Picture 41"/>
+            <wp:docPr id="42" name="Picture 42"/>
             <wp:cNvGraphicFramePr>
               <a:graphicFrameLocks noChangeAspect="1"/>
             </wp:cNvGraphicFramePr>
@@ -27104,7 +27096,7 @@
         <w:drawing>
           <wp:inline xmlns:a="http://schemas.openxmlformats.org/drawingml/2006/main" xmlns:pic="http://schemas.openxmlformats.org/drawingml/2006/picture">
             <wp:extent cx="5040000" cy="2313134"/>
-            <wp:docPr id="42" name="Picture 42"/>
+            <wp:docPr id="43" name="Picture 43"/>
             <wp:cNvGraphicFramePr>
               <a:graphicFrameLocks noChangeAspect="1"/>
             </wp:cNvGraphicFramePr>
@@ -27160,7 +27152,7 @@
         <w:drawing>
           <wp:inline xmlns:a="http://schemas.openxmlformats.org/drawingml/2006/main" xmlns:pic="http://schemas.openxmlformats.org/drawingml/2006/picture">
             <wp:extent cx="5040000" cy="533199"/>
-            <wp:docPr id="43" name="Picture 43"/>
+            <wp:docPr id="44" name="Picture 44"/>
             <wp:cNvGraphicFramePr>
               <a:graphicFrameLocks noChangeAspect="1"/>
             </wp:cNvGraphicFramePr>
@@ -27172,7 +27164,7 @@
                     <pic:cNvPicPr/>
                   </pic:nvPicPr>
                   <pic:blipFill>
-                    <a:blip r:embed="rId47"/>
+                    <a:blip r:embed="rId48"/>
                     <a:stretch>
                       <a:fillRect/>
                     </a:stretch>
@@ -27216,7 +27208,7 @@
         <w:drawing>
           <wp:inline xmlns:a="http://schemas.openxmlformats.org/drawingml/2006/main" xmlns:pic="http://schemas.openxmlformats.org/drawingml/2006/picture">
             <wp:extent cx="5040000" cy="998595"/>
-            <wp:docPr id="44" name="Picture 44"/>
+            <wp:docPr id="45" name="Picture 45"/>
             <wp:cNvGraphicFramePr>
               <a:graphicFrameLocks noChangeAspect="1"/>
             </wp:cNvGraphicFramePr>

</xml_diff>

<commit_message>
Shorten finding descriptions and remediations to 2-3 sentences each
</commit_message>
<xml_diff>
--- a/THESIS_VAPT_WORD.docx
+++ b/THESIS_VAPT_WORD.docx
@@ -20333,7 +20333,7 @@
           <w:rFonts w:ascii="Times New Roman" w:hAnsi="Times New Roman"/>
           <w:sz w:val="24"/>
         </w:rPr>
-        <w:t>Each finding is presented in a standardised format: a summary table showing severity, CVSS score, affected host, and tool used; a description of the vulnerability and its potential impact; a remediation recommendation; and an evidence reference.</w:t>
+        <w:t>Each finding is presented in a standardised format: a summary table showing severity, CVSS score, affected host, and tool used; a description of the vulnerability and its impact; a remediation recommendation; and an evidence reference.</w:t>
       </w:r>
     </w:p>
     <w:p>
@@ -20555,7 +20555,7 @@
           <w:rFonts w:ascii="Times New Roman" w:hAnsi="Times New Roman"/>
           <w:sz w:val="24"/>
         </w:rPr>
-        <w:t>The MySQL 8.0.43 database server is directly accessible from the public internet on port 3306, accepting full TCP connections from any external IP address. An attacker does not need to compromise the web application to reach the database — they can attempt authentication directly at the database layer, bypassing all application-level controls. Brute-force or credential-stuffing attacks against this port are possible with no rate limiting or IP-based blocking. If credentials are obtained, an attacker gains full read and write access to all application databases, potentially including user records, session data, and API secrets. MySQL's User Defined Function (UDF) feature could further be abused for remote command execution on the underlying server.</w:t>
+        <w:t>Port 3306 is open to the internet, allowing direct authentication attempts against MySQL without going through the web application. Successful credential guessing grants full read and write access to all databases, including user records, session data, and API secrets.</w:t>
       </w:r>
     </w:p>
     <w:p>
@@ -20598,7 +20598,7 @@
           <w:rFonts w:ascii="Times New Roman" w:hAnsi="Times New Roman"/>
           <w:sz w:val="24"/>
         </w:rPr>
-        <w:t xml:space="preserve"> or a trusted management VPN via firewall rules. Database ports must never be exposed to the public internet under any circumstances.</w:t>
+        <w:t xml:space="preserve"> or a trusted VPN only. Database ports must never be internet-facing.</w:t>
       </w:r>
     </w:p>
     <w:p>
@@ -20620,7 +20620,7 @@
           <w:rFonts w:ascii="Times New Roman" w:hAnsi="Times New Roman"/>
           <w:sz w:val="24"/>
         </w:rPr>
-        <w:t xml:space="preserve"> Figure 4.9 — Nmap scan output confirming 3306/tcp open mysql MySQL 8.0.43</w:t>
+        <w:t xml:space="preserve"> Figure 4.9 — Nmap scan confirming 3306/tcp open mysql MySQL 8.0.43</w:t>
       </w:r>
     </w:p>
     <w:p>
@@ -20842,7 +20842,7 @@
           <w:rFonts w:ascii="Times New Roman" w:hAnsi="Times New Roman"/>
           <w:sz w:val="24"/>
         </w:rPr>
-        <w:t xml:space="preserve">The MikroTik RouterOS web configuration interface is publicly accessible on port 9001, returning HTTP 200 with a fully rendered login page. The login form pre-fills </w:t>
+        <w:t xml:space="preserve">The MikroTik RouterOS admin interface is accessible from any IP on port 9001, pre-filling </w:t>
       </w:r>
       <w:r>
         <w:rPr>
@@ -20856,21 +20856,7 @@
           <w:rFonts w:ascii="Times New Roman" w:hAnsi="Times New Roman"/>
           <w:sz w:val="24"/>
         </w:rPr>
-        <w:t xml:space="preserve"> as the default username. MikroTik devices ship with a factory default of </w:t>
-      </w:r>
-      <w:r>
-        <w:rPr>
-          <w:rFonts w:ascii="Courier New" w:hAnsi="Courier New"/>
-          <w:sz w:val="22"/>
-        </w:rPr>
-        <w:t>admin</w:t>
-      </w:r>
-      <w:r>
-        <w:rPr>
-          <w:rFonts w:ascii="Times New Roman" w:hAnsi="Times New Roman"/>
-          <w:sz w:val="24"/>
-        </w:rPr>
-        <w:t xml:space="preserve"> / blank password — if this default has not been changed, full network device control is available without any credential knowledge. An attacker with RouterOS access can modify routing tables, capture all network traffic in promiscuous mode, create persistent backdoor accounts, remove firewall rules, and disrupt all hosted services on the network.</w:t>
+        <w:t xml:space="preserve"> as the default username. If the factory default blank password has not been changed, an attacker gains full network device control — routing tables, firewall rules, and live traffic capture.</w:t>
       </w:r>
     </w:p>
     <w:p>
@@ -20899,7 +20885,7 @@
           <w:rFonts w:ascii="Times New Roman" w:hAnsi="Times New Roman"/>
           <w:sz w:val="24"/>
         </w:rPr>
-        <w:t>Restrict port 9001 to a trusted management IP via firewall. Change MikroTik default credentials immediately. Disable all unused RouterOS services including telnet, FTP, and the API service.</w:t>
+        <w:t>Restrict port 9001 to a trusted management IP. Change MikroTik default credentials and disable unused services (telnet, FTP, API).</w:t>
       </w:r>
     </w:p>
     <w:p>
@@ -20921,7 +20907,7 @@
           <w:rFonts w:ascii="Times New Roman" w:hAnsi="Times New Roman"/>
           <w:sz w:val="24"/>
         </w:rPr>
-        <w:t xml:space="preserve"> Figure 4.11 — curl response showing RouterOS router configuration page</w:t>
+        <w:t xml:space="preserve"> Figure 4.11 — curl response confirming RouterOS login page on port 9001</w:t>
       </w:r>
     </w:p>
     <w:p>
@@ -21143,7 +21129,7 @@
           <w:rFonts w:ascii="Times New Roman" w:hAnsi="Times New Roman"/>
           <w:sz w:val="24"/>
         </w:rPr>
-        <w:t>The cPanel web hosting control panel is publicly accessible on port 2083 with no IP restriction and no two-factor authentication prompt. cPanel provides complete management of the hosting account: a file manager with read and write access to all web application files, database management via phpMyAdmin, email account control, FTP credential creation, and subdomain configuration. A password reset link is present on the login page — if an attacker can compromise the registered email account, they can reset the cPanel password and gain full hosting access without brute force.</w:t>
+        <w:t>The cPanel hosting panel is accessible on port 2083 with no IP restriction or two-factor authentication. Access grants full control of hosted files, databases, email accounts, and FTP credentials.</w:t>
       </w:r>
     </w:p>
     <w:p>
@@ -21172,7 +21158,7 @@
           <w:rFonts w:ascii="Times New Roman" w:hAnsi="Times New Roman"/>
           <w:sz w:val="24"/>
         </w:rPr>
-        <w:t>Restrict port 2083 to trusted management IPs via Cloudways firewall. Enable two-factor authentication on cPanel immediately.</w:t>
+        <w:t>Restrict port 2083 to trusted management IPs via Cloudways firewall and enable two-factor authentication on cPanel immediately.</w:t>
       </w:r>
     </w:p>
     <w:p>
@@ -21416,7 +21402,7 @@
           <w:rFonts w:ascii="Times New Roman" w:hAnsi="Times New Roman"/>
           <w:sz w:val="24"/>
         </w:rPr>
-        <w:t>WHM (Web Host Manager) is the root-level server administration panel for cPanel-based servers. It is publicly accessible on port 2087 with no IP restriction, no two-factor authentication, and no account lockout policy. WHM access is functionally equivalent to root shell access: it provides a built-in Terminal feature, the ability to create and manage all cPanel accounts on the server, root-level database access, and full server configuration control. An attacker who gains WHM access compromises not only neuralsh.com but every other domain hosted on the shared server simultaneously. This is the highest-severity finding in the engagement, receiving the maximum CVSS score of 10.0.</w:t>
+        <w:t>WHM (Web Host Manager) is the root-level server admin panel, accessible on port 2087 with no IP restriction, no two-factor authentication, and no lockout. WHM provides a built-in terminal (root shell), full cPanel account management, and database access — a single compromise exposes every domain hosted on the server. This is the highest-severity finding in the engagement (CVSS 10.0).</w:t>
       </w:r>
     </w:p>
     <w:p>
@@ -21445,7 +21431,7 @@
           <w:rFonts w:ascii="Times New Roman" w:hAnsi="Times New Roman"/>
           <w:sz w:val="24"/>
         </w:rPr>
-        <w:t>Immediately restrict port 2087 to trusted management IPs only via Cloudways firewall. Enable two-factor authentication on the WHM root account. This single configuration change eliminates the highest-risk attack vector in the entire engagement.</w:t>
+        <w:t>Restrict port 2087 to trusted IPs via Cloudways firewall and enable two-factor authentication. This single change eliminates the highest-risk attack vector in the engagement.</w:t>
       </w:r>
     </w:p>
     <w:p>
@@ -21689,21 +21675,7 @@
           <w:rFonts w:ascii="Times New Roman" w:hAnsi="Times New Roman"/>
           <w:sz w:val="24"/>
         </w:rPr>
-        <w:t>OpenSSH 8.9p1 is publicly accessible on port 22. SSH key-based authentication was confirmed as the enforced method for tested usernames, which reduces the immediate risk. However, the port remains exposed to brute-force attempts for any account that may have password authentication enabled. The server banner (</w:t>
-      </w:r>
-      <w:r>
-        <w:rPr>
-          <w:rFonts w:ascii="Courier New" w:hAnsi="Courier New"/>
-          <w:sz w:val="22"/>
-        </w:rPr>
-        <w:t>163-47-172-131.cprapid.com</w:t>
-      </w:r>
-      <w:r>
-        <w:rPr>
-          <w:rFonts w:ascii="Times New Roman" w:hAnsi="Times New Roman"/>
-          <w:sz w:val="24"/>
-        </w:rPr>
-        <w:t>) identified this as a cPanel shared hosting server where the primary user typically holds sudo privileges, making successful SSH compromise equivalent to root access.</w:t>
+        <w:t>OpenSSH 8.9p1 is accessible on port 22. Key-based authentication was confirmed for tested accounts, reducing immediate brute-force risk. However, any account with password authentication enabled remains vulnerable, and successful SSH access on a shared cPanel server is equivalent to root.</w:t>
       </w:r>
     </w:p>
     <w:p>
@@ -21760,7 +21732,7 @@
           <w:rFonts w:ascii="Times New Roman" w:hAnsi="Times New Roman"/>
           <w:sz w:val="24"/>
         </w:rPr>
-        <w:t>. Install fail2ban with aggressive lockout thresholds. Restrict SSH access to a trusted management IP via firewall. Change the default SSH port to reduce automated scanning noise.</w:t>
+        <w:t>, install fail2ban, and restrict port 22 to a trusted management IP.</w:t>
       </w:r>
     </w:p>
     <w:p>
@@ -22004,7 +21976,7 @@
           <w:rFonts w:ascii="Times New Roman" w:hAnsi="Times New Roman"/>
           <w:sz w:val="24"/>
         </w:rPr>
-        <w:t xml:space="preserve">The origin server is a shared cPanel hosting environment (Cloudways / cprapid.com) that hosts multiple client accounts on the same physical server. SSL certificates issued to </w:t>
+        <w:t xml:space="preserve">The origin server is a shared cPanel environment (Cloudways / cprapid.com) hosting multiple tenants, confirmed by SSL certificates issued to </w:t>
       </w:r>
       <w:r>
         <w:rPr>
@@ -22032,7 +22004,7 @@
           <w:rFonts w:ascii="Times New Roman" w:hAnsi="Times New Roman"/>
           <w:sz w:val="24"/>
         </w:rPr>
-        <w:t xml:space="preserve"> confirmed the presence of other tenants. On shared cPanel hosting, a single WHM-level compromise grants an attacker access to the files, databases, and email of every co-hosted account simultaneously. A compromise of neuralsh.com's hosting account could therefore constitute a data breach affecting third-party organisations that have no relationship with neuralsh.com and no visibility into its security posture.</w:t>
+        <w:t>. A single WHM-level compromise exposes all co-hosted accounts — their files, databases, and email — simultaneously.</w:t>
       </w:r>
     </w:p>
     <w:p>
@@ -22061,7 +22033,7 @@
           <w:rFonts w:ascii="Times New Roman" w:hAnsi="Times New Roman"/>
           <w:sz w:val="24"/>
         </w:rPr>
-        <w:t>Migrate neuralsh.com to a dedicated server or isolated cloud instance. As an immediate interim measure, restrict WHM access to trusted IPs to remove the most direct lateral movement path.</w:t>
+        <w:t>Migrate neuralsh.com to dedicated or isolated hosting. As an immediate step, restrict WHM to trusted IPs to eliminate the direct lateral movement path.</w:t>
       </w:r>
     </w:p>
     <w:p>
@@ -22083,7 +22055,7 @@
           <w:rFonts w:ascii="Times New Roman" w:hAnsi="Times New Roman"/>
           <w:sz w:val="24"/>
         </w:rPr>
-        <w:t xml:space="preserve"> Figure 4.8 — SSL certificate disclosing onesala.com and endoncambodia.com on the same origin server</w:t>
+        <w:t xml:space="preserve"> Figure 4.8 — SSL certificate disclosing co-tenant domains on the same origin server</w:t>
       </w:r>
     </w:p>
     <w:p>
@@ -22098,7 +22070,7 @@
           <w:i w:val="0"/>
           <w:sz w:val="24"/>
         </w:rPr>
-        <w:t>N-005: Rate Limit Bypass via X-Forwarded-For Header Spoofing</w:t>
+        <w:t>N-005: Rate Limit Bypass via X-Forwarded-For Spoofing</w:t>
       </w:r>
     </w:p>
     <w:tbl>
@@ -22305,7 +22277,7 @@
           <w:rFonts w:ascii="Times New Roman" w:hAnsi="Times New Roman"/>
           <w:sz w:val="24"/>
         </w:rPr>
-        <w:t xml:space="preserve">The application's rate-limiting mechanism uses the client-supplied </w:t>
+        <w:t xml:space="preserve">The rate limiter uses the client-controlled </w:t>
       </w:r>
       <w:r>
         <w:rPr>
@@ -22319,35 +22291,7 @@
           <w:rFonts w:ascii="Times New Roman" w:hAnsi="Times New Roman"/>
           <w:sz w:val="24"/>
         </w:rPr>
-        <w:t xml:space="preserve"> header as the identifier for tracking request rates per source IP. Because </w:t>
-      </w:r>
-      <w:r>
-        <w:rPr>
-          <w:rFonts w:ascii="Courier New" w:hAnsi="Courier New"/>
-          <w:sz w:val="22"/>
-        </w:rPr>
-        <w:t>X-Forwarded-For</w:t>
-      </w:r>
-      <w:r>
-        <w:rPr>
-          <w:rFonts w:ascii="Times New Roman" w:hAnsi="Times New Roman"/>
-          <w:sz w:val="24"/>
-        </w:rPr>
-        <w:t xml:space="preserve"> is fully controllable by the client, an attacker can supply a different random IP value on each request, making every request appear to originate from a unique source. Exploitation was confirmed with a 100% success rate: 50 consecutive requests were sent with rotating </w:t>
-      </w:r>
-      <w:r>
-        <w:rPr>
-          <w:rFonts w:ascii="Courier New" w:hAnsi="Courier New"/>
-          <w:sz w:val="22"/>
-        </w:rPr>
-        <w:t>X-Forwarded-For</w:t>
-      </w:r>
-      <w:r>
-        <w:rPr>
-          <w:rFonts w:ascii="Times New Roman" w:hAnsi="Times New Roman"/>
-          <w:sz w:val="24"/>
-        </w:rPr>
-        <w:t xml:space="preserve"> values and all 50 received HTTP 200 responses — not a single rate-limit response was returned. This bypass applies to any endpoint on the platform that relies on the same IP-tracking logic, not only the token endpoint.</w:t>
+        <w:t xml:space="preserve"> header as the source IP identifier. By rotating a different IP value on each request, all 50 test requests received HTTP 200 — a 100% bypass rate with zero rate-limit responses returned.</w:t>
       </w:r>
     </w:p>
     <w:p>
@@ -22404,21 +22348,21 @@
           <w:rFonts w:ascii="Times New Roman" w:hAnsi="Times New Roman"/>
           <w:sz w:val="24"/>
         </w:rPr>
-        <w:t xml:space="preserve"> header for all rate-limiting logic. The </w:t>
+        <w:t xml:space="preserve"> header for all rate-limiting logic. Unlike </w:t>
       </w:r>
       <w:r>
         <w:rPr>
           <w:rFonts w:ascii="Courier New" w:hAnsi="Courier New"/>
           <w:sz w:val="22"/>
         </w:rPr>
-        <w:t>CF-Connecting-IP</w:t>
-      </w:r>
-      <w:r>
-        <w:rPr>
-          <w:rFonts w:ascii="Times New Roman" w:hAnsi="Times New Roman"/>
-          <w:sz w:val="24"/>
-        </w:rPr>
-        <w:t xml:space="preserve"> header is set by Cloudflare at the edge and cannot be modified by the client.</w:t>
+        <w:t>X-Forwarded-For</w:t>
+      </w:r>
+      <w:r>
+        <w:rPr>
+          <w:rFonts w:ascii="Times New Roman" w:hAnsi="Times New Roman"/>
+          <w:sz w:val="24"/>
+        </w:rPr>
+        <w:t>, this header is set by Cloudflare and cannot be spoofed by the client.</w:t>
       </w:r>
     </w:p>
     <w:p>
@@ -22440,7 +22384,7 @@
           <w:rFonts w:ascii="Times New Roman" w:hAnsi="Times New Roman"/>
           <w:sz w:val="24"/>
         </w:rPr>
-        <w:t xml:space="preserve"> Figure 4.15 — Rate limit bypass results showing 50/50 successful token requests with zero rate-limit responses</w:t>
+        <w:t xml:space="preserve"> Figure 4.15 — 50/50 requests bypassed rate limiting successfully</w:t>
       </w:r>
     </w:p>
     <w:p>
@@ -22660,21 +22604,21 @@
           <w:rFonts w:ascii="Times New Roman" w:hAnsi="Times New Roman"/>
           <w:sz w:val="24"/>
         </w:rPr>
-        <w:t xml:space="preserve">The token endpoint issues a valid signed JWT token to any unauthenticated caller with no credentials, API key, device fingerprint, or identifying information required. Tokens carry a </w:t>
+        <w:t xml:space="preserve">The </w:t>
       </w:r>
       <w:r>
         <w:rPr>
           <w:rFonts w:ascii="Courier New" w:hAnsi="Courier New"/>
           <w:sz w:val="22"/>
         </w:rPr>
-        <w:t>type: guest</w:t>
-      </w:r>
-      <w:r>
-        <w:rPr>
-          <w:rFonts w:ascii="Times New Roman" w:hAnsi="Times New Roman"/>
-          <w:sz w:val="24"/>
-        </w:rPr>
-        <w:t xml:space="preserve"> claim and a 30-minute validity window. Using the rate-limit bypass from N-005, 50 valid tokens were farmed in approximately three seconds. Each token granted real API access to search and category endpoints. JWT secret brute-force was attempted against the rockyou.txt wordlist (14,344,391 candidates) — the secret was not recovered, indicating adequate entropy. However, the token farming capability is independent of the secret strength.</w:t>
+        <w:t>/web/v1/init/token</w:t>
+      </w:r>
+      <w:r>
+        <w:rPr>
+          <w:rFonts w:ascii="Times New Roman" w:hAnsi="Times New Roman"/>
+          <w:sz w:val="24"/>
+        </w:rPr>
+        <w:t xml:space="preserve"> endpoint issues a signed JWT to any caller — no credentials, API key, or fingerprint required. Combined with the N-005 rate-limit bypass, 50 valid tokens were farmed in approximately three seconds, each granting real API access.</w:t>
       </w:r>
     </w:p>
     <w:p>
@@ -22703,7 +22647,7 @@
           <w:rFonts w:ascii="Times New Roman" w:hAnsi="Times New Roman"/>
           <w:sz w:val="24"/>
         </w:rPr>
-        <w:t>Require a browser-computed fingerprint, Cloudflare Turnstile challenge, or strict origin header validation before issuing guest tokens. Implement token binding to prevent tokens from being replayed outside the originating browser session.</w:t>
+        <w:t>Require a Cloudflare Turnstile challenge or browser fingerprint before issuing tokens, and implement token binding to the originating session.</w:t>
       </w:r>
     </w:p>
     <w:p>
@@ -22725,7 +22669,7 @@
           <w:rFonts w:ascii="Times New Roman" w:hAnsi="Times New Roman"/>
           <w:sz w:val="24"/>
         </w:rPr>
-        <w:t xml:space="preserve"> Figure 4.15 — 50 tokens farmed via rate-limit bypass; Figure 4.16 — JWT endpoint confirmed live (HTTP 200)</w:t>
+        <w:t xml:space="preserve"> Figure 4.15 — 50 tokens farmed; Figure 4.16 — endpoint confirmed live (HTTP 200)</w:t>
       </w:r>
     </w:p>
     <w:p>
@@ -22945,7 +22889,7 @@
           <w:rFonts w:ascii="Times New Roman" w:hAnsi="Times New Roman"/>
           <w:sz w:val="24"/>
         </w:rPr>
-        <w:t xml:space="preserve">The complete API route structure of the application is disclosed in the compiled Nuxt.js JavaScript bundle, which is publicly accessible without authentication. Routes including </w:t>
+        <w:t xml:space="preserve">All API routes are embedded in the public Nuxt.js JavaScript bundle. Routes including </w:t>
       </w:r>
       <w:r>
         <w:rPr>
@@ -22973,27 +22917,13 @@
           <w:rFonts w:ascii="Times New Roman" w:hAnsi="Times New Roman"/>
           <w:sz w:val="24"/>
         </w:rPr>
-        <w:t xml:space="preserve">, </w:t>
+        <w:t xml:space="preserve">, and </w:t>
       </w:r>
       <w:r>
         <w:rPr>
           <w:rFonts w:ascii="Courier New" w:hAnsi="Courier New"/>
           <w:sz w:val="22"/>
         </w:rPr>
-        <w:t>/web/v1/image/search</w:t>
-      </w:r>
-      <w:r>
-        <w:rPr>
-          <w:rFonts w:ascii="Times New Roman" w:hAnsi="Times New Roman"/>
-          <w:sz w:val="24"/>
-        </w:rPr>
-        <w:t xml:space="preserve">, </w:t>
-      </w:r>
-      <w:r>
-        <w:rPr>
-          <w:rFonts w:ascii="Courier New" w:hAnsi="Courier New"/>
-          <w:sz w:val="22"/>
-        </w:rPr>
         <w:t>/web/v1/report/save</w:t>
       </w:r>
       <w:r>
@@ -23001,21 +22931,7 @@
           <w:rFonts w:ascii="Times New Roman" w:hAnsi="Times New Roman"/>
           <w:sz w:val="24"/>
         </w:rPr>
-        <w:t xml:space="preserve">, and </w:t>
-      </w:r>
-      <w:r>
-        <w:rPr>
-          <w:rFonts w:ascii="Courier New" w:hAnsi="Courier New"/>
-          <w:sz w:val="22"/>
-        </w:rPr>
-        <w:t>/api/geocode</w:t>
-      </w:r>
-      <w:r>
-        <w:rPr>
-          <w:rFonts w:ascii="Times New Roman" w:hAnsi="Times New Roman"/>
-          <w:sz w:val="24"/>
-        </w:rPr>
-        <w:t xml:space="preserve"> were extracted directly from the bundle. This reconnaissance eliminated the need for directory brute-force and directly enabled the targeted exploitation of the token endpoint described in N-005 and N-007.</w:t>
+        <w:t xml:space="preserve"> were extracted without authentication, eliminating the need for directory brute-force and enabling targeted exploitation of N-005 and N-007.</w:t>
       </w:r>
     </w:p>
     <w:p>
@@ -23044,7 +22960,7 @@
           <w:rFonts w:ascii="Times New Roman" w:hAnsi="Times New Roman"/>
           <w:sz w:val="24"/>
         </w:rPr>
-        <w:t>Minimise unnecessary route exposure within the compiled bundle. Implement an API gateway with strict allowlisting for permitted routes and methods. All API endpoints should be secured at the application layer rather than treated as hidden.</w:t>
+        <w:t>Minimise route exposure in the compiled bundle and implement an API gateway with strict allowlisting. Treat all API endpoints as publicly known and secure them at the application layer.</w:t>
       </w:r>
     </w:p>
     <w:p>
@@ -23066,7 +22982,7 @@
           <w:rFonts w:ascii="Times New Roman" w:hAnsi="Times New Roman"/>
           <w:sz w:val="24"/>
         </w:rPr>
-        <w:t xml:space="preserve"> API route extraction from </w:t>
+        <w:t xml:space="preserve"> API routes extracted from </w:t>
       </w:r>
       <w:r>
         <w:rPr>
@@ -23300,7 +23216,7 @@
           <w:rFonts w:ascii="Times New Roman" w:hAnsi="Times New Roman"/>
           <w:sz w:val="24"/>
         </w:rPr>
-        <w:t xml:space="preserve">The SSL certificate served on the backend server's HTTPS port is issued to </w:t>
+        <w:t xml:space="preserve">The origin server's HTTPS certificate is issued to </w:t>
       </w:r>
       <w:r>
         <w:rPr>
@@ -23314,7 +23230,7 @@
           <w:rFonts w:ascii="Times New Roman" w:hAnsi="Times New Roman"/>
           <w:sz w:val="24"/>
         </w:rPr>
-        <w:t xml:space="preserve">, not to neuralsh.com. Mail service certificates are issued to </w:t>
+        <w:t xml:space="preserve">, not neuralsh.com, and mail certificates belong to </w:t>
       </w:r>
       <w:r>
         <w:rPr>
@@ -23328,7 +23244,7 @@
           <w:rFonts w:ascii="Times New Roman" w:hAnsi="Times New Roman"/>
           <w:sz w:val="24"/>
         </w:rPr>
-        <w:t>. Any client connecting directly to the origin IP receives a certificate mismatch warning, confirming that infrastructure-level SSL management has not been maintained. This finding corroborates N-004 (Shared Hosting Lateral Movement Risk) and provides additional evidence that multiple tenants share this origin server.</w:t>
+        <w:t>. Clients connecting directly to the origin IP receive a certificate mismatch warning, confirming SSL management has not been maintained for this shared hosting environment.</w:t>
       </w:r>
     </w:p>
     <w:p>
@@ -23357,7 +23273,7 @@
           <w:rFonts w:ascii="Times New Roman" w:hAnsi="Times New Roman"/>
           <w:sz w:val="24"/>
         </w:rPr>
-        <w:t>Issue a dedicated SSL certificate for the neuralsh.com domain at the origin server level. Ensure each hosted domain has its own certificate or that the shared server certificate covers all hosted domains as Subject Alternative Names (SANs).</w:t>
+        <w:t>Issue a dedicated SSL certificate for neuralsh.com at the origin server level, or ensure the server certificate covers all hosted domains as Subject Alternative Names (SANs).</w:t>
       </w:r>
     </w:p>
     <w:p>
@@ -23379,7 +23295,7 @@
           <w:rFonts w:ascii="Times New Roman" w:hAnsi="Times New Roman"/>
           <w:sz w:val="24"/>
         </w:rPr>
-        <w:t xml:space="preserve"> Figure 4.8 — openssl output showing certificate subject mismatch on origin IP</w:t>
+        <w:t xml:space="preserve"> Figure 4.8 — openssl output showing certificate subject mismatch</w:t>
       </w:r>
     </w:p>
     <w:p>
@@ -23599,7 +23515,7 @@
           <w:rFonts w:ascii="Times New Roman" w:hAnsi="Times New Roman"/>
           <w:sz w:val="24"/>
         </w:rPr>
-        <w:t xml:space="preserve">The Content-Security-Policy header on the main application includes </w:t>
+        <w:t xml:space="preserve">The Content-Security-Policy header includes </w:t>
       </w:r>
       <w:r>
         <w:rPr>
@@ -23613,7 +23529,7 @@
           <w:rFonts w:ascii="Times New Roman" w:hAnsi="Times New Roman"/>
           <w:sz w:val="24"/>
         </w:rPr>
-        <w:t xml:space="preserve"> in the </w:t>
+        <w:t xml:space="preserve"> in </w:t>
       </w:r>
       <w:r>
         <w:rPr>
@@ -23627,21 +23543,7 @@
           <w:rFonts w:ascii="Times New Roman" w:hAnsi="Times New Roman"/>
           <w:sz w:val="24"/>
         </w:rPr>
-        <w:t xml:space="preserve"> directive. This instructs the browser to permit execution of all inline JavaScript, including dynamically injected </w:t>
-      </w:r>
-      <w:r>
-        <w:rPr>
-          <w:rFonts w:ascii="Courier New" w:hAnsi="Courier New"/>
-          <w:sz w:val="22"/>
-        </w:rPr>
-        <w:t>&lt;script&gt;</w:t>
-      </w:r>
-      <w:r>
-        <w:rPr>
-          <w:rFonts w:ascii="Times New Roman" w:hAnsi="Times New Roman"/>
-          <w:sz w:val="24"/>
-        </w:rPr>
-        <w:t xml:space="preserve"> blocks and event handler attributes. If a Cross-Site Scripting (XSS) vulnerability exists anywhere in the application, the CSP provides no meaningful barrier against inline script injection attacks.</w:t>
+        <w:t>, allowing execution of any inline JavaScript. If an XSS vulnerability exists anywhere in the application, this CSP setting provides no protection against inline script injection.</w:t>
       </w:r>
     </w:p>
     <w:p>
@@ -23684,21 +23586,7 @@
           <w:rFonts w:ascii="Times New Roman" w:hAnsi="Times New Roman"/>
           <w:sz w:val="24"/>
         </w:rPr>
-        <w:t xml:space="preserve"> with per-request cryptographic nonces (</w:t>
-      </w:r>
-      <w:r>
-        <w:rPr>
-          <w:rFonts w:ascii="Courier New" w:hAnsi="Courier New"/>
-          <w:sz w:val="22"/>
-        </w:rPr>
-        <w:t>'nonce-{nonce}'</w:t>
-      </w:r>
-      <w:r>
-        <w:rPr>
-          <w:rFonts w:ascii="Times New Roman" w:hAnsi="Times New Roman"/>
-          <w:sz w:val="24"/>
-        </w:rPr>
-        <w:t>). Nuxt.js provides built-in CSP nonce support through its security plugin, making this change straightforward to implement.</w:t>
+        <w:t xml:space="preserve"> with per-request nonces using Nuxt.js's built-in CSP nonce support.</w:t>
       </w:r>
     </w:p>
     <w:p>
@@ -23727,7 +23615,7 @@
           <w:rFonts w:ascii="Courier New" w:hAnsi="Courier New"/>
           <w:sz w:val="22"/>
         </w:rPr>
-        <w:t>Content-Security-Policy: script-src 'self' 'unsafe-inline'</w:t>
+        <w:t>script-src 'self' 'unsafe-inline'</w:t>
       </w:r>
     </w:p>
     <w:p>
@@ -23947,27 +23835,13 @@
           <w:rFonts w:ascii="Times New Roman" w:hAnsi="Times New Roman"/>
           <w:sz w:val="24"/>
         </w:rPr>
-        <w:t xml:space="preserve">A wildcard DNS record is configured for </w:t>
+        <w:t xml:space="preserve">A wildcard DNS record routes any subdomain of neuralsh.com to 103.16.62.217. Attackers can use convincing subdomains such as </w:t>
       </w:r>
       <w:r>
         <w:rPr>
           <w:rFonts w:ascii="Courier New" w:hAnsi="Courier New"/>
           <w:sz w:val="22"/>
         </w:rPr>
-        <w:t>*.neuralsh.com</w:t>
-      </w:r>
-      <w:r>
-        <w:rPr>
-          <w:rFonts w:ascii="Times New Roman" w:hAnsi="Times New Roman"/>
-          <w:sz w:val="24"/>
-        </w:rPr>
-        <w:t xml:space="preserve">, causing any arbitrary subdomain to resolve to 103.16.62.217. This allows an attacker or phishing actor to construct convincing subdomain URLs such as </w:t>
-      </w:r>
-      <w:r>
-        <w:rPr>
-          <w:rFonts w:ascii="Courier New" w:hAnsi="Courier New"/>
-          <w:sz w:val="22"/>
-        </w:rPr>
         <w:t>login.neuralsh.com</w:t>
       </w:r>
       <w:r>
@@ -23975,21 +23849,7 @@
           <w:rFonts w:ascii="Times New Roman" w:hAnsi="Times New Roman"/>
           <w:sz w:val="24"/>
         </w:rPr>
-        <w:t xml:space="preserve"> or </w:t>
-      </w:r>
-      <w:r>
-        <w:rPr>
-          <w:rFonts w:ascii="Courier New" w:hAnsi="Courier New"/>
-          <w:sz w:val="22"/>
-        </w:rPr>
-        <w:t>secure.neuralsh.com</w:t>
-      </w:r>
-      <w:r>
-        <w:rPr>
-          <w:rFonts w:ascii="Times New Roman" w:hAnsi="Times New Roman"/>
-          <w:sz w:val="24"/>
-        </w:rPr>
-        <w:t xml:space="preserve"> — subdomains that resolve to a real, registered IP address and thereby increase the credibility of phishing campaigns targeting neuralsh.com users.</w:t>
+        <w:t xml:space="preserve"> in phishing campaigns that resolve to a real IP address, increasing their credibility.</w:t>
       </w:r>
     </w:p>
     <w:p>
@@ -24018,7 +23878,7 @@
           <w:rFonts w:ascii="Times New Roman" w:hAnsi="Times New Roman"/>
           <w:sz w:val="24"/>
         </w:rPr>
-        <w:t>Remove the wildcard DNS record from Cloudflare. Replace it with explicit A records for only the legitimate subdomains required by the business (</w:t>
+        <w:t xml:space="preserve">Remove the wildcard DNS record from Cloudflare and define only explicit records for legitimate subdomains such as </w:t>
       </w:r>
       <w:r>
         <w:rPr>
@@ -24032,21 +23892,7 @@
           <w:rFonts w:ascii="Times New Roman" w:hAnsi="Times New Roman"/>
           <w:sz w:val="24"/>
         </w:rPr>
-        <w:t xml:space="preserve">, </w:t>
-      </w:r>
-      <w:r>
-        <w:rPr>
-          <w:rFonts w:ascii="Courier New" w:hAnsi="Courier New"/>
-          <w:sz w:val="22"/>
-        </w:rPr>
-        <w:t>www.neuralsh.com</w:t>
-      </w:r>
-      <w:r>
-        <w:rPr>
-          <w:rFonts w:ascii="Times New Roman" w:hAnsi="Times New Roman"/>
-          <w:sz w:val="24"/>
-        </w:rPr>
-        <w:t>).</w:t>
+        <w:t>.</w:t>
       </w:r>
     </w:p>
     <w:p>
@@ -24288,7 +24134,7 @@
           <w:rFonts w:ascii="Times New Roman" w:hAnsi="Times New Roman"/>
           <w:sz w:val="24"/>
         </w:rPr>
-        <w:t xml:space="preserve">Apache's directory listing feature is enabled at the document root for the neuralsh.com virtual host. A direct HTTP request to the origin IP returns an </w:t>
+        <w:t xml:space="preserve">Apache directory listing is enabled on the origin server, returning an </w:t>
       </w:r>
       <w:r>
         <w:rPr>
@@ -24302,7 +24148,7 @@
           <w:rFonts w:ascii="Times New Roman" w:hAnsi="Times New Roman"/>
           <w:sz w:val="24"/>
         </w:rPr>
-        <w:t xml:space="preserve"> page, listing all files present in the web root along with modification timestamps. While the directory was empty at the time of testing, any deployed application files would be enumerated, providing a full directory map to an attacker without any scanning.</w:t>
+        <w:t xml:space="preserve"> page for direct HTTP requests. Any deployed application files would be listed with filenames and modification timestamps, providing a full directory map without scanning.</w:t>
       </w:r>
     </w:p>
     <w:p>
@@ -24345,7 +24191,7 @@
           <w:rFonts w:ascii="Times New Roman" w:hAnsi="Times New Roman"/>
           <w:sz w:val="24"/>
         </w:rPr>
-        <w:t xml:space="preserve"> to the Apache virtual host configuration or to a </w:t>
+        <w:t xml:space="preserve"> to the Apache configuration or a </w:t>
       </w:r>
       <w:r>
         <w:rPr>
@@ -24359,7 +24205,7 @@
           <w:rFonts w:ascii="Times New Roman" w:hAnsi="Times New Roman"/>
           <w:sz w:val="24"/>
         </w:rPr>
-        <w:t xml:space="preserve"> file in the document root. Verify that this directive is applied to all virtual hosts on the server.</w:t>
+        <w:t xml:space="preserve"> file in the document root.</w:t>
       </w:r>
     </w:p>
     <w:p>
@@ -24615,35 +24461,21 @@
           <w:rFonts w:ascii="Times New Roman" w:hAnsi="Times New Roman"/>
           <w:sz w:val="24"/>
         </w:rPr>
-        <w:t xml:space="preserve">HTTP redirects from ports 2077 and 2082 on the origin server redirect explicitly to </w:t>
+        <w:t xml:space="preserve">HTTP redirects from ports 2077 and 2082 explicitly name </w:t>
       </w:r>
       <w:r>
         <w:rPr>
           <w:rFonts w:ascii="Courier New" w:hAnsi="Courier New"/>
           <w:sz w:val="22"/>
         </w:rPr>
-        <w:t>www.onesala.com:2078</w:t>
-      </w:r>
-      <w:r>
-        <w:rPr>
-          <w:rFonts w:ascii="Times New Roman" w:hAnsi="Times New Roman"/>
-          <w:sz w:val="24"/>
-        </w:rPr>
-        <w:t xml:space="preserve"> and </w:t>
-      </w:r>
-      <w:r>
-        <w:rPr>
-          <w:rFonts w:ascii="Courier New" w:hAnsi="Courier New"/>
-          <w:sz w:val="22"/>
-        </w:rPr>
-        <w:t>www.onesala.com:2083</w:t>
-      </w:r>
-      <w:r>
-        <w:rPr>
-          <w:rFonts w:ascii="Times New Roman" w:hAnsi="Times New Roman"/>
-          <w:sz w:val="24"/>
-        </w:rPr>
-        <w:t>, confirming onesala.com as a named, verifiable co-tenant on the same physical server as neuralsh.com. This elevates N-004 (Shared Hosting Lateral Movement Risk) from a theoretical risk to a confirmed scenario with an identified third-party victim. A successful compromise of neuralsh.com's hosting infrastructure now carries documented third-party data protection and legal implications.</w:t>
+        <w:t>www.onesala.com</w:t>
+      </w:r>
+      <w:r>
+        <w:rPr>
+          <w:rFonts w:ascii="Times New Roman" w:hAnsi="Times New Roman"/>
+          <w:sz w:val="24"/>
+        </w:rPr>
+        <w:t xml:space="preserve"> as a co-tenant on the same physical server. This confirms N-004 with an identified third-party victim — a compromise of neuralsh.com's server now has documented data protection implications for onesala.com.</w:t>
       </w:r>
     </w:p>
     <w:p>
@@ -24672,7 +24504,7 @@
           <w:rFonts w:ascii="Times New Roman" w:hAnsi="Times New Roman"/>
           <w:sz w:val="24"/>
         </w:rPr>
-        <w:t>No direct fix is available at the application level. Long-term remediation requires migration to isolated dedicated infrastructure. As an immediate measure, restrict WHM access to prevent the co-tenancy relationship from being exploited.</w:t>
+        <w:t>No application-level fix is available. Migrate to isolated infrastructure and restrict WHM access immediately to prevent exploitation of the co-tenancy risk.</w:t>
       </w:r>
     </w:p>
     <w:p>
@@ -24694,7 +24526,7 @@
           <w:rFonts w:ascii="Times New Roman" w:hAnsi="Times New Roman"/>
           <w:sz w:val="24"/>
         </w:rPr>
-        <w:t xml:space="preserve"> curl response showing HTTP redirect from 103.16.62.217:2077 to www.onesala.com:2078</w:t>
+        <w:t xml:space="preserve"> curl response showing redirect from 103.16.62.217:2077 to www.onesala.com:2078</w:t>
       </w:r>
     </w:p>
     <w:p>
@@ -24916,21 +24748,7 @@
           <w:rFonts w:ascii="Times New Roman" w:hAnsi="Times New Roman"/>
           <w:sz w:val="24"/>
         </w:rPr>
-        <w:t xml:space="preserve">The cPanel Webmail login interface is publicly accessible on port 2096 without IP restriction, account lockout, or CAPTCHA. This interface accepts authentication attempts against all email accounts hosted on the server, including </w:t>
-      </w:r>
-      <w:r>
-        <w:rPr>
-          <w:rFonts w:ascii="Courier New" w:hAnsi="Courier New"/>
-          <w:sz w:val="22"/>
-        </w:rPr>
-        <w:t>@neuralsh.com</w:t>
-      </w:r>
-      <w:r>
-        <w:rPr>
-          <w:rFonts w:ascii="Times New Roman" w:hAnsi="Times New Roman"/>
-          <w:sz w:val="24"/>
-        </w:rPr>
-        <w:t xml:space="preserve"> addresses. A compromised email account can be used to trigger password reset flows for linked services including cPanel and application accounts, and to send phishing emails from a legitimate neuralsh.com address.</w:t>
+        <w:t>The cPanel Webmail login page is accessible on port 2096 with no IP restriction or account lockout. It allows brute-force attempts against all hosted email accounts, and a compromised email address can be used to reset passwords on cPanel and linked services.</w:t>
       </w:r>
     </w:p>
     <w:p>
@@ -24959,7 +24777,7 @@
           <w:rFonts w:ascii="Times New Roman" w:hAnsi="Times New Roman"/>
           <w:sz w:val="24"/>
         </w:rPr>
-        <w:t>Restrict port 2096 to trusted management IPs via firewall. Enforce strong, unique passwords on all hosted email accounts. Implement CAPTCHA or an account lockout policy on the webmail login page.</w:t>
+        <w:t>Restrict port 2096 to trusted IPs via firewall and implement an account lockout policy on the webmail login.</w:t>
       </w:r>
     </w:p>
     <w:p>
@@ -25203,21 +25021,7 @@
           <w:rFonts w:ascii="Times New Roman" w:hAnsi="Times New Roman"/>
           <w:sz w:val="24"/>
         </w:rPr>
-        <w:t xml:space="preserve">Ports 2078 and 2091 were not present in the June 6 baseline scan but appeared open in the June 10 follow-up scan, both returning HTTP 401 with </w:t>
-      </w:r>
-      <w:r>
-        <w:rPr>
-          <w:rFonts w:ascii="Courier New" w:hAnsi="Courier New"/>
-          <w:sz w:val="22"/>
-        </w:rPr>
-        <w:t>WWW-Authenticate: Basic realm="Restricted Area"</w:t>
-      </w:r>
-      <w:r>
-        <w:rPr>
-          <w:rFonts w:ascii="Times New Roman" w:hAnsi="Times New Roman"/>
-          <w:sz w:val="24"/>
-        </w:rPr>
-        <w:t>. These are additional cPanel management service ports that expand the credential brute-force attack surface. Their appearance after the initial scan indicates that infrastructure changes are occurring on the server without a security review process in place.</w:t>
+        <w:t>Ports 2078 and 2091 were absent in the June 6 baseline but appeared open in the June 10 follow-up, both returning HTTP 401 Basic Auth challenges. Their undocumented addition indicates infrastructure changes are occurring without a security review process.</w:t>
       </w:r>
     </w:p>
     <w:p>
@@ -25246,7 +25050,7 @@
           <w:rFonts w:ascii="Times New Roman" w:hAnsi="Times New Roman"/>
           <w:sz w:val="24"/>
         </w:rPr>
-        <w:t>Restrict ports 2078 and 2091 via firewall immediately. Conduct a full port audit of 103.16.62.217 and close all ports that lack a documented business purpose. Establish a change management process for firewall rule modifications.</w:t>
+        <w:t>Restrict ports 2078 and 2091 via firewall and conduct a full port audit to close all ports without a documented business purpose.</w:t>
       </w:r>
     </w:p>
     <w:p>
@@ -25268,7 +25072,7 @@
           <w:rFonts w:ascii="Times New Roman" w:hAnsi="Times New Roman"/>
           <w:sz w:val="24"/>
         </w:rPr>
-        <w:t xml:space="preserve"> Follow-up Nmap scan (10 June 2026) confirming 2078/tcp and 2091/tcp open with HTTP 401 response</w:t>
+        <w:t xml:space="preserve"> Follow-up Nmap scan (10 June 2026) confirming 2078/tcp and 2091/tcp open</w:t>
       </w:r>
     </w:p>
     <w:p>
@@ -25490,21 +25294,21 @@
           <w:rFonts w:ascii="Times New Roman" w:hAnsi="Times New Roman"/>
           <w:sz w:val="24"/>
         </w:rPr>
-        <w:t xml:space="preserve">API error responses disclose internal details including the full request URL, internal status messages, expected parameter names, and backend framework identification strings. An example error response observed during testing: </w:t>
+        <w:t xml:space="preserve">API errors return the full request URL, expected parameter names, and framework identifiers. Example: </w:t>
       </w:r>
       <w:r>
         <w:rPr>
           <w:rFonts w:ascii="Courier New" w:hAnsi="Courier New"/>
           <w:sz w:val="22"/>
         </w:rPr>
-        <w:t>{"error":true,"url":"https://neuralsh.com/api/geocode","statusCode":400,"message":"Latitude and longitude are required"}</w:t>
-      </w:r>
-      <w:r>
-        <w:rPr>
-          <w:rFonts w:ascii="Times New Roman" w:hAnsi="Times New Roman"/>
-          <w:sz w:val="24"/>
-        </w:rPr>
-        <w:t>. This information reduces the reconnaissance effort required to map and target the API.</w:t>
+        <w:t>{"error":true,"url":"https://neuralsh.com/api/geocode","message":"Latitude and longitude are required"}</w:t>
+      </w:r>
+      <w:r>
+        <w:rPr>
+          <w:rFonts w:ascii="Times New Roman" w:hAnsi="Times New Roman"/>
+          <w:sz w:val="24"/>
+        </w:rPr>
+        <w:t>. This reduces the reconnaissance effort needed to map and attack the API.</w:t>
       </w:r>
     </w:p>
     <w:p>
@@ -25533,7 +25337,7 @@
           <w:rFonts w:ascii="Times New Roman" w:hAnsi="Times New Roman"/>
           <w:sz w:val="24"/>
         </w:rPr>
-        <w:t>Return generic, user-facing error messages to clients. Log detailed diagnostic information server-side only. Remove all parameter names, internal paths, and framework identifiers from client-facing error responses.</w:t>
+        <w:t>Return generic error messages to clients and log detailed diagnostics server-side only.</w:t>
       </w:r>
     </w:p>
     <w:p>
@@ -25555,7 +25359,7 @@
           <w:rFonts w:ascii="Times New Roman" w:hAnsi="Times New Roman"/>
           <w:sz w:val="24"/>
         </w:rPr>
-        <w:t xml:space="preserve"> curl request to /api/geocode returning verbose error message with internal details</w:t>
+        <w:t xml:space="preserve"> curl request to /api/geocode returning verbose internal error response</w:t>
       </w:r>
     </w:p>
     <w:p>
@@ -25777,7 +25581,7 @@
           <w:rFonts w:ascii="Times New Roman" w:hAnsi="Times New Roman"/>
           <w:sz w:val="24"/>
         </w:rPr>
-        <w:t xml:space="preserve">The SPF record uses </w:t>
+        <w:t>SPF is set to softfail (</w:t>
       </w:r>
       <w:r>
         <w:rPr>
@@ -25791,55 +25595,27 @@
           <w:rFonts w:ascii="Times New Roman" w:hAnsi="Times New Roman"/>
           <w:sz w:val="24"/>
         </w:rPr>
-        <w:t xml:space="preserve"> (softfail) rather than </w:t>
+        <w:t xml:space="preserve">) and DMARC to </w:t>
       </w:r>
       <w:r>
         <w:rPr>
           <w:rFonts w:ascii="Courier New" w:hAnsi="Courier New"/>
           <w:sz w:val="22"/>
         </w:rPr>
-        <w:t>-all</w:t>
-      </w:r>
-      <w:r>
-        <w:rPr>
-          <w:rFonts w:ascii="Times New Roman" w:hAnsi="Times New Roman"/>
-          <w:sz w:val="24"/>
-        </w:rPr>
-        <w:t xml:space="preserve"> (hardfail), and the DMARC policy is set to </w:t>
+        <w:t>p=quarantine</w:t>
+      </w:r>
+      <w:r>
+        <w:rPr>
+          <w:rFonts w:ascii="Times New Roman" w:hAnsi="Times New Roman"/>
+          <w:sz w:val="24"/>
+        </w:rPr>
+        <w:t xml:space="preserve">, meaning spoofed emails from </w:t>
       </w:r>
       <w:r>
         <w:rPr>
           <w:rFonts w:ascii="Courier New" w:hAnsi="Courier New"/>
           <w:sz w:val="22"/>
         </w:rPr>
-        <w:t>p=quarantine</w:t>
-      </w:r>
-      <w:r>
-        <w:rPr>
-          <w:rFonts w:ascii="Times New Roman" w:hAnsi="Times New Roman"/>
-          <w:sz w:val="24"/>
-        </w:rPr>
-        <w:t xml:space="preserve"> rather than </w:t>
-      </w:r>
-      <w:r>
-        <w:rPr>
-          <w:rFonts w:ascii="Courier New" w:hAnsi="Courier New"/>
-          <w:sz w:val="22"/>
-        </w:rPr>
-        <w:t>p=reject</w:t>
-      </w:r>
-      <w:r>
-        <w:rPr>
-          <w:rFonts w:ascii="Times New Roman" w:hAnsi="Times New Roman"/>
-          <w:sz w:val="24"/>
-        </w:rPr>
-        <w:t xml:space="preserve">. Emails sent by unauthorised sources spoofing </w:t>
-      </w:r>
-      <w:r>
-        <w:rPr>
-          <w:rFonts w:ascii="Courier New" w:hAnsi="Courier New"/>
-          <w:sz w:val="22"/>
-        </w:rPr>
         <w:t>@neuralsh.com</w:t>
       </w:r>
       <w:r>
@@ -25847,7 +25623,7 @@
           <w:rFonts w:ascii="Times New Roman" w:hAnsi="Times New Roman"/>
           <w:sz w:val="24"/>
         </w:rPr>
-        <w:t xml:space="preserve"> addresses are flagged but not rejected outright. On receiving mail servers that do not enforce strict SPF checking, phishing emails using the neuralsh.com brand identity may be delivered to recipients.</w:t>
+        <w:t xml:space="preserve"> are flagged but not rejected. Some mail servers may still deliver phishing emails using the neuralsh.com domain identity.</w:t>
       </w:r>
     </w:p>
     <w:p>
@@ -25876,35 +25652,35 @@
           <w:rFonts w:ascii="Times New Roman" w:hAnsi="Times New Roman"/>
           <w:sz w:val="24"/>
         </w:rPr>
-        <w:t xml:space="preserve">Update the SPF record to </w:t>
+        <w:t xml:space="preserve">Change SPF to </w:t>
       </w:r>
       <w:r>
         <w:rPr>
           <w:rFonts w:ascii="Courier New" w:hAnsi="Courier New"/>
           <w:sz w:val="22"/>
         </w:rPr>
-        <w:t>v=spf1 +mx +a +ip4:103.16.62.217 -all</w:t>
-      </w:r>
-      <w:r>
-        <w:rPr>
-          <w:rFonts w:ascii="Times New Roman" w:hAnsi="Times New Roman"/>
-          <w:sz w:val="24"/>
-        </w:rPr>
-        <w:t xml:space="preserve">. Update the DMARC record to </w:t>
+        <w:t>-all</w:t>
+      </w:r>
+      <w:r>
+        <w:rPr>
+          <w:rFonts w:ascii="Times New Roman" w:hAnsi="Times New Roman"/>
+          <w:sz w:val="24"/>
+        </w:rPr>
+        <w:t xml:space="preserve"> (hardfail) and update DMARC to </w:t>
       </w:r>
       <w:r>
         <w:rPr>
           <w:rFonts w:ascii="Courier New" w:hAnsi="Courier New"/>
           <w:sz w:val="22"/>
         </w:rPr>
-        <w:t>v=DMARC1; p=reject; rua=mailto:dmarc@neuralsh.com</w:t>
-      </w:r>
-      <w:r>
-        <w:rPr>
-          <w:rFonts w:ascii="Times New Roman" w:hAnsi="Times New Roman"/>
-          <w:sz w:val="24"/>
-        </w:rPr>
-        <w:t xml:space="preserve"> to reject all unauthorised mail.</w:t>
+        <w:t>p=reject; rua=mailto:dmarc@neuralsh.com</w:t>
+      </w:r>
+      <w:r>
+        <w:rPr>
+          <w:rFonts w:ascii="Times New Roman" w:hAnsi="Times New Roman"/>
+          <w:sz w:val="24"/>
+        </w:rPr>
+        <w:t>.</w:t>
       </w:r>
     </w:p>
     <w:p>
@@ -25926,7 +25702,7 @@
           <w:rFonts w:ascii="Times New Roman" w:hAnsi="Times New Roman"/>
           <w:sz w:val="24"/>
         </w:rPr>
-        <w:t xml:space="preserve"> dig output confirming SPF softfail (~all) and DMARC p=quarantine policy</w:t>
+        <w:t xml:space="preserve"> dig output confirming SPF ~all and DMARC p=quarantine</w:t>
       </w:r>
     </w:p>
     <w:p>
@@ -26148,7 +25924,7 @@
           <w:rFonts w:ascii="Times New Roman" w:hAnsi="Times New Roman"/>
           <w:sz w:val="24"/>
         </w:rPr>
-        <w:t xml:space="preserve">The cPanel version is indirectly disclosed through timestamp-based magic revision numbers embedded in static asset paths, for example </w:t>
+        <w:t xml:space="preserve">Static asset paths include a timestamp-based revision number (e.g. </w:t>
       </w:r>
       <w:r>
         <w:rPr>
@@ -26162,7 +25938,7 @@
           <w:rFonts w:ascii="Times New Roman" w:hAnsi="Times New Roman"/>
           <w:sz w:val="24"/>
         </w:rPr>
-        <w:t>. This timestamp can be cross-referenced against cPanel release changelogs to identify the exact installed version, enabling targeted CVE lookup and version-specific exploit research against the identified version.</w:t>
+        <w:t>) that can be cross-referenced to identify the exact cPanel version, enabling targeted CVE research.</w:t>
       </w:r>
     </w:p>
     <w:p>
@@ -26191,7 +25967,7 @@
           <w:rFonts w:ascii="Times New Roman" w:hAnsi="Times New Roman"/>
           <w:sz w:val="24"/>
         </w:rPr>
-        <w:t>Update cPanel to the current supported release. Configure cPanel to suppress magic revision identifiers in static asset paths where possible.</w:t>
+        <w:t>Update cPanel to the latest supported release and suppress magic revision numbers in static asset paths.</w:t>
       </w:r>
     </w:p>
     <w:p>
@@ -26213,7 +25989,7 @@
           <w:rFonts w:ascii="Times New Roman" w:hAnsi="Times New Roman"/>
           <w:sz w:val="24"/>
         </w:rPr>
-        <w:t xml:space="preserve"> curl response from port 2083 showing cPanel_magic_revision timestamp in asset path</w:t>
+        <w:t xml:space="preserve"> curl response from port 2083 showing cPanel_magic_revision in asset URL</w:t>
       </w:r>
     </w:p>
     <w:p>
@@ -26435,35 +26211,7 @@
           <w:rFonts w:ascii="Times New Roman" w:hAnsi="Times New Roman"/>
           <w:sz w:val="24"/>
         </w:rPr>
-        <w:t xml:space="preserve">Port 25 appeared as </w:t>
-      </w:r>
-      <w:r>
-        <w:rPr>
-          <w:rFonts w:ascii="Courier New" w:hAnsi="Courier New"/>
-          <w:sz w:val="22"/>
-        </w:rPr>
-        <w:t>filtered</w:t>
-      </w:r>
-      <w:r>
-        <w:rPr>
-          <w:rFonts w:ascii="Times New Roman" w:hAnsi="Times New Roman"/>
-          <w:sz w:val="24"/>
-        </w:rPr>
-        <w:t xml:space="preserve"> in the June 6 baseline scan and as </w:t>
-      </w:r>
-      <w:r>
-        <w:rPr>
-          <w:rFonts w:ascii="Courier New" w:hAnsi="Courier New"/>
-          <w:sz w:val="22"/>
-        </w:rPr>
-        <w:t>open</w:t>
-      </w:r>
-      <w:r>
-        <w:rPr>
-          <w:rFonts w:ascii="Times New Roman" w:hAnsi="Times New Roman"/>
-          <w:sz w:val="24"/>
-        </w:rPr>
-        <w:t xml:space="preserve"> in the June 10 follow-up scan, accepting full TCP connections. The unexplained state change indicates that a firewall rule was removed between the two scans without a documented change control process. An open SMTP port enables direct mail relay testing, SMTP user enumeration via VRFY and EXPN commands, and potential open relay abuse if the Exim configuration allows unauthenticated mail submission.</w:t>
+        <w:t>Port 25 was filtered in the June 6 baseline and open in the June 10 follow-up, indicating a firewall rule was removed without documented change control. An open SMTP port exposes the server to mail relay testing and SMTP user enumeration.</w:t>
       </w:r>
     </w:p>
     <w:p>
@@ -26492,7 +26240,7 @@
           <w:rFonts w:ascii="Times New Roman" w:hAnsi="Times New Roman"/>
           <w:sz w:val="24"/>
         </w:rPr>
-        <w:t>Investigate the cause of the port 25 firewall rule removal. If direct SMTP delivery is not required — mail submission on port 587 is the current standard — restore the firewall block on port 25 immediately and document the change.</w:t>
+        <w:t>Investigate the firewall rule change and restore the port 25 block if direct SMTP delivery is not required.</w:t>
       </w:r>
     </w:p>
     <w:p>

</xml_diff>

<commit_message>
Redact origin server IP: 103.16.62.217 → 103.16.62.xxx
</commit_message>
<xml_diff>
--- a/THESIS_VAPT_WORD.docx
+++ b/THESIS_VAPT_WORD.docx
@@ -3534,7 +3534,7 @@
                 <w:rFonts w:ascii="Times New Roman" w:hAnsi="Times New Roman"/>
                 <w:sz w:val="22"/>
               </w:rPr>
-              <w:t>Origin server entry point — resolves directly to 103.16.62.217</w:t>
+              <w:t>Origin server entry point — resolves directly to 103.16.62.xxx</w:t>
             </w:r>
           </w:p>
         </w:tc>
@@ -3554,7 +3554,7 @@
                 <w:rFonts w:ascii="Courier New" w:hAnsi="Courier New"/>
                 <w:sz w:val="22"/>
               </w:rPr>
-              <w:t>103.16.62.217</w:t>
+              <w:t>103.16.62.xxx</w:t>
             </w:r>
           </w:p>
         </w:tc>
@@ -8431,7 +8431,7 @@
           <w:b/>
           <w:sz w:val="24"/>
         </w:rPr>
-        <w:t>origin IP address (103.16.62.217)</w:t>
+        <w:t>origin IP address (103.16.62.xxx)</w:t>
       </w:r>
       <w:r>
         <w:rPr>
@@ -8467,7 +8467,7 @@
           <w:rFonts w:ascii="Times New Roman" w:hAnsi="Times New Roman"/>
           <w:sz w:val="24"/>
         </w:rPr>
-        <w:t>With the origin IP identified, active scanning was conducted against 103.16.62.217 to determine which services were reachable from the internet. Nmap was used to perform a full TCP port scan, revealing a large number of open ports that should not have been publicly accessible — including port 2087 (WHM admin panel), port 3306 (MySQL), port 2083 (cPanel), port 9001 (MikroTik), and port 25 (SMTP). Web application enumeration using Dirb and Nikto identified accessible admin interfaces, exposed directory listings, and additional administrative endpoints.</w:t>
+        <w:t>With the origin IP identified, active scanning was conducted against 103.16.62.xxx to determine which services were reachable from the internet. Nmap was used to perform a full TCP port scan, revealing a large number of open ports that should not have been publicly accessible — including port 2087 (WHM admin panel), port 3306 (MySQL), port 2083 (cPanel), port 9001 (MikroTik), and port 25 (SMTP). Web application enumeration using Dirb and Nikto identified accessible admin interfaces, exposed directory listings, and additional administrative endpoints.</w:t>
       </w:r>
     </w:p>
     <w:p>
@@ -10121,7 +10121,7 @@
                 <w:rFonts w:ascii="Times New Roman" w:hAnsi="Times New Roman"/>
                 <w:sz w:val="22"/>
               </w:rPr>
-              <w:t>Full TCP port scan on 103.16.62.217 — discovered 23 open ports</w:t>
+              <w:t>Full TCP port scan on 103.16.62.xxx — discovered 23 open ports</w:t>
             </w:r>
           </w:p>
         </w:tc>
@@ -10503,7 +10503,7 @@
           <w:rFonts w:ascii="Times New Roman" w:hAnsi="Times New Roman"/>
           <w:sz w:val="24"/>
         </w:rPr>
-        <w:t xml:space="preserve"> (Network Mapper) is the industry-standard open-source tool for network discovery and service fingerprinting. A full TCP scan with service version detection against the origin server revealed that 103.16.62.217 had 23 ports open and reachable from the public internet — including administrative interfaces that should never be exposed. This single scan produced the evidence base for Critical findings N-001, N-002, N-013, and N-014.</w:t>
+        <w:t xml:space="preserve"> (Network Mapper) is the industry-standard open-source tool for network discovery and service fingerprinting. A full TCP scan with service version detection against the origin server revealed that 103.16.62.xxx had 23 ports open and reachable from the public internet — including administrative interfaces that should never be exposed. This single scan produced the evidence base for Critical findings N-001, N-002, N-013, and N-014.</w:t>
       </w:r>
     </w:p>
     <w:p>
@@ -13143,7 +13143,7 @@
                 <w:rFonts w:ascii="Times New Roman" w:hAnsi="Times New Roman"/>
                 <w:sz w:val="22"/>
               </w:rPr>
-              <w:t>103.16.62.217</w:t>
+              <w:t>103.16.62.xxx</w:t>
             </w:r>
           </w:p>
         </w:tc>
@@ -13181,7 +13181,7 @@
                 <w:rFonts w:ascii="Times New Roman" w:hAnsi="Times New Roman"/>
                 <w:sz w:val="22"/>
               </w:rPr>
-              <w:t>103.16.62.217 (direct)</w:t>
+              <w:t>103.16.62.xxx (direct)</w:t>
             </w:r>
           </w:p>
         </w:tc>
@@ -13250,7 +13250,7 @@
           <w:rFonts w:ascii="Times New Roman" w:hAnsi="Times New Roman"/>
           <w:sz w:val="24"/>
         </w:rPr>
-        <w:t xml:space="preserve">The main site resolves to Cloudflare's anycast network. The real origin server IP (103.16.62.217) was discovered via the MX record for </w:t>
+        <w:t xml:space="preserve">The main site resolves to Cloudflare's anycast network. The real origin server IP (103.16.62.xxx) was discovered via the MX record for </w:t>
       </w:r>
       <w:r>
         <w:rPr>
@@ -13465,7 +13465,7 @@
         <w:br/>
         <w:t>dig A mail.neuralsh.com</w:t>
         <w:br/>
-        <w:t># 103.16.62.217 — the backend server that Cloudflare is meant to protect</w:t>
+        <w:t># 103.16.62.xxx — the backend server that Cloudflare is meant to protect</w:t>
       </w:r>
     </w:p>
     <w:p>
@@ -13535,7 +13535,7 @@
           <w:rFonts w:ascii="Times New Roman" w:hAnsi="Times New Roman"/>
           <w:sz w:val="24"/>
         </w:rPr>
-        <w:t>This three-step DNS chain revealed 103.16.62.217 as the origin server behind the Cloudflare WAF. The MX record is a common oversight — organizations often configure the main domain to proxy through Cloudflare but leave the mail server record pointing directly at the origin. This single lookup rendered the Cloudflare WAF irrelevant for the remainder of the engagement.</w:t>
+        <w:t>This three-step DNS chain revealed 103.16.62.xxx as the origin server behind the Cloudflare WAF. The MX record is a common oversight — organizations often configure the main domain to proxy through Cloudflare but leave the mail server record pointing directly at the origin. This single lookup rendered the Cloudflare WAF irrelevant for the remainder of the engagement.</w:t>
       </w:r>
     </w:p>
     <w:p>
@@ -13566,7 +13566,7 @@
         <w:br/>
         <w:t>dig TXT neuralsh.com</w:t>
         <w:br/>
-        <w:t># v=spf1 +mx +a +ip4:103.16.62.217 ~all   (SPF softfail — N-012)</w:t>
+        <w:t># v=spf1 +mx +a +ip4:103.16.62.xxx ~all   (SPF softfail — N-012)</w:t>
         <w:br/>
         <w:t># v=DMARC1; p=quarantine                   (DMARC not enforcing — N-012)</w:t>
         <w:br/>
@@ -13575,7 +13575,7 @@
         <w:br/>
         <w:t>dig randomxyz123.neuralsh.com</w:t>
         <w:br/>
-        <w:t># Returns: 103.16.62.217   (wildcard DNS active — N-010)</w:t>
+        <w:t># Returns: 103.16.62.xxx   (wildcard DNS active — N-010)</w:t>
         <w:br/>
         <w:br/>
         <w:t># Zone transfer — blocked (positive control)</w:t>
@@ -13680,7 +13680,7 @@
           <w:rFonts w:ascii="Courier New" w:hAnsi="Courier New"/>
           <w:sz w:val="18"/>
         </w:rPr>
-        <w:t>openssl s_client -connect 103.16.62.217:443 2&gt;/dev/null | openssl x509 -noout -subject -issuer</w:t>
+        <w:t>openssl s_client -connect 103.16.62.xxx:443 2&gt;/dev/null | openssl x509 -noout -subject -issuer</w:t>
       </w:r>
     </w:p>
     <w:p>
@@ -14002,7 +14002,7 @@
           <w:rFonts w:ascii="Times New Roman" w:hAnsi="Times New Roman"/>
           <w:sz w:val="24"/>
         </w:rPr>
-        <w:t>With the origin IP confirmed, active scanning was conducted against 103.16.62.217 to identify all exposed services and their versions. Scanning was performed from the Kali VM via SSH.</w:t>
+        <w:t>With the origin IP confirmed, active scanning was conducted against 103.16.62.xxx to identify all exposed services and their versions. Scanning was performed from the Kali VM via SSH.</w:t>
       </w:r>
     </w:p>
     <w:p>
@@ -14030,7 +14030,7 @@
           <w:rFonts w:ascii="Courier New" w:hAnsi="Courier New"/>
           <w:sz w:val="18"/>
         </w:rPr>
-        <w:t>sudo nmap -sV -sC -p 22,25,53,80,110,111,143,443,465,587,993,995,2000,2083,2087,2096,3306,5060,8899,9001 103.16.62.217</w:t>
+        <w:t>sudo nmap -sV -sC -p 22,25,53,80,110,111,143,443,465,587,993,995,2000,2083,2087,2096,3306,5060,8899,9001 103.16.62.xxx</w:t>
       </w:r>
     </w:p>
     <w:p>
@@ -14204,21 +14204,21 @@
         </w:rPr>
         <w:t># WHM root administration panel</w:t>
         <w:br/>
-        <w:t>curl -sk https://103.16.62.217:2087/ | grep "&lt;title&gt;"</w:t>
+        <w:t>curl -sk https://103.16.62.xxx:2087/ | grep "&lt;title&gt;"</w:t>
         <w:br/>
         <w:t># &lt;title&gt;WHM Login&lt;/title&gt;</w:t>
         <w:br/>
         <w:br/>
         <w:t># cPanel user panel</w:t>
         <w:br/>
-        <w:t>curl -sk https://103.16.62.217:2083/ | grep "&lt;title&gt;"</w:t>
+        <w:t>curl -sk https://103.16.62.xxx:2083/ | grep "&lt;title&gt;"</w:t>
         <w:br/>
         <w:t># &lt;title&gt;cPanel Login&lt;/title&gt;</w:t>
         <w:br/>
         <w:br/>
         <w:t># MikroTik admin interface</w:t>
         <w:br/>
-        <w:t>curl -v http://103.16.62.217:9001/ 2&gt;&amp;1 | grep -E "HTTP|title"</w:t>
+        <w:t>curl -v http://103.16.62.xxx:9001/ 2&gt;&amp;1 | grep -E "HTTP|title"</w:t>
         <w:br/>
         <w:t># HTTP/1.1 200 OK</w:t>
         <w:br/>
@@ -14227,7 +14227,7 @@
         <w:br/>
         <w:t># Directory listing on origin</w:t>
         <w:br/>
-        <w:t>curl -H "Host: neuralsh.com" http://103.16.62.217/</w:t>
+        <w:t>curl -H "Host: neuralsh.com" http://103.16.62.xxx/</w:t>
         <w:br/>
         <w:t># &lt;title&gt;Index of /&lt;/title&gt;   (Apache directory listing enabled)</w:t>
       </w:r>
@@ -14495,7 +14495,7 @@
           <w:rFonts w:ascii="Courier New" w:hAnsi="Courier New"/>
           <w:sz w:val="18"/>
         </w:rPr>
-        <w:t>nuclei -u https://neuralsh.com -u http://103.16.62.217 -severity critical,high,medium -o /home/rith/thesis/nuclei_results.txt</w:t>
+        <w:t>nuclei -u https://neuralsh.com -u http://103.16.62.xxx -severity critical,high,medium -o /home/rith/thesis/nuclei_results.txt</w:t>
       </w:r>
     </w:p>
     <w:p>
@@ -14595,7 +14595,7 @@
         </w:rPr>
         <w:t># Confirm MySQL accepts connections from public internet</w:t>
         <w:br/>
-        <w:t>mysql -h 103.16.62.217 -P 3306 -u root 2&gt;&amp;1</w:t>
+        <w:t>mysql -h 103.16.62.xxx -P 3306 -u root 2&gt;&amp;1</w:t>
         <w:br/>
         <w:t># ERROR 1045 (28000): Access denied for user 'root'@'[your-ip]' (using password: NO)</w:t>
       </w:r>
@@ -15426,7 +15426,7 @@
           <w:rFonts w:ascii="Times New Roman" w:hAnsi="Times New Roman"/>
           <w:sz w:val="24"/>
         </w:rPr>
-        <w:t>The WAF bypass was complete — any request sent to 103.16.62.217 directly is processed by the Apache web server without any Cloudflare filtering, logging, or protection.</w:t>
+        <w:t>The WAF bypass was complete — any request sent to 103.16.62.xxx directly is processed by the Apache web server without any Cloudflare filtering, logging, or protection.</w:t>
       </w:r>
     </w:p>
     <w:p>
@@ -16058,28 +16058,28 @@
         </w:rPr>
         <w:t># WHM — root server administration</w:t>
         <w:br/>
-        <w:t>curl -sk https://103.16.62.217:2087/ | grep -i title</w:t>
+        <w:t>curl -sk https://103.16.62.xxx:2087/ | grep -i title</w:t>
         <w:br/>
         <w:t># &lt;title&gt;WHM Login&lt;/title&gt;</w:t>
         <w:br/>
         <w:br/>
         <w:t># cPanel — hosting account control</w:t>
         <w:br/>
-        <w:t>curl -sk https://103.16.62.217:2083/ | grep -i title</w:t>
+        <w:t>curl -sk https://103.16.62.xxx:2083/ | grep -i title</w:t>
         <w:br/>
         <w:t># &lt;title&gt;cPanel Login&lt;/title&gt;</w:t>
         <w:br/>
         <w:br/>
         <w:t># MikroTik — network device management</w:t>
         <w:br/>
-        <w:t>curl -v http://103.16.62.217:9001/ 2&gt;&amp;1 | grep "title"</w:t>
+        <w:t>curl -v http://103.16.62.xxx:9001/ 2&gt;&amp;1 | grep "title"</w:t>
         <w:br/>
         <w:t># &lt;title&gt;RouterOS router configuration page&lt;/title&gt;</w:t>
         <w:br/>
         <w:br/>
         <w:t># MySQL — direct database access</w:t>
         <w:br/>
-        <w:t>mysql -h 103.16.62.217 -P 3306 -u root 2&gt;&amp;1 | head -1</w:t>
+        <w:t>mysql -h 103.16.62.xxx -P 3306 -u root 2&gt;&amp;1 | head -1</w:t>
         <w:br/>
         <w:t># ERROR 1045 (28000): Access denied (confirms port accepts public connections)</w:t>
       </w:r>
@@ -16544,11 +16544,11 @@
         <w:br/>
         <w:t xml:space="preserve">  ↓</w:t>
         <w:br/>
-        <w:t>MikroTik Router (103.16.62.217:9001) — exposed publicly</w:t>
+        <w:t>MikroTik Router (103.16.62.xxx:9001) — exposed publicly</w:t>
         <w:br/>
         <w:t xml:space="preserve">  ↓ [controls all traffic routing]</w:t>
         <w:br/>
-        <w:t>Backend Server (103.16.62.217)</w:t>
+        <w:t>Backend Server (103.16.62.xxx)</w:t>
         <w:br/>
         <w:t xml:space="preserve">  ├── Apache Web Server (80/443)</w:t>
         <w:br/>
@@ -16736,7 +16736,7 @@
           <w:rFonts w:ascii="Times New Roman" w:hAnsi="Times New Roman"/>
           <w:sz w:val="24"/>
         </w:rPr>
-        <w:t>This section documents direct confirmation of the four critical attack vectors identified against neuralsh.com. All evidence was collected against the live target (103.16.62.217) within the authorized scope of the engagement.</w:t>
+        <w:t>This section documents direct confirmation of the four critical attack vectors identified against neuralsh.com. All evidence was collected against the live target (103.16.62.xxx) within the authorized scope of the engagement.</w:t>
       </w:r>
     </w:p>
     <w:p>
@@ -16772,7 +16772,7 @@
           <w:rFonts w:ascii="Courier New" w:hAnsi="Courier New"/>
           <w:sz w:val="22"/>
         </w:rPr>
-        <w:t>https://103.16.62.217:2087/</w:t>
+        <w:t>https://103.16.62.xxx:2087/</w:t>
       </w:r>
       <w:r>
         <w:rPr>
@@ -16871,7 +16871,7 @@
           <w:rFonts w:ascii="Courier New" w:hAnsi="Courier New"/>
           <w:sz w:val="22"/>
         </w:rPr>
-        <w:t>http://103.16.62.217:9001/</w:t>
+        <w:t>http://103.16.62.xxx:9001/</w:t>
       </w:r>
       <w:r>
         <w:rPr>
@@ -16990,7 +16990,7 @@
           <w:rFonts w:ascii="Courier New" w:hAnsi="Courier New"/>
           <w:sz w:val="18"/>
         </w:rPr>
-        <w:t>mysql -h 103.16.62.217 -P 3306 -u root 2&gt;&amp;1</w:t>
+        <w:t>mysql -h 103.16.62.xxx -P 3306 -u root 2&gt;&amp;1</w:t>
         <w:br/>
         <w:t># ERROR 1045 (28000): Access denied for user 'root'@'58.97.216.203' (using password: NO)</w:t>
       </w:r>
@@ -20504,7 +20504,7 @@
                 <w:rFonts w:ascii="Times New Roman" w:hAnsi="Times New Roman"/>
                 <w:sz w:val="22"/>
               </w:rPr>
-              <w:t>103.16.62.217:3306</w:t>
+              <w:t>103.16.62.xxx:3306</w:t>
             </w:r>
           </w:p>
         </w:tc>
@@ -20791,7 +20791,7 @@
                 <w:rFonts w:ascii="Times New Roman" w:hAnsi="Times New Roman"/>
                 <w:sz w:val="22"/>
               </w:rPr>
-              <w:t>103.16.62.217:9001</w:t>
+              <w:t>103.16.62.xxx:9001</w:t>
             </w:r>
           </w:p>
         </w:tc>
@@ -21078,7 +21078,7 @@
                 <w:rFonts w:ascii="Times New Roman" w:hAnsi="Times New Roman"/>
                 <w:sz w:val="22"/>
               </w:rPr>
-              <w:t>103.16.62.217:2083</w:t>
+              <w:t>103.16.62.xxx:2083</w:t>
             </w:r>
           </w:p>
         </w:tc>
@@ -21351,7 +21351,7 @@
                 <w:rFonts w:ascii="Times New Roman" w:hAnsi="Times New Roman"/>
                 <w:sz w:val="22"/>
               </w:rPr>
-              <w:t>103.16.62.217:2087</w:t>
+              <w:t>103.16.62.xxx:2087</w:t>
             </w:r>
           </w:p>
         </w:tc>
@@ -21624,7 +21624,7 @@
                 <w:rFonts w:ascii="Times New Roman" w:hAnsi="Times New Roman"/>
                 <w:sz w:val="22"/>
               </w:rPr>
-              <w:t>103.16.62.217:22</w:t>
+              <w:t>103.16.62.xxx:22</w:t>
             </w:r>
           </w:p>
         </w:tc>
@@ -21925,7 +21925,7 @@
                 <w:rFonts w:ascii="Times New Roman" w:hAnsi="Times New Roman"/>
                 <w:sz w:val="22"/>
               </w:rPr>
-              <w:t>103.16.62.217 (shared)</w:t>
+              <w:t>103.16.62.xxx (shared)</w:t>
             </w:r>
           </w:p>
         </w:tc>
@@ -23165,7 +23165,7 @@
                 <w:rFonts w:ascii="Times New Roman" w:hAnsi="Times New Roman"/>
                 <w:sz w:val="22"/>
               </w:rPr>
-              <w:t>103.16.62.217:443, :110, :143, :465</w:t>
+              <w:t>103.16.62.xxx:443, :110, :143, :465</w:t>
             </w:r>
           </w:p>
         </w:tc>
@@ -23835,7 +23835,7 @@
           <w:rFonts w:ascii="Times New Roman" w:hAnsi="Times New Roman"/>
           <w:sz w:val="24"/>
         </w:rPr>
-        <w:t xml:space="preserve">A wildcard DNS record routes any subdomain of neuralsh.com to 103.16.62.217. Attackers can use convincing subdomains such as </w:t>
+        <w:t xml:space="preserve">A wildcard DNS record routes any subdomain of neuralsh.com to 103.16.62.xxx. Attackers can use convincing subdomains such as </w:t>
       </w:r>
       <w:r>
         <w:rPr>
@@ -23914,7 +23914,7 @@
           <w:rFonts w:ascii="Times New Roman" w:hAnsi="Times New Roman"/>
           <w:sz w:val="24"/>
         </w:rPr>
-        <w:t xml:space="preserve"> Figure 4.7 — dig confirming randomxyz123.neuralsh.com resolves to 103.16.62.217</w:t>
+        <w:t xml:space="preserve"> Figure 4.7 — dig confirming randomxyz123.neuralsh.com resolves to 103.16.62.xxx</w:t>
       </w:r>
     </w:p>
     <w:p>
@@ -24083,7 +24083,7 @@
                 <w:rFonts w:ascii="Times New Roman" w:hAnsi="Times New Roman"/>
                 <w:sz w:val="22"/>
               </w:rPr>
-              <w:t>103.16.62.217</w:t>
+              <w:t>103.16.62.xxx</w:t>
             </w:r>
           </w:p>
         </w:tc>
@@ -24227,7 +24227,7 @@
           <w:rFonts w:ascii="Times New Roman" w:hAnsi="Times New Roman"/>
           <w:sz w:val="24"/>
         </w:rPr>
-        <w:t xml:space="preserve"> curl response from 103.16.62.217 returning </w:t>
+        <w:t xml:space="preserve"> curl response from 103.16.62.xxx returning </w:t>
       </w:r>
       <w:r>
         <w:rPr>
@@ -24410,7 +24410,7 @@
                 <w:rFonts w:ascii="Times New Roman" w:hAnsi="Times New Roman"/>
                 <w:sz w:val="22"/>
               </w:rPr>
-              <w:t>103.16.62.217</w:t>
+              <w:t>103.16.62.xxx</w:t>
             </w:r>
           </w:p>
         </w:tc>
@@ -24526,7 +24526,7 @@
           <w:rFonts w:ascii="Times New Roman" w:hAnsi="Times New Roman"/>
           <w:sz w:val="24"/>
         </w:rPr>
-        <w:t xml:space="preserve"> curl response showing redirect from 103.16.62.217:2077 to www.onesala.com:2078</w:t>
+        <w:t xml:space="preserve"> curl response showing redirect from 103.16.62.xxx:2077 to www.onesala.com:2078</w:t>
       </w:r>
     </w:p>
     <w:p>
@@ -24697,7 +24697,7 @@
                 <w:rFonts w:ascii="Times New Roman" w:hAnsi="Times New Roman"/>
                 <w:sz w:val="22"/>
               </w:rPr>
-              <w:t>103.16.62.217:2096</w:t>
+              <w:t>103.16.62.xxx:2096</w:t>
             </w:r>
           </w:p>
         </w:tc>
@@ -24970,7 +24970,7 @@
                 <w:rFonts w:ascii="Times New Roman" w:hAnsi="Times New Roman"/>
                 <w:sz w:val="22"/>
               </w:rPr>
-              <w:t>103.16.62.217:2078, :2091</w:t>
+              <w:t>103.16.62.xxx:2078, :2091</w:t>
             </w:r>
           </w:p>
         </w:tc>
@@ -25873,7 +25873,7 @@
                 <w:rFonts w:ascii="Times New Roman" w:hAnsi="Times New Roman"/>
                 <w:sz w:val="22"/>
               </w:rPr>
-              <w:t>103.16.62.217:2083</w:t>
+              <w:t>103.16.62.xxx:2083</w:t>
             </w:r>
           </w:p>
         </w:tc>
@@ -26160,7 +26160,7 @@
                 <w:rFonts w:ascii="Times New Roman" w:hAnsi="Times New Roman"/>
                 <w:sz w:val="22"/>
               </w:rPr>
-              <w:t>103.16.62.217:25</w:t>
+              <w:t>103.16.62.xxx:25</w:t>
             </w:r>
           </w:p>
         </w:tc>
@@ -26302,11 +26302,11 @@
         <w:t>End result:      Full server root access — all hosted domains compromised</w:t>
         <w:br/>
         <w:br/>
-        <w:t>1. DNS MX lookup → mail.neuralsh.com → 103.16.62.217 (origin IP exposed)</w:t>
+        <w:t>1. DNS MX lookup → mail.neuralsh.com → 103.16.62.xxx (origin IP exposed)</w:t>
         <w:br/>
         <w:t>2. Nmap scan → Port 2087 open (WHM root panel)</w:t>
         <w:br/>
-        <w:t>3. Navigate to https://103.16.62.217:2087</w:t>
+        <w:t>3. Navigate to https://103.16.62.xxx:2087</w:t>
         <w:br/>
         <w:t>4. Brute force WHM credentials OR trigger password reset via email compromise</w:t>
         <w:br/>
@@ -26398,7 +26398,7 @@
         <w:br/>
         <w:t>1. Nmap scan → Port 9001 open (MikroTik WebFig)</w:t>
         <w:br/>
-        <w:t>2. Navigate to http://103.16.62.217:9001 in browser</w:t>
+        <w:t>2. Navigate to http://103.16.62.xxx:9001 in browser</w:t>
         <w:br/>
         <w:t>3. Attempt default credentials: admin / (blank)</w:t>
         <w:br/>
@@ -26448,7 +26448,7 @@
         <w:br/>
         <w:t>2. Collect username candidates from JS bundle, error messages, cPanel redirects</w:t>
         <w:br/>
-        <w:t>3. Targeted brute force: hydra -L users.txt -P passwords.txt mysql://103.16.62.217</w:t>
+        <w:t>3. Targeted brute force: hydra -L users.txt -P passwords.txt mysql://103.16.62.xxx</w:t>
         <w:br/>
         <w:t>4. Successful authentication → SHOW DATABASES → SELECT * FROM users</w:t>
         <w:br/>
@@ -30094,7 +30094,7 @@
           <w:i w:val="0"/>
           <w:sz w:val="28"/>
         </w:rPr>
-        <w:t>Appendix A: Nmap Scan Output — Origin Server (103.16.62.217)</w:t>
+        <w:t>Appendix A: Nmap Scan Output — Origin Server (103.16.62.xxx)</w:t>
       </w:r>
     </w:p>
     <w:p>
@@ -30165,7 +30165,7 @@
         </w:rPr>
         <w:t># Nmap 7.94SVN scan — 2026-06-06</w:t>
         <w:br/>
-        <w:t># Command: nmap -sV -p 22,25,53,80,110,111,143,443,465,587,993,995,2000,2083,2087,2096,3306,5060,8899,9001 103.16.62.217</w:t>
+        <w:t># Command: nmap -sV -p 22,25,53,80,110,111,143,443,465,587,993,995,2000,2083,2087,2096,3306,5060,8899,9001 103.16.62.xxx</w:t>
         <w:br/>
         <w:br/>
         <w:t>22/tcp   open  ssh         OpenSSH 8.9p1 Ubuntu</w:t>

</xml_diff>

<commit_message>
Widen IP redaction: 103.16.62.xxx → 103.16.xx.xxx
</commit_message>
<xml_diff>
--- a/THESIS_VAPT_WORD.docx
+++ b/THESIS_VAPT_WORD.docx
@@ -3534,7 +3534,7 @@
                 <w:rFonts w:ascii="Times New Roman" w:hAnsi="Times New Roman"/>
                 <w:sz w:val="22"/>
               </w:rPr>
-              <w:t>Origin server entry point — resolves directly to 103.16.62.xxx</w:t>
+              <w:t>Origin server entry point — resolves directly to 103.16.xx.xxx</w:t>
             </w:r>
           </w:p>
         </w:tc>
@@ -3554,7 +3554,7 @@
                 <w:rFonts w:ascii="Courier New" w:hAnsi="Courier New"/>
                 <w:sz w:val="22"/>
               </w:rPr>
-              <w:t>103.16.62.xxx</w:t>
+              <w:t>103.16.xx.xxx</w:t>
             </w:r>
           </w:p>
         </w:tc>
@@ -8431,7 +8431,7 @@
           <w:b/>
           <w:sz w:val="24"/>
         </w:rPr>
-        <w:t>origin IP address (103.16.62.xxx)</w:t>
+        <w:t>origin IP address (103.16.xx.xxx)</w:t>
       </w:r>
       <w:r>
         <w:rPr>
@@ -8467,7 +8467,7 @@
           <w:rFonts w:ascii="Times New Roman" w:hAnsi="Times New Roman"/>
           <w:sz w:val="24"/>
         </w:rPr>
-        <w:t>With the origin IP identified, active scanning was conducted against 103.16.62.xxx to determine which services were reachable from the internet. Nmap was used to perform a full TCP port scan, revealing a large number of open ports that should not have been publicly accessible — including port 2087 (WHM admin panel), port 3306 (MySQL), port 2083 (cPanel), port 9001 (MikroTik), and port 25 (SMTP). Web application enumeration using Dirb and Nikto identified accessible admin interfaces, exposed directory listings, and additional administrative endpoints.</w:t>
+        <w:t>With the origin IP identified, active scanning was conducted against 103.16.xx.xxx to determine which services were reachable from the internet. Nmap was used to perform a full TCP port scan, revealing a large number of open ports that should not have been publicly accessible — including port 2087 (WHM admin panel), port 3306 (MySQL), port 2083 (cPanel), port 9001 (MikroTik), and port 25 (SMTP). Web application enumeration using Dirb and Nikto identified accessible admin interfaces, exposed directory listings, and additional administrative endpoints.</w:t>
       </w:r>
     </w:p>
     <w:p>
@@ -10121,7 +10121,7 @@
                 <w:rFonts w:ascii="Times New Roman" w:hAnsi="Times New Roman"/>
                 <w:sz w:val="22"/>
               </w:rPr>
-              <w:t>Full TCP port scan on 103.16.62.xxx — discovered 23 open ports</w:t>
+              <w:t>Full TCP port scan on 103.16.xx.xxx — discovered 23 open ports</w:t>
             </w:r>
           </w:p>
         </w:tc>
@@ -10503,7 +10503,7 @@
           <w:rFonts w:ascii="Times New Roman" w:hAnsi="Times New Roman"/>
           <w:sz w:val="24"/>
         </w:rPr>
-        <w:t xml:space="preserve"> (Network Mapper) is the industry-standard open-source tool for network discovery and service fingerprinting. A full TCP scan with service version detection against the origin server revealed that 103.16.62.xxx had 23 ports open and reachable from the public internet — including administrative interfaces that should never be exposed. This single scan produced the evidence base for Critical findings N-001, N-002, N-013, and N-014.</w:t>
+        <w:t xml:space="preserve"> (Network Mapper) is the industry-standard open-source tool for network discovery and service fingerprinting. A full TCP scan with service version detection against the origin server revealed that 103.16.xx.xxx had 23 ports open and reachable from the public internet — including administrative interfaces that should never be exposed. This single scan produced the evidence base for Critical findings N-001, N-002, N-013, and N-014.</w:t>
       </w:r>
     </w:p>
     <w:p>
@@ -13143,7 +13143,7 @@
                 <w:rFonts w:ascii="Times New Roman" w:hAnsi="Times New Roman"/>
                 <w:sz w:val="22"/>
               </w:rPr>
-              <w:t>103.16.62.xxx</w:t>
+              <w:t>103.16.xx.xxx</w:t>
             </w:r>
           </w:p>
         </w:tc>
@@ -13181,7 +13181,7 @@
                 <w:rFonts w:ascii="Times New Roman" w:hAnsi="Times New Roman"/>
                 <w:sz w:val="22"/>
               </w:rPr>
-              <w:t>103.16.62.xxx (direct)</w:t>
+              <w:t>103.16.xx.xxx (direct)</w:t>
             </w:r>
           </w:p>
         </w:tc>
@@ -13250,7 +13250,7 @@
           <w:rFonts w:ascii="Times New Roman" w:hAnsi="Times New Roman"/>
           <w:sz w:val="24"/>
         </w:rPr>
-        <w:t xml:space="preserve">The main site resolves to Cloudflare's anycast network. The real origin server IP (103.16.62.xxx) was discovered via the MX record for </w:t>
+        <w:t xml:space="preserve">The main site resolves to Cloudflare's anycast network. The real origin server IP (103.16.xx.xxx) was discovered via the MX record for </w:t>
       </w:r>
       <w:r>
         <w:rPr>
@@ -13465,7 +13465,7 @@
         <w:br/>
         <w:t>dig A mail.neuralsh.com</w:t>
         <w:br/>
-        <w:t># 103.16.62.xxx — the backend server that Cloudflare is meant to protect</w:t>
+        <w:t># 103.16.xx.xxx — the backend server that Cloudflare is meant to protect</w:t>
       </w:r>
     </w:p>
     <w:p>
@@ -13535,7 +13535,7 @@
           <w:rFonts w:ascii="Times New Roman" w:hAnsi="Times New Roman"/>
           <w:sz w:val="24"/>
         </w:rPr>
-        <w:t>This three-step DNS chain revealed 103.16.62.xxx as the origin server behind the Cloudflare WAF. The MX record is a common oversight — organizations often configure the main domain to proxy through Cloudflare but leave the mail server record pointing directly at the origin. This single lookup rendered the Cloudflare WAF irrelevant for the remainder of the engagement.</w:t>
+        <w:t>This three-step DNS chain revealed 103.16.xx.xxx as the origin server behind the Cloudflare WAF. The MX record is a common oversight — organizations often configure the main domain to proxy through Cloudflare but leave the mail server record pointing directly at the origin. This single lookup rendered the Cloudflare WAF irrelevant for the remainder of the engagement.</w:t>
       </w:r>
     </w:p>
     <w:p>
@@ -13566,7 +13566,7 @@
         <w:br/>
         <w:t>dig TXT neuralsh.com</w:t>
         <w:br/>
-        <w:t># v=spf1 +mx +a +ip4:103.16.62.xxx ~all   (SPF softfail — N-012)</w:t>
+        <w:t># v=spf1 +mx +a +ip4:103.16.xx.xxx ~all   (SPF softfail — N-012)</w:t>
         <w:br/>
         <w:t># v=DMARC1; p=quarantine                   (DMARC not enforcing — N-012)</w:t>
         <w:br/>
@@ -13575,7 +13575,7 @@
         <w:br/>
         <w:t>dig randomxyz123.neuralsh.com</w:t>
         <w:br/>
-        <w:t># Returns: 103.16.62.xxx   (wildcard DNS active — N-010)</w:t>
+        <w:t># Returns: 103.16.xx.xxx   (wildcard DNS active — N-010)</w:t>
         <w:br/>
         <w:br/>
         <w:t># Zone transfer — blocked (positive control)</w:t>
@@ -13680,7 +13680,7 @@
           <w:rFonts w:ascii="Courier New" w:hAnsi="Courier New"/>
           <w:sz w:val="18"/>
         </w:rPr>
-        <w:t>openssl s_client -connect 103.16.62.xxx:443 2&gt;/dev/null | openssl x509 -noout -subject -issuer</w:t>
+        <w:t>openssl s_client -connect 103.16.xx.xxx:443 2&gt;/dev/null | openssl x509 -noout -subject -issuer</w:t>
       </w:r>
     </w:p>
     <w:p>
@@ -14002,7 +14002,7 @@
           <w:rFonts w:ascii="Times New Roman" w:hAnsi="Times New Roman"/>
           <w:sz w:val="24"/>
         </w:rPr>
-        <w:t>With the origin IP confirmed, active scanning was conducted against 103.16.62.xxx to identify all exposed services and their versions. Scanning was performed from the Kali VM via SSH.</w:t>
+        <w:t>With the origin IP confirmed, active scanning was conducted against 103.16.xx.xxx to identify all exposed services and their versions. Scanning was performed from the Kali VM via SSH.</w:t>
       </w:r>
     </w:p>
     <w:p>
@@ -14030,7 +14030,7 @@
           <w:rFonts w:ascii="Courier New" w:hAnsi="Courier New"/>
           <w:sz w:val="18"/>
         </w:rPr>
-        <w:t>sudo nmap -sV -sC -p 22,25,53,80,110,111,143,443,465,587,993,995,2000,2083,2087,2096,3306,5060,8899,9001 103.16.62.xxx</w:t>
+        <w:t>sudo nmap -sV -sC -p 22,25,53,80,110,111,143,443,465,587,993,995,2000,2083,2087,2096,3306,5060,8899,9001 103.16.xx.xxx</w:t>
       </w:r>
     </w:p>
     <w:p>
@@ -14204,21 +14204,21 @@
         </w:rPr>
         <w:t># WHM root administration panel</w:t>
         <w:br/>
-        <w:t>curl -sk https://103.16.62.xxx:2087/ | grep "&lt;title&gt;"</w:t>
+        <w:t>curl -sk https://103.16.xx.xxx:2087/ | grep "&lt;title&gt;"</w:t>
         <w:br/>
         <w:t># &lt;title&gt;WHM Login&lt;/title&gt;</w:t>
         <w:br/>
         <w:br/>
         <w:t># cPanel user panel</w:t>
         <w:br/>
-        <w:t>curl -sk https://103.16.62.xxx:2083/ | grep "&lt;title&gt;"</w:t>
+        <w:t>curl -sk https://103.16.xx.xxx:2083/ | grep "&lt;title&gt;"</w:t>
         <w:br/>
         <w:t># &lt;title&gt;cPanel Login&lt;/title&gt;</w:t>
         <w:br/>
         <w:br/>
         <w:t># MikroTik admin interface</w:t>
         <w:br/>
-        <w:t>curl -v http://103.16.62.xxx:9001/ 2&gt;&amp;1 | grep -E "HTTP|title"</w:t>
+        <w:t>curl -v http://103.16.xx.xxx:9001/ 2&gt;&amp;1 | grep -E "HTTP|title"</w:t>
         <w:br/>
         <w:t># HTTP/1.1 200 OK</w:t>
         <w:br/>
@@ -14227,7 +14227,7 @@
         <w:br/>
         <w:t># Directory listing on origin</w:t>
         <w:br/>
-        <w:t>curl -H "Host: neuralsh.com" http://103.16.62.xxx/</w:t>
+        <w:t>curl -H "Host: neuralsh.com" http://103.16.xx.xxx/</w:t>
         <w:br/>
         <w:t># &lt;title&gt;Index of /&lt;/title&gt;   (Apache directory listing enabled)</w:t>
       </w:r>
@@ -14495,7 +14495,7 @@
           <w:rFonts w:ascii="Courier New" w:hAnsi="Courier New"/>
           <w:sz w:val="18"/>
         </w:rPr>
-        <w:t>nuclei -u https://neuralsh.com -u http://103.16.62.xxx -severity critical,high,medium -o /home/rith/thesis/nuclei_results.txt</w:t>
+        <w:t>nuclei -u https://neuralsh.com -u http://103.16.xx.xxx -severity critical,high,medium -o /home/rith/thesis/nuclei_results.txt</w:t>
       </w:r>
     </w:p>
     <w:p>
@@ -14595,7 +14595,7 @@
         </w:rPr>
         <w:t># Confirm MySQL accepts connections from public internet</w:t>
         <w:br/>
-        <w:t>mysql -h 103.16.62.xxx -P 3306 -u root 2&gt;&amp;1</w:t>
+        <w:t>mysql -h 103.16.xx.xxx -P 3306 -u root 2&gt;&amp;1</w:t>
         <w:br/>
         <w:t># ERROR 1045 (28000): Access denied for user 'root'@'[your-ip]' (using password: NO)</w:t>
       </w:r>
@@ -15426,7 +15426,7 @@
           <w:rFonts w:ascii="Times New Roman" w:hAnsi="Times New Roman"/>
           <w:sz w:val="24"/>
         </w:rPr>
-        <w:t>The WAF bypass was complete — any request sent to 103.16.62.xxx directly is processed by the Apache web server without any Cloudflare filtering, logging, or protection.</w:t>
+        <w:t>The WAF bypass was complete — any request sent to 103.16.xx.xxx directly is processed by the Apache web server without any Cloudflare filtering, logging, or protection.</w:t>
       </w:r>
     </w:p>
     <w:p>
@@ -16058,28 +16058,28 @@
         </w:rPr>
         <w:t># WHM — root server administration</w:t>
         <w:br/>
-        <w:t>curl -sk https://103.16.62.xxx:2087/ | grep -i title</w:t>
+        <w:t>curl -sk https://103.16.xx.xxx:2087/ | grep -i title</w:t>
         <w:br/>
         <w:t># &lt;title&gt;WHM Login&lt;/title&gt;</w:t>
         <w:br/>
         <w:br/>
         <w:t># cPanel — hosting account control</w:t>
         <w:br/>
-        <w:t>curl -sk https://103.16.62.xxx:2083/ | grep -i title</w:t>
+        <w:t>curl -sk https://103.16.xx.xxx:2083/ | grep -i title</w:t>
         <w:br/>
         <w:t># &lt;title&gt;cPanel Login&lt;/title&gt;</w:t>
         <w:br/>
         <w:br/>
         <w:t># MikroTik — network device management</w:t>
         <w:br/>
-        <w:t>curl -v http://103.16.62.xxx:9001/ 2&gt;&amp;1 | grep "title"</w:t>
+        <w:t>curl -v http://103.16.xx.xxx:9001/ 2&gt;&amp;1 | grep "title"</w:t>
         <w:br/>
         <w:t># &lt;title&gt;RouterOS router configuration page&lt;/title&gt;</w:t>
         <w:br/>
         <w:br/>
         <w:t># MySQL — direct database access</w:t>
         <w:br/>
-        <w:t>mysql -h 103.16.62.xxx -P 3306 -u root 2&gt;&amp;1 | head -1</w:t>
+        <w:t>mysql -h 103.16.xx.xxx -P 3306 -u root 2&gt;&amp;1 | head -1</w:t>
         <w:br/>
         <w:t># ERROR 1045 (28000): Access denied (confirms port accepts public connections)</w:t>
       </w:r>
@@ -16544,11 +16544,11 @@
         <w:br/>
         <w:t xml:space="preserve">  ↓</w:t>
         <w:br/>
-        <w:t>MikroTik Router (103.16.62.xxx:9001) — exposed publicly</w:t>
+        <w:t>MikroTik Router (103.16.xx.xxx:9001) — exposed publicly</w:t>
         <w:br/>
         <w:t xml:space="preserve">  ↓ [controls all traffic routing]</w:t>
         <w:br/>
-        <w:t>Backend Server (103.16.62.xxx)</w:t>
+        <w:t>Backend Server (103.16.xx.xxx)</w:t>
         <w:br/>
         <w:t xml:space="preserve">  ├── Apache Web Server (80/443)</w:t>
         <w:br/>
@@ -16736,7 +16736,7 @@
           <w:rFonts w:ascii="Times New Roman" w:hAnsi="Times New Roman"/>
           <w:sz w:val="24"/>
         </w:rPr>
-        <w:t>This section documents direct confirmation of the four critical attack vectors identified against neuralsh.com. All evidence was collected against the live target (103.16.62.xxx) within the authorized scope of the engagement.</w:t>
+        <w:t>This section documents direct confirmation of the four critical attack vectors identified against neuralsh.com. All evidence was collected against the live target (103.16.xx.xxx) within the authorized scope of the engagement.</w:t>
       </w:r>
     </w:p>
     <w:p>
@@ -16772,7 +16772,7 @@
           <w:rFonts w:ascii="Courier New" w:hAnsi="Courier New"/>
           <w:sz w:val="22"/>
         </w:rPr>
-        <w:t>https://103.16.62.xxx:2087/</w:t>
+        <w:t>https://103.16.xx.xxx:2087/</w:t>
       </w:r>
       <w:r>
         <w:rPr>
@@ -16871,7 +16871,7 @@
           <w:rFonts w:ascii="Courier New" w:hAnsi="Courier New"/>
           <w:sz w:val="22"/>
         </w:rPr>
-        <w:t>http://103.16.62.xxx:9001/</w:t>
+        <w:t>http://103.16.xx.xxx:9001/</w:t>
       </w:r>
       <w:r>
         <w:rPr>
@@ -16990,7 +16990,7 @@
           <w:rFonts w:ascii="Courier New" w:hAnsi="Courier New"/>
           <w:sz w:val="18"/>
         </w:rPr>
-        <w:t>mysql -h 103.16.62.xxx -P 3306 -u root 2&gt;&amp;1</w:t>
+        <w:t>mysql -h 103.16.xx.xxx -P 3306 -u root 2&gt;&amp;1</w:t>
         <w:br/>
         <w:t># ERROR 1045 (28000): Access denied for user 'root'@'58.97.216.203' (using password: NO)</w:t>
       </w:r>
@@ -20504,7 +20504,7 @@
                 <w:rFonts w:ascii="Times New Roman" w:hAnsi="Times New Roman"/>
                 <w:sz w:val="22"/>
               </w:rPr>
-              <w:t>103.16.62.xxx:3306</w:t>
+              <w:t>103.16.xx.xxx:3306</w:t>
             </w:r>
           </w:p>
         </w:tc>
@@ -20791,7 +20791,7 @@
                 <w:rFonts w:ascii="Times New Roman" w:hAnsi="Times New Roman"/>
                 <w:sz w:val="22"/>
               </w:rPr>
-              <w:t>103.16.62.xxx:9001</w:t>
+              <w:t>103.16.xx.xxx:9001</w:t>
             </w:r>
           </w:p>
         </w:tc>
@@ -21078,7 +21078,7 @@
                 <w:rFonts w:ascii="Times New Roman" w:hAnsi="Times New Roman"/>
                 <w:sz w:val="22"/>
               </w:rPr>
-              <w:t>103.16.62.xxx:2083</w:t>
+              <w:t>103.16.xx.xxx:2083</w:t>
             </w:r>
           </w:p>
         </w:tc>
@@ -21351,7 +21351,7 @@
                 <w:rFonts w:ascii="Times New Roman" w:hAnsi="Times New Roman"/>
                 <w:sz w:val="22"/>
               </w:rPr>
-              <w:t>103.16.62.xxx:2087</w:t>
+              <w:t>103.16.xx.xxx:2087</w:t>
             </w:r>
           </w:p>
         </w:tc>
@@ -21624,7 +21624,7 @@
                 <w:rFonts w:ascii="Times New Roman" w:hAnsi="Times New Roman"/>
                 <w:sz w:val="22"/>
               </w:rPr>
-              <w:t>103.16.62.xxx:22</w:t>
+              <w:t>103.16.xx.xxx:22</w:t>
             </w:r>
           </w:p>
         </w:tc>
@@ -21925,7 +21925,7 @@
                 <w:rFonts w:ascii="Times New Roman" w:hAnsi="Times New Roman"/>
                 <w:sz w:val="22"/>
               </w:rPr>
-              <w:t>103.16.62.xxx (shared)</w:t>
+              <w:t>103.16.xx.xxx (shared)</w:t>
             </w:r>
           </w:p>
         </w:tc>
@@ -23165,7 +23165,7 @@
                 <w:rFonts w:ascii="Times New Roman" w:hAnsi="Times New Roman"/>
                 <w:sz w:val="22"/>
               </w:rPr>
-              <w:t>103.16.62.xxx:443, :110, :143, :465</w:t>
+              <w:t>103.16.xx.xxx:443, :110, :143, :465</w:t>
             </w:r>
           </w:p>
         </w:tc>
@@ -23835,7 +23835,7 @@
           <w:rFonts w:ascii="Times New Roman" w:hAnsi="Times New Roman"/>
           <w:sz w:val="24"/>
         </w:rPr>
-        <w:t xml:space="preserve">A wildcard DNS record routes any subdomain of neuralsh.com to 103.16.62.xxx. Attackers can use convincing subdomains such as </w:t>
+        <w:t xml:space="preserve">A wildcard DNS record routes any subdomain of neuralsh.com to 103.16.xx.xxx. Attackers can use convincing subdomains such as </w:t>
       </w:r>
       <w:r>
         <w:rPr>
@@ -23914,7 +23914,7 @@
           <w:rFonts w:ascii="Times New Roman" w:hAnsi="Times New Roman"/>
           <w:sz w:val="24"/>
         </w:rPr>
-        <w:t xml:space="preserve"> Figure 4.7 — dig confirming randomxyz123.neuralsh.com resolves to 103.16.62.xxx</w:t>
+        <w:t xml:space="preserve"> Figure 4.7 — dig confirming randomxyz123.neuralsh.com resolves to 103.16.xx.xxx</w:t>
       </w:r>
     </w:p>
     <w:p>
@@ -24083,7 +24083,7 @@
                 <w:rFonts w:ascii="Times New Roman" w:hAnsi="Times New Roman"/>
                 <w:sz w:val="22"/>
               </w:rPr>
-              <w:t>103.16.62.xxx</w:t>
+              <w:t>103.16.xx.xxx</w:t>
             </w:r>
           </w:p>
         </w:tc>
@@ -24227,7 +24227,7 @@
           <w:rFonts w:ascii="Times New Roman" w:hAnsi="Times New Roman"/>
           <w:sz w:val="24"/>
         </w:rPr>
-        <w:t xml:space="preserve"> curl response from 103.16.62.xxx returning </w:t>
+        <w:t xml:space="preserve"> curl response from 103.16.xx.xxx returning </w:t>
       </w:r>
       <w:r>
         <w:rPr>
@@ -24410,7 +24410,7 @@
                 <w:rFonts w:ascii="Times New Roman" w:hAnsi="Times New Roman"/>
                 <w:sz w:val="22"/>
               </w:rPr>
-              <w:t>103.16.62.xxx</w:t>
+              <w:t>103.16.xx.xxx</w:t>
             </w:r>
           </w:p>
         </w:tc>
@@ -24526,7 +24526,7 @@
           <w:rFonts w:ascii="Times New Roman" w:hAnsi="Times New Roman"/>
           <w:sz w:val="24"/>
         </w:rPr>
-        <w:t xml:space="preserve"> curl response showing redirect from 103.16.62.xxx:2077 to www.onesala.com:2078</w:t>
+        <w:t xml:space="preserve"> curl response showing redirect from 103.16.xx.xxx:2077 to www.onesala.com:2078</w:t>
       </w:r>
     </w:p>
     <w:p>
@@ -24697,7 +24697,7 @@
                 <w:rFonts w:ascii="Times New Roman" w:hAnsi="Times New Roman"/>
                 <w:sz w:val="22"/>
               </w:rPr>
-              <w:t>103.16.62.xxx:2096</w:t>
+              <w:t>103.16.xx.xxx:2096</w:t>
             </w:r>
           </w:p>
         </w:tc>
@@ -24970,7 +24970,7 @@
                 <w:rFonts w:ascii="Times New Roman" w:hAnsi="Times New Roman"/>
                 <w:sz w:val="22"/>
               </w:rPr>
-              <w:t>103.16.62.xxx:2078, :2091</w:t>
+              <w:t>103.16.xx.xxx:2078, :2091</w:t>
             </w:r>
           </w:p>
         </w:tc>
@@ -25873,7 +25873,7 @@
                 <w:rFonts w:ascii="Times New Roman" w:hAnsi="Times New Roman"/>
                 <w:sz w:val="22"/>
               </w:rPr>
-              <w:t>103.16.62.xxx:2083</w:t>
+              <w:t>103.16.xx.xxx:2083</w:t>
             </w:r>
           </w:p>
         </w:tc>
@@ -26160,7 +26160,7 @@
                 <w:rFonts w:ascii="Times New Roman" w:hAnsi="Times New Roman"/>
                 <w:sz w:val="22"/>
               </w:rPr>
-              <w:t>103.16.62.xxx:25</w:t>
+              <w:t>103.16.xx.xxx:25</w:t>
             </w:r>
           </w:p>
         </w:tc>
@@ -26302,11 +26302,11 @@
         <w:t>End result:      Full server root access — all hosted domains compromised</w:t>
         <w:br/>
         <w:br/>
-        <w:t>1. DNS MX lookup → mail.neuralsh.com → 103.16.62.xxx (origin IP exposed)</w:t>
+        <w:t>1. DNS MX lookup → mail.neuralsh.com → 103.16.xx.xxx (origin IP exposed)</w:t>
         <w:br/>
         <w:t>2. Nmap scan → Port 2087 open (WHM root panel)</w:t>
         <w:br/>
-        <w:t>3. Navigate to https://103.16.62.xxx:2087</w:t>
+        <w:t>3. Navigate to https://103.16.xx.xxx:2087</w:t>
         <w:br/>
         <w:t>4. Brute force WHM credentials OR trigger password reset via email compromise</w:t>
         <w:br/>
@@ -26398,7 +26398,7 @@
         <w:br/>
         <w:t>1. Nmap scan → Port 9001 open (MikroTik WebFig)</w:t>
         <w:br/>
-        <w:t>2. Navigate to http://103.16.62.xxx:9001 in browser</w:t>
+        <w:t>2. Navigate to http://103.16.xx.xxx:9001 in browser</w:t>
         <w:br/>
         <w:t>3. Attempt default credentials: admin / (blank)</w:t>
         <w:br/>
@@ -26448,7 +26448,7 @@
         <w:br/>
         <w:t>2. Collect username candidates from JS bundle, error messages, cPanel redirects</w:t>
         <w:br/>
-        <w:t>3. Targeted brute force: hydra -L users.txt -P passwords.txt mysql://103.16.62.xxx</w:t>
+        <w:t>3. Targeted brute force: hydra -L users.txt -P passwords.txt mysql://103.16.xx.xxx</w:t>
         <w:br/>
         <w:t>4. Successful authentication → SHOW DATABASES → SELECT * FROM users</w:t>
         <w:br/>
@@ -30094,7 +30094,7 @@
           <w:i w:val="0"/>
           <w:sz w:val="28"/>
         </w:rPr>
-        <w:t>Appendix A: Nmap Scan Output — Origin Server (103.16.62.xxx)</w:t>
+        <w:t>Appendix A: Nmap Scan Output — Origin Server (103.16.xx.xxx)</w:t>
       </w:r>
     </w:p>
     <w:p>
@@ -30165,7 +30165,7 @@
         </w:rPr>
         <w:t># Nmap 7.94SVN scan — 2026-06-06</w:t>
         <w:br/>
-        <w:t># Command: nmap -sV -p 22,25,53,80,110,111,143,443,465,587,993,995,2000,2083,2087,2096,3306,5060,8899,9001 103.16.62.xxx</w:t>
+        <w:t># Command: nmap -sV -p 22,25,53,80,110,111,143,443,465,587,993,995,2000,2083,2087,2096,3306,5060,8899,9001 103.16.xx.xxx</w:t>
         <w:br/>
         <w:br/>
         <w:t>22/tcp   open  ssh         OpenSSH 8.9p1 Ubuntu</w:t>

</xml_diff>

<commit_message>
Update lab config: Bridge Mode → NAT, static IP 10.0.2.15, SSH via port forwarding
</commit_message>
<xml_diff>
--- a/THESIS_VAPT_WORD.docx
+++ b/THESIS_VAPT_WORD.docx
@@ -12139,7 +12139,7 @@
           <w:rFonts w:ascii="Times New Roman" w:hAnsi="Times New Roman"/>
           <w:sz w:val="24"/>
         </w:rPr>
-        <w:t>After booting the Kali VM, SSH access was established as follows:</w:t>
+        <w:t>After booting the Kali VM, SSH access was established as follows. The VM network adapter was configured to use NAT mode in VirtualBox, and a port forwarding rule was added (Host port 2222 → Guest port 22) to allow SSH from the host machine:</w:t>
       </w:r>
     </w:p>
     <w:p>
@@ -12157,14 +12157,9 @@
         <w:t>VBoxManage startvm "Kali-Pentest" --type headless</w:t>
         <w:br/>
         <w:br/>
-        <w:t># Discover Kali's IP on the local network</w:t>
+        <w:t># Connect via SSH using the NAT port forwarding rule</w:t>
         <w:br/>
-        <w:t>nmap -sn 192.168.18.0/24 | grep -A1 "Kali"</w:t>
-        <w:br/>
-        <w:br/>
-        <w:t># Connect via SSH</w:t>
-        <w:br/>
-        <w:t>ssh kali@192.168.18.152</w:t>
+        <w:t>ssh -p 2222 kali@127.0.0.1</w:t>
       </w:r>
     </w:p>
     <w:p>
@@ -12234,7 +12229,7 @@
           <w:rFonts w:ascii="Times New Roman" w:hAnsi="Times New Roman"/>
           <w:sz w:val="24"/>
         </w:rPr>
-        <w:t>Once SSH was confirmed working, a static IP was assigned to the Kali VM to ensure the address did not change between sessions:</w:t>
+        <w:t>Once SSH was confirmed working, a static IP was assigned to the Kali VM to prevent the address from changing between sessions:</w:t>
       </w:r>
     </w:p>
     <w:p>
@@ -12251,7 +12246,7 @@
         <w:br/>
         <w:t>sudo nano /etc/network/interfaces</w:t>
         <w:br/>
-        <w:t># Set: address 192.168.18.152, netmask 255.255.255.0, gateway 192.168.18.1</w:t>
+        <w:t># Set: address 10.0.2.15, netmask 255.255.255.0, gateway 10.0.2.2</w:t>
       </w:r>
     </w:p>
     <w:p>

</xml_diff>

<commit_message>
Reformat attack chains: remove code blocks, plain body text + numbered steps
</commit_message>
<xml_diff>
--- a/THESIS_VAPT_WORD.docx
+++ b/THESIS_VAPT_WORD.docx
@@ -26264,7 +26264,63 @@
           <w:rFonts w:ascii="Times New Roman" w:hAnsi="Times New Roman"/>
           <w:sz w:val="24"/>
         </w:rPr>
-        <w:t>The 20 individual findings do not exist in isolation. The following attack chains map how findings combine into multi-step compromise paths, each representing a realistic scenario that could be executed by an external attacker.</w:t>
+        <w:t>The 20 individual findings do not exist in isolation. The following attack chains map how findings combine into multi-step compromise paths, each representing a realistic scenario executable by an external unauthenticated attacker. Figure 4.22 provides a visual overview of all four chains.</w:t>
+      </w:r>
+    </w:p>
+    <w:p>
+      <w:pPr>
+        <w:ind w:firstLine="0"/>
+        <w:jc w:val="center"/>
+      </w:pPr>
+      <w:r>
+        <w:drawing>
+          <wp:inline xmlns:a="http://schemas.openxmlformats.org/drawingml/2006/main" xmlns:pic="http://schemas.openxmlformats.org/drawingml/2006/picture">
+            <wp:extent cx="5040000" cy="2503926"/>
+            <wp:docPr id="38" name="Picture 38"/>
+            <wp:cNvGraphicFramePr>
+              <a:graphicFrameLocks noChangeAspect="1"/>
+            </wp:cNvGraphicFramePr>
+            <a:graphic>
+              <a:graphicData uri="http://schemas.openxmlformats.org/drawingml/2006/picture">
+                <pic:pic>
+                  <pic:nvPicPr>
+                    <pic:cNvPr id="0" name="fig422_attack_chains.png"/>
+                    <pic:cNvPicPr/>
+                  </pic:nvPicPr>
+                  <pic:blipFill>
+                    <a:blip r:embed="rId45"/>
+                    <a:stretch>
+                      <a:fillRect/>
+                    </a:stretch>
+                  </pic:blipFill>
+                  <pic:spPr>
+                    <a:xfrm>
+                      <a:off x="0" y="0"/>
+                      <a:ext cx="5040000" cy="2503926"/>
+                    </a:xfrm>
+                    <a:prstGeom prst="rect"/>
+                  </pic:spPr>
+                </pic:pic>
+              </a:graphicData>
+            </a:graphic>
+          </wp:inline>
+        </w:drawing>
+      </w:r>
+    </w:p>
+    <w:p>
+      <w:pPr>
+        <w:spacing w:after="240"/>
+        <w:ind w:firstLine="0"/>
+        <w:jc w:val="center"/>
+      </w:pPr>
+      <w:r>
+        <w:rPr>
+          <w:rFonts w:ascii="Times New Roman" w:hAnsi="Times New Roman"/>
+          <w:b w:val="0"/>
+          <w:i/>
+          <w:sz w:val="20"/>
+        </w:rPr>
+        <w:t>Figure 4.22: Attack chain diagram — four confirmed attack vectors</w:t>
       </w:r>
     </w:p>
     <w:p>
@@ -26284,35 +26340,259 @@
     </w:p>
     <w:p>
       <w:pPr>
-        <w:spacing w:before="80" w:after="80"/>
-        <w:ind w:left="720" w:right="283" w:firstLine="0"/>
-      </w:pPr>
-      <w:r>
-        <w:rPr>
-          <w:rFonts w:ascii="Courier New" w:hAnsi="Courier New"/>
-          <w:sz w:val="18"/>
-        </w:rPr>
-        <w:t>Starting point:  Any internet connection</w:t>
-        <w:br/>
-        <w:t>End result:      Full server root access — all hosted domains compromised</w:t>
-        <w:br/>
-        <w:br/>
-        <w:t>1. DNS MX lookup → mail.neuralsh.com → 103.16.xx.xxx (origin IP exposed)</w:t>
-        <w:br/>
-        <w:t>2. Nmap scan → Port 2087 open (WHM root panel)</w:t>
-        <w:br/>
-        <w:t>3. Navigate to https://103.16.xx.xxx:2087</w:t>
-        <w:br/>
-        <w:t>4. Brute force WHM credentials OR trigger password reset via email compromise</w:t>
-        <w:br/>
-        <w:t>5. Login to WHM → Terminal → root shell access</w:t>
-        <w:br/>
-        <w:t>6. Read all .env files, database credentials, API keys across all hosted accounts</w:t>
-        <w:br/>
-        <w:t>7. Access MySQL directly with extracted credentials → full data theft</w:t>
-        <w:br/>
-        <w:br/>
-        <w:t>Complexity: Medium | Likelihood: Medium | Severity: Maximum</w:t>
+        <w:spacing w:line="360" w:lineRule="auto" w:after="120"/>
+        <w:ind w:firstLine="720"/>
+        <w:jc w:val="both"/>
+      </w:pPr>
+      <w:r>
+        <w:rPr>
+          <w:rFonts w:ascii="Times New Roman" w:hAnsi="Times New Roman"/>
+          <w:b/>
+          <w:sz w:val="24"/>
+        </w:rPr>
+        <w:t>Starting point:</w:t>
+      </w:r>
+      <w:r>
+        <w:rPr>
+          <w:rFonts w:ascii="Times New Roman" w:hAnsi="Times New Roman"/>
+          <w:sz w:val="24"/>
+        </w:rPr>
+        <w:t xml:space="preserve"> Any internet connection</w:t>
+      </w:r>
+    </w:p>
+    <w:p>
+      <w:pPr>
+        <w:spacing w:line="360" w:lineRule="auto" w:after="120"/>
+        <w:ind w:firstLine="720"/>
+        <w:jc w:val="both"/>
+      </w:pPr>
+      <w:r>
+        <w:rPr>
+          <w:rFonts w:ascii="Times New Roman" w:hAnsi="Times New Roman"/>
+          <w:b/>
+          <w:sz w:val="24"/>
+        </w:rPr>
+        <w:t>End result:</w:t>
+      </w:r>
+      <w:r>
+        <w:rPr>
+          <w:rFonts w:ascii="Times New Roman" w:hAnsi="Times New Roman"/>
+          <w:sz w:val="24"/>
+        </w:rPr>
+        <w:t xml:space="preserve"> Full server root access — all hosted domains compromised</w:t>
+      </w:r>
+    </w:p>
+    <w:p>
+      <w:pPr>
+        <w:spacing w:line="360" w:lineRule="auto" w:after="80"/>
+        <w:ind w:left="720" w:firstLine="0"/>
+        <w:jc w:val="both"/>
+      </w:pPr>
+      <w:r>
+        <w:rPr>
+          <w:rFonts w:ascii="Times New Roman" w:hAnsi="Times New Roman"/>
+          <w:b w:val="0"/>
+          <w:i w:val="0"/>
+          <w:sz w:val="24"/>
+        </w:rPr>
+        <w:t xml:space="preserve">1.  </w:t>
+      </w:r>
+      <w:r>
+        <w:rPr>
+          <w:rFonts w:ascii="Times New Roman" w:hAnsi="Times New Roman"/>
+          <w:sz w:val="24"/>
+        </w:rPr>
+        <w:t>DNS MX lookup on mail.neuralsh.com reveals the origin IP address</w:t>
+      </w:r>
+    </w:p>
+    <w:p>
+      <w:pPr>
+        <w:spacing w:line="360" w:lineRule="auto" w:after="80"/>
+        <w:ind w:left="720" w:firstLine="0"/>
+        <w:jc w:val="both"/>
+      </w:pPr>
+      <w:r>
+        <w:rPr>
+          <w:rFonts w:ascii="Times New Roman" w:hAnsi="Times New Roman"/>
+          <w:b w:val="0"/>
+          <w:i w:val="0"/>
+          <w:sz w:val="24"/>
+        </w:rPr>
+        <w:t xml:space="preserve">2.  </w:t>
+      </w:r>
+      <w:r>
+        <w:rPr>
+          <w:rFonts w:ascii="Times New Roman" w:hAnsi="Times New Roman"/>
+          <w:sz w:val="24"/>
+        </w:rPr>
+        <w:t>Nmap scan confirms port 2087 open — WHM root admin panel</w:t>
+      </w:r>
+    </w:p>
+    <w:p>
+      <w:pPr>
+        <w:spacing w:line="360" w:lineRule="auto" w:after="80"/>
+        <w:ind w:left="720" w:firstLine="0"/>
+        <w:jc w:val="both"/>
+      </w:pPr>
+      <w:r>
+        <w:rPr>
+          <w:rFonts w:ascii="Times New Roman" w:hAnsi="Times New Roman"/>
+          <w:b w:val="0"/>
+          <w:i w:val="0"/>
+          <w:sz w:val="24"/>
+        </w:rPr>
+        <w:t xml:space="preserve">3.  </w:t>
+      </w:r>
+      <w:r>
+        <w:rPr>
+          <w:rFonts w:ascii="Times New Roman" w:hAnsi="Times New Roman"/>
+          <w:sz w:val="24"/>
+        </w:rPr>
+        <w:t>Navigate to WHM login page — no IP restriction, no 2FA, no lockout</w:t>
+      </w:r>
+    </w:p>
+    <w:p>
+      <w:pPr>
+        <w:spacing w:line="360" w:lineRule="auto" w:after="80"/>
+        <w:ind w:left="720" w:firstLine="0"/>
+        <w:jc w:val="both"/>
+      </w:pPr>
+      <w:r>
+        <w:rPr>
+          <w:rFonts w:ascii="Times New Roman" w:hAnsi="Times New Roman"/>
+          <w:b w:val="0"/>
+          <w:i w:val="0"/>
+          <w:sz w:val="24"/>
+        </w:rPr>
+        <w:t xml:space="preserve">4.  </w:t>
+      </w:r>
+      <w:r>
+        <w:rPr>
+          <w:rFonts w:ascii="Times New Roman" w:hAnsi="Times New Roman"/>
+          <w:sz w:val="24"/>
+        </w:rPr>
+        <w:t>Brute force credentials or trigger password reset via email compromise</w:t>
+      </w:r>
+    </w:p>
+    <w:p>
+      <w:pPr>
+        <w:spacing w:line="360" w:lineRule="auto" w:after="80"/>
+        <w:ind w:left="720" w:firstLine="0"/>
+        <w:jc w:val="both"/>
+      </w:pPr>
+      <w:r>
+        <w:rPr>
+          <w:rFonts w:ascii="Times New Roman" w:hAnsi="Times New Roman"/>
+          <w:b w:val="0"/>
+          <w:i w:val="0"/>
+          <w:sz w:val="24"/>
+        </w:rPr>
+        <w:t xml:space="preserve">5.  </w:t>
+      </w:r>
+      <w:r>
+        <w:rPr>
+          <w:rFonts w:ascii="Times New Roman" w:hAnsi="Times New Roman"/>
+          <w:sz w:val="24"/>
+        </w:rPr>
+        <w:t>Login to WHM Terminal — root shell access obtained</w:t>
+      </w:r>
+    </w:p>
+    <w:p>
+      <w:pPr>
+        <w:spacing w:line="360" w:lineRule="auto" w:after="80"/>
+        <w:ind w:left="720" w:firstLine="0"/>
+        <w:jc w:val="both"/>
+      </w:pPr>
+      <w:r>
+        <w:rPr>
+          <w:rFonts w:ascii="Times New Roman" w:hAnsi="Times New Roman"/>
+          <w:b w:val="0"/>
+          <w:i w:val="0"/>
+          <w:sz w:val="24"/>
+        </w:rPr>
+        <w:t xml:space="preserve">6.  </w:t>
+      </w:r>
+      <w:r>
+        <w:rPr>
+          <w:rFonts w:ascii="Times New Roman" w:hAnsi="Times New Roman"/>
+          <w:sz w:val="24"/>
+        </w:rPr>
+        <w:t>Read all .env files, database credentials, and API keys across all hosted accounts</w:t>
+      </w:r>
+    </w:p>
+    <w:p>
+      <w:pPr>
+        <w:spacing w:line="360" w:lineRule="auto" w:after="80"/>
+        <w:ind w:left="720" w:firstLine="0"/>
+        <w:jc w:val="both"/>
+      </w:pPr>
+      <w:r>
+        <w:rPr>
+          <w:rFonts w:ascii="Times New Roman" w:hAnsi="Times New Roman"/>
+          <w:b w:val="0"/>
+          <w:i w:val="0"/>
+          <w:sz w:val="24"/>
+        </w:rPr>
+        <w:t xml:space="preserve">7.  </w:t>
+      </w:r>
+      <w:r>
+        <w:rPr>
+          <w:rFonts w:ascii="Times New Roman" w:hAnsi="Times New Roman"/>
+          <w:sz w:val="24"/>
+        </w:rPr>
+        <w:t>Connect to MySQL directly with extracted credentials — full data theft</w:t>
+      </w:r>
+    </w:p>
+    <w:p>
+      <w:pPr>
+        <w:spacing w:line="360" w:lineRule="auto" w:after="120"/>
+        <w:ind w:firstLine="720"/>
+        <w:jc w:val="both"/>
+      </w:pPr>
+      <w:r>
+        <w:rPr>
+          <w:rFonts w:ascii="Times New Roman" w:hAnsi="Times New Roman"/>
+          <w:b/>
+          <w:sz w:val="24"/>
+        </w:rPr>
+        <w:t>Complexity:</w:t>
+      </w:r>
+      <w:r>
+        <w:rPr>
+          <w:rFonts w:ascii="Times New Roman" w:hAnsi="Times New Roman"/>
+          <w:sz w:val="24"/>
+        </w:rPr>
+        <w:t xml:space="preserve"> Medium | </w:t>
+      </w:r>
+      <w:r>
+        <w:rPr>
+          <w:rFonts w:ascii="Times New Roman" w:hAnsi="Times New Roman"/>
+          <w:b/>
+          <w:sz w:val="24"/>
+        </w:rPr>
+        <w:t>Likelihood:</w:t>
+      </w:r>
+      <w:r>
+        <w:rPr>
+          <w:rFonts w:ascii="Times New Roman" w:hAnsi="Times New Roman"/>
+          <w:sz w:val="24"/>
+        </w:rPr>
+        <w:t xml:space="preserve"> Medium | </w:t>
+      </w:r>
+      <w:r>
+        <w:rPr>
+          <w:rFonts w:ascii="Times New Roman" w:hAnsi="Times New Roman"/>
+          <w:b/>
+          <w:sz w:val="24"/>
+        </w:rPr>
+        <w:t>Severity:</w:t>
+      </w:r>
+      <w:r>
+        <w:rPr>
+          <w:rFonts w:ascii="Times New Roman" w:hAnsi="Times New Roman"/>
+          <w:sz w:val="24"/>
+        </w:rPr>
+        <w:t xml:space="preserve"> Maximum (CVSS 10.0)</w:t>
       </w:r>
     </w:p>
     <w:p>
@@ -26332,33 +26612,236 @@
     </w:p>
     <w:p>
       <w:pPr>
-        <w:spacing w:before="80" w:after="80"/>
-        <w:ind w:left="720" w:right="283" w:firstLine="0"/>
-      </w:pPr>
-      <w:r>
-        <w:rPr>
-          <w:rFonts w:ascii="Courier New" w:hAnsi="Courier New"/>
-          <w:sz w:val="18"/>
-        </w:rPr>
-        <w:t>Starting point:  Any internet connection</w:t>
-        <w:br/>
-        <w:t>End result:      Unlimited API access, data enumeration, potential account takeover</w:t>
-        <w:br/>
-        <w:br/>
-        <w:t>1. Load neuralsh.com in browser → JavaScript bundle reveals /web/v1/init/token</w:t>
-        <w:br/>
-        <w:t>2. Send 50 requests with rotating X-Forwarded-For headers</w:t>
-        <w:br/>
-        <w:t>3. Collect 50 valid JWT tokens — 0 rate limit responses (100% bypass)</w:t>
-        <w:br/>
-        <w:t>4. Automate token refresh every 29 minutes → perpetual API access</w:t>
-        <w:br/>
-        <w:t>5. Enumerate /web/v1/text/search, /web/v1/image/search, /web/v1/category</w:t>
-        <w:br/>
-        <w:t>6. If JWT secret obtained via Chain 1 → forge token with type:admin</w:t>
-        <w:br/>
-        <w:br/>
-        <w:t>Complexity: Low | Likelihood: High (fully demonstrated) | Severity: High</w:t>
+        <w:spacing w:line="360" w:lineRule="auto" w:after="120"/>
+        <w:ind w:firstLine="720"/>
+        <w:jc w:val="both"/>
+      </w:pPr>
+      <w:r>
+        <w:rPr>
+          <w:rFonts w:ascii="Times New Roman" w:hAnsi="Times New Roman"/>
+          <w:b/>
+          <w:sz w:val="24"/>
+        </w:rPr>
+        <w:t>Starting point:</w:t>
+      </w:r>
+      <w:r>
+        <w:rPr>
+          <w:rFonts w:ascii="Times New Roman" w:hAnsi="Times New Roman"/>
+          <w:sz w:val="24"/>
+        </w:rPr>
+        <w:t xml:space="preserve"> Any internet connection</w:t>
+      </w:r>
+    </w:p>
+    <w:p>
+      <w:pPr>
+        <w:spacing w:line="360" w:lineRule="auto" w:after="120"/>
+        <w:ind w:firstLine="720"/>
+        <w:jc w:val="both"/>
+      </w:pPr>
+      <w:r>
+        <w:rPr>
+          <w:rFonts w:ascii="Times New Roman" w:hAnsi="Times New Roman"/>
+          <w:b/>
+          <w:sz w:val="24"/>
+        </w:rPr>
+        <w:t>End result:</w:t>
+      </w:r>
+      <w:r>
+        <w:rPr>
+          <w:rFonts w:ascii="Times New Roman" w:hAnsi="Times New Roman"/>
+          <w:sz w:val="24"/>
+        </w:rPr>
+        <w:t xml:space="preserve"> Unlimited API access, data enumeration, potential account takeover</w:t>
+      </w:r>
+    </w:p>
+    <w:p>
+      <w:pPr>
+        <w:spacing w:line="360" w:lineRule="auto" w:after="80"/>
+        <w:ind w:left="720" w:firstLine="0"/>
+        <w:jc w:val="both"/>
+      </w:pPr>
+      <w:r>
+        <w:rPr>
+          <w:rFonts w:ascii="Times New Roman" w:hAnsi="Times New Roman"/>
+          <w:b w:val="0"/>
+          <w:i w:val="0"/>
+          <w:sz w:val="24"/>
+        </w:rPr>
+        <w:t xml:space="preserve">1.  </w:t>
+      </w:r>
+      <w:r>
+        <w:rPr>
+          <w:rFonts w:ascii="Times New Roman" w:hAnsi="Times New Roman"/>
+          <w:sz w:val="24"/>
+        </w:rPr>
+        <w:t>Load neuralsh.com — JavaScript bundle reveals /web/v1/init/token</w:t>
+      </w:r>
+    </w:p>
+    <w:p>
+      <w:pPr>
+        <w:spacing w:line="360" w:lineRule="auto" w:after="80"/>
+        <w:ind w:left="720" w:firstLine="0"/>
+        <w:jc w:val="both"/>
+      </w:pPr>
+      <w:r>
+        <w:rPr>
+          <w:rFonts w:ascii="Times New Roman" w:hAnsi="Times New Roman"/>
+          <w:b w:val="0"/>
+          <w:i w:val="0"/>
+          <w:sz w:val="24"/>
+        </w:rPr>
+        <w:t xml:space="preserve">2.  </w:t>
+      </w:r>
+      <w:r>
+        <w:rPr>
+          <w:rFonts w:ascii="Times New Roman" w:hAnsi="Times New Roman"/>
+          <w:sz w:val="24"/>
+        </w:rPr>
+        <w:t>Send requests with rotating X-Forwarded-For values — rate limiter is bypassed</w:t>
+      </w:r>
+    </w:p>
+    <w:p>
+      <w:pPr>
+        <w:spacing w:line="360" w:lineRule="auto" w:after="80"/>
+        <w:ind w:left="720" w:firstLine="0"/>
+        <w:jc w:val="both"/>
+      </w:pPr>
+      <w:r>
+        <w:rPr>
+          <w:rFonts w:ascii="Times New Roman" w:hAnsi="Times New Roman"/>
+          <w:b w:val="0"/>
+          <w:i w:val="0"/>
+          <w:sz w:val="24"/>
+        </w:rPr>
+        <w:t xml:space="preserve">3.  </w:t>
+      </w:r>
+      <w:r>
+        <w:rPr>
+          <w:rFonts w:ascii="Times New Roman" w:hAnsi="Times New Roman"/>
+          <w:sz w:val="24"/>
+        </w:rPr>
+        <w:t>Collect 50 valid JWT tokens in under three seconds (100% bypass, confirmed)</w:t>
+      </w:r>
+    </w:p>
+    <w:p>
+      <w:pPr>
+        <w:spacing w:line="360" w:lineRule="auto" w:after="80"/>
+        <w:ind w:left="720" w:firstLine="0"/>
+        <w:jc w:val="both"/>
+      </w:pPr>
+      <w:r>
+        <w:rPr>
+          <w:rFonts w:ascii="Times New Roman" w:hAnsi="Times New Roman"/>
+          <w:b w:val="0"/>
+          <w:i w:val="0"/>
+          <w:sz w:val="24"/>
+        </w:rPr>
+        <w:t xml:space="preserve">4.  </w:t>
+      </w:r>
+      <w:r>
+        <w:rPr>
+          <w:rFonts w:ascii="Times New Roman" w:hAnsi="Times New Roman"/>
+          <w:sz w:val="24"/>
+        </w:rPr>
+        <w:t>Automate token refresh every 29 minutes — perpetual API access established</w:t>
+      </w:r>
+    </w:p>
+    <w:p>
+      <w:pPr>
+        <w:spacing w:line="360" w:lineRule="auto" w:after="80"/>
+        <w:ind w:left="720" w:firstLine="0"/>
+        <w:jc w:val="both"/>
+      </w:pPr>
+      <w:r>
+        <w:rPr>
+          <w:rFonts w:ascii="Times New Roman" w:hAnsi="Times New Roman"/>
+          <w:b w:val="0"/>
+          <w:i w:val="0"/>
+          <w:sz w:val="24"/>
+        </w:rPr>
+        <w:t xml:space="preserve">5.  </w:t>
+      </w:r>
+      <w:r>
+        <w:rPr>
+          <w:rFonts w:ascii="Times New Roman" w:hAnsi="Times New Roman"/>
+          <w:sz w:val="24"/>
+        </w:rPr>
+        <w:t>Enumerate /web/v1/text/search, /web/v1/image/search, /web/v1/category</w:t>
+      </w:r>
+    </w:p>
+    <w:p>
+      <w:pPr>
+        <w:spacing w:line="360" w:lineRule="auto" w:after="80"/>
+        <w:ind w:left="720" w:firstLine="0"/>
+        <w:jc w:val="both"/>
+      </w:pPr>
+      <w:r>
+        <w:rPr>
+          <w:rFonts w:ascii="Times New Roman" w:hAnsi="Times New Roman"/>
+          <w:b w:val="0"/>
+          <w:i w:val="0"/>
+          <w:sz w:val="24"/>
+        </w:rPr>
+        <w:t xml:space="preserve">6.  </w:t>
+      </w:r>
+      <w:r>
+        <w:rPr>
+          <w:rFonts w:ascii="Times New Roman" w:hAnsi="Times New Roman"/>
+          <w:sz w:val="24"/>
+        </w:rPr>
+        <w:t>If JWT secret obtained via Chain 1 — forge token with type:admin claim</w:t>
+      </w:r>
+    </w:p>
+    <w:p>
+      <w:pPr>
+        <w:spacing w:line="360" w:lineRule="auto" w:after="120"/>
+        <w:ind w:firstLine="720"/>
+        <w:jc w:val="both"/>
+      </w:pPr>
+      <w:r>
+        <w:rPr>
+          <w:rFonts w:ascii="Times New Roman" w:hAnsi="Times New Roman"/>
+          <w:b/>
+          <w:sz w:val="24"/>
+        </w:rPr>
+        <w:t>Complexity:</w:t>
+      </w:r>
+      <w:r>
+        <w:rPr>
+          <w:rFonts w:ascii="Times New Roman" w:hAnsi="Times New Roman"/>
+          <w:sz w:val="24"/>
+        </w:rPr>
+        <w:t xml:space="preserve"> Low | </w:t>
+      </w:r>
+      <w:r>
+        <w:rPr>
+          <w:rFonts w:ascii="Times New Roman" w:hAnsi="Times New Roman"/>
+          <w:b/>
+          <w:sz w:val="24"/>
+        </w:rPr>
+        <w:t>Likelihood:</w:t>
+      </w:r>
+      <w:r>
+        <w:rPr>
+          <w:rFonts w:ascii="Times New Roman" w:hAnsi="Times New Roman"/>
+          <w:sz w:val="24"/>
+        </w:rPr>
+        <w:t xml:space="preserve"> High (fully demonstrated) | </w:t>
+      </w:r>
+      <w:r>
+        <w:rPr>
+          <w:rFonts w:ascii="Times New Roman" w:hAnsi="Times New Roman"/>
+          <w:b/>
+          <w:sz w:val="24"/>
+        </w:rPr>
+        <w:t>Severity:</w:t>
+      </w:r>
+      <w:r>
+        <w:rPr>
+          <w:rFonts w:ascii="Times New Roman" w:hAnsi="Times New Roman"/>
+          <w:sz w:val="24"/>
+        </w:rPr>
+        <w:t xml:space="preserve"> High</w:t>
       </w:r>
     </w:p>
     <w:p>
@@ -26378,35 +26861,259 @@
     </w:p>
     <w:p>
       <w:pPr>
-        <w:spacing w:before="80" w:after="80"/>
-        <w:ind w:left="720" w:right="283" w:firstLine="0"/>
-      </w:pPr>
-      <w:r>
-        <w:rPr>
-          <w:rFonts w:ascii="Courier New" w:hAnsi="Courier New"/>
-          <w:sz w:val="18"/>
-        </w:rPr>
-        <w:t>Starting point:  Any internet connection</w:t>
-        <w:br/>
-        <w:t>End result:      Full network routing control — traffic interception possible</w:t>
-        <w:br/>
-        <w:br/>
-        <w:t>1. Nmap scan → Port 9001 open (MikroTik WebFig)</w:t>
-        <w:br/>
-        <w:t>2. Navigate to http://103.16.xx.xxx:9001 in browser</w:t>
-        <w:br/>
-        <w:t>3. Attempt default credentials: admin / (blank)</w:t>
-        <w:br/>
-        <w:t>4. If successful → RouterOS Dashboard</w:t>
-        <w:br/>
-        <w:t>5. Tools → Packet Sniffer → capture all network traffic in plaintext</w:t>
-        <w:br/>
-        <w:t>6. IP → Routes → add malicious routing entries</w:t>
-        <w:br/>
-        <w:t>7. System → Users → create backdoor admin account (persistence)</w:t>
-        <w:br/>
-        <w:br/>
-        <w:t>Complexity: Low (if default creds active) | Likelihood: Medium-High | Severity: Critical</w:t>
+        <w:spacing w:line="360" w:lineRule="auto" w:after="120"/>
+        <w:ind w:firstLine="720"/>
+        <w:jc w:val="both"/>
+      </w:pPr>
+      <w:r>
+        <w:rPr>
+          <w:rFonts w:ascii="Times New Roman" w:hAnsi="Times New Roman"/>
+          <w:b/>
+          <w:sz w:val="24"/>
+        </w:rPr>
+        <w:t>Starting point:</w:t>
+      </w:r>
+      <w:r>
+        <w:rPr>
+          <w:rFonts w:ascii="Times New Roman" w:hAnsi="Times New Roman"/>
+          <w:sz w:val="24"/>
+        </w:rPr>
+        <w:t xml:space="preserve"> Any internet connection</w:t>
+      </w:r>
+    </w:p>
+    <w:p>
+      <w:pPr>
+        <w:spacing w:line="360" w:lineRule="auto" w:after="120"/>
+        <w:ind w:firstLine="720"/>
+        <w:jc w:val="both"/>
+      </w:pPr>
+      <w:r>
+        <w:rPr>
+          <w:rFonts w:ascii="Times New Roman" w:hAnsi="Times New Roman"/>
+          <w:b/>
+          <w:sz w:val="24"/>
+        </w:rPr>
+        <w:t>End result:</w:t>
+      </w:r>
+      <w:r>
+        <w:rPr>
+          <w:rFonts w:ascii="Times New Roman" w:hAnsi="Times New Roman"/>
+          <w:sz w:val="24"/>
+        </w:rPr>
+        <w:t xml:space="preserve"> Full network routing control — traffic interception possible</w:t>
+      </w:r>
+    </w:p>
+    <w:p>
+      <w:pPr>
+        <w:spacing w:line="360" w:lineRule="auto" w:after="80"/>
+        <w:ind w:left="720" w:firstLine="0"/>
+        <w:jc w:val="both"/>
+      </w:pPr>
+      <w:r>
+        <w:rPr>
+          <w:rFonts w:ascii="Times New Roman" w:hAnsi="Times New Roman"/>
+          <w:b w:val="0"/>
+          <w:i w:val="0"/>
+          <w:sz w:val="24"/>
+        </w:rPr>
+        <w:t xml:space="preserve">1.  </w:t>
+      </w:r>
+      <w:r>
+        <w:rPr>
+          <w:rFonts w:ascii="Times New Roman" w:hAnsi="Times New Roman"/>
+          <w:sz w:val="24"/>
+        </w:rPr>
+        <w:t>Nmap scan confirms port 9001 open — MikroTik RouterOS WebFig interface</w:t>
+      </w:r>
+    </w:p>
+    <w:p>
+      <w:pPr>
+        <w:spacing w:line="360" w:lineRule="auto" w:after="80"/>
+        <w:ind w:left="720" w:firstLine="0"/>
+        <w:jc w:val="both"/>
+      </w:pPr>
+      <w:r>
+        <w:rPr>
+          <w:rFonts w:ascii="Times New Roman" w:hAnsi="Times New Roman"/>
+          <w:b w:val="0"/>
+          <w:i w:val="0"/>
+          <w:sz w:val="24"/>
+        </w:rPr>
+        <w:t xml:space="preserve">2.  </w:t>
+      </w:r>
+      <w:r>
+        <w:rPr>
+          <w:rFonts w:ascii="Times New Roman" w:hAnsi="Times New Roman"/>
+          <w:sz w:val="24"/>
+        </w:rPr>
+        <w:t>Navigate to the login page — pre-filled admin username, no IP restriction</w:t>
+      </w:r>
+    </w:p>
+    <w:p>
+      <w:pPr>
+        <w:spacing w:line="360" w:lineRule="auto" w:after="80"/>
+        <w:ind w:left="720" w:firstLine="0"/>
+        <w:jc w:val="both"/>
+      </w:pPr>
+      <w:r>
+        <w:rPr>
+          <w:rFonts w:ascii="Times New Roman" w:hAnsi="Times New Roman"/>
+          <w:b w:val="0"/>
+          <w:i w:val="0"/>
+          <w:sz w:val="24"/>
+        </w:rPr>
+        <w:t xml:space="preserve">3.  </w:t>
+      </w:r>
+      <w:r>
+        <w:rPr>
+          <w:rFonts w:ascii="Times New Roman" w:hAnsi="Times New Roman"/>
+          <w:sz w:val="24"/>
+        </w:rPr>
+        <w:t>Attempt factory default credentials: admin / (blank password)</w:t>
+      </w:r>
+    </w:p>
+    <w:p>
+      <w:pPr>
+        <w:spacing w:line="360" w:lineRule="auto" w:after="80"/>
+        <w:ind w:left="720" w:firstLine="0"/>
+        <w:jc w:val="both"/>
+      </w:pPr>
+      <w:r>
+        <w:rPr>
+          <w:rFonts w:ascii="Times New Roman" w:hAnsi="Times New Roman"/>
+          <w:b w:val="0"/>
+          <w:i w:val="0"/>
+          <w:sz w:val="24"/>
+        </w:rPr>
+        <w:t xml:space="preserve">4.  </w:t>
+      </w:r>
+      <w:r>
+        <w:rPr>
+          <w:rFonts w:ascii="Times New Roman" w:hAnsi="Times New Roman"/>
+          <w:sz w:val="24"/>
+        </w:rPr>
+        <w:t>If default credentials active — full RouterOS dashboard access</w:t>
+      </w:r>
+    </w:p>
+    <w:p>
+      <w:pPr>
+        <w:spacing w:line="360" w:lineRule="auto" w:after="80"/>
+        <w:ind w:left="720" w:firstLine="0"/>
+        <w:jc w:val="both"/>
+      </w:pPr>
+      <w:r>
+        <w:rPr>
+          <w:rFonts w:ascii="Times New Roman" w:hAnsi="Times New Roman"/>
+          <w:b w:val="0"/>
+          <w:i w:val="0"/>
+          <w:sz w:val="24"/>
+        </w:rPr>
+        <w:t xml:space="preserve">5.  </w:t>
+      </w:r>
+      <w:r>
+        <w:rPr>
+          <w:rFonts w:ascii="Times New Roman" w:hAnsi="Times New Roman"/>
+          <w:sz w:val="24"/>
+        </w:rPr>
+        <w:t>Enable Packet Sniffer — capture all network traffic in plaintext</w:t>
+      </w:r>
+    </w:p>
+    <w:p>
+      <w:pPr>
+        <w:spacing w:line="360" w:lineRule="auto" w:after="80"/>
+        <w:ind w:left="720" w:firstLine="0"/>
+        <w:jc w:val="both"/>
+      </w:pPr>
+      <w:r>
+        <w:rPr>
+          <w:rFonts w:ascii="Times New Roman" w:hAnsi="Times New Roman"/>
+          <w:b w:val="0"/>
+          <w:i w:val="0"/>
+          <w:sz w:val="24"/>
+        </w:rPr>
+        <w:t xml:space="preserve">6.  </w:t>
+      </w:r>
+      <w:r>
+        <w:rPr>
+          <w:rFonts w:ascii="Times New Roman" w:hAnsi="Times New Roman"/>
+          <w:sz w:val="24"/>
+        </w:rPr>
+        <w:t>Modify routing tables — redirect traffic to attacker-controlled endpoint</w:t>
+      </w:r>
+    </w:p>
+    <w:p>
+      <w:pPr>
+        <w:spacing w:line="360" w:lineRule="auto" w:after="80"/>
+        <w:ind w:left="720" w:firstLine="0"/>
+        <w:jc w:val="both"/>
+      </w:pPr>
+      <w:r>
+        <w:rPr>
+          <w:rFonts w:ascii="Times New Roman" w:hAnsi="Times New Roman"/>
+          <w:b w:val="0"/>
+          <w:i w:val="0"/>
+          <w:sz w:val="24"/>
+        </w:rPr>
+        <w:t xml:space="preserve">7.  </w:t>
+      </w:r>
+      <w:r>
+        <w:rPr>
+          <w:rFonts w:ascii="Times New Roman" w:hAnsi="Times New Roman"/>
+          <w:sz w:val="24"/>
+        </w:rPr>
+        <w:t>Create backdoor admin account for persistent access</w:t>
+      </w:r>
+    </w:p>
+    <w:p>
+      <w:pPr>
+        <w:spacing w:line="360" w:lineRule="auto" w:after="120"/>
+        <w:ind w:firstLine="720"/>
+        <w:jc w:val="both"/>
+      </w:pPr>
+      <w:r>
+        <w:rPr>
+          <w:rFonts w:ascii="Times New Roman" w:hAnsi="Times New Roman"/>
+          <w:b/>
+          <w:sz w:val="24"/>
+        </w:rPr>
+        <w:t>Complexity:</w:t>
+      </w:r>
+      <w:r>
+        <w:rPr>
+          <w:rFonts w:ascii="Times New Roman" w:hAnsi="Times New Roman"/>
+          <w:sz w:val="24"/>
+        </w:rPr>
+        <w:t xml:space="preserve"> Low (if default credentials active) | </w:t>
+      </w:r>
+      <w:r>
+        <w:rPr>
+          <w:rFonts w:ascii="Times New Roman" w:hAnsi="Times New Roman"/>
+          <w:b/>
+          <w:sz w:val="24"/>
+        </w:rPr>
+        <w:t>Likelihood:</w:t>
+      </w:r>
+      <w:r>
+        <w:rPr>
+          <w:rFonts w:ascii="Times New Roman" w:hAnsi="Times New Roman"/>
+          <w:sz w:val="24"/>
+        </w:rPr>
+        <w:t xml:space="preserve"> Medium-High | </w:t>
+      </w:r>
+      <w:r>
+        <w:rPr>
+          <w:rFonts w:ascii="Times New Roman" w:hAnsi="Times New Roman"/>
+          <w:b/>
+          <w:sz w:val="24"/>
+        </w:rPr>
+        <w:t>Severity:</w:t>
+      </w:r>
+      <w:r>
+        <w:rPr>
+          <w:rFonts w:ascii="Times New Roman" w:hAnsi="Times New Roman"/>
+          <w:sz w:val="24"/>
+        </w:rPr>
+        <w:t xml:space="preserve"> Critical</w:t>
       </w:r>
     </w:p>
     <w:p>
@@ -26426,33 +27133,236 @@
     </w:p>
     <w:p>
       <w:pPr>
-        <w:spacing w:before="80" w:after="80"/>
-        <w:ind w:left="720" w:right="283" w:firstLine="0"/>
-      </w:pPr>
-      <w:r>
-        <w:rPr>
-          <w:rFonts w:ascii="Courier New" w:hAnsi="Courier New"/>
-          <w:sz w:val="18"/>
-        </w:rPr>
-        <w:t>Starting point:  Any internet connection</w:t>
-        <w:br/>
-        <w:t>End result:      Full database access, potential remote code execution</w:t>
-        <w:br/>
-        <w:br/>
-        <w:t>1. Nmap scan → Port 3306 open (MySQL 8.0.43)</w:t>
-        <w:br/>
-        <w:t>2. Collect username candidates from JS bundle, error messages, cPanel redirects</w:t>
-        <w:br/>
-        <w:t>3. Targeted brute force: hydra -L users.txt -P passwords.txt mysql://103.16.xx.xxx</w:t>
-        <w:br/>
-        <w:t>4. Successful authentication → SHOW DATABASES → SELECT * FROM users</w:t>
-        <w:br/>
-        <w:t>5. Full data exfiltration: user records, search history, API credentials</w:t>
-        <w:br/>
-        <w:t>6. If FILE privilege granted → write PHP web shell to /var/www/html/ → RCE</w:t>
-        <w:br/>
-        <w:br/>
-        <w:t>Complexity: Medium | Likelihood: Medium | Severity: Critical</w:t>
+        <w:spacing w:line="360" w:lineRule="auto" w:after="120"/>
+        <w:ind w:firstLine="720"/>
+        <w:jc w:val="both"/>
+      </w:pPr>
+      <w:r>
+        <w:rPr>
+          <w:rFonts w:ascii="Times New Roman" w:hAnsi="Times New Roman"/>
+          <w:b/>
+          <w:sz w:val="24"/>
+        </w:rPr>
+        <w:t>Starting point:</w:t>
+      </w:r>
+      <w:r>
+        <w:rPr>
+          <w:rFonts w:ascii="Times New Roman" w:hAnsi="Times New Roman"/>
+          <w:sz w:val="24"/>
+        </w:rPr>
+        <w:t xml:space="preserve"> Any internet connection</w:t>
+      </w:r>
+    </w:p>
+    <w:p>
+      <w:pPr>
+        <w:spacing w:line="360" w:lineRule="auto" w:after="120"/>
+        <w:ind w:firstLine="720"/>
+        <w:jc w:val="both"/>
+      </w:pPr>
+      <w:r>
+        <w:rPr>
+          <w:rFonts w:ascii="Times New Roman" w:hAnsi="Times New Roman"/>
+          <w:b/>
+          <w:sz w:val="24"/>
+        </w:rPr>
+        <w:t>End result:</w:t>
+      </w:r>
+      <w:r>
+        <w:rPr>
+          <w:rFonts w:ascii="Times New Roman" w:hAnsi="Times New Roman"/>
+          <w:sz w:val="24"/>
+        </w:rPr>
+        <w:t xml:space="preserve"> Full database access, potential remote code execution</w:t>
+      </w:r>
+    </w:p>
+    <w:p>
+      <w:pPr>
+        <w:spacing w:line="360" w:lineRule="auto" w:after="80"/>
+        <w:ind w:left="720" w:firstLine="0"/>
+        <w:jc w:val="both"/>
+      </w:pPr>
+      <w:r>
+        <w:rPr>
+          <w:rFonts w:ascii="Times New Roman" w:hAnsi="Times New Roman"/>
+          <w:b w:val="0"/>
+          <w:i w:val="0"/>
+          <w:sz w:val="24"/>
+        </w:rPr>
+        <w:t xml:space="preserve">1.  </w:t>
+      </w:r>
+      <w:r>
+        <w:rPr>
+          <w:rFonts w:ascii="Times New Roman" w:hAnsi="Times New Roman"/>
+          <w:sz w:val="24"/>
+        </w:rPr>
+        <w:t>Nmap scan confirms port 3306 open — MySQL 8.0.43 accepting remote connections</w:t>
+      </w:r>
+    </w:p>
+    <w:p>
+      <w:pPr>
+        <w:spacing w:line="360" w:lineRule="auto" w:after="80"/>
+        <w:ind w:left="720" w:firstLine="0"/>
+        <w:jc w:val="both"/>
+      </w:pPr>
+      <w:r>
+        <w:rPr>
+          <w:rFonts w:ascii="Times New Roman" w:hAnsi="Times New Roman"/>
+          <w:b w:val="0"/>
+          <w:i w:val="0"/>
+          <w:sz w:val="24"/>
+        </w:rPr>
+        <w:t xml:space="preserve">2.  </w:t>
+      </w:r>
+      <w:r>
+        <w:rPr>
+          <w:rFonts w:ascii="Times New Roman" w:hAnsi="Times New Roman"/>
+          <w:sz w:val="24"/>
+        </w:rPr>
+        <w:t>Gather username candidates from JS bundle, error messages, and cPanel redirects</w:t>
+      </w:r>
+    </w:p>
+    <w:p>
+      <w:pPr>
+        <w:spacing w:line="360" w:lineRule="auto" w:after="80"/>
+        <w:ind w:left="720" w:firstLine="0"/>
+        <w:jc w:val="both"/>
+      </w:pPr>
+      <w:r>
+        <w:rPr>
+          <w:rFonts w:ascii="Times New Roman" w:hAnsi="Times New Roman"/>
+          <w:b w:val="0"/>
+          <w:i w:val="0"/>
+          <w:sz w:val="24"/>
+        </w:rPr>
+        <w:t xml:space="preserve">3.  </w:t>
+      </w:r>
+      <w:r>
+        <w:rPr>
+          <w:rFonts w:ascii="Times New Roman" w:hAnsi="Times New Roman"/>
+          <w:sz w:val="24"/>
+        </w:rPr>
+        <w:t>Run credential brute force: hydra -L users.txt -P passwords.txt mysql://[TARGET]</w:t>
+      </w:r>
+    </w:p>
+    <w:p>
+      <w:pPr>
+        <w:spacing w:line="360" w:lineRule="auto" w:after="80"/>
+        <w:ind w:left="720" w:firstLine="0"/>
+        <w:jc w:val="both"/>
+      </w:pPr>
+      <w:r>
+        <w:rPr>
+          <w:rFonts w:ascii="Times New Roman" w:hAnsi="Times New Roman"/>
+          <w:b w:val="0"/>
+          <w:i w:val="0"/>
+          <w:sz w:val="24"/>
+        </w:rPr>
+        <w:t xml:space="preserve">4.  </w:t>
+      </w:r>
+      <w:r>
+        <w:rPr>
+          <w:rFonts w:ascii="Times New Roman" w:hAnsi="Times New Roman"/>
+          <w:sz w:val="24"/>
+        </w:rPr>
+        <w:t>Successful login — execute SHOW DATABASES and SELECT * FROM users</w:t>
+      </w:r>
+    </w:p>
+    <w:p>
+      <w:pPr>
+        <w:spacing w:line="360" w:lineRule="auto" w:after="80"/>
+        <w:ind w:left="720" w:firstLine="0"/>
+        <w:jc w:val="both"/>
+      </w:pPr>
+      <w:r>
+        <w:rPr>
+          <w:rFonts w:ascii="Times New Roman" w:hAnsi="Times New Roman"/>
+          <w:b w:val="0"/>
+          <w:i w:val="0"/>
+          <w:sz w:val="24"/>
+        </w:rPr>
+        <w:t xml:space="preserve">5.  </w:t>
+      </w:r>
+      <w:r>
+        <w:rPr>
+          <w:rFonts w:ascii="Times New Roman" w:hAnsi="Times New Roman"/>
+          <w:sz w:val="24"/>
+        </w:rPr>
+        <w:t>Exfiltrate user records, search history, and API credentials</w:t>
+      </w:r>
+    </w:p>
+    <w:p>
+      <w:pPr>
+        <w:spacing w:line="360" w:lineRule="auto" w:after="80"/>
+        <w:ind w:left="720" w:firstLine="0"/>
+        <w:jc w:val="both"/>
+      </w:pPr>
+      <w:r>
+        <w:rPr>
+          <w:rFonts w:ascii="Times New Roman" w:hAnsi="Times New Roman"/>
+          <w:b w:val="0"/>
+          <w:i w:val="0"/>
+          <w:sz w:val="24"/>
+        </w:rPr>
+        <w:t xml:space="preserve">6.  </w:t>
+      </w:r>
+      <w:r>
+        <w:rPr>
+          <w:rFonts w:ascii="Times New Roman" w:hAnsi="Times New Roman"/>
+          <w:sz w:val="24"/>
+        </w:rPr>
+        <w:t>If FILE privilege granted — write PHP web shell to document root for remote code execution</w:t>
+      </w:r>
+    </w:p>
+    <w:p>
+      <w:pPr>
+        <w:spacing w:line="360" w:lineRule="auto" w:after="120"/>
+        <w:ind w:firstLine="720"/>
+        <w:jc w:val="both"/>
+      </w:pPr>
+      <w:r>
+        <w:rPr>
+          <w:rFonts w:ascii="Times New Roman" w:hAnsi="Times New Roman"/>
+          <w:b/>
+          <w:sz w:val="24"/>
+        </w:rPr>
+        <w:t>Complexity:</w:t>
+      </w:r>
+      <w:r>
+        <w:rPr>
+          <w:rFonts w:ascii="Times New Roman" w:hAnsi="Times New Roman"/>
+          <w:sz w:val="24"/>
+        </w:rPr>
+        <w:t xml:space="preserve"> Medium | </w:t>
+      </w:r>
+      <w:r>
+        <w:rPr>
+          <w:rFonts w:ascii="Times New Roman" w:hAnsi="Times New Roman"/>
+          <w:b/>
+          <w:sz w:val="24"/>
+        </w:rPr>
+        <w:t>Likelihood:</w:t>
+      </w:r>
+      <w:r>
+        <w:rPr>
+          <w:rFonts w:ascii="Times New Roman" w:hAnsi="Times New Roman"/>
+          <w:sz w:val="24"/>
+        </w:rPr>
+        <w:t xml:space="preserve"> Medium | </w:t>
+      </w:r>
+      <w:r>
+        <w:rPr>
+          <w:rFonts w:ascii="Times New Roman" w:hAnsi="Times New Roman"/>
+          <w:b/>
+          <w:sz w:val="24"/>
+        </w:rPr>
+        <w:t>Severity:</w:t>
+      </w:r>
+      <w:r>
+        <w:rPr>
+          <w:rFonts w:ascii="Times New Roman" w:hAnsi="Times New Roman"/>
+          <w:sz w:val="24"/>
+        </w:rPr>
+        <w:t xml:space="preserve"> Critical</w:t>
       </w:r>
     </w:p>
     <w:p>
@@ -27922,7 +28832,7 @@
         <w:drawing>
           <wp:inline xmlns:a="http://schemas.openxmlformats.org/drawingml/2006/main" xmlns:pic="http://schemas.openxmlformats.org/drawingml/2006/picture">
             <wp:extent cx="5040000" cy="4421977"/>
-            <wp:docPr id="38" name="Picture 38"/>
+            <wp:docPr id="39" name="Picture 39"/>
             <wp:cNvGraphicFramePr>
               <a:graphicFrameLocks noChangeAspect="1"/>
             </wp:cNvGraphicFramePr>
@@ -30101,7 +31011,7 @@
         <w:drawing>
           <wp:inline xmlns:a="http://schemas.openxmlformats.org/drawingml/2006/main" xmlns:pic="http://schemas.openxmlformats.org/drawingml/2006/picture">
             <wp:extent cx="5040000" cy="3908898"/>
-            <wp:docPr id="39" name="Picture 39"/>
+            <wp:docPr id="40" name="Picture 40"/>
             <wp:cNvGraphicFramePr>
               <a:graphicFrameLocks noChangeAspect="1"/>
             </wp:cNvGraphicFramePr>
@@ -30229,7 +31139,7 @@
         <w:drawing>
           <wp:inline xmlns:a="http://schemas.openxmlformats.org/drawingml/2006/main" xmlns:pic="http://schemas.openxmlformats.org/drawingml/2006/picture">
             <wp:extent cx="5040000" cy="959680"/>
-            <wp:docPr id="40" name="Picture 40"/>
+            <wp:docPr id="41" name="Picture 41"/>
             <wp:cNvGraphicFramePr>
               <a:graphicFrameLocks noChangeAspect="1"/>
             </wp:cNvGraphicFramePr>
@@ -30333,7 +31243,7 @@
         <w:drawing>
           <wp:inline xmlns:a="http://schemas.openxmlformats.org/drawingml/2006/main" xmlns:pic="http://schemas.openxmlformats.org/drawingml/2006/picture">
             <wp:extent cx="5040000" cy="2583063"/>
-            <wp:docPr id="41" name="Picture 41"/>
+            <wp:docPr id="42" name="Picture 42"/>
             <wp:cNvGraphicFramePr>
               <a:graphicFrameLocks noChangeAspect="1"/>
             </wp:cNvGraphicFramePr>
@@ -30389,7 +31299,7 @@
         <w:drawing>
           <wp:inline xmlns:a="http://schemas.openxmlformats.org/drawingml/2006/main" xmlns:pic="http://schemas.openxmlformats.org/drawingml/2006/picture">
             <wp:extent cx="5040000" cy="2168250"/>
-            <wp:docPr id="42" name="Picture 42"/>
+            <wp:docPr id="43" name="Picture 43"/>
             <wp:cNvGraphicFramePr>
               <a:graphicFrameLocks noChangeAspect="1"/>
             </wp:cNvGraphicFramePr>
@@ -30500,7 +31410,7 @@
         <w:drawing>
           <wp:inline xmlns:a="http://schemas.openxmlformats.org/drawingml/2006/main" xmlns:pic="http://schemas.openxmlformats.org/drawingml/2006/picture">
             <wp:extent cx="5040000" cy="2313134"/>
-            <wp:docPr id="43" name="Picture 43"/>
+            <wp:docPr id="44" name="Picture 44"/>
             <wp:cNvGraphicFramePr>
               <a:graphicFrameLocks noChangeAspect="1"/>
             </wp:cNvGraphicFramePr>
@@ -30556,7 +31466,7 @@
         <w:drawing>
           <wp:inline xmlns:a="http://schemas.openxmlformats.org/drawingml/2006/main" xmlns:pic="http://schemas.openxmlformats.org/drawingml/2006/picture">
             <wp:extent cx="5040000" cy="533199"/>
-            <wp:docPr id="44" name="Picture 44"/>
+            <wp:docPr id="45" name="Picture 45"/>
             <wp:cNvGraphicFramePr>
               <a:graphicFrameLocks noChangeAspect="1"/>
             </wp:cNvGraphicFramePr>
@@ -30612,7 +31522,7 @@
         <w:drawing>
           <wp:inline xmlns:a="http://schemas.openxmlformats.org/drawingml/2006/main" xmlns:pic="http://schemas.openxmlformats.org/drawingml/2006/picture">
             <wp:extent cx="5040000" cy="998595"/>
-            <wp:docPr id="45" name="Picture 45"/>
+            <wp:docPr id="46" name="Picture 46"/>
             <wp:cNvGraphicFramePr>
               <a:graphicFrameLocks noChangeAspect="1"/>
             </wp:cNvGraphicFramePr>

</xml_diff>

<commit_message>
Appendixes: remove typed content and dates, screenshots only; add Appendix E shots
</commit_message>
<xml_diff>
--- a/THESIS_VAPT_WORD.docx
+++ b/THESIS_VAPT_WORD.docx
@@ -30999,7 +30999,7 @@
           <w:i w:val="0"/>
           <w:sz w:val="28"/>
         </w:rPr>
-        <w:t>Appendix A: Nmap Scan Output — Origin Server (103.16.xx.xxx)</w:t>
+        <w:t>Appendix A: Nmap Scan Output — Origin Server</w:t>
       </w:r>
     </w:p>
     <w:p>
@@ -31055,64 +31055,21 @@
           <w:i/>
           <w:sz w:val="20"/>
         </w:rPr>
-        <w:t>Figure A.1: Nmap full port scan — 103.16.62.217 (twenty-three open ports confirmed)</w:t>
-      </w:r>
-    </w:p>
-    <w:p>
-      <w:pPr>
-        <w:spacing w:before="80" w:after="80"/>
-        <w:ind w:left="720" w:right="283" w:firstLine="0"/>
-      </w:pPr>
-      <w:r>
-        <w:rPr>
-          <w:rFonts w:ascii="Courier New" w:hAnsi="Courier New"/>
-          <w:sz w:val="18"/>
-        </w:rPr>
-        <w:t># Nmap 7.94SVN scan — 2026-06-06</w:t>
-        <w:br/>
-        <w:t># Command: nmap -sV -p 22,25,53,80,110,111,143,443,465,587,993,995,2000,2083,2087,2096,3306,5060,8899,9001 103.16.xx.xxx</w:t>
-        <w:br/>
-        <w:br/>
-        <w:t>22/tcp   open  ssh         OpenSSH 8.9p1 Ubuntu</w:t>
-        <w:br/>
-        <w:t>25/tcp   open  smtp        Exim smtpd 4.99.2</w:t>
-        <w:br/>
-        <w:t>53/tcp   open  domain      PowerDNS Authoritative Server 4.9.2</w:t>
-        <w:br/>
-        <w:t>80/tcp   open  http        Apache httpd</w:t>
-        <w:br/>
-        <w:t>110/tcp  open  pop3        Dovecot pop3d</w:t>
-        <w:br/>
-        <w:t>111/tcp  open  rpcbind     2-4 (RPC #100000)</w:t>
-        <w:br/>
-        <w:t>143/tcp  open  imap        Dovecot imapd</w:t>
-        <w:br/>
-        <w:t>443/tcp  open  https       Apache httpd</w:t>
-        <w:br/>
-        <w:t>465/tcp  open  smtps       Exim (SSL)</w:t>
-        <w:br/>
-        <w:t>587/tcp  open  smtp        Exim (STARTTLS)</w:t>
-        <w:br/>
-        <w:t>993/tcp  open  imaps       Dovecot</w:t>
-        <w:br/>
-        <w:t>995/tcp  open  pop3s       Dovecot</w:t>
-        <w:br/>
-        <w:t>2083/tcp open  https       cPanel (SSL)</w:t>
-        <w:br/>
-        <w:t>2087/tcp open  https       WHM (Web Host Manager)</w:t>
-        <w:br/>
-        <w:t>2096/tcp open  https       cPanel Webmail</w:t>
-        <w:br/>
-        <w:t>3306/tcp open  mysql       MySQL 8.0.43</w:t>
-        <w:br/>
-        <w:t>5060/tcp open  sip</w:t>
-        <w:br/>
-        <w:t>8899/tcp open  http        (unknown)</w:t>
-        <w:br/>
-        <w:t>9001/tcp open  http        MikroTik RouterOS webfig</w:t>
-        <w:br/>
-        <w:br/>
-        <w:t>Nmap done: 1 IP address (1 host up)</w:t>
+        <w:t>Figure A.1: Nmap full port scan — origin server (twenty-three open ports confirmed)</w:t>
+      </w:r>
+    </w:p>
+    <w:p>
+      <w:pPr>
+        <w:spacing w:line="360" w:lineRule="auto" w:after="120"/>
+        <w:ind w:firstLine="720"/>
+        <w:jc w:val="both"/>
+      </w:pPr>
+      <w:r>
+        <w:rPr>
+          <w:rFonts w:ascii="Times New Roman" w:hAnsi="Times New Roman"/>
+          <w:sz w:val="24"/>
+        </w:rPr>
+        <w:t>Full TCP port scan conducted against the origin server, confirming twenty-three open ports including administrative interfaces that should not be publicly accessible from the internet.</w:t>
       </w:r>
     </w:p>
     <w:p>
@@ -31127,7 +31084,7 @@
           <w:i w:val="0"/>
           <w:sz w:val="28"/>
         </w:rPr>
-        <w:t>Appendix B: Dirb Results — neuralsh.com</w:t>
+        <w:t>Appendix B: SSL Certificate Analysis</w:t>
       </w:r>
     </w:p>
     <w:p>
@@ -31188,35 +31145,16 @@
     </w:p>
     <w:p>
       <w:pPr>
-        <w:spacing w:before="80" w:after="80"/>
-        <w:ind w:left="720" w:right="283" w:firstLine="0"/>
-      </w:pPr>
-      <w:r>
-        <w:rPr>
-          <w:rFonts w:ascii="Courier New" w:hAnsi="Courier New"/>
-          <w:sz w:val="18"/>
-        </w:rPr>
-        <w:t># DIRB v2.22 — 2026-06-06</w:t>
-        <w:br/>
-        <w:t># Target: https://neuralsh.com/</w:t>
-        <w:br/>
-        <w:br/>
-        <w:t>---- Scanning URL: https://neuralsh.com/ ----</w:t>
-        <w:br/>
-        <w:t>+ https://neuralsh.com/About (CODE:200|SIZE:5242)</w:t>
-        <w:br/>
-        <w:t>+ https://neuralsh.com/about (CODE:200|SIZE:5242)</w:t>
-        <w:br/>
-        <w:t>+ https://neuralsh.com/favicon.ico (CODE:200|SIZE:15406)</w:t>
-        <w:br/>
-        <w:t>+ https://neuralsh.com/privacy (CODE:200|SIZE:4891)</w:t>
-        <w:br/>
-        <w:t>+ https://neuralsh.com/publication (CODE:200|SIZE:6234)</w:t>
-        <w:br/>
-        <w:t>+ https://neuralsh.com/robots.txt (CODE:200|SIZE:0)</w:t>
-        <w:br/>
-        <w:br/>
-        <w:t>No sensitive administrative paths found behind Cloudflare WAF.</w:t>
+        <w:spacing w:line="360" w:lineRule="auto" w:after="120"/>
+        <w:ind w:firstLine="720"/>
+        <w:jc w:val="both"/>
+      </w:pPr>
+      <w:r>
+        <w:rPr>
+          <w:rFonts w:ascii="Times New Roman" w:hAnsi="Times New Roman"/>
+          <w:sz w:val="24"/>
+        </w:rPr>
+        <w:t>SSL certificate inspection of the origin server confirming multiple co-hosted domains, including onesala.com. This evidence supports findings N-004 (Shared Hosting Lateral Movement Risk) and N-020 (Co-Tenant Confirmed).</w:t>
       </w:r>
     </w:p>
     <w:p>
@@ -31348,42 +31286,16 @@
     </w:p>
     <w:p>
       <w:pPr>
-        <w:spacing w:before="80" w:after="80"/>
-        <w:ind w:left="720" w:right="283" w:firstLine="0"/>
-      </w:pPr>
-      <w:r>
-        <w:rPr>
-          <w:rFonts w:ascii="Courier New" w:hAnsi="Courier New"/>
-          <w:sz w:val="18"/>
-        </w:rPr>
-        <w:t>=== TEST 1: No bypass ===</w:t>
-        <w:br/>
-        <w:t>Request 1: HTTP 200</w:t>
-        <w:br/>
-        <w:t>Request 2: HTTP 200</w:t>
-        <w:br/>
-        <w:t>...</w:t>
-        <w:br/>
-        <w:t>Request 18: HTTP 200</w:t>
-        <w:br/>
-        <w:t>Request 19: HTTP 429  ← Rate limit triggered</w:t>
-        <w:br/>
-        <w:t>Requests 20-50: HTTP 429</w:t>
-        <w:br/>
-        <w:t>Result: 18/50 tokens before rate limit</w:t>
-        <w:br/>
-        <w:br/>
-        <w:t>=== TEST 2: X-Forwarded-For bypass ===</w:t>
-        <w:br/>
-        <w:t>Request 1:  [XFF: 87.23.145.12]  HTTP 200</w:t>
-        <w:br/>
-        <w:t>Request 2:  [XFF: 192.34.67.89]  HTTP 200</w:t>
-        <w:br/>
-        <w:t>...</w:t>
-        <w:br/>
-        <w:t>Request 50: [XFF: 45.67.234.11]  HTTP 200</w:t>
-        <w:br/>
-        <w:t>Result: 50/50 tokens — rate limit never triggered</w:t>
+        <w:spacing w:line="360" w:lineRule="auto" w:after="120"/>
+        <w:ind w:firstLine="720"/>
+        <w:jc w:val="both"/>
+      </w:pPr>
+      <w:r>
+        <w:rPr>
+          <w:rFonts w:ascii="Times New Roman" w:hAnsi="Times New Roman"/>
+          <w:sz w:val="24"/>
+        </w:rPr>
+        <w:t>HTTP response evidence from the rate limit bypass exploitation. All fifty requests returned HTTP 200 with zero rate-limit responses triggered, confirming a 100% bypass rate as documented in finding N-005.</w:t>
       </w:r>
     </w:p>
     <w:p>
@@ -31398,7 +31310,7 @@
           <w:i w:val="0"/>
           <w:sz w:val="28"/>
         </w:rPr>
-        <w:t>Appendix D: JWT Token Structure</w:t>
+        <w:t>Appendix D: JWT Token Evidence</w:t>
       </w:r>
     </w:p>
     <w:p>
@@ -31454,7 +31366,7 @@
           <w:i/>
           <w:sz w:val="20"/>
         </w:rPr>
-        <w:t>Figure D.1: JWT token response in Burp Suite</w:t>
+        <w:t>Figure D.1: JWT token response captured in Burp Suite</w:t>
       </w:r>
     </w:p>
     <w:p>
@@ -31566,49 +31478,21 @@
           <w:i/>
           <w:sz w:val="20"/>
         </w:rPr>
-        <w:t>Figure D.3: JWT endpoint returning HTTP 200 — confirmed unpatched as of eleven June 2026</w:t>
-      </w:r>
-    </w:p>
-    <w:p>
-      <w:pPr>
-        <w:spacing w:before="80" w:after="80"/>
-        <w:ind w:left="720" w:right="283" w:firstLine="0"/>
-      </w:pPr>
-      <w:r>
-        <w:rPr>
-          <w:rFonts w:ascii="Courier New" w:hAnsi="Courier New"/>
-          <w:sz w:val="18"/>
-        </w:rPr>
-        <w:t>Token (example):</w:t>
-        <w:br/>
-        <w:t>eyJhbGciOiJIUzI1NiIsInR5cCI6IkpXVCJ9.</w:t>
-        <w:br/>
-        <w:t>eyJ0eXBlIjoiZ3Vlc3QiLCJ0aWQiOiI1NTBlO...</w:t>
-        <w:br/>
-        <w:br/>
-        <w:t>Decoded Header:</w:t>
-        <w:br/>
-        <w:t>{"alg":"HS256","typ":"JWT"}</w:t>
-        <w:br/>
-        <w:br/>
-        <w:t>Decoded Payload:</w:t>
-        <w:br/>
-        <w:t>{</w:t>
-        <w:br/>
-        <w:t xml:space="preserve">  "type": "guest",</w:t>
-        <w:br/>
-        <w:t xml:space="preserve">  "tid": "550e8400-e29b-41d4-a716-446655440000",</w:t>
-        <w:br/>
-        <w:t xml:space="preserve">  "iat": 1749220800,</w:t>
-        <w:br/>
-        <w:t xml:space="preserve">  "exp": 1749222600</w:t>
-        <w:br/>
-        <w:t>}</w:t>
-        <w:br/>
-        <w:br/>
-        <w:t>Validity: 30 minutes from issuance</w:t>
-        <w:br/>
-        <w:t>Secret: Not cracked (rockyou.txt — 14,344,391 candidates exhausted)</w:t>
+        <w:t>Figure D.3: JWT endpoint returning HTTP 200 — confirmed live and unpatched</w:t>
+      </w:r>
+    </w:p>
+    <w:p>
+      <w:pPr>
+        <w:spacing w:line="360" w:lineRule="auto" w:after="120"/>
+        <w:ind w:firstLine="720"/>
+        <w:jc w:val="both"/>
+      </w:pPr>
+      <w:r>
+        <w:rPr>
+          <w:rFonts w:ascii="Times New Roman" w:hAnsi="Times New Roman"/>
+          <w:sz w:val="24"/>
+        </w:rPr>
+        <w:t>JWT token captured in Burp Suite, decoded token structure, and live endpoint confirmation. Supports findings N-005 (Rate Limit Bypass) and N-007 (Unauthenticated JWT Token Issuance).</w:t>
       </w:r>
     </w:p>
     <w:p>
@@ -31623,36 +31507,189 @@
           <w:i w:val="0"/>
           <w:sz w:val="28"/>
         </w:rPr>
-        <w:t>Appendix E: Follow-Up Verification Scan — 10 June 2026</w:t>
-      </w:r>
-    </w:p>
-    <w:p>
-      <w:pPr>
-        <w:spacing w:before="80" w:after="80"/>
-        <w:ind w:left="720" w:right="283" w:firstLine="0"/>
-      </w:pPr>
-      <w:r>
-        <w:rPr>
-          <w:rFonts w:ascii="Courier New" w:hAnsi="Courier New"/>
-          <w:sz w:val="18"/>
-        </w:rPr>
-        <w:t>New findings vs June 6 baseline:</w:t>
-        <w:br/>
-        <w:br/>
-        <w:t>N-018: Port 2078 — HTTP 401 WWW-Authenticate: Basic realm="Restricted Area"</w:t>
-        <w:br/>
-        <w:t>N-018: Port 2091 — HTTP 401 WWW-Authenticate: Basic realm="Restricted Area"</w:t>
-        <w:br/>
-        <w:t>N-019: Port 25 — Changed from 'filtered' to 'open' (TCP connection accepted)</w:t>
-        <w:br/>
-        <w:t>N-020: Port 2077 → Redirects to https://www.onesala.com:2078/</w:t>
-        <w:br/>
-        <w:t>N-020: Port 2082 → Redirects to https://www.onesala.com:2083/</w:t>
-        <w:br/>
-        <w:br/>
-        <w:t>Conclusion: All 17 original findings confirmed unpatched.</w:t>
-        <w:br/>
-        <w:t>3 new findings discovered. Total: 20 findings.</w:t>
+        <w:t>Appendix E: Additional Technical Evidence</w:t>
+      </w:r>
+    </w:p>
+    <w:p>
+      <w:pPr>
+        <w:ind w:firstLine="0"/>
+        <w:jc w:val="center"/>
+      </w:pPr>
+      <w:r>
+        <w:drawing>
+          <wp:inline xmlns:a="http://schemas.openxmlformats.org/drawingml/2006/main" xmlns:pic="http://schemas.openxmlformats.org/drawingml/2006/picture">
+            <wp:extent cx="5040000" cy="2651937"/>
+            <wp:docPr id="47" name="Picture 47"/>
+            <wp:cNvGraphicFramePr>
+              <a:graphicFrameLocks noChangeAspect="1"/>
+            </wp:cNvGraphicFramePr>
+            <a:graphic>
+              <a:graphicData uri="http://schemas.openxmlformats.org/drawingml/2006/picture">
+                <pic:pic>
+                  <pic:nvPicPr>
+                    <pic:cNvPr id="0" name="fig417_whm_browser.png"/>
+                    <pic:cNvPicPr/>
+                  </pic:nvPicPr>
+                  <pic:blipFill>
+                    <a:blip r:embed="rId40"/>
+                    <a:stretch>
+                      <a:fillRect/>
+                    </a:stretch>
+                  </pic:blipFill>
+                  <pic:spPr>
+                    <a:xfrm>
+                      <a:off x="0" y="0"/>
+                      <a:ext cx="5040000" cy="2651937"/>
+                    </a:xfrm>
+                    <a:prstGeom prst="rect"/>
+                  </pic:spPr>
+                </pic:pic>
+              </a:graphicData>
+            </a:graphic>
+          </wp:inline>
+        </w:drawing>
+      </w:r>
+    </w:p>
+    <w:p>
+      <w:pPr>
+        <w:spacing w:after="240"/>
+        <w:ind w:firstLine="0"/>
+        <w:jc w:val="center"/>
+      </w:pPr>
+      <w:r>
+        <w:rPr>
+          <w:rFonts w:ascii="Times New Roman" w:hAnsi="Times New Roman"/>
+          <w:b w:val="0"/>
+          <w:i/>
+          <w:sz w:val="20"/>
+        </w:rPr>
+        <w:t>Figure E.1: WHM root admin panel accessible from public internet — no authentication bypass required</w:t>
+      </w:r>
+    </w:p>
+    <w:p>
+      <w:pPr>
+        <w:ind w:firstLine="0"/>
+        <w:jc w:val="center"/>
+      </w:pPr>
+      <w:r>
+        <w:drawing>
+          <wp:inline xmlns:a="http://schemas.openxmlformats.org/drawingml/2006/main" xmlns:pic="http://schemas.openxmlformats.org/drawingml/2006/picture">
+            <wp:extent cx="5040000" cy="2633487"/>
+            <wp:docPr id="48" name="Picture 48"/>
+            <wp:cNvGraphicFramePr>
+              <a:graphicFrameLocks noChangeAspect="1"/>
+            </wp:cNvGraphicFramePr>
+            <a:graphic>
+              <a:graphicData uri="http://schemas.openxmlformats.org/drawingml/2006/picture">
+                <pic:pic>
+                  <pic:nvPicPr>
+                    <pic:cNvPr id="0" name="fig418_mikrotik_browser.png"/>
+                    <pic:cNvPicPr/>
+                  </pic:nvPicPr>
+                  <pic:blipFill>
+                    <a:blip r:embed="rId41"/>
+                    <a:stretch>
+                      <a:fillRect/>
+                    </a:stretch>
+                  </pic:blipFill>
+                  <pic:spPr>
+                    <a:xfrm>
+                      <a:off x="0" y="0"/>
+                      <a:ext cx="5040000" cy="2633487"/>
+                    </a:xfrm>
+                    <a:prstGeom prst="rect"/>
+                  </pic:spPr>
+                </pic:pic>
+              </a:graphicData>
+            </a:graphic>
+          </wp:inline>
+        </w:drawing>
+      </w:r>
+    </w:p>
+    <w:p>
+      <w:pPr>
+        <w:spacing w:after="240"/>
+        <w:ind w:firstLine="0"/>
+        <w:jc w:val="center"/>
+      </w:pPr>
+      <w:r>
+        <w:rPr>
+          <w:rFonts w:ascii="Times New Roman" w:hAnsi="Times New Roman"/>
+          <w:b w:val="0"/>
+          <w:i/>
+          <w:sz w:val="20"/>
+        </w:rPr>
+        <w:t>Figure E.2: MikroTik RouterOS admin panel accessible from public internet</w:t>
+      </w:r>
+    </w:p>
+    <w:p>
+      <w:pPr>
+        <w:ind w:firstLine="0"/>
+        <w:jc w:val="center"/>
+      </w:pPr>
+      <w:r>
+        <w:drawing>
+          <wp:inline xmlns:a="http://schemas.openxmlformats.org/drawingml/2006/main" xmlns:pic="http://schemas.openxmlformats.org/drawingml/2006/picture">
+            <wp:extent cx="5040000" cy="889412"/>
+            <wp:docPr id="49" name="Picture 49"/>
+            <wp:cNvGraphicFramePr>
+              <a:graphicFrameLocks noChangeAspect="1"/>
+            </wp:cNvGraphicFramePr>
+            <a:graphic>
+              <a:graphicData uri="http://schemas.openxmlformats.org/drawingml/2006/picture">
+                <pic:pic>
+                  <pic:nvPicPr>
+                    <pic:cNvPr id="0" name="fig419_mysql_connect.png"/>
+                    <pic:cNvPicPr/>
+                  </pic:nvPicPr>
+                  <pic:blipFill>
+                    <a:blip r:embed="rId42"/>
+                    <a:stretch>
+                      <a:fillRect/>
+                    </a:stretch>
+                  </pic:blipFill>
+                  <pic:spPr>
+                    <a:xfrm>
+                      <a:off x="0" y="0"/>
+                      <a:ext cx="5040000" cy="889412"/>
+                    </a:xfrm>
+                    <a:prstGeom prst="rect"/>
+                  </pic:spPr>
+                </pic:pic>
+              </a:graphicData>
+            </a:graphic>
+          </wp:inline>
+        </w:drawing>
+      </w:r>
+    </w:p>
+    <w:p>
+      <w:pPr>
+        <w:spacing w:after="240"/>
+        <w:ind w:firstLine="0"/>
+        <w:jc w:val="center"/>
+      </w:pPr>
+      <w:r>
+        <w:rPr>
+          <w:rFonts w:ascii="Times New Roman" w:hAnsi="Times New Roman"/>
+          <w:b w:val="0"/>
+          <w:i/>
+          <w:sz w:val="20"/>
+        </w:rPr>
+        <w:t>Figure E.3: MySQL port 3306 accepting remote connections from external host</w:t>
+      </w:r>
+    </w:p>
+    <w:p>
+      <w:pPr>
+        <w:spacing w:line="360" w:lineRule="auto" w:after="120"/>
+        <w:ind w:firstLine="720"/>
+        <w:jc w:val="both"/>
+      </w:pPr>
+      <w:r>
+        <w:rPr>
+          <w:rFonts w:ascii="Times New Roman" w:hAnsi="Times New Roman"/>
+          <w:sz w:val="24"/>
+        </w:rPr>
+        <w:t>Browser-based evidence of exposed administrative interfaces confirmed accessible from any internet connection during the engagement, supporting findings N-001, N-002, and N-014.</w:t>
       </w:r>
     </w:p>
     <w:sectPr>

</xml_diff>

<commit_message>
Style ToC entries to match Se Lytheng format: bold/caps level 1, indented levels, dot leaders
</commit_message>
<xml_diff>
--- a/THESIS_VAPT_WORD.docx
+++ b/THESIS_VAPT_WORD.docx
@@ -43766,6 +43766,54 @@
       </w:tcPr>
     </w:tblStylePr>
   </w:style>
+  <w:style w:type="paragraph" w:customStyle="1" w:styleId="TOC1">
+    <w:name w:val="TOC 1"/>
+    <w:pPr>
+      <w:spacing w:before="0" w:after="60"/>
+      <w:ind w:left="0" w:firstLine="0"/>
+      <w:tabs>
+        <w:tab w:val="right" w:leader="dot" w:pos="9072"/>
+      </w:tabs>
+    </w:pPr>
+    <w:rPr>
+      <w:rFonts w:ascii="Times New Roman" w:hAnsi="Times New Roman"/>
+      <w:b/>
+      <w:caps/>
+      <w:sz w:val="24"/>
+    </w:rPr>
+  </w:style>
+  <w:style w:type="paragraph" w:customStyle="1" w:styleId="TOC2">
+    <w:name w:val="TOC 2"/>
+    <w:pPr>
+      <w:spacing w:before="0" w:after="60"/>
+      <w:ind w:left="283" w:firstLine="0"/>
+      <w:tabs>
+        <w:tab w:val="right" w:leader="dot" w:pos="9072"/>
+      </w:tabs>
+    </w:pPr>
+    <w:rPr>
+      <w:rFonts w:ascii="Times New Roman" w:hAnsi="Times New Roman"/>
+      <w:b/>
+      <w:caps w:val="0"/>
+      <w:sz w:val="24"/>
+    </w:rPr>
+  </w:style>
+  <w:style w:type="paragraph" w:customStyle="1" w:styleId="TOC3">
+    <w:name w:val="TOC 3"/>
+    <w:pPr>
+      <w:spacing w:before="0" w:after="60"/>
+      <w:ind w:left="850" w:firstLine="0"/>
+      <w:tabs>
+        <w:tab w:val="right" w:leader="dot" w:pos="9072"/>
+      </w:tabs>
+    </w:pPr>
+    <w:rPr>
+      <w:rFonts w:ascii="Times New Roman" w:hAnsi="Times New Roman"/>
+      <w:b w:val="0"/>
+      <w:caps w:val="0"/>
+      <w:sz w:val="24"/>
+    </w:rPr>
+  </w:style>
 </w:styles>
 </file>
 

</xml_diff>

<commit_message>
Fix ToC styles: inject XML with correct styleId TOC1/2/3 for Word to pick up on F9
</commit_message>
<xml_diff>
--- a/THESIS_VAPT_WORD.docx
+++ b/THESIS_VAPT_WORD.docx
@@ -43766,11 +43766,11 @@
       </w:tcPr>
     </w:tblStylePr>
   </w:style>
-  <w:style w:type="paragraph" w:customStyle="1" w:styleId="TOC1">
-    <w:name w:val="TOC 1"/>
+  <w:style w:type="paragraph" w:styleId="TOC1">
+    <w:name w:val="toc 1"/>
+    <w:basedOn w:val="Normal"/>
     <w:pPr>
       <w:spacing w:before="0" w:after="60"/>
-      <w:ind w:left="0" w:firstLine="0"/>
       <w:tabs>
         <w:tab w:val="right" w:leader="dot" w:pos="9072"/>
       </w:tabs>
@@ -43778,15 +43778,18 @@
     <w:rPr>
       <w:rFonts w:ascii="Times New Roman" w:hAnsi="Times New Roman"/>
       <w:b/>
+      <w:bCs/>
       <w:caps/>
       <w:sz w:val="24"/>
+      <w:szCs w:val="24"/>
     </w:rPr>
   </w:style>
-  <w:style w:type="paragraph" w:customStyle="1" w:styleId="TOC2">
-    <w:name w:val="TOC 2"/>
+  <w:style w:type="paragraph" w:styleId="TOC2">
+    <w:name w:val="toc 2"/>
+    <w:basedOn w:val="Normal"/>
     <w:pPr>
       <w:spacing w:before="0" w:after="60"/>
-      <w:ind w:left="283" w:firstLine="0"/>
+      <w:ind w:left="284" w:firstLine="0"/>
       <w:tabs>
         <w:tab w:val="right" w:leader="dot" w:pos="9072"/>
       </w:tabs>
@@ -43794,24 +43797,25 @@
     <w:rPr>
       <w:rFonts w:ascii="Times New Roman" w:hAnsi="Times New Roman"/>
       <w:b/>
-      <w:caps w:val="0"/>
+      <w:bCs/>
       <w:sz w:val="24"/>
+      <w:szCs w:val="24"/>
     </w:rPr>
   </w:style>
-  <w:style w:type="paragraph" w:customStyle="1" w:styleId="TOC3">
-    <w:name w:val="TOC 3"/>
+  <w:style w:type="paragraph" w:styleId="TOC3">
+    <w:name w:val="toc 3"/>
+    <w:basedOn w:val="Normal"/>
     <w:pPr>
       <w:spacing w:before="0" w:after="60"/>
-      <w:ind w:left="850" w:firstLine="0"/>
+      <w:ind w:left="851" w:firstLine="0"/>
       <w:tabs>
         <w:tab w:val="right" w:leader="dot" w:pos="9072"/>
       </w:tabs>
     </w:pPr>
     <w:rPr>
       <w:rFonts w:ascii="Times New Roman" w:hAnsi="Times New Roman"/>
-      <w:b w:val="0"/>
-      <w:caps w:val="0"/>
       <w:sz w:val="24"/>
+      <w:szCs w:val="24"/>
     </w:rPr>
   </w:style>
 </w:styles>

</xml_diff>

<commit_message>
Front matter headings 12pt; chapter headings stay 16pt; section 14pt; subsection 12pt
</commit_message>
<xml_diff>
--- a/THESIS_VAPT_WORD.docx
+++ b/THESIS_VAPT_WORD.docx
@@ -337,7 +337,7 @@
           <w:rFonts w:ascii="Times New Roman" w:hAnsi="Times New Roman"/>
           <w:b/>
           <w:i w:val="0"/>
-          <w:sz w:val="32"/>
+          <w:sz w:val="24"/>
         </w:rPr>
         <w:t>ACKNOWLEDGMENT</w:t>
       </w:r>
@@ -394,7 +394,7 @@
           <w:rFonts w:ascii="Khmer OS" w:hAnsi="Khmer OS"/>
           <w:b/>
           <w:color w:val="000000"/>
-          <w:sz w:val="32"/>
+          <w:sz w:val="24"/>
         </w:rPr>
         <w:t>មូលដ្ឋានទេច</w:t>
       </w:r>
@@ -425,7 +425,7 @@
           <w:rFonts w:ascii="Times New Roman" w:hAnsi="Times New Roman"/>
           <w:b/>
           <w:i w:val="0"/>
-          <w:sz w:val="32"/>
+          <w:sz w:val="24"/>
         </w:rPr>
         <w:t>ABSTRACT</w:t>
       </w:r>
@@ -496,7 +496,7 @@
           <w:rFonts w:ascii="Times New Roman" w:hAnsi="Times New Roman"/>
           <w:b/>
           <w:i w:val="0"/>
-          <w:sz w:val="32"/>
+          <w:sz w:val="24"/>
         </w:rPr>
         <w:t>TABLE OF CONTENTS</w:t>
       </w:r>
@@ -538,7 +538,7 @@
           <w:rFonts w:ascii="Times New Roman" w:hAnsi="Times New Roman"/>
           <w:b/>
           <w:i w:val="0"/>
-          <w:sz w:val="32"/>
+          <w:sz w:val="24"/>
         </w:rPr>
         <w:t>LIST OF FIGURES</w:t>
       </w:r>
@@ -1561,7 +1561,7 @@
           <w:rFonts w:ascii="Times New Roman" w:hAnsi="Times New Roman"/>
           <w:b/>
           <w:i w:val="0"/>
-          <w:sz w:val="32"/>
+          <w:sz w:val="24"/>
         </w:rPr>
         <w:t>LIST OF TABLES</w:t>
       </w:r>
@@ -1672,7 +1672,7 @@
           <w:rFonts w:ascii="Times New Roman" w:hAnsi="Times New Roman"/>
           <w:b/>
           <w:i w:val="0"/>
-          <w:sz w:val="32"/>
+          <w:sz w:val="24"/>
         </w:rPr>
         <w:t>LIST OF ABBREVIATIONS</w:t>
       </w:r>

</xml_diff>

<commit_message>
Add RESUME page; fix TOC entry sizes to 16/14/12pt matching heading hierarchy
</commit_message>
<xml_diff>
--- a/THESIS_VAPT_WORD.docx
+++ b/THESIS_VAPT_WORD.docx
@@ -413,6 +413,77 @@
           <w:sz w:val="24"/>
         </w:rPr>
         <w:t>[បញ្ចូលសរុបខ្លឹមសារជាភាសាខ្មែររបស់អ្នកនៅទីនេះ — paste your Khmer summary here]</w:t>
+      </w:r>
+    </w:p>
+    <w:p>
+      <w:pPr>
+        <w:pStyle w:val="Heading1"/>
+        <w:jc w:val="center"/>
+      </w:pPr>
+      <w:r>
+        <w:rPr>
+          <w:rFonts w:ascii="Times New Roman" w:hAnsi="Times New Roman"/>
+          <w:b/>
+          <w:i w:val="0"/>
+          <w:sz w:val="24"/>
+        </w:rPr>
+        <w:t>RÉSUMÉ</w:t>
+      </w:r>
+    </w:p>
+    <w:p>
+      <w:pPr>
+        <w:spacing w:line="360" w:lineRule="auto" w:after="120"/>
+        <w:ind w:firstLine="720"/>
+        <w:jc w:val="both"/>
+      </w:pPr>
+      <w:r>
+        <w:rPr>
+          <w:rFonts w:ascii="Times New Roman" w:hAnsi="Times New Roman"/>
+          <w:sz w:val="24"/>
+        </w:rPr>
+        <w:t>Ce rapport présente un engagement complet d'Évaluation des Vulnérabilités et de Tests de Pénétration (VAPT) réalisé sur neuralsh.com, une plateforme de recherche neurale alimentée par l'intelligence artificielle, dans le cadre d'un stage au sein de Prestige Alliance Co., Ltd. L'évaluation a été autorisée par écrit avant le début des tests, et toutes les activités ont été menées conformément au guide de test OWASP et aux normes éthiques établies.</w:t>
+      </w:r>
+    </w:p>
+    <w:p>
+      <w:pPr>
+        <w:spacing w:line="360" w:lineRule="auto" w:after="120"/>
+        <w:ind w:firstLine="720"/>
+        <w:jc w:val="both"/>
+      </w:pPr>
+      <w:r>
+        <w:rPr>
+          <w:rFonts w:ascii="Times New Roman" w:hAnsi="Times New Roman"/>
+          <w:sz w:val="24"/>
+        </w:rPr>
+        <w:t>Une méthodologie boîte noire a été appliquée, simulant un attaquant externe sans connaissance préalable du système cible. L'engagement a suivi le cycle complet des tests d'intrusion : reconnaissance, analyse, énumération, exploitation, post-exploitation et rapport. Vingt vulnérabilités distinctes ont été découvertes : quatre Critiques, cinq Élevées, sept Moyennes et quatre Faibles. Les résultats critiques comprennent une base de données MySQL exposée publiquement, un panneau d'administration de routeur réseau MikroTik, un panneau de contrôle d'hébergement cPanel et un panneau d'administration de serveur racine WHM, tous accessibles depuis l'internet public sans restriction d'adresse IP.</w:t>
+      </w:r>
+    </w:p>
+    <w:p>
+      <w:pPr>
+        <w:spacing w:line="360" w:lineRule="auto" w:after="120"/>
+        <w:ind w:firstLine="720"/>
+        <w:jc w:val="both"/>
+      </w:pPr>
+      <w:r>
+        <w:rPr>
+          <w:rFonts w:ascii="Times New Roman" w:hAnsi="Times New Roman"/>
+          <w:sz w:val="24"/>
+        </w:rPr>
+        <w:t>Un contrôle de limitation de débit a été contourné avec succès via la falsification d'en-têtes HTTP, permettant une génération illimitée de jetons API. Une analyse de vérification de suivi a confirmé que toutes les découvertes originales n'étaient pas corrigées et a identifié trois nouvelles vulnérabilités.</w:t>
+      </w:r>
+    </w:p>
+    <w:p>
+      <w:pPr>
+        <w:spacing w:line="360" w:lineRule="auto" w:after="120"/>
+        <w:ind w:firstLine="720"/>
+        <w:jc w:val="both"/>
+      </w:pPr>
+      <w:r>
+        <w:rPr>
+          <w:rFonts w:ascii="Times New Roman" w:hAnsi="Times New Roman"/>
+          <w:sz w:val="24"/>
+        </w:rPr>
+        <w:t>Mots-clés : Tests de pénétration, VAPT, Sécurité des applications web, OWASP, Contournement de limitation de débit, Analyse JWT, Exposition cPanel, MikroTik, Tests boîte noire, CVSS v3.1</w:t>
       </w:r>
     </w:p>
     <w:p>
@@ -43780,8 +43851,8 @@
       <w:b/>
       <w:bCs/>
       <w:caps/>
-      <w:sz w:val="24"/>
-      <w:szCs w:val="24"/>
+      <w:sz w:val="32"/>
+      <w:szCs w:val="32"/>
     </w:rPr>
   </w:style>
   <w:style w:type="paragraph" w:styleId="TOC2">
@@ -43798,8 +43869,8 @@
       <w:rFonts w:ascii="Times New Roman" w:hAnsi="Times New Roman"/>
       <w:b/>
       <w:bCs/>
-      <w:sz w:val="24"/>
-      <w:szCs w:val="24"/>
+      <w:sz w:val="28"/>
+      <w:szCs w:val="28"/>
     </w:rPr>
   </w:style>
   <w:style w:type="paragraph" w:styleId="TOC3">
@@ -43814,6 +43885,8 @@
     </w:pPr>
     <w:rPr>
       <w:rFonts w:ascii="Times New Roman" w:hAnsi="Times New Roman"/>
+      <w:b/>
+      <w:bCs/>
       <w:sz w:val="24"/>
       <w:szCs w:val="24"/>
     </w:rPr>

</xml_diff>

<commit_message>
Rewrite acknowledgement: H.E. PO Kimtho, LAY Heng, DR KUY Movsun, KIM Sereyvuth
</commit_message>
<xml_diff>
--- a/THESIS_VAPT_WORD.docx
+++ b/THESIS_VAPT_WORD.docx
@@ -353,7 +353,7 @@
           <w:rFonts w:ascii="Times New Roman" w:hAnsi="Times New Roman"/>
           <w:sz w:val="24"/>
         </w:rPr>
-        <w:t>I would like to express my sincere gratitude to the President of the Institution of Technology of Cambodia, the Head of the Department of General Studies and Natural Sciences, and my academic supervisor for their continuous guidance and support throughout this internship programme.</w:t>
+        <w:t>Before I start this report, I would like to express my sincere gratitude to our school and to everyone who has contributed to the making of this report. Everyone has dedicated their hard work and efforts, without which it would not have been possible to achieve this accomplishment. I am very grateful for the opportunity and the guidance that allowed me to grow and enhance my knowledge in both hard and soft skills. I would like to extend my appreciation to the following individuals:</w:t>
       </w:r>
     </w:p>
     <w:p>
@@ -367,7 +367,22 @@
           <w:rFonts w:ascii="Times New Roman" w:hAnsi="Times New Roman"/>
           <w:sz w:val="24"/>
         </w:rPr>
-        <w:t>I am deeply grateful to the management and technical team at Prestige Alliance Co., Ltd. for providing the opportunity to conduct this vulnerability assessment and penetration testing engagement on neuralsh.com, and for their professional guidance during the internship period.</w:t>
+        <w:t xml:space="preserve">First of all, I would like to offer my sincere thanks to </w:t>
+      </w:r>
+      <w:r>
+        <w:rPr>
+          <w:rFonts w:ascii="Times New Roman" w:hAnsi="Times New Roman"/>
+          <w:b/>
+          <w:sz w:val="24"/>
+        </w:rPr>
+        <w:t>H.E. PO Kimtho, Director of the Institute of Technology of Cambodia, a.k.a (ITC)</w:t>
+      </w:r>
+      <w:r>
+        <w:rPr>
+          <w:rFonts w:ascii="Times New Roman" w:hAnsi="Times New Roman"/>
+          <w:sz w:val="24"/>
+        </w:rPr>
+        <w:t>. For his leadership and efforts that steer our institute to be one of the top universities in Cambodia. His cooperation with local and international enterprises has been instrumental in making this opportunity possible.</w:t>
       </w:r>
     </w:p>
     <w:p>
@@ -381,7 +396,94 @@
           <w:rFonts w:ascii="Times New Roman" w:hAnsi="Times New Roman"/>
           <w:sz w:val="24"/>
         </w:rPr>
-        <w:t>I also extend my appreciation to all colleagues and peers who provided feedback during the preparation of this report.</w:t>
+        <w:t xml:space="preserve">Secondly, I would like to express my appreciation to </w:t>
+      </w:r>
+      <w:r>
+        <w:rPr>
+          <w:rFonts w:ascii="Times New Roman" w:hAnsi="Times New Roman"/>
+          <w:b/>
+          <w:sz w:val="24"/>
+        </w:rPr>
+        <w:t>MR. LAY Heng, Head of Department of Information and Communication Engineering (DICE) at ITC</w:t>
+      </w:r>
+      <w:r>
+        <w:rPr>
+          <w:rFonts w:ascii="Times New Roman" w:hAnsi="Times New Roman"/>
+          <w:sz w:val="24"/>
+        </w:rPr>
+        <w:t>. His guidance and management have provided excellent education and courses within our department which are the foundation of this internship.</w:t>
+      </w:r>
+    </w:p>
+    <w:p>
+      <w:pPr>
+        <w:spacing w:line="360" w:lineRule="auto" w:after="120"/>
+        <w:ind w:firstLine="720"/>
+        <w:jc w:val="both"/>
+      </w:pPr>
+      <w:r>
+        <w:rPr>
+          <w:rFonts w:ascii="Times New Roman" w:hAnsi="Times New Roman"/>
+          <w:sz w:val="24"/>
+        </w:rPr>
+        <w:t xml:space="preserve">Thirdly, I would like to give my deep gratitude to my supervisor, </w:t>
+      </w:r>
+      <w:r>
+        <w:rPr>
+          <w:rFonts w:ascii="Times New Roman" w:hAnsi="Times New Roman"/>
+          <w:b/>
+          <w:sz w:val="24"/>
+        </w:rPr>
+        <w:t>DR. KUY Movsun, Lecturer at the Department of Information and Communication Engineering (DICE), ITC</w:t>
+      </w:r>
+      <w:r>
+        <w:rPr>
+          <w:rFonts w:ascii="Times New Roman" w:hAnsi="Times New Roman"/>
+          <w:sz w:val="24"/>
+        </w:rPr>
+        <w:t>. His kindness and dedication of time have guided this internship to achieve its goals. From the beginning of the internship to the final report, his thoughtful suggestions were invaluable.</w:t>
+      </w:r>
+    </w:p>
+    <w:p>
+      <w:pPr>
+        <w:spacing w:line="360" w:lineRule="auto" w:after="120"/>
+        <w:ind w:firstLine="720"/>
+        <w:jc w:val="both"/>
+      </w:pPr>
+      <w:r>
+        <w:rPr>
+          <w:rFonts w:ascii="Times New Roman" w:hAnsi="Times New Roman"/>
+          <w:sz w:val="24"/>
+        </w:rPr>
+        <w:t xml:space="preserve">Finally, I would like to express my sincere thanks to my advisor, </w:t>
+      </w:r>
+      <w:r>
+        <w:rPr>
+          <w:rFonts w:ascii="Times New Roman" w:hAnsi="Times New Roman"/>
+          <w:b/>
+          <w:sz w:val="24"/>
+        </w:rPr>
+        <w:t>MR. KIM Sereyvuth, Head of Red Team at Prestige Alliance Co., Ltd</w:t>
+      </w:r>
+      <w:r>
+        <w:rPr>
+          <w:rFonts w:ascii="Times New Roman" w:hAnsi="Times New Roman"/>
+          <w:sz w:val="24"/>
+        </w:rPr>
+        <w:t>. He has allowed me to conduct this vulnerability assessment and penetration testing engagement and generously dedicated his invaluable time to allow me to learn more in cybersecurity skills. He provided the incredible opportunity that enhanced my technical skills.</w:t>
+      </w:r>
+    </w:p>
+    <w:p>
+      <w:pPr>
+        <w:spacing w:line="360" w:lineRule="auto" w:after="120"/>
+        <w:ind w:firstLine="720"/>
+        <w:jc w:val="both"/>
+      </w:pPr>
+      <w:r>
+        <w:rPr>
+          <w:rFonts w:ascii="Times New Roman" w:hAnsi="Times New Roman"/>
+          <w:sz w:val="24"/>
+        </w:rPr>
+        <w:t>Additionally, I would like to extend my deep appreciation to all others who have supported me during this internship. Your kindness and assistance have been essential to this accomplishment. I wish everyone all the best.</w:t>
       </w:r>
     </w:p>
     <w:p>

</xml_diff>

<commit_message>
Rewrite RÉSUMÉ, ABSTRACT, and Khmer abstract in Se Lytheng style
All three sections now follow the same 4-paragraph internship-focused
structure: internship context → project title → tools/findings → conclusion.
Khmer heading changed to អក្គបទសង្ខេប; Khmer body text added (was placeholder).
</commit_message>
<xml_diff>
--- a/THESIS_VAPT_WORD.docx
+++ b/THESIS_VAPT_WORD.docx
@@ -498,7 +498,7 @@
           <w:color w:val="000000"/>
           <w:sz w:val="24"/>
         </w:rPr>
-        <w:t>មូលដ្ឋានទេច</w:t>
+        <w:t>អក្គបទសង្ខេប</w:t>
       </w:r>
     </w:p>
     <w:p>
@@ -510,26 +510,9 @@
       <w:r>
         <w:rPr>
           <w:rFonts w:ascii="Khmer OS" w:hAnsi="Khmer OS"/>
-          <w:i/>
-          <w:color w:val="808080"/>
-          <w:sz w:val="24"/>
-        </w:rPr>
-        <w:t>[បញ្ចូលសរុបខ្លឹមសារជាភាសាខ្មែររបស់អ្នកនៅទីនេះ — paste your Khmer summary here]</w:t>
-      </w:r>
-    </w:p>
-    <w:p>
-      <w:pPr>
-        <w:pStyle w:val="Heading1"/>
-        <w:jc w:val="center"/>
-      </w:pPr>
-      <w:r>
-        <w:rPr>
-          <w:rFonts w:ascii="Times New Roman" w:hAnsi="Times New Roman"/>
-          <w:b/>
-          <w:i w:val="0"/>
-          <w:sz w:val="24"/>
-        </w:rPr>
-        <w:t>RÉSUMÉ</w:t>
+          <w:sz w:val="24"/>
+        </w:rPr>
+        <w:t>នេះគឺជាការហ្វឹកហ្វឺនការងាររយៈពេល ៤ ខែ នៅ Prestige Alliance Co., Ltd. ចាប់ពីខែកុម្ភៈ ដល់ ខែឧសភា ឆ្នាំ ២០២៦។ និស្សិតឆ្នាំទី ៥ ទាំងអស់ ត្រូវបានតម្រូវឱ្យដាក់ពាក្យសុំការហ្វឹកហ្វឺន ដើម្បីបញ្ចូលក្នុងការការពារអត្ថបទបញ្ចប់ការសិក្សា ដែលនឹងប្រព្រឹត្តទៅនៅខែកក្កដា ឆ្នាំ ២០២៦។ និស្សិតម្នាក់ៗ ត្រូវតែអនុវត្តជំនាញដែលបានរៀននៅ GIC ក្នុងស្ថានភាពជាក់ស្តែង ដូចជា ការងារ ឬ ការហ្វឹកហ្វឺន យ៉ាងតិច ៣.៥ ខែ។</w:t>
       </w:r>
     </w:p>
     <w:p>
@@ -540,10 +523,10 @@
       </w:pPr>
       <w:r>
         <w:rPr>
-          <w:rFonts w:ascii="Times New Roman" w:hAnsi="Times New Roman"/>
-          <w:sz w:val="24"/>
-        </w:rPr>
-        <w:t>Ce rapport présente un engagement complet d'Évaluation des Vulnérabilités et de Tests de Pénétration (VAPT) réalisé sur neuralsh.com, une plateforme de recherche neurale alimentée par l'intelligence artificielle, dans le cadre d'un stage au sein de Prestige Alliance Co., Ltd. L'évaluation a été autorisée par écrit avant le début des tests, et toutes les activités ont été menées conformément au guide de test OWASP et aux normes éthiques établies.</w:t>
+          <w:rFonts w:ascii="Khmer OS" w:hAnsi="Khmer OS"/>
+          <w:sz w:val="24"/>
+        </w:rPr>
+        <w:t>គម្រោងហ្វឹកហ្វឺនរបស់ខ្ញុំ ដែលមានចំណងជើងថា «ការវាយតម្លៃភាពងាយរងគ្រោះ និង ការធ្វើតេស្តការជ្រៀតចូលលើ neuralsh.com» មានគោលបំណងពង្រឹងជំនាញបច្ចេកទេសសន្តិសុខតាមអ៊ីនធឺណិត ដែលខ្ញុំបានទទួលក្នុងអំឡុងឆ្នាំសិក្សានៅ GIC។ ជំនាញទាំងនេះ ត្រូវបានប្រើប្រាស់ ក្នុងការកំណត់អត្តសញ្ញាណ ការវាយតម្លៃ និង ការដោះស្រាយភាពងាយរងគ្រោះ នៃ neuralsh.com ដើម្បីការពារការវាយប្រហារតាមអ៊ីនធឺណិតពីអ្នកគំរាមកំហែងអនាមិក។</w:t>
       </w:r>
     </w:p>
     <w:p>
@@ -554,10 +537,10 @@
       </w:pPr>
       <w:r>
         <w:rPr>
-          <w:rFonts w:ascii="Times New Roman" w:hAnsi="Times New Roman"/>
-          <w:sz w:val="24"/>
-        </w:rPr>
-        <w:t>Une méthodologie boîte noire a été appliquée, simulant un attaquant externe sans connaissance préalable du système cible. L'engagement a suivi le cycle complet des tests d'intrusion : reconnaissance, analyse, énumération, exploitation, post-exploitation et rapport. Vingt vulnérabilités distinctes ont été découvertes : quatre Critiques, cinq Élevées, sept Moyennes et quatre Faibles. Les résultats critiques comprennent une base de données MySQL exposée publiquement, un panneau d'administration de routeur réseau MikroTik, un panneau de contrôle d'hébergement cPanel et un panneau d'administration de serveur racine WHM, tous accessibles depuis l'internet public sans restriction d'adresse IP.</w:t>
+          <w:rFonts w:ascii="Khmer OS" w:hAnsi="Khmer OS"/>
+          <w:sz w:val="24"/>
+        </w:rPr>
+        <w:t>ក្នុងអំឡុងការវាយតម្លៃ ឧបករណ៍ជាច្រើនត្រូវបានពិនិត្យ ប៉ុន្តែមានតែឧបករណ៍ចាំបាច់ប៉ុណ្ណោះ ត្រូវបានជ្រើសរើស ដោយផ្អែកលើស្តង់ដារ OWASP TOP 10។ ភាពងាយរងគ្រោះចំនួន ១៧ ត្រូវបានកំណត់ ចែកចេញជា ៤ វិកល្ប ៤ ខ្ពស់ ៦ មធ្យម និង ៣ ទាប។ ក្នុងចំណោមការរកឃើញដ៏ធ្ងន់ធ្ងរ គឺមានការបញ្ជាក់ពីការរំលំប្រព័ន្ធគ្រប់គ្រងល្បឿនស្នើសុំ ដោយមានអត្រាជោគជ័យ ១០០ ភាគរយ ដែលបង្ហាញពីគ្មានការការពារការផ្ទៀងផ្ទាត់ភាពត្រឹមត្រូវ។</w:t>
       </w:r>
     </w:p>
     <w:p>
@@ -568,10 +551,25 @@
       </w:pPr>
       <w:r>
         <w:rPr>
-          <w:rFonts w:ascii="Times New Roman" w:hAnsi="Times New Roman"/>
-          <w:sz w:val="24"/>
-        </w:rPr>
-        <w:t>Un contrôle de limitation de débit a été contourné avec succès via la falsification d'en-têtes HTTP, permettant une génération illimitée de jetons API. Une analyse de vérification de suivi a confirmé que toutes les découvertes originales n'étaient pas corrigées et a identifié trois nouvelles vulnérabilités.</w:t>
+          <w:rFonts w:ascii="Khmer OS" w:hAnsi="Khmer OS"/>
+          <w:sz w:val="24"/>
+        </w:rPr>
+        <w:t>សរុបសេចក្តី ការហ្វឹកហ្វឺននេះ គឺជាបទពិសោធន៍សំខាន់ ដែលអនុញ្ញាតឱ្យខ្ញុំ អនុវត្តជំនាញ ក្នុងបរិយាកាសវិជ្ជាជីវៈពិតប្រាកដ។ វាបានពង្រីកចំណេះដឹង លើសពីអ្វីដែលខ្ញុំបានរៀននៅ ITC។ ខ្ញុំសូមថ្លែងអំណរគុណ ចំពោះ Prestige Alliance Co., Ltd. ចំពោះឱកាសសិក្សា ព្រមទាំងអំណរគុណ ITC ចំពោះការណែនាំ របស់គ្រូបង្គោល និង អ្នកត្រួតពិនិត្យ ដែលបានធ្វើឱ្យការហ្វឹកហ្វឺននេះ បញ្ចប់ដោយជោគជ័យ។</w:t>
+      </w:r>
+    </w:p>
+    <w:p>
+      <w:pPr>
+        <w:pStyle w:val="Heading1"/>
+        <w:jc w:val="center"/>
+      </w:pPr>
+      <w:r>
+        <w:rPr>
+          <w:rFonts w:ascii="Times New Roman" w:hAnsi="Times New Roman"/>
+          <w:b/>
+          <w:i w:val="0"/>
+          <w:sz w:val="24"/>
+        </w:rPr>
+        <w:t>RÉSUMÉ</w:t>
       </w:r>
     </w:p>
     <w:p>
@@ -585,22 +583,37 @@
           <w:rFonts w:ascii="Times New Roman" w:hAnsi="Times New Roman"/>
           <w:sz w:val="24"/>
         </w:rPr>
-        <w:t>Mots-clés : Tests de pénétration, VAPT, Sécurité des applications web, OWASP, Contournement de limitation de débit, Analyse JWT, Exposition cPanel, MikroTik, Tests boîte noire, CVSS v3.1</w:t>
-      </w:r>
-    </w:p>
-    <w:p>
-      <w:pPr>
-        <w:pStyle w:val="Heading1"/>
-        <w:jc w:val="center"/>
-      </w:pPr>
+        <w:t xml:space="preserve">Il s'agit d'un stage de 4 mois chez </w:t>
+      </w:r>
       <w:r>
         <w:rPr>
           <w:rFonts w:ascii="Times New Roman" w:hAnsi="Times New Roman"/>
           <w:b/>
-          <w:i w:val="0"/>
-          <w:sz w:val="24"/>
-        </w:rPr>
-        <w:t>ABSTRACT</w:t>
+          <w:sz w:val="24"/>
+        </w:rPr>
+        <w:t>Prestige Alliance Co., Ltd.</w:t>
+      </w:r>
+      <w:r>
+        <w:rPr>
+          <w:rFonts w:ascii="Times New Roman" w:hAnsi="Times New Roman"/>
+          <w:sz w:val="24"/>
+        </w:rPr>
+        <w:t xml:space="preserve">, de février à mai 2026. Tous les étudiants de cinquième année étaient tenus de postuler à un stage afin de l'intégrer dans leur soutenance de mémoire prévue en juillet 2026. Chaque étudiant devait appliquer les compétences acquises au cours de la formation à </w:t>
+      </w:r>
+      <w:r>
+        <w:rPr>
+          <w:rFonts w:ascii="Times New Roman" w:hAnsi="Times New Roman"/>
+          <w:b/>
+          <w:sz w:val="24"/>
+        </w:rPr>
+        <w:t>GIC</w:t>
+      </w:r>
+      <w:r>
+        <w:rPr>
+          <w:rFonts w:ascii="Times New Roman" w:hAnsi="Times New Roman"/>
+          <w:sz w:val="24"/>
+        </w:rPr>
+        <w:t xml:space="preserve"> dans des situations réelles, telles qu'un emploi ou un stage, d'une durée d'au moins 3,5 mois.</w:t>
       </w:r>
     </w:p>
     <w:p>
@@ -614,7 +627,37 @@
           <w:rFonts w:ascii="Times New Roman" w:hAnsi="Times New Roman"/>
           <w:sz w:val="24"/>
         </w:rPr>
-        <w:t>This report presents a comprehensive Vulnerability Assessment and Penetration Testing (VAPT) engagement conducted on neuralsh.com, an AI-powered neural search platform, as part of an internship at Prestige Alliance Co., Ltd. The assessment was authorized in writing prior to testing, and all activities were conducted in accordance with the OWASP Testing Guide and established ethical hacking standards.</w:t>
+        <w:t xml:space="preserve">Mon projet de stage, intitulé </w:t>
+      </w:r>
+      <w:r>
+        <w:rPr>
+          <w:rFonts w:ascii="Times New Roman" w:hAnsi="Times New Roman"/>
+          <w:b/>
+          <w:sz w:val="24"/>
+        </w:rPr>
+        <w:t>« L'Évaluation des Vulnérabilités et les Tests de Pénétration sur neuralsh.com »</w:t>
+      </w:r>
+      <w:r>
+        <w:rPr>
+          <w:rFonts w:ascii="Times New Roman" w:hAnsi="Times New Roman"/>
+          <w:sz w:val="24"/>
+        </w:rPr>
+        <w:t xml:space="preserve">, avait pour objectif de renforcer les compétences techniques en cybersécurité acquises pendant mon cursus universitaire en tant qu'étudiant en informatique au sein du département </w:t>
+      </w:r>
+      <w:r>
+        <w:rPr>
+          <w:rFonts w:ascii="Times New Roman" w:hAnsi="Times New Roman"/>
+          <w:b/>
+          <w:sz w:val="24"/>
+        </w:rPr>
+        <w:t>GIC</w:t>
+      </w:r>
+      <w:r>
+        <w:rPr>
+          <w:rFonts w:ascii="Times New Roman" w:hAnsi="Times New Roman"/>
+          <w:sz w:val="24"/>
+        </w:rPr>
+        <w:t>. Ces compétences ont été principalement mobilisées pour identifier, évaluer et corriger les failles de sécurité de la plateforme cible, neuralsh.com, afin de prévenir les cyberattaques menées par des acteurs malveillants anonymes.</w:t>
       </w:r>
     </w:p>
     <w:p>
@@ -628,7 +671,22 @@
           <w:rFonts w:ascii="Times New Roman" w:hAnsi="Times New Roman"/>
           <w:sz w:val="24"/>
         </w:rPr>
-        <w:t>A black-box methodology was applied, simulating an external attacker with no prior knowledge of the target system. The engagement followed the complete penetration testing lifecycle: reconnaissance, scanning, enumeration, exploitation, post-exploitation, and reporting. Twenty distinct vulnerabilities were discovered: four Critical, five High, seven Medium, and four Low severity findings. Critical findings include a publicly exposed MySQL database, a MikroTik network router administration panel, a cPanel hosting control panel, and a WHM root server administration panel — all accessible from the public internet without IP restriction.</w:t>
+        <w:t xml:space="preserve">Au cours des tests et des investigations, plusieurs outils ont été examinés, mais seuls ceux jugés essentiels ont été retenus, en nous basant sur la norme </w:t>
+      </w:r>
+      <w:r>
+        <w:rPr>
+          <w:rFonts w:ascii="Times New Roman" w:hAnsi="Times New Roman"/>
+          <w:b/>
+          <w:sz w:val="24"/>
+        </w:rPr>
+        <w:t>OWASP TOP 10</w:t>
+      </w:r>
+      <w:r>
+        <w:rPr>
+          <w:rFonts w:ascii="Times New Roman" w:hAnsi="Times New Roman"/>
+          <w:sz w:val="24"/>
+        </w:rPr>
+        <w:t>. Une approche boîte noire a été appliquée tout au long de l'engagement. Dix-sept vulnérabilités ont été identifiées et classées par niveau de gravité : faible, moyen, élevé et critique. Parmi les résultats critiques figuraient un panneau d'administration WHM, un port MySQL, un panneau d'administration MikroTik et un contournement du WAF Cloudflare via la divulgation de l'adresse IP d'origine. Un contournement de la limitation de débit a été confirmé avec un taux de réussite de 100 %.</w:t>
       </w:r>
     </w:p>
     <w:p>
@@ -642,7 +700,67 @@
           <w:rFonts w:ascii="Times New Roman" w:hAnsi="Times New Roman"/>
           <w:sz w:val="24"/>
         </w:rPr>
-        <w:t>A rate-limiting control was successfully bypassed via HTTP header spoofing, enabling unlimited API token generation. A follow-up verification scan conducted on ten June 2026 confirmed all original findings remained unpatched and identified three additional findings.</w:t>
+        <w:t xml:space="preserve">En résumé, ce stage a représenté une expérience précieuse qui m'a permis de mettre en pratique les compétences acquises dans un cadre professionnel réel. Il m'a permis d'approfondir mes connaissances au-delà de ce que j'avais appris à </w:t>
+      </w:r>
+      <w:r>
+        <w:rPr>
+          <w:rFonts w:ascii="Times New Roman" w:hAnsi="Times New Roman"/>
+          <w:b/>
+          <w:sz w:val="24"/>
+        </w:rPr>
+        <w:t>l'ITC</w:t>
+      </w:r>
+      <w:r>
+        <w:rPr>
+          <w:rFonts w:ascii="Times New Roman" w:hAnsi="Times New Roman"/>
+          <w:sz w:val="24"/>
+        </w:rPr>
+        <w:t xml:space="preserve">. Je tiens à exprimer ma sincère gratitude à </w:t>
+      </w:r>
+      <w:r>
+        <w:rPr>
+          <w:rFonts w:ascii="Times New Roman" w:hAnsi="Times New Roman"/>
+          <w:b/>
+          <w:sz w:val="24"/>
+        </w:rPr>
+        <w:t>Prestige Alliance Co., Ltd.</w:t>
+      </w:r>
+      <w:r>
+        <w:rPr>
+          <w:rFonts w:ascii="Times New Roman" w:hAnsi="Times New Roman"/>
+          <w:sz w:val="24"/>
+        </w:rPr>
+        <w:t xml:space="preserve"> pour l'opportunité qu'ils m'ont offerte, ainsi qu'à </w:t>
+      </w:r>
+      <w:r>
+        <w:rPr>
+          <w:rFonts w:ascii="Times New Roman" w:hAnsi="Times New Roman"/>
+          <w:b/>
+          <w:sz w:val="24"/>
+        </w:rPr>
+        <w:t>l'ITC</w:t>
+      </w:r>
+      <w:r>
+        <w:rPr>
+          <w:rFonts w:ascii="Times New Roman" w:hAnsi="Times New Roman"/>
+          <w:sz w:val="24"/>
+        </w:rPr>
+        <w:t xml:space="preserve"> pour l'encadrement de mes superviseurs et professeurs, qui a été déterminant dans la réussite de ce stage.</w:t>
+      </w:r>
+    </w:p>
+    <w:p>
+      <w:pPr>
+        <w:pStyle w:val="Heading1"/>
+        <w:jc w:val="center"/>
+      </w:pPr>
+      <w:r>
+        <w:rPr>
+          <w:rFonts w:ascii="Times New Roman" w:hAnsi="Times New Roman"/>
+          <w:b/>
+          <w:i w:val="0"/>
+          <w:sz w:val="24"/>
+        </w:rPr>
+        <w:t>ABSTRACT</w:t>
       </w:r>
     </w:p>
     <w:p>
@@ -656,7 +774,199 @@
           <w:rFonts w:ascii="Times New Roman" w:hAnsi="Times New Roman"/>
           <w:sz w:val="24"/>
         </w:rPr>
-        <w:t>Keywords: Penetration Testing, VAPT, Web Application Security, OWASP, Rate Limiting Bypass, JWT Analysis, cPanel Exposure, MikroTik, Black Box Testing, CVSS v3.1</w:t>
+        <w:t xml:space="preserve">This is a 4-month internship at </w:t>
+      </w:r>
+      <w:r>
+        <w:rPr>
+          <w:rFonts w:ascii="Times New Roman" w:hAnsi="Times New Roman"/>
+          <w:b/>
+          <w:sz w:val="24"/>
+        </w:rPr>
+        <w:t>Prestige Alliance Co., Ltd.</w:t>
+      </w:r>
+      <w:r>
+        <w:rPr>
+          <w:rFonts w:ascii="Times New Roman" w:hAnsi="Times New Roman"/>
+          <w:sz w:val="24"/>
+        </w:rPr>
+        <w:t xml:space="preserve"> from </w:t>
+      </w:r>
+      <w:r>
+        <w:rPr>
+          <w:rFonts w:ascii="Times New Roman" w:hAnsi="Times New Roman"/>
+          <w:b/>
+          <w:sz w:val="24"/>
+        </w:rPr>
+        <w:t>February to May 2026</w:t>
+      </w:r>
+      <w:r>
+        <w:rPr>
+          <w:rFonts w:ascii="Times New Roman" w:hAnsi="Times New Roman"/>
+          <w:sz w:val="24"/>
+        </w:rPr>
+        <w:t xml:space="preserve">. All fifth-year students were required to apply for the internship to incorporate it into their thesis defence, which takes place in </w:t>
+      </w:r>
+      <w:r>
+        <w:rPr>
+          <w:rFonts w:ascii="Times New Roman" w:hAnsi="Times New Roman"/>
+          <w:b/>
+          <w:sz w:val="24"/>
+        </w:rPr>
+        <w:t>July 2026</w:t>
+      </w:r>
+      <w:r>
+        <w:rPr>
+          <w:rFonts w:ascii="Times New Roman" w:hAnsi="Times New Roman"/>
+          <w:sz w:val="24"/>
+        </w:rPr>
+        <w:t xml:space="preserve">. Each student must apply the skills they have learned from the course at </w:t>
+      </w:r>
+      <w:r>
+        <w:rPr>
+          <w:rFonts w:ascii="Times New Roman" w:hAnsi="Times New Roman"/>
+          <w:b/>
+          <w:sz w:val="24"/>
+        </w:rPr>
+        <w:t>GIC</w:t>
+      </w:r>
+      <w:r>
+        <w:rPr>
+          <w:rFonts w:ascii="Times New Roman" w:hAnsi="Times New Roman"/>
+          <w:sz w:val="24"/>
+        </w:rPr>
+        <w:t xml:space="preserve"> and put them into real-world scenarios such as employment or an internship for at least 3.5 months.</w:t>
+      </w:r>
+    </w:p>
+    <w:p>
+      <w:pPr>
+        <w:spacing w:line="360" w:lineRule="auto" w:after="120"/>
+        <w:ind w:firstLine="720"/>
+        <w:jc w:val="both"/>
+      </w:pPr>
+      <w:r>
+        <w:rPr>
+          <w:rFonts w:ascii="Times New Roman" w:hAnsi="Times New Roman"/>
+          <w:sz w:val="24"/>
+        </w:rPr>
+        <w:t xml:space="preserve">For my internship project, titled </w:t>
+      </w:r>
+      <w:r>
+        <w:rPr>
+          <w:rFonts w:ascii="Times New Roman" w:hAnsi="Times New Roman"/>
+          <w:b/>
+          <w:sz w:val="24"/>
+        </w:rPr>
+        <w:t>"Vulnerability Assessment and Penetration Testing on neuralsh.com"</w:t>
+      </w:r>
+      <w:r>
+        <w:rPr>
+          <w:rFonts w:ascii="Times New Roman" w:hAnsi="Times New Roman"/>
+          <w:sz w:val="24"/>
+        </w:rPr>
+        <w:t xml:space="preserve">, the purpose was to strengthen the technical cybersecurity skills acquired during my academic year as a Computer Science student in the department of </w:t>
+      </w:r>
+      <w:r>
+        <w:rPr>
+          <w:rFonts w:ascii="Times New Roman" w:hAnsi="Times New Roman"/>
+          <w:b/>
+          <w:sz w:val="24"/>
+        </w:rPr>
+        <w:t>GIC</w:t>
+      </w:r>
+      <w:r>
+        <w:rPr>
+          <w:rFonts w:ascii="Times New Roman" w:hAnsi="Times New Roman"/>
+          <w:sz w:val="24"/>
+        </w:rPr>
+        <w:t>. The cybersecurity skills were primarily utilised during this internship for identifying, evaluating, and remediating the security weaknesses of the target web application, neuralsh.com, to prevent attacks by anonymous threat actors.</w:t>
+      </w:r>
+    </w:p>
+    <w:p>
+      <w:pPr>
+        <w:spacing w:line="360" w:lineRule="auto" w:after="120"/>
+        <w:ind w:firstLine="720"/>
+        <w:jc w:val="both"/>
+      </w:pPr>
+      <w:r>
+        <w:rPr>
+          <w:rFonts w:ascii="Times New Roman" w:hAnsi="Times New Roman"/>
+          <w:sz w:val="24"/>
+        </w:rPr>
+        <w:t xml:space="preserve">During the assessment, various tools were evaluated, but only those deemed essential were selected, based on the </w:t>
+      </w:r>
+      <w:r>
+        <w:rPr>
+          <w:rFonts w:ascii="Times New Roman" w:hAnsi="Times New Roman"/>
+          <w:b/>
+          <w:sz w:val="24"/>
+        </w:rPr>
+        <w:t>OWASP TOP 10</w:t>
+      </w:r>
+      <w:r>
+        <w:rPr>
+          <w:rFonts w:ascii="Times New Roman" w:hAnsi="Times New Roman"/>
+          <w:sz w:val="24"/>
+        </w:rPr>
+        <w:t xml:space="preserve"> standard. Seventeen vulnerabilities were identified and classified by severity: Low, Medium, High, and Critical. Among the critical findings were a publicly exposed WHM root administration panel, MySQL database port, MikroTik network device panel, and a Cloudflare WAF bypass via origin IP disclosure. A rate-limiting bypass was confirmed with a 100 percent success rate, demonstrating a complete absence of authentication throttling.</w:t>
+      </w:r>
+    </w:p>
+    <w:p>
+      <w:pPr>
+        <w:spacing w:line="360" w:lineRule="auto" w:after="120"/>
+        <w:ind w:firstLine="720"/>
+        <w:jc w:val="both"/>
+      </w:pPr>
+      <w:r>
+        <w:rPr>
+          <w:rFonts w:ascii="Times New Roman" w:hAnsi="Times New Roman"/>
+          <w:sz w:val="24"/>
+        </w:rPr>
+        <w:t xml:space="preserve">In summary, this internship has been a significant learning experience that allowed me to apply the skills I have acquired in a real professional environment. It enabled me to expand my knowledge beyond what I studied at </w:t>
+      </w:r>
+      <w:r>
+        <w:rPr>
+          <w:rFonts w:ascii="Times New Roman" w:hAnsi="Times New Roman"/>
+          <w:b/>
+          <w:sz w:val="24"/>
+        </w:rPr>
+        <w:t>ITC</w:t>
+      </w:r>
+      <w:r>
+        <w:rPr>
+          <w:rFonts w:ascii="Times New Roman" w:hAnsi="Times New Roman"/>
+          <w:sz w:val="24"/>
+        </w:rPr>
+        <w:t xml:space="preserve">. I would like to express my sincere gratitude to </w:t>
+      </w:r>
+      <w:r>
+        <w:rPr>
+          <w:rFonts w:ascii="Times New Roman" w:hAnsi="Times New Roman"/>
+          <w:b/>
+          <w:sz w:val="24"/>
+        </w:rPr>
+        <w:t>Prestige Alliance Co., Ltd.</w:t>
+      </w:r>
+      <w:r>
+        <w:rPr>
+          <w:rFonts w:ascii="Times New Roman" w:hAnsi="Times New Roman"/>
+          <w:sz w:val="24"/>
+        </w:rPr>
+        <w:t xml:space="preserve"> for the opportunity they provided, and also to </w:t>
+      </w:r>
+      <w:r>
+        <w:rPr>
+          <w:rFonts w:ascii="Times New Roman" w:hAnsi="Times New Roman"/>
+          <w:b/>
+          <w:sz w:val="24"/>
+        </w:rPr>
+        <w:t>ITC</w:t>
+      </w:r>
+      <w:r>
+        <w:rPr>
+          <w:rFonts w:ascii="Times New Roman" w:hAnsi="Times New Roman"/>
+          <w:sz w:val="24"/>
+        </w:rPr>
+        <w:t xml:space="preserve"> for the guidance of my supervisors and professors, which was essential to the successful completion of this internship.</w:t>
       </w:r>
     </w:p>
     <w:p>

</xml_diff>

<commit_message>
Rewrite abstracts: technical summary format, no first-line indent, 2-paragraph résumé, 5-paragraph abstract
</commit_message>
<xml_diff>
--- a/THESIS_VAPT_WORD.docx
+++ b/THESIS_VAPT_WORD.docx
@@ -498,13 +498,13 @@
           <w:color w:val="000000"/>
           <w:sz w:val="24"/>
         </w:rPr>
-        <w:t>អក្គបទសង្ខេប</w:t>
-      </w:r>
-    </w:p>
-    <w:p>
-      <w:pPr>
-        <w:spacing w:line="360" w:lineRule="auto" w:after="120"/>
-        <w:ind w:firstLine="720"/>
+        <w:t>សេចក្តីសង្ខេប</w:t>
+      </w:r>
+    </w:p>
+    <w:p>
+      <w:pPr>
+        <w:spacing w:line="360" w:lineRule="auto" w:after="160"/>
+        <w:ind w:firstLine="0"/>
         <w:jc w:val="both"/>
       </w:pPr>
       <w:r>
@@ -512,49 +512,7 @@
           <w:rFonts w:ascii="Khmer OS" w:hAnsi="Khmer OS"/>
           <w:sz w:val="24"/>
         </w:rPr>
-        <w:t>នេះគឺជាការហ្វឹកហ្វឺនការងាររយៈពេល ៤ ខែ នៅ Prestige Alliance Co., Ltd. ចាប់ពីខែកុម្ភៈ ដល់ ខែឧសភា ឆ្នាំ ២០២៦។ និស្សិតឆ្នាំទី ៥ ទាំងអស់ ត្រូវបានតម្រូវឱ្យដាក់ពាក្យសុំការហ្វឹកហ្វឺន ដើម្បីបញ្ចូលក្នុងការការពារអត្ថបទបញ្ចប់ការសិក្សា ដែលនឹងប្រព្រឹត្តទៅនៅខែកក្កដា ឆ្នាំ ២០២៦។ និស្សិតម្នាក់ៗ ត្រូវតែអនុវត្តជំនាញដែលបានរៀននៅ GIC ក្នុងស្ថានភាពជាក់ស្តែង ដូចជា ការងារ ឬ ការហ្វឹកហ្វឺន យ៉ាងតិច ៣.៥ ខែ។</w:t>
-      </w:r>
-    </w:p>
-    <w:p>
-      <w:pPr>
-        <w:spacing w:line="360" w:lineRule="auto" w:after="120"/>
-        <w:ind w:firstLine="720"/>
-        <w:jc w:val="both"/>
-      </w:pPr>
-      <w:r>
-        <w:rPr>
-          <w:rFonts w:ascii="Khmer OS" w:hAnsi="Khmer OS"/>
-          <w:sz w:val="24"/>
-        </w:rPr>
-        <w:t>គម្រោងហ្វឹកហ្វឺនរបស់ខ្ញុំ ដែលមានចំណងជើងថា «ការវាយតម្លៃភាពងាយរងគ្រោះ និង ការធ្វើតេស្តការជ្រៀតចូលលើ neuralsh.com» មានគោលបំណងពង្រឹងជំនាញបច្ចេកទេសសន្តិសុខតាមអ៊ីនធឺណិត ដែលខ្ញុំបានទទួលក្នុងអំឡុងឆ្នាំសិក្សានៅ GIC។ ជំនាញទាំងនេះ ត្រូវបានប្រើប្រាស់ ក្នុងការកំណត់អត្តសញ្ញាណ ការវាយតម្លៃ និង ការដោះស្រាយភាពងាយរងគ្រោះ នៃ neuralsh.com ដើម្បីការពារការវាយប្រហារតាមអ៊ីនធឺណិតពីអ្នកគំរាមកំហែងអនាមិក។</w:t>
-      </w:r>
-    </w:p>
-    <w:p>
-      <w:pPr>
-        <w:spacing w:line="360" w:lineRule="auto" w:after="120"/>
-        <w:ind w:firstLine="720"/>
-        <w:jc w:val="both"/>
-      </w:pPr>
-      <w:r>
-        <w:rPr>
-          <w:rFonts w:ascii="Khmer OS" w:hAnsi="Khmer OS"/>
-          <w:sz w:val="24"/>
-        </w:rPr>
-        <w:t>ក្នុងអំឡុងការវាយតម្លៃ ឧបករណ៍ជាច្រើនត្រូវបានពិនិត្យ ប៉ុន្តែមានតែឧបករណ៍ចាំបាច់ប៉ុណ្ណោះ ត្រូវបានជ្រើសរើស ដោយផ្អែកលើស្តង់ដារ OWASP TOP 10។ ភាពងាយរងគ្រោះចំនួន ១៧ ត្រូវបានកំណត់ ចែកចេញជា ៤ វិកល្ប ៤ ខ្ពស់ ៦ មធ្យម និង ៣ ទាប។ ក្នុងចំណោមការរកឃើញដ៏ធ្ងន់ធ្ងរ គឺមានការបញ្ជាក់ពីការរំលំប្រព័ន្ធគ្រប់គ្រងល្បឿនស្នើសុំ ដោយមានអត្រាជោគជ័យ ១០០ ភាគរយ ដែលបង្ហាញពីគ្មានការការពារការផ្ទៀងផ្ទាត់ភាពត្រឹមត្រូវ។</w:t>
-      </w:r>
-    </w:p>
-    <w:p>
-      <w:pPr>
-        <w:spacing w:line="360" w:lineRule="auto" w:after="120"/>
-        <w:ind w:firstLine="720"/>
-        <w:jc w:val="both"/>
-      </w:pPr>
-      <w:r>
-        <w:rPr>
-          <w:rFonts w:ascii="Khmer OS" w:hAnsi="Khmer OS"/>
-          <w:sz w:val="24"/>
-        </w:rPr>
-        <w:t>សរុបសេចក្តី ការហ្វឹកហ្វឺននេះ គឺជាបទពិសោធន៍សំខាន់ ដែលអនុញ្ញាតឱ្យខ្ញុំ អនុវត្តជំនាញ ក្នុងបរិយាកាសវិជ្ជាជីវៈពិតប្រាកដ។ វាបានពង្រីកចំណេះដឹង លើសពីអ្វីដែលខ្ញុំបានរៀននៅ ITC។ ខ្ញុំសូមថ្លែងអំណរគុណ ចំពោះ Prestige Alliance Co., Ltd. ចំពោះឱកាសសិក្សា ព្រមទាំងអំណរគុណ ITC ចំពោះការណែនាំ របស់គ្រូបង្គោល និង អ្នកត្រួតពិនិត្យ ដែលបានធ្វើឱ្យការហ្វឹកហ្វឺននេះ បញ្ចប់ដោយជោគជ័យ។</w:t>
+        <w:t>អត្ថបទនេះ បង្ហាញអំពីការអនុវត្តការវាយតម្លៃភាពងាយរងគ្រោះ និងការធ្វើតេស្តការជ្រៀតចូល (VAPT) លើ neuralsh.com ដែលជាវេទិកាស្វែងរកដោយប្រើបញ្ញាសិប្បនិម្មិត ដំណើរការដោយ Prestige Alliance Co., Ltd.។ ការអនុវត្តនេះ ត្រូវបានប្រព្រឹត្ត​ក្នុងអំឡុងការហ្វឹកហ្វឺនរយៈពេល ៤ ខែ ចាប់ពីខែកុម្ភៈ ដល់ ខែឧសភា ឆ្នាំ ២០២៦ ដោយប្រើប្រាស់វិធីសាស្ត្របំបែចខ្មៅ (Black-box) ដែលផ្អែកលើ OWASP Testing Guide ចែកចេញជា ៥ ដំណាក់កាល ។ ភាពងាយរងគ្រោះចំនួន ១៧ ត្រូវបានរកឃើញ ចែកចេញជា ៤ វិកល្ប ៤ ខ្ពស់ ៦ មធ្យម និង ៣ ទាប ។ ក្នុងចំណោមការរកឃើញដ៏ធ្ងន់ធ្ងរ គឺ​មាន​ ផ្ទាំងអ្នកគ្រប់គ្រង WHM ដែលអាចចូលប្រើប្រាស់ជាសាធារណៈ ច្រកទ្វារ MySQL ត្រូវបានបង្ហាញលើអ៊ីនធឺណិត ផ្ទាំងបណ្តាញ MikroTik ដែលត្រូវបានបង្ហាញ និង ការរំលំ WAF Cloudflare តាមការបង្ហាញអាសយដ្ឋាន IP ដើម ។ ការរំលំប្រព័ន្ធគ្រប់គ្រងចំនួនស្នើសុំ ត្រូវបានបញ្ជាក់ ដោយអត្រាជោគជ័យ ១០០ ភាគរយ ដោយប្រើ X-Forwarded-For header spoofing ។ របាយការណ៍ VAPT ពេញលេញ ដែលមានអនុសាសន៍កែប្រែ ត្រូវបានប្រគល់ជូនដល់ Prestige Alliance Co., Ltd.។</w:t>
       </w:r>
     </w:p>
     <w:p>
@@ -575,7 +533,7 @@
     <w:p>
       <w:pPr>
         <w:spacing w:line="360" w:lineRule="auto" w:after="120"/>
-        <w:ind w:firstLine="720"/>
+        <w:ind w:firstLine="0"/>
         <w:jc w:val="both"/>
       </w:pPr>
       <w:r>
@@ -583,7 +541,21 @@
           <w:rFonts w:ascii="Times New Roman" w:hAnsi="Times New Roman"/>
           <w:sz w:val="24"/>
         </w:rPr>
-        <w:t xml:space="preserve">Il s'agit d'un stage de 4 mois chez </w:t>
+        <w:t>Ce mémoire présente un engagement d'Évaluation des Vulnérabilités et de Tests de Pénétration (VAPT) conduit sur neuralsh.com, une plateforme de recherche neurale alimentée par l'intelligence artificielle, exploitée par Prestige Alliance Co., Ltd. Les travaux ont été réalisés dans le cadre d'un stage de 4 mois, de février à mai 2026, avec l'autorisation écrite préalable de l'organisation. Une approche boîte noire a été suivie, simulant un attaquant externe sans connaissance préalable du système cible, en conformité avec le guide de test OWASP. L'engagement a été structuré en cinq phases séquentielles : reconnaissance, analyse et énumération, évaluation des vulnérabilités, exploitation et post-exploitation.</w:t>
+      </w:r>
+    </w:p>
+    <w:p>
+      <w:pPr>
+        <w:spacing w:line="360" w:lineRule="auto" w:after="120"/>
+        <w:ind w:firstLine="0"/>
+        <w:jc w:val="both"/>
+      </w:pPr>
+      <w:r>
+        <w:rPr>
+          <w:rFonts w:ascii="Times New Roman" w:hAnsi="Times New Roman"/>
+          <w:sz w:val="24"/>
+        </w:rPr>
+        <w:t xml:space="preserve">Dix-sept vulnérabilités ont été identifiées : quatre Critiques, quatre Élevées, six Moyennes et trois Faibles. Les résultats critiques comprennent un panneau d'administration WHM accessible publiquement, un port MySQL exposé sur Internet, un panneau d'administration réseau MikroTik et un contournement du pare-feu applicatif Cloudflare par divulgation de l'adresse IP d'origine. Deux chaînes d'exploitation ont été confirmées : un contournement de la limitation de débit atteignant un taux de réussite de 100 % via la falsification d'en-têtes HTTP, et une génération illimitée de jetons JWT via un point d'accès non authentifié. Un rapport complet incluant des recommandations de remédiation, classées par score </w:t>
       </w:r>
       <w:r>
         <w:rPr>
@@ -591,161 +563,14 @@
           <w:b/>
           <w:sz w:val="24"/>
         </w:rPr>
-        <w:t>Prestige Alliance Co., Ltd.</w:t>
-      </w:r>
-      <w:r>
-        <w:rPr>
-          <w:rFonts w:ascii="Times New Roman" w:hAnsi="Times New Roman"/>
-          <w:sz w:val="24"/>
-        </w:rPr>
-        <w:t xml:space="preserve">, de février à mai 2026. Tous les étudiants de cinquième année étaient tenus de postuler à un stage afin de l'intégrer dans leur soutenance de mémoire prévue en juillet 2026. Chaque étudiant devait appliquer les compétences acquises au cours de la formation à </w:t>
-      </w:r>
-      <w:r>
-        <w:rPr>
-          <w:rFonts w:ascii="Times New Roman" w:hAnsi="Times New Roman"/>
-          <w:b/>
-          <w:sz w:val="24"/>
-        </w:rPr>
-        <w:t>GIC</w:t>
-      </w:r>
-      <w:r>
-        <w:rPr>
-          <w:rFonts w:ascii="Times New Roman" w:hAnsi="Times New Roman"/>
-          <w:sz w:val="24"/>
-        </w:rPr>
-        <w:t xml:space="preserve"> dans des situations réelles, telles qu'un emploi ou un stage, d'une durée d'au moins 3,5 mois.</w:t>
-      </w:r>
-    </w:p>
-    <w:p>
-      <w:pPr>
-        <w:spacing w:line="360" w:lineRule="auto" w:after="120"/>
-        <w:ind w:firstLine="720"/>
-        <w:jc w:val="both"/>
-      </w:pPr>
-      <w:r>
-        <w:rPr>
-          <w:rFonts w:ascii="Times New Roman" w:hAnsi="Times New Roman"/>
-          <w:sz w:val="24"/>
-        </w:rPr>
-        <w:t xml:space="preserve">Mon projet de stage, intitulé </w:t>
-      </w:r>
-      <w:r>
-        <w:rPr>
-          <w:rFonts w:ascii="Times New Roman" w:hAnsi="Times New Roman"/>
-          <w:b/>
-          <w:sz w:val="24"/>
-        </w:rPr>
-        <w:t>« L'Évaluation des Vulnérabilités et les Tests de Pénétration sur neuralsh.com »</w:t>
-      </w:r>
-      <w:r>
-        <w:rPr>
-          <w:rFonts w:ascii="Times New Roman" w:hAnsi="Times New Roman"/>
-          <w:sz w:val="24"/>
-        </w:rPr>
-        <w:t xml:space="preserve">, avait pour objectif de renforcer les compétences techniques en cybersécurité acquises pendant mon cursus universitaire en tant qu'étudiant en informatique au sein du département </w:t>
-      </w:r>
-      <w:r>
-        <w:rPr>
-          <w:rFonts w:ascii="Times New Roman" w:hAnsi="Times New Roman"/>
-          <w:b/>
-          <w:sz w:val="24"/>
-        </w:rPr>
-        <w:t>GIC</w:t>
-      </w:r>
-      <w:r>
-        <w:rPr>
-          <w:rFonts w:ascii="Times New Roman" w:hAnsi="Times New Roman"/>
-          <w:sz w:val="24"/>
-        </w:rPr>
-        <w:t>. Ces compétences ont été principalement mobilisées pour identifier, évaluer et corriger les failles de sécurité de la plateforme cible, neuralsh.com, afin de prévenir les cyberattaques menées par des acteurs malveillants anonymes.</w:t>
-      </w:r>
-    </w:p>
-    <w:p>
-      <w:pPr>
-        <w:spacing w:line="360" w:lineRule="auto" w:after="120"/>
-        <w:ind w:firstLine="720"/>
-        <w:jc w:val="both"/>
-      </w:pPr>
-      <w:r>
-        <w:rPr>
-          <w:rFonts w:ascii="Times New Roman" w:hAnsi="Times New Roman"/>
-          <w:sz w:val="24"/>
-        </w:rPr>
-        <w:t xml:space="preserve">Au cours des tests et des investigations, plusieurs outils ont été examinés, mais seuls ceux jugés essentiels ont été retenus, en nous basant sur la norme </w:t>
-      </w:r>
-      <w:r>
-        <w:rPr>
-          <w:rFonts w:ascii="Times New Roman" w:hAnsi="Times New Roman"/>
-          <w:b/>
-          <w:sz w:val="24"/>
-        </w:rPr>
-        <w:t>OWASP TOP 10</w:t>
-      </w:r>
-      <w:r>
-        <w:rPr>
-          <w:rFonts w:ascii="Times New Roman" w:hAnsi="Times New Roman"/>
-          <w:sz w:val="24"/>
-        </w:rPr>
-        <w:t>. Une approche boîte noire a été appliquée tout au long de l'engagement. Dix-sept vulnérabilités ont été identifiées et classées par niveau de gravité : faible, moyen, élevé et critique. Parmi les résultats critiques figuraient un panneau d'administration WHM, un port MySQL, un panneau d'administration MikroTik et un contournement du WAF Cloudflare via la divulgation de l'adresse IP d'origine. Un contournement de la limitation de débit a été confirmé avec un taux de réussite de 100 %.</w:t>
-      </w:r>
-    </w:p>
-    <w:p>
-      <w:pPr>
-        <w:spacing w:line="360" w:lineRule="auto" w:after="120"/>
-        <w:ind w:firstLine="720"/>
-        <w:jc w:val="both"/>
-      </w:pPr>
-      <w:r>
-        <w:rPr>
-          <w:rFonts w:ascii="Times New Roman" w:hAnsi="Times New Roman"/>
-          <w:sz w:val="24"/>
-        </w:rPr>
-        <w:t xml:space="preserve">En résumé, ce stage a représenté une expérience précieuse qui m'a permis de mettre en pratique les compétences acquises dans un cadre professionnel réel. Il m'a permis d'approfondir mes connaissances au-delà de ce que j'avais appris à </w:t>
-      </w:r>
-      <w:r>
-        <w:rPr>
-          <w:rFonts w:ascii="Times New Roman" w:hAnsi="Times New Roman"/>
-          <w:b/>
-          <w:sz w:val="24"/>
-        </w:rPr>
-        <w:t>l'ITC</w:t>
-      </w:r>
-      <w:r>
-        <w:rPr>
-          <w:rFonts w:ascii="Times New Roman" w:hAnsi="Times New Roman"/>
-          <w:sz w:val="24"/>
-        </w:rPr>
-        <w:t xml:space="preserve">. Je tiens à exprimer ma sincère gratitude à </w:t>
-      </w:r>
-      <w:r>
-        <w:rPr>
-          <w:rFonts w:ascii="Times New Roman" w:hAnsi="Times New Roman"/>
-          <w:b/>
-          <w:sz w:val="24"/>
-        </w:rPr>
-        <w:t>Prestige Alliance Co., Ltd.</w:t>
-      </w:r>
-      <w:r>
-        <w:rPr>
-          <w:rFonts w:ascii="Times New Roman" w:hAnsi="Times New Roman"/>
-          <w:sz w:val="24"/>
-        </w:rPr>
-        <w:t xml:space="preserve"> pour l'opportunité qu'ils m'ont offerte, ainsi qu'à </w:t>
-      </w:r>
-      <w:r>
-        <w:rPr>
-          <w:rFonts w:ascii="Times New Roman" w:hAnsi="Times New Roman"/>
-          <w:b/>
-          <w:sz w:val="24"/>
-        </w:rPr>
-        <w:t>l'ITC</w:t>
-      </w:r>
-      <w:r>
-        <w:rPr>
-          <w:rFonts w:ascii="Times New Roman" w:hAnsi="Times New Roman"/>
-          <w:sz w:val="24"/>
-        </w:rPr>
-        <w:t xml:space="preserve"> pour l'encadrement de mes superviseurs et professeurs, qui a été déterminant dans la réussite de ce stage.</w:t>
+        <w:t>CVSS v3.1</w:t>
+      </w:r>
+      <w:r>
+        <w:rPr>
+          <w:rFonts w:ascii="Times New Roman" w:hAnsi="Times New Roman"/>
+          <w:sz w:val="24"/>
+        </w:rPr>
+        <w:t>, a été remis aux parties prenantes.</w:t>
       </w:r>
     </w:p>
     <w:p>
@@ -766,7 +591,7 @@
     <w:p>
       <w:pPr>
         <w:spacing w:line="360" w:lineRule="auto" w:after="120"/>
-        <w:ind w:firstLine="720"/>
+        <w:ind w:firstLine="0"/>
         <w:jc w:val="both"/>
       </w:pPr>
       <w:r>
@@ -774,7 +599,63 @@
           <w:rFonts w:ascii="Times New Roman" w:hAnsi="Times New Roman"/>
           <w:sz w:val="24"/>
         </w:rPr>
-        <w:t xml:space="preserve">This is a 4-month internship at </w:t>
+        <w:t>This thesis presents a Vulnerability Assessment and Penetration Testing (VAPT) engagement conducted on neuralsh.com, an AI-powered neural search platform operated by Prestige Alliance Co., Ltd. The work was carried out over a 4-month internship from February to May 2026, under written authorization from the organization prior to any testing activities.</w:t>
+      </w:r>
+    </w:p>
+    <w:p>
+      <w:pPr>
+        <w:spacing w:line="360" w:lineRule="auto" w:after="120"/>
+        <w:ind w:firstLine="0"/>
+        <w:jc w:val="both"/>
+      </w:pPr>
+      <w:r>
+        <w:rPr>
+          <w:rFonts w:ascii="Times New Roman" w:hAnsi="Times New Roman"/>
+          <w:sz w:val="24"/>
+        </w:rPr>
+        <w:t>A black-box methodology was applied throughout the engagement, simulating an external adversary with no prior system knowledge. The testing process followed the OWASP Testing Guide and was structured into five sequential phases: reconnaissance, scanning and enumeration, vulnerability assessment, exploitation, and post-exploitation analysis.</w:t>
+      </w:r>
+    </w:p>
+    <w:p>
+      <w:pPr>
+        <w:spacing w:line="360" w:lineRule="auto" w:after="120"/>
+        <w:ind w:firstLine="0"/>
+        <w:jc w:val="both"/>
+      </w:pPr>
+      <w:r>
+        <w:rPr>
+          <w:rFonts w:ascii="Times New Roman" w:hAnsi="Times New Roman"/>
+          <w:sz w:val="24"/>
+        </w:rPr>
+        <w:t>Seventeen vulnerabilities were identified across the target environment: four Critical, four High, six Medium, and three Low severity findings. Critical findings included a publicly accessible WHM root server administration panel, an internet-facing MySQL database port, an exposed MikroTik network device administration panel, and a Cloudflare Web Application Firewall bypass achieved through origin IP disclosure.</w:t>
+      </w:r>
+    </w:p>
+    <w:p>
+      <w:pPr>
+        <w:spacing w:line="360" w:lineRule="auto" w:after="120"/>
+        <w:ind w:firstLine="0"/>
+        <w:jc w:val="both"/>
+      </w:pPr>
+      <w:r>
+        <w:rPr>
+          <w:rFonts w:ascii="Times New Roman" w:hAnsi="Times New Roman"/>
+          <w:sz w:val="24"/>
+        </w:rPr>
+        <w:t>Two exploitation chains were confirmed during the engagement. An authentication rate-limiting bypass was executed via X-Forwarded-For HTTP header spoofing, achieving 50 successful requests with zero rate-limit responses — a 100 percent bypass rate. Additionally, an unauthenticated JWT token generation endpoint was confirmed active, enabling unlimited token farming without valid credentials.</w:t>
+      </w:r>
+    </w:p>
+    <w:p>
+      <w:pPr>
+        <w:spacing w:line="360" w:lineRule="auto" w:after="120"/>
+        <w:ind w:firstLine="0"/>
+        <w:jc w:val="both"/>
+      </w:pPr>
+      <w:r>
+        <w:rPr>
+          <w:rFonts w:ascii="Times New Roman" w:hAnsi="Times New Roman"/>
+          <w:sz w:val="24"/>
+        </w:rPr>
+        <w:t xml:space="preserve">A complete penetration testing report with remediation recommendations prioritised by </w:t>
       </w:r>
       <w:r>
         <w:rPr>
@@ -782,191 +663,14 @@
           <w:b/>
           <w:sz w:val="24"/>
         </w:rPr>
-        <w:t>Prestige Alliance Co., Ltd.</w:t>
-      </w:r>
-      <w:r>
-        <w:rPr>
-          <w:rFonts w:ascii="Times New Roman" w:hAnsi="Times New Roman"/>
-          <w:sz w:val="24"/>
-        </w:rPr>
-        <w:t xml:space="preserve"> from </w:t>
-      </w:r>
-      <w:r>
-        <w:rPr>
-          <w:rFonts w:ascii="Times New Roman" w:hAnsi="Times New Roman"/>
-          <w:b/>
-          <w:sz w:val="24"/>
-        </w:rPr>
-        <w:t>February to May 2026</w:t>
-      </w:r>
-      <w:r>
-        <w:rPr>
-          <w:rFonts w:ascii="Times New Roman" w:hAnsi="Times New Roman"/>
-          <w:sz w:val="24"/>
-        </w:rPr>
-        <w:t xml:space="preserve">. All fifth-year students were required to apply for the internship to incorporate it into their thesis defence, which takes place in </w:t>
-      </w:r>
-      <w:r>
-        <w:rPr>
-          <w:rFonts w:ascii="Times New Roman" w:hAnsi="Times New Roman"/>
-          <w:b/>
-          <w:sz w:val="24"/>
-        </w:rPr>
-        <w:t>July 2026</w:t>
-      </w:r>
-      <w:r>
-        <w:rPr>
-          <w:rFonts w:ascii="Times New Roman" w:hAnsi="Times New Roman"/>
-          <w:sz w:val="24"/>
-        </w:rPr>
-        <w:t xml:space="preserve">. Each student must apply the skills they have learned from the course at </w:t>
-      </w:r>
-      <w:r>
-        <w:rPr>
-          <w:rFonts w:ascii="Times New Roman" w:hAnsi="Times New Roman"/>
-          <w:b/>
-          <w:sz w:val="24"/>
-        </w:rPr>
-        <w:t>GIC</w:t>
-      </w:r>
-      <w:r>
-        <w:rPr>
-          <w:rFonts w:ascii="Times New Roman" w:hAnsi="Times New Roman"/>
-          <w:sz w:val="24"/>
-        </w:rPr>
-        <w:t xml:space="preserve"> and put them into real-world scenarios such as employment or an internship for at least 3.5 months.</w:t>
-      </w:r>
-    </w:p>
-    <w:p>
-      <w:pPr>
-        <w:spacing w:line="360" w:lineRule="auto" w:after="120"/>
-        <w:ind w:firstLine="720"/>
-        <w:jc w:val="both"/>
-      </w:pPr>
-      <w:r>
-        <w:rPr>
-          <w:rFonts w:ascii="Times New Roman" w:hAnsi="Times New Roman"/>
-          <w:sz w:val="24"/>
-        </w:rPr>
-        <w:t xml:space="preserve">For my internship project, titled </w:t>
-      </w:r>
-      <w:r>
-        <w:rPr>
-          <w:rFonts w:ascii="Times New Roman" w:hAnsi="Times New Roman"/>
-          <w:b/>
-          <w:sz w:val="24"/>
-        </w:rPr>
-        <w:t>"Vulnerability Assessment and Penetration Testing on neuralsh.com"</w:t>
-      </w:r>
-      <w:r>
-        <w:rPr>
-          <w:rFonts w:ascii="Times New Roman" w:hAnsi="Times New Roman"/>
-          <w:sz w:val="24"/>
-        </w:rPr>
-        <w:t xml:space="preserve">, the purpose was to strengthen the technical cybersecurity skills acquired during my academic year as a Computer Science student in the department of </w:t>
-      </w:r>
-      <w:r>
-        <w:rPr>
-          <w:rFonts w:ascii="Times New Roman" w:hAnsi="Times New Roman"/>
-          <w:b/>
-          <w:sz w:val="24"/>
-        </w:rPr>
-        <w:t>GIC</w:t>
-      </w:r>
-      <w:r>
-        <w:rPr>
-          <w:rFonts w:ascii="Times New Roman" w:hAnsi="Times New Roman"/>
-          <w:sz w:val="24"/>
-        </w:rPr>
-        <w:t>. The cybersecurity skills were primarily utilised during this internship for identifying, evaluating, and remediating the security weaknesses of the target web application, neuralsh.com, to prevent attacks by anonymous threat actors.</w:t>
-      </w:r>
-    </w:p>
-    <w:p>
-      <w:pPr>
-        <w:spacing w:line="360" w:lineRule="auto" w:after="120"/>
-        <w:ind w:firstLine="720"/>
-        <w:jc w:val="both"/>
-      </w:pPr>
-      <w:r>
-        <w:rPr>
-          <w:rFonts w:ascii="Times New Roman" w:hAnsi="Times New Roman"/>
-          <w:sz w:val="24"/>
-        </w:rPr>
-        <w:t xml:space="preserve">During the assessment, various tools were evaluated, but only those deemed essential were selected, based on the </w:t>
-      </w:r>
-      <w:r>
-        <w:rPr>
-          <w:rFonts w:ascii="Times New Roman" w:hAnsi="Times New Roman"/>
-          <w:b/>
-          <w:sz w:val="24"/>
-        </w:rPr>
-        <w:t>OWASP TOP 10</w:t>
-      </w:r>
-      <w:r>
-        <w:rPr>
-          <w:rFonts w:ascii="Times New Roman" w:hAnsi="Times New Roman"/>
-          <w:sz w:val="24"/>
-        </w:rPr>
-        <w:t xml:space="preserve"> standard. Seventeen vulnerabilities were identified and classified by severity: Low, Medium, High, and Critical. Among the critical findings were a publicly exposed WHM root administration panel, MySQL database port, MikroTik network device panel, and a Cloudflare WAF bypass via origin IP disclosure. A rate-limiting bypass was confirmed with a 100 percent success rate, demonstrating a complete absence of authentication throttling.</w:t>
-      </w:r>
-    </w:p>
-    <w:p>
-      <w:pPr>
-        <w:spacing w:line="360" w:lineRule="auto" w:after="120"/>
-        <w:ind w:firstLine="720"/>
-        <w:jc w:val="both"/>
-      </w:pPr>
-      <w:r>
-        <w:rPr>
-          <w:rFonts w:ascii="Times New Roman" w:hAnsi="Times New Roman"/>
-          <w:sz w:val="24"/>
-        </w:rPr>
-        <w:t xml:space="preserve">In summary, this internship has been a significant learning experience that allowed me to apply the skills I have acquired in a real professional environment. It enabled me to expand my knowledge beyond what I studied at </w:t>
-      </w:r>
-      <w:r>
-        <w:rPr>
-          <w:rFonts w:ascii="Times New Roman" w:hAnsi="Times New Roman"/>
-          <w:b/>
-          <w:sz w:val="24"/>
-        </w:rPr>
-        <w:t>ITC</w:t>
-      </w:r>
-      <w:r>
-        <w:rPr>
-          <w:rFonts w:ascii="Times New Roman" w:hAnsi="Times New Roman"/>
-          <w:sz w:val="24"/>
-        </w:rPr>
-        <w:t xml:space="preserve">. I would like to express my sincere gratitude to </w:t>
-      </w:r>
-      <w:r>
-        <w:rPr>
-          <w:rFonts w:ascii="Times New Roman" w:hAnsi="Times New Roman"/>
-          <w:b/>
-          <w:sz w:val="24"/>
-        </w:rPr>
-        <w:t>Prestige Alliance Co., Ltd.</w:t>
-      </w:r>
-      <w:r>
-        <w:rPr>
-          <w:rFonts w:ascii="Times New Roman" w:hAnsi="Times New Roman"/>
-          <w:sz w:val="24"/>
-        </w:rPr>
-        <w:t xml:space="preserve"> for the opportunity they provided, and also to </w:t>
-      </w:r>
-      <w:r>
-        <w:rPr>
-          <w:rFonts w:ascii="Times New Roman" w:hAnsi="Times New Roman"/>
-          <w:b/>
-          <w:sz w:val="24"/>
-        </w:rPr>
-        <w:t>ITC</w:t>
-      </w:r>
-      <w:r>
-        <w:rPr>
-          <w:rFonts w:ascii="Times New Roman" w:hAnsi="Times New Roman"/>
-          <w:sz w:val="24"/>
-        </w:rPr>
-        <w:t xml:space="preserve"> for the guidance of my supervisors and professors, which was essential to the successful completion of this internship.</w:t>
+        <w:t>CVSS v3.1</w:t>
+      </w:r>
+      <w:r>
+        <w:rPr>
+          <w:rFonts w:ascii="Times New Roman" w:hAnsi="Times New Roman"/>
+          <w:sz w:val="24"/>
+        </w:rPr>
+        <w:t xml:space="preserve"> score was delivered to Prestige Alliance Co., Ltd. The findings highlight critical risks in shared hosting infrastructure exposure, origin server accessibility, and API authentication controls that require immediate remediation.</w:t>
       </w:r>
     </w:p>
     <w:p>

</xml_diff>

<commit_message>
Expand Khmer abstract to 4 paragraphs and RÉSUMÉ to 4 paragraphs
</commit_message>
<xml_diff>
--- a/THESIS_VAPT_WORD.docx
+++ b/THESIS_VAPT_WORD.docx
@@ -512,7 +512,49 @@
           <w:rFonts w:ascii="Khmer OS" w:hAnsi="Khmer OS"/>
           <w:sz w:val="24"/>
         </w:rPr>
-        <w:t>អត្ថបទនេះ បង្ហាញអំពីការអនុវត្តការវាយតម្លៃភាពងាយរងគ្រោះ និងការធ្វើតេស្តការជ្រៀតចូល (VAPT) លើ neuralsh.com ដែលជាវេទិកាស្វែងរកដោយប្រើបញ្ញាសិប្បនិម្មិត ដំណើរការដោយ Prestige Alliance Co., Ltd.។ ការអនុវត្តនេះ ត្រូវបានប្រព្រឹត្ត​ក្នុងអំឡុងការហ្វឹកហ្វឺនរយៈពេល ៤ ខែ ចាប់ពីខែកុម្ភៈ ដល់ ខែឧសភា ឆ្នាំ ២០២៦ ដោយប្រើប្រាស់វិធីសាស្ត្របំបែចខ្មៅ (Black-box) ដែលផ្អែកលើ OWASP Testing Guide ចែកចេញជា ៥ ដំណាក់កាល ។ ភាពងាយរងគ្រោះចំនួន ១៧ ត្រូវបានរកឃើញ ចែកចេញជា ៤ វិកល្ប ៤ ខ្ពស់ ៦ មធ្យម និង ៣ ទាប ។ ក្នុងចំណោមការរកឃើញដ៏ធ្ងន់ធ្ងរ គឺ​មាន​ ផ្ទាំងអ្នកគ្រប់គ្រង WHM ដែលអាចចូលប្រើប្រាស់ជាសាធារណៈ ច្រកទ្វារ MySQL ត្រូវបានបង្ហាញលើអ៊ីនធឺណិត ផ្ទាំងបណ្តាញ MikroTik ដែលត្រូវបានបង្ហាញ និង ការរំលំ WAF Cloudflare តាមការបង្ហាញអាសយដ្ឋាន IP ដើម ។ ការរំលំប្រព័ន្ធគ្រប់គ្រងចំនួនស្នើសុំ ត្រូវបានបញ្ជាក់ ដោយអត្រាជោគជ័យ ១០០ ភាគរយ ដោយប្រើ X-Forwarded-For header spoofing ។ របាយការណ៍ VAPT ពេញលេញ ដែលមានអនុសាសន៍កែប្រែ ត្រូវបានប្រគល់ជូនដល់ Prestige Alliance Co., Ltd.។</w:t>
+        <w:t>អត្ថបទនេះ បង្ហាញអំពីការអនុវត្តការវាយតម្លៃភាពងាយរងគ្រោះ និងការធ្វើតេស្តការជ្រៀតចូល (VAPT) លើ neuralsh.com ដែលជាវេទិកាស្វែងរកដោយប្រើបញ្ញាសិប្បនិម្មិត ដំណើរការដោយ Prestige Alliance Co., Ltd.។ ការងារនេះ ត្រូវបានអនុវត្ត ក្នុងក្របខ័ណ្ឌការហ្វឹកហ្វឺនរយៈពេល ៤ ខែ ចាប់ពីខែកុម្ភៈ ដល់ ខែឧសភា ឆ្នាំ ២០២៦ ដោយមានការអនុញ្ញាតជាលាយលក្ខណ៍អក្សរ ពីស្ថាប័ន មុនពេលចាប់ផ្តើមការធ្វើតេស្ត។ គោលបំណងចម្បង គឺ​ ការ​វាយ​តម្លៃ​ ស្ថានភាព​សន្តិសុខ​ នៃ​ vplatform គោលដៅ ដោយ​ ក្លែង​ធ្វើ​ ការ​វាយ​ប្រហារ​ ពិត​ប្រាកដ ដើម្បី​ស្វែង​រក​ និង​ ចងក្រង​ ភាព​ងាយ​រងគ្រោះ​ ដែល​អាច​ ត្រូវ​ទាញ​យក​ប្រយោជន៍​ ។</w:t>
+      </w:r>
+    </w:p>
+    <w:p>
+      <w:pPr>
+        <w:spacing w:lineRule="auto" w:line="240" w:after="160"/>
+        <w:ind w:firstLine="0"/>
+        <w:jc w:val="both"/>
+      </w:pPr>
+      <w:r>
+        <w:rPr>
+          <w:rFonts w:ascii="Khmer OS" w:hAnsi="Khmer OS"/>
+          <w:sz w:val="24"/>
+        </w:rPr>
+        <w:t>វិធីសាស្ត្របំបែចខ្មៅ (Black-box) ត្រូវបានអនុវត្ត ក្នុងការហ្វឹកហ្វឺននេះ ដោយក្លែងធ្វើជាអ្នកវាយប្រហារខាងក្រៅ ដែលគ្មានចំណេះដឹងជាមុន អំពីប្រព័ន្ធគោលដៅ។ ដំណើរការធ្វើតេស្ត ផ្អែកលើ OWASP Testing Guide ហើយ​ ត្រូវបានរៀបចំជា ៥ ដំណាក់កាលជាបន្តបន្ទាប់ ។ ដំណាក់កាលទាំង ៥ រួមមាន ការស្វែងរកព័ត៌មាន (Reconnaissance) ការស្កែន និងការរាប់ (Scanning &amp; Enumeration) ការវាយតម្លៃភាពងាយរងគ្រោះ (Vulnerability Assessment) ការទាញយកប្រយោជន៍ (Exploitation) និង ការវិភាគក្រោយការទាញយកប្រយោជន៍ (Post-Exploitation)។ ឧបករណ៍ដូចជា Nmap, Nikto, Burp Suite, Shodan និង Metasploit ត្រូវបានប្រើប្រាស់ ដើម្បីជួយក្នុងការស្គែន ការរាប់ និង ការទាញយកប្រយោជន៍ ។</w:t>
+      </w:r>
+    </w:p>
+    <w:p>
+      <w:pPr>
+        <w:spacing w:lineRule="auto" w:line="240" w:after="160"/>
+        <w:ind w:firstLine="0"/>
+        <w:jc w:val="both"/>
+      </w:pPr>
+      <w:r>
+        <w:rPr>
+          <w:rFonts w:ascii="Khmer OS" w:hAnsi="Khmer OS"/>
+          <w:sz w:val="24"/>
+        </w:rPr>
+        <w:t>ភាពងាយរងគ្រោះចំនួន ១៧ ត្រូវបានរកឃើញ នៅក្នុងបរិស្ថានគោលដៅ ចែកចេញជា ៤ វិកល្ប ៤ ខ្ពស់ ៦ មធ្យម និង ៣ ទាប ។ ការរកឃើញដ៏ធ្ងន់ធ្ងររួមមាន ផ្ទាំងគ្រប់គ្រង WHM root server ដែលអាចចូលប្រើបានជាសាធារណៈ ច្រកទ្វារ MySQL ដែលបង្ហាញ​ លើ​ Internet ផ្ទាំងគ្រប់គ្រងបណ្តាញ MikroTik ដែលត្រូវបានបង្ហាញ និង ការរំលំ WAF Cloudflare តាមរយៈការបង្ហាញអាសយដ្ឋាន IP ដើម ។ ខ្សែច្រវ៉ាក់ការទាញយកប្រយោជន៍ចំនួន ២ ត្រូវបានបញ្ជាក់ ។ ការរំលំប្រព័ន្ធគ្រប់គ្រងល្បឿនចំនួនស្នើសុំ ត្រូវបានធ្វើ តាមរយៈការក្លែងបន្លំ X-Forwarded-For header ដោយទទួលបានភាពជោគជ័យ ១០០ ភាគរយ ។ ម្យ៉ាងវិញទៀត ច្រកចូល JWT ដែលមិនទាមទារការផ្ទៀងផ្ទាត់ ត្រូវបានបញ្ជាក់ ដែលអនុញ្ញាតឱ្យ​ ចម្លង token ដោយគ្មានដែនកំណត់ ។</w:t>
+      </w:r>
+    </w:p>
+    <w:p>
+      <w:pPr>
+        <w:spacing w:lineRule="auto" w:line="240" w:after="160"/>
+        <w:ind w:firstLine="0"/>
+        <w:jc w:val="both"/>
+      </w:pPr>
+      <w:r>
+        <w:rPr>
+          <w:rFonts w:ascii="Khmer OS" w:hAnsi="Khmer OS"/>
+          <w:sz w:val="24"/>
+        </w:rPr>
+        <w:t>របាយការណ៍ VAPT ពេញលេញ ដែលរួមមានអនុសាសន៍ដោះស្រាយ ដែលបានចាត់ចំណាត់ថ្នាក់ ដោយ CVSS v3.1 ត្រូវបានប្រគល់ជូន Prestige Alliance Co., Ltd.។ ការរកឃើញទាំងនេះ បង្ហាញពីហានិភ័យ​ សន្តិសុខ ដ៏ធ្ងន់ធ្ងរ ទាក់ទងនឹង ការបង្ហាញហេដ្ឋារចនាសម្ព័ន្ធ shared hosting ការចូលប្រើ origin server និង ការត្រួតពិនិត្យ API authentication controls ដែលទាមទារ​ ការដោះស្រាយ​ ភ្លាមៗ ។</w:t>
       </w:r>
     </w:p>
     <w:p>
@@ -541,7 +583,7 @@
           <w:rFonts w:ascii="Times New Roman" w:hAnsi="Times New Roman"/>
           <w:sz w:val="24"/>
         </w:rPr>
-        <w:t>Ce mémoire présente un engagement d'Évaluation des Vulnérabilités et de Tests de Pénétration (VAPT) conduit sur neuralsh.com, une plateforme de recherche neurale alimentée par l'intelligence artificielle, exploitée par Prestige Alliance Co., Ltd. Les travaux ont été réalisés dans le cadre d'un stage de 4 mois, de février à mai 2026, avec l'autorisation écrite préalable de l'organisation. Une approche boîte noire a été suivie, simulant un attaquant externe sans connaissance préalable du système cible, en conformité avec le guide de test OWASP. L'engagement a été structuré en cinq phases séquentielles : reconnaissance, analyse et énumération, évaluation des vulnérabilités, exploitation et post-exploitation.</w:t>
+        <w:t>Ce mémoire présente un engagement d'Évaluation des Vulnérabilités et de Tests de Pénétration (VAPT) conduit sur neuralsh.com, une plateforme de recherche neurale alimentée par l'intelligence artificielle, exploitée par Prestige Alliance Co., Ltd. Les travaux ont été réalisés dans le cadre d'un stage de 4 mois, de février à mai 2026, avec l'autorisation écrite préalable de l'organisation. L'objectif principal de cet engagement était d'évaluer la posture de sécurité de la plateforme cible en simulant des attaques réelles, afin d'identifier et de documenter les vulnérabilités exploitables avant qu'elles ne soient découvertes par des acteurs malveillants.</w:t>
       </w:r>
     </w:p>
     <w:p>
@@ -555,7 +597,35 @@
           <w:rFonts w:ascii="Times New Roman" w:hAnsi="Times New Roman"/>
           <w:sz w:val="24"/>
         </w:rPr>
-        <w:t xml:space="preserve">Dix-sept vulnérabilités ont été identifiées : quatre Critiques, quatre Élevées, six Moyennes et trois Faibles. Les résultats critiques comprennent un panneau d'administration WHM accessible publiquement, un port MySQL exposé sur Internet, un panneau d'administration réseau MikroTik et un contournement du pare-feu applicatif Cloudflare par divulgation de l'adresse IP d'origine. Deux chaînes d'exploitation ont été confirmées : un contournement de la limitation de débit atteignant un taux de réussite de 100 % via la falsification d'en-têtes HTTP, et une génération illimitée de jetons JWT via un point d'accès non authentifié. Un rapport complet incluant des recommandations de remédiation, classées par score </w:t>
+        <w:t>Une approche boîte noire a été suivie tout au long de l'engagement, simulant un attaquant externe sans connaissance préalable du système cible. La démarche a été conduite en conformité avec le guide de test OWASP et structurée en cinq phases séquentielles : reconnaissance, analyse et énumération, évaluation des vulnérabilités, exploitation et post-exploitation. Des outils spécialisés ont été employés à chaque phase, notamment Nmap, Nikto, Burp Suite, Shodan et Metasploit, sélectionnés selon leur pertinence par rapport aux objectifs spécifiques de chaque étape.</w:t>
+      </w:r>
+    </w:p>
+    <w:p>
+      <w:pPr>
+        <w:spacing w:line="360" w:lineRule="auto" w:after="120"/>
+        <w:ind w:firstLine="0"/>
+        <w:jc w:val="both"/>
+      </w:pPr>
+      <w:r>
+        <w:rPr>
+          <w:rFonts w:ascii="Times New Roman" w:hAnsi="Times New Roman"/>
+          <w:sz w:val="24"/>
+        </w:rPr>
+        <w:t>Dix-sept vulnérabilités ont été identifiées : quatre Critiques, quatre Élevées, six Moyennes et trois Faibles. Les résultats critiques comprennent un panneau d'administration WHM accessible publiquement sans restriction d'adresse IP, un port MySQL exposé directement sur Internet, un panneau d'administration réseau MikroTik accessible à distance, et un contournement du pare-feu applicatif Cloudflare rendu possible par la divulgation de l'adresse IP du serveur d'origine. Ces failles, combinées, exposent l'ensemble de l'infrastructure à un risque de compromission totale.</w:t>
+      </w:r>
+    </w:p>
+    <w:p>
+      <w:pPr>
+        <w:spacing w:line="360" w:lineRule="auto" w:after="120"/>
+        <w:ind w:firstLine="0"/>
+        <w:jc w:val="both"/>
+      </w:pPr>
+      <w:r>
+        <w:rPr>
+          <w:rFonts w:ascii="Times New Roman" w:hAnsi="Times New Roman"/>
+          <w:sz w:val="24"/>
+        </w:rPr>
+        <w:t xml:space="preserve">Deux chaînes d'exploitation ont été confirmées durant l'engagement. Un contournement de la limitation de débit d'authentification a été exécuté via la falsification d'en-têtes HTTP X-Forwarded-For, atteignant un taux de réussite de 100 % avec 50 requêtes réussies sur 50, sans aucune réponse de limitation déclenchée. Par ailleurs, un point d'accès de génération de jetons JWT non authentifié a été confirmé actif, permettant une génération illimitée de jetons sans identifiants valides. Un rapport complet incluant des recommandations de remédiation classées par score </w:t>
       </w:r>
       <w:r>
         <w:rPr>
@@ -570,7 +640,7 @@
           <w:rFonts w:ascii="Times New Roman" w:hAnsi="Times New Roman"/>
           <w:sz w:val="24"/>
         </w:rPr>
-        <w:t>, a été remis aux parties prenantes.</w:t>
+        <w:t xml:space="preserve"> a été remis à Prestige Alliance Co., Ltd., afin de permettre une correction priorisée des vulnérabilités identifiées.</w:t>
       </w:r>
     </w:p>
     <w:p>

</xml_diff>

<commit_message>
Rewrite Khmer abstract: 3 paragraphs, starts with target system not internship, no gratitude
</commit_message>
<xml_diff>
--- a/THESIS_VAPT_WORD.docx
+++ b/THESIS_VAPT_WORD.docx
@@ -512,7 +512,7 @@
           <w:rFonts w:ascii="Khmer OS" w:hAnsi="Khmer OS"/>
           <w:sz w:val="24"/>
         </w:rPr>
-        <w:t>អត្ថបទនេះ បង្ហាញអំពីការអនុវត្តការវាយតម្លៃភាពងាយរងគ្រោះ និងការធ្វើតេស្តការជ្រៀតចូល (VAPT) លើ neuralsh.com ដែលជាវេទិកាស្វែងរកដោយប្រើបញ្ញាសិប្បនិម្មិត ដំណើរការដោយ Prestige Alliance Co., Ltd.។ ការងារនេះ ត្រូវបានអនុវត្ត ក្នុងក្របខ័ណ្ឌការហ្វឹកហ្វឺនរយៈពេល ៤ ខែ ចាប់ពីខែកុម្ភៈ ដល់ ខែឧសភា ឆ្នាំ ២០២៦ ដោយមានការអនុញ្ញាតជាលាយលក្ខណ៍អក្សរ ពីស្ថាប័ន មុនពេលចាប់ផ្តើមការធ្វើតេស្ត។ គោលបំណងចម្បង គឺ​ ការ​វាយ​តម្លៃ​ ស្ថានភាព​សន្តិសុខ​ នៃ​ vplatform គោលដៅ ដោយ​ ក្លែង​ធ្វើ​ ការ​វាយ​ប្រហារ​ ពិត​ប្រាកដ ដើម្បី​ស្វែង​រក​ និង​ ចងក្រង​ ភាព​ងាយ​រងគ្រោះ​ ដែល​អាច​ ត្រូវ​ទាញ​យក​ប្រយោជន៍​ ។</w:t>
+        <w:t>neuralsh.com ជាវេទិកាស្វែងរកបញ្ញាសិប្បនិម្មិត ដំណើរការដោយ Prestige Alliance Co., Ltd. ត្រូវបានជ្រើសរើស ជាគោលដៅ នៃការស្រាវជ្រាវ VAPT នេះ។ ការស្រាវជ្រាវ ប្រើប្រាស់វិធីសាស្ត្រ Black-box ផ្អែកលើ OWASP Testing Guide ចែកចេញជា ៥ ដំណាក់កាល ។ ដំណាក់កាលទាំង ៥ រួមមាន ការស្វែងរកព័ត៌មាន (Reconnaissance) ការស្កែន និងការរាប់ (Scanning &amp; Enumeration) ការវាយតម្លៃភាពងាយរងគ្រោះ (Vulnerability Assessment) ការទាញយកប្រយោជន៍ (Exploitation) និង ការវិភាគក្រោយការទាញយកប្រយោជន៍ (Post-Exploitation) ។ ឧបករណ៍ដូចជា Nmap, Nikto, Burp Suite, Shodan និង Metasploit ត្រូវបានប្រើប្រាស់ ក្នុងដំណាក់កាលស្កែន ការរាប់ និងការទាញយកប្រយោជន៍ ។</w:t>
       </w:r>
     </w:p>
     <w:p>
@@ -526,7 +526,7 @@
           <w:rFonts w:ascii="Khmer OS" w:hAnsi="Khmer OS"/>
           <w:sz w:val="24"/>
         </w:rPr>
-        <w:t>វិធីសាស្ត្របំបែចខ្មៅ (Black-box) ត្រូវបានអនុវត្ត ក្នុងការហ្វឹកហ្វឺននេះ ដោយក្លែងធ្វើជាអ្នកវាយប្រហារខាងក្រៅ ដែលគ្មានចំណេះដឹងជាមុន អំពីប្រព័ន្ធគោលដៅ។ ដំណើរការធ្វើតេស្ត ផ្អែកលើ OWASP Testing Guide ហើយ​ ត្រូវបានរៀបចំជា ៥ ដំណាក់កាលជាបន្តបន្ទាប់ ។ ដំណាក់កាលទាំង ៥ រួមមាន ការស្វែងរកព័ត៌មាន (Reconnaissance) ការស្កែន និងការរាប់ (Scanning &amp; Enumeration) ការវាយតម្លៃភាពងាយរងគ្រោះ (Vulnerability Assessment) ការទាញយកប្រយោជន៍ (Exploitation) និង ការវិភាគក្រោយការទាញយកប្រយោជន៍ (Post-Exploitation)។ ឧបករណ៍ដូចជា Nmap, Nikto, Burp Suite, Shodan និង Metasploit ត្រូវបានប្រើប្រាស់ ដើម្បីជួយក្នុងការស្គែន ការរាប់ និង ការទាញយកប្រយោជន៍ ។</w:t>
+        <w:t>ចំពោះលទ្ធផល ភាពងាយរងគ្រោះ ១៧ ចំណុច ត្រូវបានរកឃើញ ចែកចេញជា ៤ វិកល្ប ៤ ខ្ពស់ ៦ មធ្យម និង ៣ ទាប ។ ចំណុចវិកល្បរួមមាន ផ្ទាំងគ្រប់គ្រង WHM root server ដែលអាចចូលប្រើបានដោយសាធារណជន ច្រកទ្វារ MySQL បង្ហាញ​លើ Internet ផ្ទាំងគ្រប់គ្រងបណ្ដាញ MikroTik ដែលត្រូវបង្ហាញ និង ការរំលំ WAF Cloudflare តាមការបង្ហាញ IP ដើម ។ ខ្សែច្រវ៉ាក់ ២ ត្រូវបានបញ្ជាក់ ។ ការរំលំ Rate Limit ត្រូវបានធ្វើ ដោយប្រើ X-Forwarded-For header ឈានដល់ ១០០ ភាគរយ ក្នុងចំណោម ៥០ ចំណោម ៥០ ។ ច្រកចូល JWT ដែលគ្មានការផ្ទៀងផ្ទាត់ ត្រូវបានរកឃើញ ដែលអនុញ្ញាតឱ្យបង្កើត token គ្មានដែនកំណត់ ។</w:t>
       </w:r>
     </w:p>
     <w:p>
@@ -540,21 +540,7 @@
           <w:rFonts w:ascii="Khmer OS" w:hAnsi="Khmer OS"/>
           <w:sz w:val="24"/>
         </w:rPr>
-        <w:t>ភាពងាយរងគ្រោះចំនួន ១៧ ត្រូវបានរកឃើញ នៅក្នុងបរិស្ថានគោលដៅ ចែកចេញជា ៤ វិកល្ប ៤ ខ្ពស់ ៦ មធ្យម និង ៣ ទាប ។ ការរកឃើញដ៏ធ្ងន់ធ្ងររួមមាន ផ្ទាំងគ្រប់គ្រង WHM root server ដែលអាចចូលប្រើបានជាសាធារណៈ ច្រកទ្វារ MySQL ដែលបង្ហាញ​ លើ​ Internet ផ្ទាំងគ្រប់គ្រងបណ្តាញ MikroTik ដែលត្រូវបានបង្ហាញ និង ការរំលំ WAF Cloudflare តាមរយៈការបង្ហាញអាសយដ្ឋាន IP ដើម ។ ខ្សែច្រវ៉ាក់ការទាញយកប្រយោជន៍ចំនួន ២ ត្រូវបានបញ្ជាក់ ។ ការរំលំប្រព័ន្ធគ្រប់គ្រងល្បឿនចំនួនស្នើសុំ ត្រូវបានធ្វើ តាមរយៈការក្លែងបន្លំ X-Forwarded-For header ដោយទទួលបានភាពជោគជ័យ ១០០ ភាគរយ ។ ម្យ៉ាងវិញទៀត ច្រកចូល JWT ដែលមិនទាមទារការផ្ទៀងផ្ទាត់ ត្រូវបានបញ្ជាក់ ដែលអនុញ្ញាតឱ្យ​ ចម្លង token ដោយគ្មានដែនកំណត់ ។</w:t>
-      </w:r>
-    </w:p>
-    <w:p>
-      <w:pPr>
-        <w:spacing w:lineRule="auto" w:line="240" w:after="160"/>
-        <w:ind w:firstLine="0"/>
-        <w:jc w:val="both"/>
-      </w:pPr>
-      <w:r>
-        <w:rPr>
-          <w:rFonts w:ascii="Khmer OS" w:hAnsi="Khmer OS"/>
-          <w:sz w:val="24"/>
-        </w:rPr>
-        <w:t>របាយការណ៍ VAPT ពេញលេញ ដែលរួមមានអនុសាសន៍ដោះស្រាយ ដែលបានចាត់ចំណាត់ថ្នាក់ ដោយ CVSS v3.1 ត្រូវបានប្រគល់ជូន Prestige Alliance Co., Ltd.។ ការរកឃើញទាំងនេះ បង្ហាញពីហានិភ័យ​ សន្តិសុខ ដ៏ធ្ងន់ធ្ងរ ទាក់ទងនឹង ការបង្ហាញហេដ្ឋារចនាសម្ព័ន្ធ shared hosting ការចូលប្រើ origin server និង ការត្រួតពិនិត្យ API authentication controls ដែលទាមទារ​ ការដោះស្រាយ​ ភ្លាមៗ ។</w:t>
+        <w:t>របាយការណ៍ VAPT ពេញលេញ ដែលមានអនុសាសន៍ ចាត់ចំណាត់ថ្នាក់ ដោយ CVSS v3.1 ត្រូវបានប្រគល់ជូន Prestige Alliance Co., Ltd.។ ការរកឃើញ​ បង្ហាញ ហានិភ័យ​ ធ្ងន់ធ្ងរ ក្នុង shared hosting infrastructure ការចូលប្រើ origin server និង API authentication controls ដែលទាមទារ ការដោះស្រាយ ភ្លាមៗ ។</w:t>
       </w:r>
     </w:p>
     <w:p>

</xml_diff>

<commit_message>
Add Roman/Arabic page numbering, Introduction page, and company contact info
- Front matter (Acknowledgment → List of Abbreviations) numbered in Roman numerals (I, II, III…)
- Introduction page added as first Arabic-numbered page (1, 2, 3…)
- 3-section OOXML structure: title section (no numbers) → front matter (upperRoman) → body (decimal)
- setup_section_footers() applies centered PAGE field footers to sections 1 and 2
- Replace company address/website/email/phone placeholders with real Prestige Alliance contact info
</commit_message>
<xml_diff>
--- a/THESIS_VAPT_WORD.docx
+++ b/THESIS_VAPT_WORD.docx
@@ -329,6 +329,14 @@
     <w:p/>
     <w:p>
       <w:pPr>
+        <w:sectPr>
+          <w:pgSz w:w="11905" w:h="16837"/>
+          <w:pgMar w:top="1133" w:right="1133" w:bottom="1133" w:left="1700"/>
+        </w:sectPr>
+      </w:pPr>
+    </w:p>
+    <w:p>
+      <w:pPr>
         <w:pStyle w:val="Heading1"/>
         <w:jc w:val="center"/>
       </w:pPr>
@@ -2595,11 +2603,55 @@
     <w:p>
       <w:pPr>
         <w:sectPr>
+          <w:footerReference w:type="default" r:id="rId49"/>
           <w:pgSz w:w="11905" w:h="16837"/>
           <w:pgMar w:top="1133" w:right="1133" w:bottom="1133" w:left="1700"/>
-          <w:pgNumType w:fmt="decimal" w:start="1"/>
+          <w:pgNumType w:fmt="upperRoman" w:start="1"/>
         </w:sectPr>
       </w:pPr>
+    </w:p>
+    <w:p>
+      <w:pPr>
+        <w:pStyle w:val="Heading1"/>
+        <w:jc w:val="center"/>
+      </w:pPr>
+      <w:r>
+        <w:rPr>
+          <w:rFonts w:ascii="Times New Roman" w:hAnsi="Times New Roman"/>
+          <w:b/>
+          <w:i w:val="0"/>
+          <w:sz w:val="32"/>
+        </w:rPr>
+        <w:t>INTRODUCTION</w:t>
+      </w:r>
+    </w:p>
+    <w:p>
+      <w:pPr>
+        <w:spacing w:line="360" w:lineRule="auto" w:after="120"/>
+        <w:ind w:firstLine="720"/>
+        <w:jc w:val="both"/>
+      </w:pPr>
+      <w:r>
+        <w:rPr>
+          <w:rFonts w:ascii="Times New Roman" w:hAnsi="Times New Roman"/>
+          <w:sz w:val="24"/>
+        </w:rPr>
+        <w:t>This report documents a Vulnerability Assessment and Penetration Testing (VAPT) engagement conducted on neuralsh.com, an AI-powered neural search platform developed and operated by Prestige Alliance Co., Ltd. The engagement was undertaken as part of a 4-month internship from February to May 2026, during which the author was embedded with the company's cybersecurity team under the supervision of the Head of Red Team, with written authorization from the organization prior to any testing activities.</w:t>
+      </w:r>
+    </w:p>
+    <w:p>
+      <w:pPr>
+        <w:spacing w:line="360" w:lineRule="auto" w:after="120"/>
+        <w:ind w:firstLine="720"/>
+        <w:jc w:val="both"/>
+      </w:pPr>
+      <w:r>
+        <w:rPr>
+          <w:rFonts w:ascii="Times New Roman" w:hAnsi="Times New Roman"/>
+          <w:sz w:val="24"/>
+        </w:rPr>
+        <w:t>The report is organized into six chapters. Chapter 1 provides the project overview and organizational context, covering the project description, objectives, scope, action plan, and company description. Chapter 2 presents the conceptual foundations of penetration testing, including industry frameworks such as OWASP and NIST SP 800-115. Chapter 3 details the research methodology and tools used throughout the engagement. Chapter 4 covers the full implementation — the testing environment, reconnaissance, scanning, vulnerability assessment, exploitation, and post-exploitation phases. Chapter 5 presents the results, complete findings register, attack chain analysis, and remediation roadmap. Chapter 6 concludes with a summary of findings, lessons learned, and recommendations for future security improvements.</w:t>
+      </w:r>
     </w:p>
     <w:p>
       <w:pPr>
@@ -31936,13 +31988,55 @@
       </w:r>
     </w:p>
     <w:sectPr>
+      <w:footerReference w:type="default" r:id="rId50"/>
       <w:pgSz w:w="11906" w:h="16838"/>
       <w:pgMar w:top="1134" w:right="1134" w:bottom="1134" w:left="1701" w:header="720" w:footer="720" w:gutter="0"/>
       <w:cols w:space="720"/>
       <w:docGrid w:linePitch="360"/>
+      <w:pgNumType w:fmt="decimal" w:start="1"/>
     </w:sectPr>
   </w:body>
 </w:document>
+</file>
+
+<file path=word/footer1.xml><?xml version="1.0" encoding="utf-8"?>
+<w:ftr xmlns:m="http://schemas.openxmlformats.org/officeDocument/2006/math" xmlns:mc="http://schemas.openxmlformats.org/markup-compatibility/2006" xmlns:mo="http://schemas.microsoft.com/office/mac/office/2008/main" xmlns:mv="urn:schemas-microsoft-com:mac:vml" xmlns:o="urn:schemas-microsoft-com:office:office" xmlns:r="http://schemas.openxmlformats.org/officeDocument/2006/relationships" xmlns:v="urn:schemas-microsoft-com:vml" xmlns:w10="urn:schemas-microsoft-com:office:word" xmlns:w14="http://schemas.microsoft.com/office/word/2010/wordml" xmlns:w="http://schemas.openxmlformats.org/wordprocessingml/2006/main" xmlns:wne="http://schemas.microsoft.com/office/word/2006/wordml" xmlns:wp14="http://schemas.microsoft.com/office/word/2010/wordprocessingDrawing" xmlns:wp="http://schemas.openxmlformats.org/drawingml/2006/wordprocessingDrawing" xmlns:wpc="http://schemas.microsoft.com/office/word/2010/wordprocessingCanvas" xmlns:wpg="http://schemas.microsoft.com/office/word/2010/wordprocessingGroup" xmlns:wpi="http://schemas.microsoft.com/office/word/2010/wordprocessingInk" xmlns:wps="http://schemas.microsoft.com/office/word/2010/wordprocessingShape" mc:Ignorable="w14 wp14">
+  <w:p>
+    <w:pPr>
+      <w:pStyle w:val="Footer"/>
+      <w:jc w:val="center"/>
+    </w:pPr>
+    <w:r>
+      <w:rPr>
+        <w:rFonts w:ascii="Times New Roman" w:hAnsi="Times New Roman"/>
+        <w:sz w:val="24"/>
+      </w:rPr>
+      <w:fldChar w:fldCharType="begin"/>
+      <w:instrText xml:space="preserve"> PAGE </w:instrText>
+      <w:fldChar w:fldCharType="end"/>
+    </w:r>
+  </w:p>
+</w:ftr>
+</file>
+
+<file path=word/footer2.xml><?xml version="1.0" encoding="utf-8"?>
+<w:ftr xmlns:m="http://schemas.openxmlformats.org/officeDocument/2006/math" xmlns:mc="http://schemas.openxmlformats.org/markup-compatibility/2006" xmlns:mo="http://schemas.microsoft.com/office/mac/office/2008/main" xmlns:mv="urn:schemas-microsoft-com:mac:vml" xmlns:o="urn:schemas-microsoft-com:office:office" xmlns:r="http://schemas.openxmlformats.org/officeDocument/2006/relationships" xmlns:v="urn:schemas-microsoft-com:vml" xmlns:w10="urn:schemas-microsoft-com:office:word" xmlns:w14="http://schemas.microsoft.com/office/word/2010/wordml" xmlns:w="http://schemas.openxmlformats.org/wordprocessingml/2006/main" xmlns:wne="http://schemas.microsoft.com/office/word/2006/wordml" xmlns:wp14="http://schemas.microsoft.com/office/word/2010/wordprocessingDrawing" xmlns:wp="http://schemas.openxmlformats.org/drawingml/2006/wordprocessingDrawing" xmlns:wpc="http://schemas.microsoft.com/office/word/2010/wordprocessingCanvas" xmlns:wpg="http://schemas.microsoft.com/office/word/2010/wordprocessingGroup" xmlns:wpi="http://schemas.microsoft.com/office/word/2010/wordprocessingInk" xmlns:wps="http://schemas.microsoft.com/office/word/2010/wordprocessingShape" mc:Ignorable="w14 wp14">
+  <w:p>
+    <w:pPr>
+      <w:pStyle w:val="Footer"/>
+      <w:jc w:val="center"/>
+    </w:pPr>
+    <w:r>
+      <w:rPr>
+        <w:rFonts w:ascii="Times New Roman" w:hAnsi="Times New Roman"/>
+        <w:sz w:val="24"/>
+      </w:rPr>
+      <w:fldChar w:fldCharType="begin"/>
+      <w:instrText xml:space="preserve"> PAGE </w:instrText>
+      <w:fldChar w:fldCharType="end"/>
+    </w:r>
+  </w:p>
+</w:ftr>
 </file>
 
 <file path=word/numbering.xml><?xml version="1.0" encoding="utf-8"?>

</xml_diff>

<commit_message>
Remove body text from Introduction page — heading only
</commit_message>
<xml_diff>
--- a/THESIS_VAPT_WORD.docx
+++ b/THESIS_VAPT_WORD.docx
@@ -2623,34 +2623,6 @@
           <w:sz w:val="32"/>
         </w:rPr>
         <w:t>INTRODUCTION</w:t>
-      </w:r>
-    </w:p>
-    <w:p>
-      <w:pPr>
-        <w:spacing w:line="360" w:lineRule="auto" w:after="120"/>
-        <w:ind w:firstLine="720"/>
-        <w:jc w:val="both"/>
-      </w:pPr>
-      <w:r>
-        <w:rPr>
-          <w:rFonts w:ascii="Times New Roman" w:hAnsi="Times New Roman"/>
-          <w:sz w:val="24"/>
-        </w:rPr>
-        <w:t>This report documents a Vulnerability Assessment and Penetration Testing (VAPT) engagement conducted on neuralsh.com, an AI-powered neural search platform developed and operated by Prestige Alliance Co., Ltd. The engagement was undertaken as part of a 4-month internship from February to May 2026, during which the author was embedded with the company's cybersecurity team under the supervision of the Head of Red Team, with written authorization from the organization prior to any testing activities.</w:t>
-      </w:r>
-    </w:p>
-    <w:p>
-      <w:pPr>
-        <w:spacing w:line="360" w:lineRule="auto" w:after="120"/>
-        <w:ind w:firstLine="720"/>
-        <w:jc w:val="both"/>
-      </w:pPr>
-      <w:r>
-        <w:rPr>
-          <w:rFonts w:ascii="Times New Roman" w:hAnsi="Times New Roman"/>
-          <w:sz w:val="24"/>
-        </w:rPr>
-        <w:t>The report is organized into six chapters. Chapter 1 provides the project overview and organizational context, covering the project description, objectives, scope, action plan, and company description. Chapter 2 presents the conceptual foundations of penetration testing, including industry frameworks such as OWASP and NIST SP 800-115. Chapter 3 details the research methodology and tools used throughout the engagement. Chapter 4 covers the full implementation — the testing environment, reconnaissance, scanning, vulnerability assessment, exploitation, and post-exploitation phases. Chapter 5 presents the results, complete findings register, attack chain analysis, and remediation roadmap. Chapter 6 concludes with a summary of findings, lessons learned, and recommendations for future security improvements.</w:t>
       </w:r>
     </w:p>
     <w:p>

</xml_diff>

<commit_message>
Fix PAGE field structure: 3 separate runs (begin/instrText/end) per OOXML spec
</commit_message>
<xml_diff>
--- a/THESIS_VAPT_WORD.docx
+++ b/THESIS_VAPT_WORD.docx
@@ -31984,7 +31984,19 @@
         <w:sz w:val="24"/>
       </w:rPr>
       <w:fldChar w:fldCharType="begin"/>
+    </w:r>
+    <w:r>
+      <w:rPr>
+        <w:rFonts w:ascii="Times New Roman" w:hAnsi="Times New Roman"/>
+        <w:sz w:val="24"/>
+      </w:rPr>
       <w:instrText xml:space="preserve"> PAGE </w:instrText>
+    </w:r>
+    <w:r>
+      <w:rPr>
+        <w:rFonts w:ascii="Times New Roman" w:hAnsi="Times New Roman"/>
+        <w:sz w:val="24"/>
+      </w:rPr>
       <w:fldChar w:fldCharType="end"/>
     </w:r>
   </w:p>
@@ -32004,7 +32016,19 @@
         <w:sz w:val="24"/>
       </w:rPr>
       <w:fldChar w:fldCharType="begin"/>
+    </w:r>
+    <w:r>
+      <w:rPr>
+        <w:rFonts w:ascii="Times New Roman" w:hAnsi="Times New Roman"/>
+        <w:sz w:val="24"/>
+      </w:rPr>
       <w:instrText xml:space="preserve"> PAGE </w:instrText>
+    </w:r>
+    <w:r>
+      <w:rPr>
+        <w:rFonts w:ascii="Times New Roman" w:hAnsi="Times New Roman"/>
+        <w:sz w:val="24"/>
+      </w:rPr>
       <w:fldChar w:fldCharType="end"/>
     </w:r>
   </w:p>

</xml_diff>

<commit_message>
Apply ITC format rules: front_head 16pt, our→my in ack, spell out numbers <100 in prose
</commit_message>
<xml_diff>
--- a/THESIS_VAPT_WORD.docx
+++ b/THESIS_VAPT_WORD.docx
@@ -345,7 +345,7 @@
           <w:rFonts w:ascii="Times New Roman" w:hAnsi="Times New Roman"/>
           <w:b/>
           <w:i w:val="0"/>
-          <w:sz w:val="24"/>
+          <w:sz w:val="32"/>
         </w:rPr>
         <w:t>ACKNOWLEDGMENT</w:t>
       </w:r>
@@ -361,7 +361,7 @@
           <w:rFonts w:ascii="Times New Roman" w:hAnsi="Times New Roman"/>
           <w:sz w:val="24"/>
         </w:rPr>
-        <w:t>Before I start this report, I would like to express my sincere gratitude to our school and to everyone who has contributed to the making of this report. Everyone has dedicated their hard work and efforts, without which it would not have been possible to achieve this accomplishment. I am very grateful for the opportunity and the guidance that allowed me to grow and enhance my knowledge in both hard and soft skills. I would like to extend my appreciation to the following individuals:</w:t>
+        <w:t>Before I start this report, I would like to express my sincere gratitude to my school and to everyone who has contributed to the making of this report. Everyone has dedicated their hard work and efforts, without which it would not have been possible to achieve this accomplishment. I am very grateful for the opportunity and the guidance that allowed me to grow and enhance my knowledge in both hard and soft skills. I would like to extend my appreciation to the following individuals:</w:t>
       </w:r>
     </w:p>
     <w:p>
@@ -390,7 +390,7 @@
           <w:rFonts w:ascii="Times New Roman" w:hAnsi="Times New Roman"/>
           <w:sz w:val="24"/>
         </w:rPr>
-        <w:t>. For his leadership and efforts that steer our institute to be one of the top universities in Cambodia. His cooperation with local and international enterprises has been instrumental in making this opportunity possible.</w:t>
+        <w:t>. For his leadership and efforts that steer this institute to be one of the top universities in Cambodia. His cooperation with local and international enterprises has been instrumental in making this opportunity possible.</w:t>
       </w:r>
     </w:p>
     <w:p>
@@ -419,7 +419,7 @@
           <w:rFonts w:ascii="Times New Roman" w:hAnsi="Times New Roman"/>
           <w:sz w:val="24"/>
         </w:rPr>
-        <w:t>. His guidance and management have provided excellent education and courses within our department which are the foundation of this internship.</w:t>
+        <w:t>. His guidance and management have provided excellent education and courses within my department which are the foundation of this internship.</w:t>
       </w:r>
     </w:p>
     <w:p>
@@ -561,7 +561,7 @@
           <w:rFonts w:ascii="Times New Roman" w:hAnsi="Times New Roman"/>
           <w:b/>
           <w:i w:val="0"/>
-          <w:sz w:val="24"/>
+          <w:sz w:val="32"/>
         </w:rPr>
         <w:t>RÉSUMÉ</w:t>
       </w:r>
@@ -647,7 +647,7 @@
           <w:rFonts w:ascii="Times New Roman" w:hAnsi="Times New Roman"/>
           <w:b/>
           <w:i w:val="0"/>
-          <w:sz w:val="24"/>
+          <w:sz w:val="32"/>
         </w:rPr>
         <w:t>ABSTRACT</w:t>
       </w:r>
@@ -747,7 +747,7 @@
           <w:rFonts w:ascii="Times New Roman" w:hAnsi="Times New Roman"/>
           <w:b/>
           <w:i w:val="0"/>
-          <w:sz w:val="24"/>
+          <w:sz w:val="32"/>
         </w:rPr>
         <w:t>TABLE OF CONTENTS</w:t>
       </w:r>
@@ -789,7 +789,7 @@
           <w:rFonts w:ascii="Times New Roman" w:hAnsi="Times New Roman"/>
           <w:b/>
           <w:i w:val="0"/>
-          <w:sz w:val="24"/>
+          <w:sz w:val="32"/>
         </w:rPr>
         <w:t>LIST OF FIGURES</w:t>
       </w:r>
@@ -1812,7 +1812,7 @@
           <w:rFonts w:ascii="Times New Roman" w:hAnsi="Times New Roman"/>
           <w:b/>
           <w:i w:val="0"/>
-          <w:sz w:val="24"/>
+          <w:sz w:val="32"/>
         </w:rPr>
         <w:t>LIST OF TABLES</w:t>
       </w:r>
@@ -1923,7 +1923,7 @@
           <w:rFonts w:ascii="Times New Roman" w:hAnsi="Times New Roman"/>
           <w:b/>
           <w:i w:val="0"/>
-          <w:sz w:val="24"/>
+          <w:sz w:val="32"/>
         </w:rPr>
         <w:t>LIST OF ABBREVIATIONS</w:t>
       </w:r>
@@ -11814,7 +11814,7 @@
           <w:rFonts w:ascii="Times New Roman" w:hAnsi="Times New Roman"/>
           <w:sz w:val="24"/>
         </w:rPr>
-        <w:t>Rate-limiting bypass demonstration was capped at 50 requests per test scenario</w:t>
+        <w:t>Rate-limiting bypass demonstration was capped at fifty requests per test scenario</w:t>
       </w:r>
     </w:p>
     <w:p>
@@ -16861,7 +16861,7 @@
           <w:rFonts w:ascii="Times New Roman" w:hAnsi="Times New Roman"/>
           <w:sz w:val="24"/>
         </w:rPr>
-        <w:t>A follow-up scan conducted four days after the initial assessment confirmed all 17 original findings remained unpatched. Three additional findings were discovered:</w:t>
+        <w:t>A follow-up scan conducted four days after the initial assessment confirmed all seventeen original findings remained unpatched. Three additional findings were discovered:</w:t>
       </w:r>
     </w:p>
     <w:p>
@@ -26987,7 +26987,7 @@
           <w:rFonts w:ascii="Times New Roman" w:hAnsi="Times New Roman"/>
           <w:sz w:val="24"/>
         </w:rPr>
-        <w:t>Collect 50 valid JWT tokens in under three seconds (100% bypass, confirmed)</w:t>
+        <w:t>Collect fifty valid JWT tokens in under three seconds (100% bypass, confirmed)</w:t>
       </w:r>
     </w:p>
     <w:p>
@@ -27010,7 +27010,7 @@
           <w:rFonts w:ascii="Times New Roman" w:hAnsi="Times New Roman"/>
           <w:sz w:val="24"/>
         </w:rPr>
-        <w:t>Automate token refresh every 29 minutes — perpetual API access established</w:t>
+        <w:t>Automate token refresh every twenty-nine minutes — perpetual API access established</w:t>
       </w:r>
     </w:p>
     <w:p>

</xml_diff>

<commit_message>
Remove duplicate front matter from process_md, add Introduction body text
</commit_message>
<xml_diff>
--- a/THESIS_VAPT_WORD.docx
+++ b/THESIS_VAPT_WORD.docx
@@ -2627,51 +2627,6 @@
     </w:p>
     <w:p>
       <w:pPr>
-        <w:pStyle w:val="Heading1"/>
-        <w:jc w:val="center"/>
-      </w:pPr>
-      <w:r>
-        <w:rPr>
-          <w:rFonts w:ascii="Times New Roman" w:hAnsi="Times New Roman"/>
-          <w:b/>
-          <w:i w:val="0"/>
-          <w:sz w:val="32"/>
-        </w:rPr>
-        <w:t>VULNERABILITY ASSESSMENT AND PENETRATION TESTING (VAPT) ON A WEB APPLICATION</w:t>
-      </w:r>
-    </w:p>
-    <w:p>
-      <w:pPr>
-        <w:pStyle w:val="Heading2"/>
-        <w:jc w:val="left"/>
-      </w:pPr>
-      <w:r>
-        <w:rPr>
-          <w:rFonts w:ascii="Times New Roman" w:hAnsi="Times New Roman"/>
-          <w:b/>
-          <w:i w:val="0"/>
-          <w:sz w:val="28"/>
-        </w:rPr>
-        <w:t>A Case Study of neuralsh.com</w:t>
-      </w:r>
-    </w:p>
-    <w:p>
-      <w:pPr>
-        <w:pStyle w:val="Heading2"/>
-        <w:jc w:val="left"/>
-      </w:pPr>
-      <w:r>
-        <w:rPr>
-          <w:rFonts w:ascii="Times New Roman" w:hAnsi="Times New Roman"/>
-          <w:b/>
-          <w:i w:val="0"/>
-          <w:sz w:val="28"/>
-        </w:rPr>
-        <w:t>Declaration</w:t>
-      </w:r>
-    </w:p>
-    <w:p>
-      <w:pPr>
         <w:spacing w:line="360" w:lineRule="auto" w:after="120"/>
         <w:ind w:firstLine="720"/>
         <w:jc w:val="both"/>
@@ -2681,22 +2636,7 @@
           <w:rFonts w:ascii="Times New Roman" w:hAnsi="Times New Roman"/>
           <w:sz w:val="24"/>
         </w:rPr>
-        <w:t>I declare that this thesis is my own work and has been carried out with full written authorization from the owner of the target system. All penetration testing activities described herein were conducted ethically, responsibly, and within the agreed scope of engagement. No unauthorized access was attempted against any system not explicitly listed in this document.</w:t>
-      </w:r>
-    </w:p>
-    <w:p>
-      <w:pPr>
-        <w:pStyle w:val="Heading2"/>
-        <w:jc w:val="left"/>
-      </w:pPr>
-      <w:r>
-        <w:rPr>
-          <w:rFonts w:ascii="Times New Roman" w:hAnsi="Times New Roman"/>
-          <w:b/>
-          <w:i w:val="0"/>
-          <w:sz w:val="28"/>
-        </w:rPr>
-        <w:t>Abstract</w:t>
+        <w:t>This report presents the findings and methodology of a Vulnerability Assessment and Penetration Testing (VAPT) engagement conducted on neuralsh.com, an AI-powered neural search platform operated by Prestige Alliance Co., Ltd. The engagement was carried out as part of a four-month internship from February to May 2026, with full written authorization from the organization prior to any testing activities.</w:t>
       </w:r>
     </w:p>
     <w:p>
@@ -2710,260 +2650,7 @@
           <w:rFonts w:ascii="Times New Roman" w:hAnsi="Times New Roman"/>
           <w:sz w:val="24"/>
         </w:rPr>
-        <w:t xml:space="preserve">This thesis presents a comprehensive Vulnerability Assessment and Penetration Testing (VAPT) engagement conducted on </w:t>
-      </w:r>
-      <w:r>
-        <w:rPr>
-          <w:rFonts w:ascii="Times New Roman" w:hAnsi="Times New Roman"/>
-          <w:b/>
-          <w:sz w:val="24"/>
-        </w:rPr>
-        <w:t>neuralsh.com</w:t>
-      </w:r>
-      <w:r>
-        <w:rPr>
-          <w:rFonts w:ascii="Times New Roman" w:hAnsi="Times New Roman"/>
-          <w:sz w:val="24"/>
-        </w:rPr>
-        <w:t>, an AI-powered neural search platform. The assessment was authorized in writing prior to testing, and all activities were conducted in accordance with established ethical hacking standards and the OWASP Testing Guide.</w:t>
-      </w:r>
-    </w:p>
-    <w:p>
-      <w:pPr>
-        <w:spacing w:line="360" w:lineRule="auto" w:after="120"/>
-        <w:ind w:firstLine="720"/>
-        <w:jc w:val="both"/>
-      </w:pPr>
-      <w:r>
-        <w:rPr>
-          <w:rFonts w:ascii="Times New Roman" w:hAnsi="Times New Roman"/>
-          <w:sz w:val="24"/>
-        </w:rPr>
-        <w:t>The assessment followed the complete penetration testing lifecycle: reconnaissance, scanning, enumeration, exploitation, post-exploitation, and reporting. A black-box methodology was applied as the primary testing approach, simulating an external attacker with no prior knowledge of the target system.</w:t>
-      </w:r>
-    </w:p>
-    <w:p>
-      <w:pPr>
-        <w:spacing w:line="360" w:lineRule="auto" w:after="120"/>
-        <w:ind w:firstLine="720"/>
-        <w:jc w:val="both"/>
-      </w:pPr>
-      <w:r>
-        <w:rPr>
-          <w:rFonts w:ascii="Times New Roman" w:hAnsi="Times New Roman"/>
-          <w:sz w:val="24"/>
-        </w:rPr>
-        <w:t xml:space="preserve">The findings reveal significant and immediate security risks across the platform. Twenty (20) distinct vulnerabilities were discovered: </w:t>
-      </w:r>
-      <w:r>
-        <w:rPr>
-          <w:rFonts w:ascii="Times New Roman" w:hAnsi="Times New Roman"/>
-          <w:b/>
-          <w:sz w:val="24"/>
-        </w:rPr>
-        <w:t>4 Critical, 5 High, 7 Medium, and 4 Low</w:t>
-      </w:r>
-      <w:r>
-        <w:rPr>
-          <w:rFonts w:ascii="Times New Roman" w:hAnsi="Times New Roman"/>
-          <w:sz w:val="24"/>
-        </w:rPr>
-        <w:t xml:space="preserve"> severity findings. Critical findings include a publicly exposed MySQL database, MikroTik network router administration panel, cPanel hosting control panel, and WHM root server administration panel — all accessible from the public internet without IP restriction. A rate-limiting control was successfully bypassed via HTTP header spoofing, enabling unlimited API token generation. A follow-up verification scan conducted on 10 June 2026 confirmed all original findings remained unpatched and identified three additional findings: newly exposed cPanel service ports (2078, 2091), SMTP port 25 transitioning from filtered to open, and confirmed identification of a named co-tenant (onesala.com) sharing the same physical server infrastructure.</w:t>
-      </w:r>
-    </w:p>
-    <w:p>
-      <w:pPr>
-        <w:spacing w:line="360" w:lineRule="auto" w:after="120"/>
-        <w:ind w:firstLine="720"/>
-        <w:jc w:val="both"/>
-      </w:pPr>
-      <w:r>
-        <w:rPr>
-          <w:rFonts w:ascii="Times New Roman" w:hAnsi="Times New Roman"/>
-          <w:sz w:val="24"/>
-        </w:rPr>
-        <w:t>This thesis documents the complete methodology, evidence, exploitation results, risk analysis using CVSS v3.1 scoring, and a full remediation roadmap.</w:t>
-      </w:r>
-    </w:p>
-    <w:p>
-      <w:pPr>
-        <w:pStyle w:val="Heading2"/>
-        <w:jc w:val="left"/>
-      </w:pPr>
-      <w:r>
-        <w:rPr>
-          <w:rFonts w:ascii="Times New Roman" w:hAnsi="Times New Roman"/>
-          <w:b/>
-          <w:i w:val="0"/>
-          <w:sz w:val="28"/>
-        </w:rPr>
-        <w:t>Table of Contents</w:t>
-      </w:r>
-    </w:p>
-    <w:p>
-      <w:pPr>
-        <w:spacing w:line="360" w:lineRule="auto" w:after="80"/>
-        <w:ind w:left="720" w:firstLine="0"/>
-        <w:jc w:val="both"/>
-      </w:pPr>
-      <w:r>
-        <w:rPr>
-          <w:rFonts w:ascii="Times New Roman" w:hAnsi="Times New Roman"/>
-          <w:b w:val="0"/>
-          <w:i w:val="0"/>
-          <w:sz w:val="24"/>
-        </w:rPr>
-        <w:t xml:space="preserve">1.  </w:t>
-      </w:r>
-      <w:r>
-        <w:rPr>
-          <w:rFonts w:ascii="Times New Roman" w:hAnsi="Times New Roman"/>
-          <w:sz w:val="24"/>
-        </w:rPr>
-        <w:t>Introduction</w:t>
-      </w:r>
-    </w:p>
-    <w:p>
-      <w:pPr>
-        <w:spacing w:line="360" w:lineRule="auto" w:after="80"/>
-        <w:ind w:left="720" w:firstLine="0"/>
-        <w:jc w:val="both"/>
-      </w:pPr>
-      <w:r>
-        <w:rPr>
-          <w:rFonts w:ascii="Times New Roman" w:hAnsi="Times New Roman"/>
-          <w:b w:val="0"/>
-          <w:i w:val="0"/>
-          <w:sz w:val="24"/>
-        </w:rPr>
-        <w:t xml:space="preserve">2.  </w:t>
-      </w:r>
-      <w:r>
-        <w:rPr>
-          <w:rFonts w:ascii="Times New Roman" w:hAnsi="Times New Roman"/>
-          <w:sz w:val="24"/>
-        </w:rPr>
-        <w:t>Concepts of Penetration Testing</w:t>
-      </w:r>
-    </w:p>
-    <w:p>
-      <w:pPr>
-        <w:spacing w:line="360" w:lineRule="auto" w:after="80"/>
-        <w:ind w:left="720" w:firstLine="0"/>
-        <w:jc w:val="both"/>
-      </w:pPr>
-      <w:r>
-        <w:rPr>
-          <w:rFonts w:ascii="Times New Roman" w:hAnsi="Times New Roman"/>
-          <w:b w:val="0"/>
-          <w:i w:val="0"/>
-          <w:sz w:val="24"/>
-        </w:rPr>
-        <w:t xml:space="preserve">3.  </w:t>
-      </w:r>
-      <w:r>
-        <w:rPr>
-          <w:rFonts w:ascii="Times New Roman" w:hAnsi="Times New Roman"/>
-          <w:sz w:val="24"/>
-        </w:rPr>
-        <w:t>Research Methodology and Tools</w:t>
-      </w:r>
-    </w:p>
-    <w:p>
-      <w:pPr>
-        <w:spacing w:line="360" w:lineRule="auto" w:after="80"/>
-        <w:ind w:left="720" w:firstLine="0"/>
-        <w:jc w:val="both"/>
-      </w:pPr>
-      <w:r>
-        <w:rPr>
-          <w:rFonts w:ascii="Times New Roman" w:hAnsi="Times New Roman"/>
-          <w:b w:val="0"/>
-          <w:i w:val="0"/>
-          <w:sz w:val="24"/>
-        </w:rPr>
-        <w:t xml:space="preserve">4.  </w:t>
-      </w:r>
-      <w:r>
-        <w:rPr>
-          <w:rFonts w:ascii="Times New Roman" w:hAnsi="Times New Roman"/>
-          <w:sz w:val="24"/>
-        </w:rPr>
-        <w:t>Implementation and Deployment</w:t>
-      </w:r>
-    </w:p>
-    <w:p>
-      <w:pPr>
-        <w:spacing w:line="360" w:lineRule="auto" w:after="80"/>
-        <w:ind w:left="720" w:firstLine="0"/>
-        <w:jc w:val="both"/>
-      </w:pPr>
-      <w:r>
-        <w:rPr>
-          <w:rFonts w:ascii="Times New Roman" w:hAnsi="Times New Roman"/>
-          <w:b w:val="0"/>
-          <w:i w:val="0"/>
-          <w:sz w:val="24"/>
-        </w:rPr>
-        <w:t xml:space="preserve">5.  </w:t>
-      </w:r>
-      <w:r>
-        <w:rPr>
-          <w:rFonts w:ascii="Times New Roman" w:hAnsi="Times New Roman"/>
-          <w:sz w:val="24"/>
-        </w:rPr>
-        <w:t>Results, Analysis and Remediation</w:t>
-      </w:r>
-    </w:p>
-    <w:p>
-      <w:pPr>
-        <w:spacing w:line="360" w:lineRule="auto" w:after="80"/>
-        <w:ind w:left="720" w:firstLine="0"/>
-        <w:jc w:val="both"/>
-      </w:pPr>
-      <w:r>
-        <w:rPr>
-          <w:rFonts w:ascii="Times New Roman" w:hAnsi="Times New Roman"/>
-          <w:b w:val="0"/>
-          <w:i w:val="0"/>
-          <w:sz w:val="24"/>
-        </w:rPr>
-        <w:t xml:space="preserve">6.  </w:t>
-      </w:r>
-      <w:r>
-        <w:rPr>
-          <w:rFonts w:ascii="Times New Roman" w:hAnsi="Times New Roman"/>
-          <w:sz w:val="24"/>
-        </w:rPr>
-        <w:t>Conclusion</w:t>
-      </w:r>
-    </w:p>
-    <w:p>
-      <w:pPr>
-        <w:spacing w:line="360" w:lineRule="auto" w:after="120"/>
-        <w:ind w:firstLine="720"/>
-        <w:jc w:val="both"/>
-      </w:pPr>
-      <w:r>
-        <w:rPr>
-          <w:rFonts w:ascii="Times New Roman" w:hAnsi="Times New Roman"/>
-          <w:sz w:val="24"/>
-        </w:rPr>
-        <w:t>+ References</w:t>
-      </w:r>
-    </w:p>
-    <w:p>
-      <w:pPr>
-        <w:spacing w:line="360" w:lineRule="auto" w:after="120"/>
-        <w:ind w:firstLine="720"/>
-        <w:jc w:val="both"/>
-      </w:pPr>
-      <w:r>
-        <w:rPr>
-          <w:rFonts w:ascii="Times New Roman" w:hAnsi="Times New Roman"/>
-          <w:sz w:val="24"/>
-        </w:rPr>
-        <w:t>+ Appendices</w:t>
+        <w:t>Chapter 1 provides the project overview, objectives, scope, and a description of the company. Chapter 2 presents the theoretical foundations of penetration testing, including the OWASP framework and CVSS scoring system. Chapter 3 details the research methodology and tools used throughout the engagement. Chapter 4 covers the full implementation across five testing phases: reconnaissance, scanning and enumeration, vulnerability assessment, exploitation, and post-exploitation. Chapter 5 presents the complete findings register, attack chain analysis, and remediation roadmap. Chapter 6 concludes with a summary, lessons learned, and recommendations for future security improvements.</w:t>
       </w:r>
     </w:p>
     <w:p>

</xml_diff>

<commit_message>
Change DICE to GIC in acknowledgment
</commit_message>
<xml_diff>
--- a/THESIS_VAPT_WORD.docx
+++ b/THESIS_VAPT_WORD.docx
@@ -412,7 +412,7 @@
           <w:b/>
           <w:sz w:val="24"/>
         </w:rPr>
-        <w:t>MR. LAY Heng, Head of Department of Information and Communication Engineering (DICE) at ITC</w:t>
+        <w:t>MR. LAY Heng, Head of Department of Information and Communication Engineering (GIC) at ITC</w:t>
       </w:r>
       <w:r>
         <w:rPr>
@@ -441,7 +441,7 @@
           <w:b/>
           <w:sz w:val="24"/>
         </w:rPr>
-        <w:t>DR. KUY Movsun, Lecturer at the Department of Information and Communication Engineering (DICE), ITC</w:t>
+        <w:t>DR. KUY Movsun, Lecturer at the Department of Information and Communication Engineering (GIC), ITC</w:t>
       </w:r>
       <w:r>
         <w:rPr>

</xml_diff>

<commit_message>
Add org chart (Figure 2) above map, shift figures 2-15 to 3-16, keep contact info under map
</commit_message>
<xml_diff>
--- a/THESIS_VAPT_WORD.docx
+++ b/THESIS_VAPT_WORD.docx
@@ -839,7 +839,7 @@
           <w:i w:val="0"/>
           <w:sz w:val="22"/>
         </w:rPr>
-        <w:t xml:space="preserve">  Prestige Alliance office location map</w:t>
+        <w:t xml:space="preserve">  Prestige Alliance organisational structure</w:t>
       </w:r>
     </w:p>
     <w:p>
@@ -863,7 +863,7 @@
           <w:i w:val="0"/>
           <w:sz w:val="22"/>
         </w:rPr>
-        <w:t xml:space="preserve">  Hack The Box platform logo</w:t>
+        <w:t xml:space="preserve">  Prestige Alliance office location map</w:t>
       </w:r>
     </w:p>
     <w:p>
@@ -887,7 +887,7 @@
           <w:i w:val="0"/>
           <w:sz w:val="22"/>
         </w:rPr>
-        <w:t xml:space="preserve">  HTB Certified Penetration Testing Specialist (CPTS) logo</w:t>
+        <w:t xml:space="preserve">  Hack The Box platform logo</w:t>
       </w:r>
     </w:p>
     <w:p>
@@ -911,7 +911,7 @@
           <w:i w:val="0"/>
           <w:sz w:val="22"/>
         </w:rPr>
-        <w:t xml:space="preserve">  HTB Certified Web Exploitation Specialist (CWES) logo</w:t>
+        <w:t xml:space="preserve">  HTB Certified Penetration Testing Specialist (CPTS) logo</w:t>
       </w:r>
     </w:p>
     <w:p>
@@ -935,7 +935,7 @@
           <w:i w:val="0"/>
           <w:sz w:val="22"/>
         </w:rPr>
-        <w:t xml:space="preserve">  Penetration testing process diagram</w:t>
+        <w:t xml:space="preserve">  HTB Certified Web Exploitation Specialist (CWES) logo</w:t>
       </w:r>
     </w:p>
     <w:p>
@@ -959,7 +959,7 @@
           <w:i w:val="0"/>
           <w:sz w:val="22"/>
         </w:rPr>
-        <w:t xml:space="preserve">  OWASP logo</w:t>
+        <w:t xml:space="preserve">  Penetration testing process diagram</w:t>
       </w:r>
     </w:p>
     <w:p>
@@ -983,7 +983,7 @@
           <w:i w:val="0"/>
           <w:sz w:val="22"/>
         </w:rPr>
-        <w:t xml:space="preserve">  NIST SP 800-115 logo</w:t>
+        <w:t xml:space="preserve">  OWASP logo</w:t>
       </w:r>
     </w:p>
     <w:p>
@@ -1007,7 +1007,7 @@
           <w:i w:val="0"/>
           <w:sz w:val="22"/>
         </w:rPr>
-        <w:t xml:space="preserve">  CVSS v3.1 scoring system logo</w:t>
+        <w:t xml:space="preserve">  NIST SP 800-115 logo</w:t>
       </w:r>
     </w:p>
     <w:p>
@@ -1031,7 +1031,7 @@
           <w:i w:val="0"/>
           <w:sz w:val="22"/>
         </w:rPr>
-        <w:t xml:space="preserve">  Nmap network scanner logo</w:t>
+        <w:t xml:space="preserve">  CVSS v3.1 scoring system logo</w:t>
       </w:r>
     </w:p>
     <w:p>
@@ -1055,7 +1055,7 @@
           <w:i w:val="0"/>
           <w:sz w:val="22"/>
         </w:rPr>
-        <w:t xml:space="preserve">  Nikto web server scanner logo</w:t>
+        <w:t xml:space="preserve">  Nmap network scanner logo</w:t>
       </w:r>
     </w:p>
     <w:p>
@@ -1079,7 +1079,7 @@
           <w:i w:val="0"/>
           <w:sz w:val="22"/>
         </w:rPr>
-        <w:t xml:space="preserve">  Shodan search engine logo</w:t>
+        <w:t xml:space="preserve">  Nikto web server scanner logo</w:t>
       </w:r>
     </w:p>
     <w:p>
@@ -1103,7 +1103,7 @@
           <w:i w:val="0"/>
           <w:sz w:val="22"/>
         </w:rPr>
-        <w:t xml:space="preserve">  Burp Suite Community Edition logo</w:t>
+        <w:t xml:space="preserve">  Shodan search engine logo</w:t>
       </w:r>
     </w:p>
     <w:p>
@@ -1127,7 +1127,7 @@
           <w:i w:val="0"/>
           <w:sz w:val="22"/>
         </w:rPr>
-        <w:t xml:space="preserve">  CyberChef data analysis tool logo</w:t>
+        <w:t xml:space="preserve">  Burp Suite Community Edition logo</w:t>
       </w:r>
     </w:p>
     <w:p>
@@ -1151,7 +1151,7 @@
           <w:i w:val="0"/>
           <w:sz w:val="22"/>
         </w:rPr>
-        <w:t xml:space="preserve">  Claude (Anthropic) AI assistant logo</w:t>
+        <w:t xml:space="preserve">  CyberChef data analysis tool logo</w:t>
       </w:r>
     </w:p>
     <w:p>
@@ -1166,7 +1166,7 @@
           <w:i w:val="0"/>
           <w:sz w:val="22"/>
         </w:rPr>
-        <w:t>Figure 4.1:</w:t>
+        <w:t>Figure 16:</w:t>
       </w:r>
       <w:r>
         <w:rPr>
@@ -1175,7 +1175,7 @@
           <w:i w:val="0"/>
           <w:sz w:val="22"/>
         </w:rPr>
-        <w:t xml:space="preserve">  VirtualBox showing Kali Linux VM running</w:t>
+        <w:t xml:space="preserve">  Claude (Anthropic) AI assistant logo</w:t>
       </w:r>
     </w:p>
     <w:p>
@@ -1190,7 +1190,7 @@
           <w:i w:val="0"/>
           <w:sz w:val="22"/>
         </w:rPr>
-        <w:t>Figure 4.2:</w:t>
+        <w:t>Figure 4.1:</w:t>
       </w:r>
       <w:r>
         <w:rPr>
@@ -1199,7 +1199,7 @@
           <w:i w:val="0"/>
           <w:sz w:val="22"/>
         </w:rPr>
-        <w:t xml:space="preserve">  SSH session from Linux Mint terminal connected to Kali VM</w:t>
+        <w:t xml:space="preserve">  VirtualBox showing Kali Linux VM running</w:t>
       </w:r>
     </w:p>
     <w:p>
@@ -1214,7 +1214,7 @@
           <w:i w:val="0"/>
           <w:sz w:val="22"/>
         </w:rPr>
-        <w:t>Figure 4.3:</w:t>
+        <w:t>Figure 4.2:</w:t>
       </w:r>
       <w:r>
         <w:rPr>
@@ -1223,7 +1223,7 @@
           <w:i w:val="0"/>
           <w:sz w:val="22"/>
         </w:rPr>
-        <w:t xml:space="preserve">  Tool version verification — Nmap, Nikto, Metasploit</w:t>
+        <w:t xml:space="preserve">  SSH session from Linux Mint terminal connected to Kali VM</w:t>
       </w:r>
     </w:p>
     <w:p>
@@ -1238,7 +1238,7 @@
           <w:i w:val="0"/>
           <w:sz w:val="22"/>
         </w:rPr>
-        <w:t>Figure 4.4:</w:t>
+        <w:t>Figure 4.3:</w:t>
       </w:r>
       <w:r>
         <w:rPr>
@@ -1247,7 +1247,7 @@
           <w:i w:val="0"/>
           <w:sz w:val="22"/>
         </w:rPr>
-        <w:t xml:space="preserve">  neuralsh.com homepage in browser</w:t>
+        <w:t xml:space="preserve">  Tool version verification — Nmap, Nikto, Metasploit</w:t>
       </w:r>
     </w:p>
     <w:p>
@@ -1262,7 +1262,7 @@
           <w:i w:val="0"/>
           <w:sz w:val="22"/>
         </w:rPr>
-        <w:t>Figure 4.5:</w:t>
+        <w:t>Figure 4.4:</w:t>
       </w:r>
       <w:r>
         <w:rPr>
@@ -1271,7 +1271,7 @@
           <w:i w:val="0"/>
           <w:sz w:val="22"/>
         </w:rPr>
-        <w:t xml:space="preserve">  WHOIS lookup for neuralsh.com</w:t>
+        <w:t xml:space="preserve">  neuralsh.com homepage in browser</w:t>
       </w:r>
     </w:p>
     <w:p>
@@ -1286,7 +1286,7 @@
           <w:i w:val="0"/>
           <w:sz w:val="22"/>
         </w:rPr>
-        <w:t>Figure 4.6:</w:t>
+        <w:t>Figure 4.5:</w:t>
       </w:r>
       <w:r>
         <w:rPr>
@@ -1295,7 +1295,7 @@
           <w:i w:val="0"/>
           <w:sz w:val="22"/>
         </w:rPr>
-        <w:t xml:space="preserve">  dig MX — origin IP discovery and DNS records</w:t>
+        <w:t xml:space="preserve">  WHOIS lookup for neuralsh.com</w:t>
       </w:r>
     </w:p>
     <w:p>
@@ -1310,7 +1310,7 @@
           <w:i w:val="0"/>
           <w:sz w:val="22"/>
         </w:rPr>
-        <w:t>Figure 4.7:</w:t>
+        <w:t>Figure 4.6:</w:t>
       </w:r>
       <w:r>
         <w:rPr>
@@ -1319,7 +1319,7 @@
           <w:i w:val="0"/>
           <w:sz w:val="22"/>
         </w:rPr>
-        <w:t xml:space="preserve">  Wildcard DNS — randomxyz123.neuralsh.com resolves to 103.16.62.217</w:t>
+        <w:t xml:space="preserve">  dig MX — origin IP discovery and DNS records</w:t>
       </w:r>
     </w:p>
     <w:p>
@@ -1334,7 +1334,7 @@
           <w:i w:val="0"/>
           <w:sz w:val="22"/>
         </w:rPr>
-        <w:t>Figure 4.8:</w:t>
+        <w:t>Figure 4.7:</w:t>
       </w:r>
       <w:r>
         <w:rPr>
@@ -1343,7 +1343,7 @@
           <w:i w:val="0"/>
           <w:sz w:val="22"/>
         </w:rPr>
-        <w:t xml:space="preserve">  SSL certificate mismatch — endoncambodia.com and onesala.com on origin server</w:t>
+        <w:t xml:space="preserve">  Wildcard DNS — randomxyz123.neuralsh.com resolves to 103.16.62.217</w:t>
       </w:r>
     </w:p>
     <w:p>
@@ -1358,7 +1358,7 @@
           <w:i w:val="0"/>
           <w:sz w:val="22"/>
         </w:rPr>
-        <w:t>Figure 4.9:</w:t>
+        <w:t>Figure 4.8:</w:t>
       </w:r>
       <w:r>
         <w:rPr>
@@ -1367,7 +1367,7 @@
           <w:i w:val="0"/>
           <w:sz w:val="22"/>
         </w:rPr>
-        <w:t xml:space="preserve">  Nmap full port scan of 103.16.62.217 — twenty-three open ports</w:t>
+        <w:t xml:space="preserve">  SSL certificate mismatch — endoncambodia.com and onesala.com on origin server</w:t>
       </w:r>
     </w:p>
     <w:p>
@@ -1382,7 +1382,7 @@
           <w:i w:val="0"/>
           <w:sz w:val="22"/>
         </w:rPr>
-        <w:t>Figure 4.10:</w:t>
+        <w:t>Figure 4.9:</w:t>
       </w:r>
       <w:r>
         <w:rPr>
@@ -1391,7 +1391,7 @@
           <w:i w:val="0"/>
           <w:sz w:val="22"/>
         </w:rPr>
-        <w:t xml:space="preserve">  cPanel and WHM login pages accessible from the public internet</w:t>
+        <w:t xml:space="preserve">  Nmap full port scan of 103.16.62.217 — twenty-three open ports</w:t>
       </w:r>
     </w:p>
     <w:p>
@@ -1406,7 +1406,7 @@
           <w:i w:val="0"/>
           <w:sz w:val="22"/>
         </w:rPr>
-        <w:t>Figure 4.11:</w:t>
+        <w:t>Figure 4.10:</w:t>
       </w:r>
       <w:r>
         <w:rPr>
@@ -1415,7 +1415,7 @@
           <w:i w:val="0"/>
           <w:sz w:val="22"/>
         </w:rPr>
-        <w:t xml:space="preserve">  MikroTik RouterOS WebFig login page — publicly accessible</w:t>
+        <w:t xml:space="preserve">  cPanel and WHM login pages accessible from the public internet</w:t>
       </w:r>
     </w:p>
     <w:p>
@@ -1430,7 +1430,7 @@
           <w:i w:val="0"/>
           <w:sz w:val="22"/>
         </w:rPr>
-        <w:t>Figure 4.12:</w:t>
+        <w:t>Figure 4.11:</w:t>
       </w:r>
       <w:r>
         <w:rPr>
@@ -1439,7 +1439,7 @@
           <w:i w:val="0"/>
           <w:sz w:val="22"/>
         </w:rPr>
-        <w:t xml:space="preserve">  Nikto web scanner results against neuralsh.com</w:t>
+        <w:t xml:space="preserve">  MikroTik RouterOS WebFig login page — publicly accessible</w:t>
       </w:r>
     </w:p>
     <w:p>
@@ -1454,7 +1454,7 @@
           <w:i w:val="0"/>
           <w:sz w:val="22"/>
         </w:rPr>
-        <w:t>Figure 4.13:</w:t>
+        <w:t>Figure 4.12:</w:t>
       </w:r>
       <w:r>
         <w:rPr>
@@ -1463,7 +1463,7 @@
           <w:i w:val="0"/>
           <w:sz w:val="22"/>
         </w:rPr>
-        <w:t xml:space="preserve">  Nuclei vulnerability scan — zero matches returned</w:t>
+        <w:t xml:space="preserve">  Nikto web scanner results against neuralsh.com</w:t>
       </w:r>
     </w:p>
     <w:p>
@@ -1478,7 +1478,7 @@
           <w:i w:val="0"/>
           <w:sz w:val="22"/>
         </w:rPr>
-        <w:t>Figure 4.14:</w:t>
+        <w:t>Figure 4.13:</w:t>
       </w:r>
       <w:r>
         <w:rPr>
@@ -1487,7 +1487,7 @@
           <w:i w:val="0"/>
           <w:sz w:val="22"/>
         </w:rPr>
-        <w:t xml:space="preserve">  Burp Suite — Cloudflare WAF bypass confirmation</w:t>
+        <w:t xml:space="preserve">  Nuclei vulnerability scan — zero matches returned</w:t>
       </w:r>
     </w:p>
     <w:p>
@@ -1502,7 +1502,7 @@
           <w:i w:val="0"/>
           <w:sz w:val="22"/>
         </w:rPr>
-        <w:t>Figure 4.15:</w:t>
+        <w:t>Figure 4.14:</w:t>
       </w:r>
       <w:r>
         <w:rPr>
@@ -1511,7 +1511,7 @@
           <w:i w:val="0"/>
           <w:sz w:val="22"/>
         </w:rPr>
-        <w:t xml:space="preserve">  Rate limit bypass — fifty/fifty tokens, zero rate-limit responses</w:t>
+        <w:t xml:space="preserve">  Burp Suite — Cloudflare WAF bypass confirmation</w:t>
       </w:r>
     </w:p>
     <w:p>
@@ -1526,7 +1526,7 @@
           <w:i w:val="0"/>
           <w:sz w:val="22"/>
         </w:rPr>
-        <w:t>Figure 4.16:</w:t>
+        <w:t>Figure 4.15:</w:t>
       </w:r>
       <w:r>
         <w:rPr>
@@ -1535,7 +1535,7 @@
           <w:i w:val="0"/>
           <w:sz w:val="22"/>
         </w:rPr>
-        <w:t xml:space="preserve">  JWT endpoint confirmed live — HTTP 200 as of eleven June 2026</w:t>
+        <w:t xml:space="preserve">  Rate limit bypass — fifty/fifty tokens, zero rate-limit responses</w:t>
       </w:r>
     </w:p>
     <w:p>
@@ -1550,7 +1550,7 @@
           <w:i w:val="0"/>
           <w:sz w:val="22"/>
         </w:rPr>
-        <w:t>Figure 4.17:</w:t>
+        <w:t>Figure 4.16:</w:t>
       </w:r>
       <w:r>
         <w:rPr>
@@ -1559,7 +1559,7 @@
           <w:i w:val="0"/>
           <w:sz w:val="22"/>
         </w:rPr>
-        <w:t xml:space="preserve">  WHM admin panel at 103.16.62.217:2087 — publicly accessible</w:t>
+        <w:t xml:space="preserve">  JWT endpoint confirmed live — HTTP 200 as of eleven June 2026</w:t>
       </w:r>
     </w:p>
     <w:p>
@@ -1574,7 +1574,7 @@
           <w:i w:val="0"/>
           <w:sz w:val="22"/>
         </w:rPr>
-        <w:t>Figure 4.18:</w:t>
+        <w:t>Figure 4.17:</w:t>
       </w:r>
       <w:r>
         <w:rPr>
@@ -1583,7 +1583,7 @@
           <w:i w:val="0"/>
           <w:sz w:val="22"/>
         </w:rPr>
-        <w:t xml:space="preserve">  MikroTik WebFig — RouterOS v6.49.18, admin pre-filled</w:t>
+        <w:t xml:space="preserve">  WHM admin panel at 103.16.62.217:2087 — publicly accessible</w:t>
       </w:r>
     </w:p>
     <w:p>
@@ -1598,7 +1598,7 @@
           <w:i w:val="0"/>
           <w:sz w:val="22"/>
         </w:rPr>
-        <w:t>Figure 4.19:</w:t>
+        <w:t>Figure 4.18:</w:t>
       </w:r>
       <w:r>
         <w:rPr>
@@ -1607,7 +1607,7 @@
           <w:i w:val="0"/>
           <w:sz w:val="22"/>
         </w:rPr>
-        <w:t xml:space="preserve">  MySQL connection from public IP — authentication prompt exposed</w:t>
+        <w:t xml:space="preserve">  MikroTik WebFig — RouterOS v6.49.18, admin pre-filled</w:t>
       </w:r>
     </w:p>
     <w:p>
@@ -1622,7 +1622,7 @@
           <w:i w:val="0"/>
           <w:sz w:val="22"/>
         </w:rPr>
-        <w:t>Figure 4.20:</w:t>
+        <w:t>Figure 4.19:</w:t>
       </w:r>
       <w:r>
         <w:rPr>
@@ -1631,7 +1631,7 @@
           <w:i w:val="0"/>
           <w:sz w:val="22"/>
         </w:rPr>
-        <w:t xml:space="preserve">  Thirty consecutive HTTP 200 responses — rate limiting not triggered</w:t>
+        <w:t xml:space="preserve">  MySQL connection from public IP — authentication prompt exposed</w:t>
       </w:r>
     </w:p>
     <w:p>
@@ -1646,7 +1646,7 @@
           <w:i w:val="0"/>
           <w:sz w:val="22"/>
         </w:rPr>
-        <w:t>Figure 4.21:</w:t>
+        <w:t>Figure 4.20:</w:t>
       </w:r>
       <w:r>
         <w:rPr>
@@ -1655,7 +1655,7 @@
           <w:i w:val="0"/>
           <w:sz w:val="22"/>
         </w:rPr>
-        <w:t xml:space="preserve">  Burp Suite showing live JWT token response from /web/v1/init/token</w:t>
+        <w:t xml:space="preserve">  Thirty consecutive HTTP 200 responses — rate limiting not triggered</w:t>
       </w:r>
     </w:p>
     <w:p>
@@ -1670,7 +1670,7 @@
           <w:i w:val="0"/>
           <w:sz w:val="22"/>
         </w:rPr>
-        <w:t>Figure 4.22:</w:t>
+        <w:t>Figure 4.21:</w:t>
       </w:r>
       <w:r>
         <w:rPr>
@@ -1679,7 +1679,7 @@
           <w:i w:val="0"/>
           <w:sz w:val="22"/>
         </w:rPr>
-        <w:t xml:space="preserve">  Attack chain diagram — four confirmed attack vectors</w:t>
+        <w:t xml:space="preserve">  Burp Suite showing live JWT token response from /web/v1/init/token</w:t>
       </w:r>
     </w:p>
     <w:p>
@@ -1694,7 +1694,7 @@
           <w:i w:val="0"/>
           <w:sz w:val="22"/>
         </w:rPr>
-        <w:t>Figure A.1:</w:t>
+        <w:t>Figure 4.22:</w:t>
       </w:r>
       <w:r>
         <w:rPr>
@@ -1703,7 +1703,7 @@
           <w:i w:val="0"/>
           <w:sz w:val="22"/>
         </w:rPr>
-        <w:t xml:space="preserve">  Nmap full port scan output — Appendix A</w:t>
+        <w:t xml:space="preserve">  Attack chain diagram — four confirmed attack vectors</w:t>
       </w:r>
     </w:p>
     <w:p>
@@ -1718,7 +1718,7 @@
           <w:i w:val="0"/>
           <w:sz w:val="22"/>
         </w:rPr>
-        <w:t>Figure C.1:</w:t>
+        <w:t>Figure A.1:</w:t>
       </w:r>
       <w:r>
         <w:rPr>
@@ -1727,7 +1727,7 @@
           <w:i w:val="0"/>
           <w:sz w:val="22"/>
         </w:rPr>
-        <w:t xml:space="preserve">  Thirty requests, zero rate-limit responses — Appendix C</w:t>
+        <w:t xml:space="preserve">  Nmap full port scan output — Appendix A</w:t>
       </w:r>
     </w:p>
     <w:p>
@@ -1742,7 +1742,7 @@
           <w:i w:val="0"/>
           <w:sz w:val="22"/>
         </w:rPr>
-        <w:t>Figure C.2:</w:t>
+        <w:t>Figure C.1:</w:t>
       </w:r>
       <w:r>
         <w:rPr>
@@ -1751,7 +1751,7 @@
           <w:i w:val="0"/>
           <w:sz w:val="22"/>
         </w:rPr>
-        <w:t xml:space="preserve">  Rate limit bypass confirmation — Appendix C</w:t>
+        <w:t xml:space="preserve">  Thirty requests, zero rate-limit responses — Appendix C</w:t>
       </w:r>
     </w:p>
     <w:p>
@@ -1766,7 +1766,7 @@
           <w:i w:val="0"/>
           <w:sz w:val="22"/>
         </w:rPr>
-        <w:t>Figure D.1:</w:t>
+        <w:t>Figure C.2:</w:t>
       </w:r>
       <w:r>
         <w:rPr>
@@ -1775,7 +1775,7 @@
           <w:i w:val="0"/>
           <w:sz w:val="22"/>
         </w:rPr>
-        <w:t xml:space="preserve">  JWT token response in Burp Suite — Appendix D</w:t>
+        <w:t xml:space="preserve">  Rate limit bypass confirmation — Appendix C</w:t>
       </w:r>
     </w:p>
     <w:p>
@@ -1790,7 +1790,7 @@
           <w:i w:val="0"/>
           <w:sz w:val="22"/>
         </w:rPr>
-        <w:t>Figure D.2:</w:t>
+        <w:t>Figure D.1:</w:t>
       </w:r>
       <w:r>
         <w:rPr>
@@ -1799,6 +1799,30 @@
           <w:i w:val="0"/>
           <w:sz w:val="22"/>
         </w:rPr>
+        <w:t xml:space="preserve">  JWT token response in Burp Suite — Appendix D</w:t>
+      </w:r>
+    </w:p>
+    <w:p>
+      <w:pPr>
+        <w:spacing w:after="60" w:line="360" w:lineRule="auto"/>
+        <w:ind w:firstLine="0"/>
+      </w:pPr>
+      <w:r>
+        <w:rPr>
+          <w:rFonts w:ascii="Times New Roman" w:hAnsi="Times New Roman"/>
+          <w:b/>
+          <w:i w:val="0"/>
+          <w:sz w:val="22"/>
+        </w:rPr>
+        <w:t>Figure D.2:</w:t>
+      </w:r>
+      <w:r>
+        <w:rPr>
+          <w:rFonts w:ascii="Times New Roman" w:hAnsi="Times New Roman"/>
+          <w:b w:val="0"/>
+          <w:i w:val="0"/>
+          <w:sz w:val="22"/>
+        </w:rPr>
         <w:t xml:space="preserve">  JWT endpoint returning HTTP 200, eleven June 2026 — Appendix D</w:t>
       </w:r>
     </w:p>
@@ -2603,7 +2627,7 @@
     <w:p>
       <w:pPr>
         <w:sectPr>
-          <w:footerReference w:type="default" r:id="rId49"/>
+          <w:footerReference w:type="default" r:id="rId50"/>
           <w:pgSz w:w="11905" w:h="16837"/>
           <w:pgMar w:top="1133" w:right="1133" w:bottom="1133" w:left="1700"/>
           <w:pgNumType w:fmt="upperRoman" w:start="1"/>
@@ -7746,8 +7770,64 @@
       <w:r>
         <w:drawing>
           <wp:inline xmlns:a="http://schemas.openxmlformats.org/drawingml/2006/main" xmlns:pic="http://schemas.openxmlformats.org/drawingml/2006/picture">
+            <wp:extent cx="2880000" cy="1647653"/>
+            <wp:docPr id="2" name="Picture 2"/>
+            <wp:cNvGraphicFramePr>
+              <a:graphicFrameLocks noChangeAspect="1"/>
+            </wp:cNvGraphicFramePr>
+            <a:graphic>
+              <a:graphicData uri="http://schemas.openxmlformats.org/drawingml/2006/picture">
+                <pic:pic>
+                  <pic:nvPicPr>
+                    <pic:cNvPr id="0" name="PrestigeAlliance_OrgChart.png"/>
+                    <pic:cNvPicPr/>
+                  </pic:nvPicPr>
+                  <pic:blipFill>
+                    <a:blip r:embed="rId10"/>
+                    <a:stretch>
+                      <a:fillRect/>
+                    </a:stretch>
+                  </pic:blipFill>
+                  <pic:spPr>
+                    <a:xfrm>
+                      <a:off x="0" y="0"/>
+                      <a:ext cx="2880000" cy="1647653"/>
+                    </a:xfrm>
+                    <a:prstGeom prst="rect"/>
+                  </pic:spPr>
+                </pic:pic>
+              </a:graphicData>
+            </a:graphic>
+          </wp:inline>
+        </w:drawing>
+      </w:r>
+    </w:p>
+    <w:p>
+      <w:pPr>
+        <w:spacing w:after="240"/>
+        <w:ind w:firstLine="0"/>
+        <w:jc w:val="center"/>
+      </w:pPr>
+      <w:r>
+        <w:rPr>
+          <w:rFonts w:ascii="Times New Roman" w:hAnsi="Times New Roman"/>
+          <w:b w:val="0"/>
+          <w:i/>
+          <w:sz w:val="20"/>
+        </w:rPr>
+        <w:t>Figure 2: Prestige Alliance organisational structure</w:t>
+      </w:r>
+    </w:p>
+    <w:p>
+      <w:pPr>
+        <w:ind w:firstLine="0"/>
+        <w:jc w:val="center"/>
+      </w:pPr>
+      <w:r>
+        <w:drawing>
+          <wp:inline xmlns:a="http://schemas.openxmlformats.org/drawingml/2006/main" xmlns:pic="http://schemas.openxmlformats.org/drawingml/2006/picture">
             <wp:extent cx="2880000" cy="1289953"/>
-            <wp:docPr id="2" name="Picture 2"/>
+            <wp:docPr id="3" name="Picture 3"/>
             <wp:cNvGraphicFramePr>
               <a:graphicFrameLocks noChangeAspect="1"/>
             </wp:cNvGraphicFramePr>
@@ -7759,7 +7839,7 @@
                     <pic:cNvPicPr/>
                   </pic:nvPicPr>
                   <pic:blipFill>
-                    <a:blip r:embed="rId10"/>
+                    <a:blip r:embed="rId11"/>
                     <a:stretch>
                       <a:fillRect/>
                     </a:stretch>
@@ -7791,7 +7871,7 @@
           <w:i/>
           <w:sz w:val="20"/>
         </w:rPr>
-        <w:t>Figure 2: Prestige Alliance office location</w:t>
+        <w:t>Figure 3: Prestige Alliance office location</w:t>
       </w:r>
     </w:p>
     <w:p>
@@ -7919,7 +7999,7 @@
         <w:drawing>
           <wp:inline xmlns:a="http://schemas.openxmlformats.org/drawingml/2006/main" xmlns:pic="http://schemas.openxmlformats.org/drawingml/2006/picture">
             <wp:extent cx="2880000" cy="556875"/>
-            <wp:docPr id="3" name="Picture 3"/>
+            <wp:docPr id="4" name="Picture 4"/>
             <wp:cNvGraphicFramePr>
               <a:graphicFrameLocks noChangeAspect="1"/>
             </wp:cNvGraphicFramePr>
@@ -7931,7 +8011,7 @@
                     <pic:cNvPicPr/>
                   </pic:nvPicPr>
                   <pic:blipFill>
-                    <a:blip r:embed="rId11"/>
+                    <a:blip r:embed="rId12"/>
                     <a:stretch>
                       <a:fillRect/>
                     </a:stretch>
@@ -7963,7 +8043,7 @@
           <w:i/>
           <w:sz w:val="20"/>
         </w:rPr>
-        <w:t>Figure 3: Hack The Box platform logo</w:t>
+        <w:t>Figure 4: Hack The Box platform logo</w:t>
       </w:r>
     </w:p>
     <w:p>
@@ -8022,120 +8102,6 @@
           <w:sz w:val="24"/>
         </w:rPr>
         <w:t>2.1 Certified Penetration Testing Specialist (CPTS)</w:t>
-      </w:r>
-    </w:p>
-    <w:p>
-      <w:pPr>
-        <w:ind w:firstLine="0"/>
-        <w:jc w:val="center"/>
-      </w:pPr>
-      <w:r>
-        <w:drawing>
-          <wp:inline xmlns:a="http://schemas.openxmlformats.org/drawingml/2006/main" xmlns:pic="http://schemas.openxmlformats.org/drawingml/2006/picture">
-            <wp:extent cx="2880000" cy="2880000"/>
-            <wp:docPr id="4" name="Picture 4"/>
-            <wp:cNvGraphicFramePr>
-              <a:graphicFrameLocks noChangeAspect="1"/>
-            </wp:cNvGraphicFramePr>
-            <a:graphic>
-              <a:graphicData uri="http://schemas.openxmlformats.org/drawingml/2006/picture">
-                <pic:pic>
-                  <pic:nvPicPr>
-                    <pic:cNvPr id="0" name="cpts_logo.png"/>
-                    <pic:cNvPicPr/>
-                  </pic:nvPicPr>
-                  <pic:blipFill>
-                    <a:blip r:embed="rId12"/>
-                    <a:stretch>
-                      <a:fillRect/>
-                    </a:stretch>
-                  </pic:blipFill>
-                  <pic:spPr>
-                    <a:xfrm>
-                      <a:off x="0" y="0"/>
-                      <a:ext cx="2880000" cy="2880000"/>
-                    </a:xfrm>
-                    <a:prstGeom prst="rect"/>
-                  </pic:spPr>
-                </pic:pic>
-              </a:graphicData>
-            </a:graphic>
-          </wp:inline>
-        </w:drawing>
-      </w:r>
-    </w:p>
-    <w:p>
-      <w:pPr>
-        <w:spacing w:after="240"/>
-        <w:ind w:firstLine="0"/>
-        <w:jc w:val="center"/>
-      </w:pPr>
-      <w:r>
-        <w:rPr>
-          <w:rFonts w:ascii="Times New Roman" w:hAnsi="Times New Roman"/>
-          <w:b w:val="0"/>
-          <w:i/>
-          <w:sz w:val="20"/>
-        </w:rPr>
-        <w:t>Figure 4: HTB Certified Penetration Testing Specialist (CPTS) logo</w:t>
-      </w:r>
-    </w:p>
-    <w:p>
-      <w:pPr>
-        <w:spacing w:line="360" w:lineRule="auto" w:after="120"/>
-        <w:ind w:firstLine="720"/>
-        <w:jc w:val="both"/>
-      </w:pPr>
-      <w:r>
-        <w:rPr>
-          <w:rFonts w:ascii="Times New Roman" w:hAnsi="Times New Roman"/>
-          <w:sz w:val="24"/>
-        </w:rPr>
-        <w:t xml:space="preserve">The </w:t>
-      </w:r>
-      <w:r>
-        <w:rPr>
-          <w:rFonts w:ascii="Times New Roman" w:hAnsi="Times New Roman"/>
-          <w:b/>
-          <w:sz w:val="24"/>
-        </w:rPr>
-        <w:t>Certified Penetration Testing Specialist (CPTS)</w:t>
-      </w:r>
-      <w:r>
-        <w:rPr>
-          <w:rFonts w:ascii="Times New Roman" w:hAnsi="Times New Roman"/>
-          <w:sz w:val="24"/>
-        </w:rPr>
-        <w:t xml:space="preserve"> pathway covers the full penetration testing engagement lifecycle — from information gathering and reconnaissance through network enumeration, web application attacks, privilege escalation, Active Directory exploitation, and professional reporting. The curriculum is structured around real-world methodology rather than abstract theory, covering every phase of the PTES framework applied in this internship.</w:t>
-      </w:r>
-    </w:p>
-    <w:p>
-      <w:pPr>
-        <w:spacing w:line="360" w:lineRule="auto" w:after="120"/>
-        <w:ind w:firstLine="720"/>
-        <w:jc w:val="both"/>
-      </w:pPr>
-      <w:r>
-        <w:rPr>
-          <w:rFonts w:ascii="Times New Roman" w:hAnsi="Times New Roman"/>
-          <w:sz w:val="24"/>
-        </w:rPr>
-        <w:t>Skills developed through CPTS — including DNS enumeration, port scanning interpretation, service fingerprinting, and authentication bypass — were applied directly during the neuralsh.com engagement.</w:t>
-      </w:r>
-    </w:p>
-    <w:p>
-      <w:pPr>
-        <w:pStyle w:val="Heading3"/>
-        <w:jc w:val="left"/>
-      </w:pPr>
-      <w:r>
-        <w:rPr>
-          <w:rFonts w:ascii="Times New Roman" w:hAnsi="Times New Roman"/>
-          <w:b/>
-          <w:i w:val="0"/>
-          <w:sz w:val="24"/>
-        </w:rPr>
-        <w:t>2.2 Certified Web Exploitation Specialist (CWES)</w:t>
       </w:r>
     </w:p>
     <w:p>
@@ -8155,7 +8121,7 @@
               <a:graphicData uri="http://schemas.openxmlformats.org/drawingml/2006/picture">
                 <pic:pic>
                   <pic:nvPicPr>
-                    <pic:cNvPr id="0" name="cwes_logo.png"/>
+                    <pic:cNvPr id="0" name="cpts_logo.png"/>
                     <pic:cNvPicPr/>
                   </pic:nvPicPr>
                   <pic:blipFill>
@@ -8191,7 +8157,7 @@
           <w:i/>
           <w:sz w:val="20"/>
         </w:rPr>
-        <w:t>Figure 5: HTB Certified Web Exploitation Specialist (CWES) logo</w:t>
+        <w:t>Figure 5: HTB Certified Penetration Testing Specialist (CPTS) logo</w:t>
       </w:r>
     </w:p>
     <w:p>
@@ -8213,14 +8179,14 @@
           <w:b/>
           <w:sz w:val="24"/>
         </w:rPr>
-        <w:t>Certified Web Exploitation Specialist (CWES)</w:t>
-      </w:r>
-      <w:r>
-        <w:rPr>
-          <w:rFonts w:ascii="Times New Roman" w:hAnsi="Times New Roman"/>
-          <w:sz w:val="24"/>
-        </w:rPr>
-        <w:t xml:space="preserve"> is an HTB certification focused specifically on web application security and exploitation. It covers the full OWASP Top 10 attack categories in depth, including broken access control, authentication failures, injection vulnerabilities, insecure design, and API security testing — all of which appeared as findings in this engagement.</w:t>
+        <w:t>Certified Penetration Testing Specialist (CPTS)</w:t>
+      </w:r>
+      <w:r>
+        <w:rPr>
+          <w:rFonts w:ascii="Times New Roman" w:hAnsi="Times New Roman"/>
+          <w:sz w:val="24"/>
+        </w:rPr>
+        <w:t xml:space="preserve"> pathway covers the full penetration testing engagement lifecycle — from information gathering and reconnaissance through network enumeration, web application attacks, privilege escalation, Active Directory exploitation, and professional reporting. The curriculum is structured around real-world methodology rather than abstract theory, covering every phase of the PTES framework applied in this internship.</w:t>
       </w:r>
     </w:p>
     <w:p>
@@ -8234,6 +8200,120 @@
           <w:rFonts w:ascii="Times New Roman" w:hAnsi="Times New Roman"/>
           <w:sz w:val="24"/>
         </w:rPr>
+        <w:t>Skills developed through CPTS — including DNS enumeration, port scanning interpretation, service fingerprinting, and authentication bypass — were applied directly during the neuralsh.com engagement.</w:t>
+      </w:r>
+    </w:p>
+    <w:p>
+      <w:pPr>
+        <w:pStyle w:val="Heading3"/>
+        <w:jc w:val="left"/>
+      </w:pPr>
+      <w:r>
+        <w:rPr>
+          <w:rFonts w:ascii="Times New Roman" w:hAnsi="Times New Roman"/>
+          <w:b/>
+          <w:i w:val="0"/>
+          <w:sz w:val="24"/>
+        </w:rPr>
+        <w:t>2.2 Certified Web Exploitation Specialist (CWES)</w:t>
+      </w:r>
+    </w:p>
+    <w:p>
+      <w:pPr>
+        <w:ind w:firstLine="0"/>
+        <w:jc w:val="center"/>
+      </w:pPr>
+      <w:r>
+        <w:drawing>
+          <wp:inline xmlns:a="http://schemas.openxmlformats.org/drawingml/2006/main" xmlns:pic="http://schemas.openxmlformats.org/drawingml/2006/picture">
+            <wp:extent cx="2880000" cy="2880000"/>
+            <wp:docPr id="6" name="Picture 6"/>
+            <wp:cNvGraphicFramePr>
+              <a:graphicFrameLocks noChangeAspect="1"/>
+            </wp:cNvGraphicFramePr>
+            <a:graphic>
+              <a:graphicData uri="http://schemas.openxmlformats.org/drawingml/2006/picture">
+                <pic:pic>
+                  <pic:nvPicPr>
+                    <pic:cNvPr id="0" name="cwes_logo.png"/>
+                    <pic:cNvPicPr/>
+                  </pic:nvPicPr>
+                  <pic:blipFill>
+                    <a:blip r:embed="rId14"/>
+                    <a:stretch>
+                      <a:fillRect/>
+                    </a:stretch>
+                  </pic:blipFill>
+                  <pic:spPr>
+                    <a:xfrm>
+                      <a:off x="0" y="0"/>
+                      <a:ext cx="2880000" cy="2880000"/>
+                    </a:xfrm>
+                    <a:prstGeom prst="rect"/>
+                  </pic:spPr>
+                </pic:pic>
+              </a:graphicData>
+            </a:graphic>
+          </wp:inline>
+        </w:drawing>
+      </w:r>
+    </w:p>
+    <w:p>
+      <w:pPr>
+        <w:spacing w:after="240"/>
+        <w:ind w:firstLine="0"/>
+        <w:jc w:val="center"/>
+      </w:pPr>
+      <w:r>
+        <w:rPr>
+          <w:rFonts w:ascii="Times New Roman" w:hAnsi="Times New Roman"/>
+          <w:b w:val="0"/>
+          <w:i/>
+          <w:sz w:val="20"/>
+        </w:rPr>
+        <w:t>Figure 6: HTB Certified Web Exploitation Specialist (CWES) logo</w:t>
+      </w:r>
+    </w:p>
+    <w:p>
+      <w:pPr>
+        <w:spacing w:line="360" w:lineRule="auto" w:after="120"/>
+        <w:ind w:firstLine="720"/>
+        <w:jc w:val="both"/>
+      </w:pPr>
+      <w:r>
+        <w:rPr>
+          <w:rFonts w:ascii="Times New Roman" w:hAnsi="Times New Roman"/>
+          <w:sz w:val="24"/>
+        </w:rPr>
+        <w:t xml:space="preserve">The </w:t>
+      </w:r>
+      <w:r>
+        <w:rPr>
+          <w:rFonts w:ascii="Times New Roman" w:hAnsi="Times New Roman"/>
+          <w:b/>
+          <w:sz w:val="24"/>
+        </w:rPr>
+        <w:t>Certified Web Exploitation Specialist (CWES)</w:t>
+      </w:r>
+      <w:r>
+        <w:rPr>
+          <w:rFonts w:ascii="Times New Roman" w:hAnsi="Times New Roman"/>
+          <w:sz w:val="24"/>
+        </w:rPr>
+        <w:t xml:space="preserve"> is an HTB certification focused specifically on web application security and exploitation. It covers the full OWASP Top 10 attack categories in depth, including broken access control, authentication failures, injection vulnerabilities, insecure design, and API security testing — all of which appeared as findings in this engagement.</w:t>
+      </w:r>
+    </w:p>
+    <w:p>
+      <w:pPr>
+        <w:spacing w:line="360" w:lineRule="auto" w:after="120"/>
+        <w:ind w:firstLine="720"/>
+        <w:jc w:val="both"/>
+      </w:pPr>
+      <w:r>
+        <w:rPr>
+          <w:rFonts w:ascii="Times New Roman" w:hAnsi="Times New Roman"/>
+          <w:sz w:val="24"/>
+        </w:rPr>
         <w:t>CWES is particularly relevant to the neuralsh.com assessment because the target is a web application with an API-driven architecture. Skills from the CWES pathway — including JWT analysis, rate-limiting bypass techniques, API endpoint enumeration via JavaScript bundle inspection, and authentication flow exploitation — directly informed the discovery and exploitation of findings N-005 (Rate Limit Bypass) and N-007 (JWT Token Farming), both of which were confirmed exploited during this engagement.</w:t>
       </w:r>
     </w:p>
@@ -8290,7 +8370,7 @@
         <w:drawing>
           <wp:inline xmlns:a="http://schemas.openxmlformats.org/drawingml/2006/main" xmlns:pic="http://schemas.openxmlformats.org/drawingml/2006/picture">
             <wp:extent cx="2880000" cy="1346264"/>
-            <wp:docPr id="6" name="Picture 6"/>
+            <wp:docPr id="7" name="Picture 7"/>
             <wp:cNvGraphicFramePr>
               <a:graphicFrameLocks noChangeAspect="1"/>
             </wp:cNvGraphicFramePr>
@@ -8302,7 +8382,7 @@
                     <pic:cNvPicPr/>
                   </pic:nvPicPr>
                   <pic:blipFill>
-                    <a:blip r:embed="rId14"/>
+                    <a:blip r:embed="rId15"/>
                     <a:stretch>
                       <a:fillRect/>
                     </a:stretch>
@@ -8334,7 +8414,7 @@
           <w:i/>
           <w:sz w:val="20"/>
         </w:rPr>
-        <w:t>Figure 6: Penetration testing process diagram</w:t>
+        <w:t>Figure 7: Penetration testing process diagram</w:t>
       </w:r>
     </w:p>
     <w:p>
@@ -8564,7 +8644,7 @@
         <w:drawing>
           <wp:inline xmlns:a="http://schemas.openxmlformats.org/drawingml/2006/main" xmlns:pic="http://schemas.openxmlformats.org/drawingml/2006/picture">
             <wp:extent cx="2880000" cy="997795"/>
-            <wp:docPr id="7" name="Picture 7"/>
+            <wp:docPr id="8" name="Picture 8"/>
             <wp:cNvGraphicFramePr>
               <a:graphicFrameLocks noChangeAspect="1"/>
             </wp:cNvGraphicFramePr>
@@ -8576,7 +8656,7 @@
                     <pic:cNvPicPr/>
                   </pic:nvPicPr>
                   <pic:blipFill>
-                    <a:blip r:embed="rId15"/>
+                    <a:blip r:embed="rId16"/>
                     <a:stretch>
                       <a:fillRect/>
                     </a:stretch>
@@ -8608,7 +8688,7 @@
           <w:i/>
           <w:sz w:val="20"/>
         </w:rPr>
-        <w:t>Figure 7: OWASP (Open Web Application Security Project) logo</w:t>
+        <w:t>Figure 8: OWASP (Open Web Application Security Project) logo</w:t>
       </w:r>
     </w:p>
     <w:p>
@@ -9347,7 +9427,7 @@
         <w:drawing>
           <wp:inline xmlns:a="http://schemas.openxmlformats.org/drawingml/2006/main" xmlns:pic="http://schemas.openxmlformats.org/drawingml/2006/picture">
             <wp:extent cx="2880000" cy="759750"/>
-            <wp:docPr id="8" name="Picture 8"/>
+            <wp:docPr id="9" name="Picture 9"/>
             <wp:cNvGraphicFramePr>
               <a:graphicFrameLocks noChangeAspect="1"/>
             </wp:cNvGraphicFramePr>
@@ -9359,7 +9439,7 @@
                     <pic:cNvPicPr/>
                   </pic:nvPicPr>
                   <pic:blipFill>
-                    <a:blip r:embed="rId16"/>
+                    <a:blip r:embed="rId17"/>
                     <a:stretch>
                       <a:fillRect/>
                     </a:stretch>
@@ -9391,7 +9471,7 @@
           <w:i/>
           <w:sz w:val="20"/>
         </w:rPr>
-        <w:t>Figure 8: NIST SP 800-115 logo</w:t>
+        <w:t>Figure 9: NIST SP 800-115 logo</w:t>
       </w:r>
     </w:p>
     <w:p>
@@ -9440,7 +9520,7 @@
         <w:drawing>
           <wp:inline xmlns:a="http://schemas.openxmlformats.org/drawingml/2006/main" xmlns:pic="http://schemas.openxmlformats.org/drawingml/2006/picture">
             <wp:extent cx="2880000" cy="1558032"/>
-            <wp:docPr id="9" name="Picture 9"/>
+            <wp:docPr id="10" name="Picture 10"/>
             <wp:cNvGraphicFramePr>
               <a:graphicFrameLocks noChangeAspect="1"/>
             </wp:cNvGraphicFramePr>
@@ -9452,7 +9532,7 @@
                     <pic:cNvPicPr/>
                   </pic:nvPicPr>
                   <pic:blipFill>
-                    <a:blip r:embed="rId17"/>
+                    <a:blip r:embed="rId18"/>
                     <a:stretch>
                       <a:fillRect/>
                     </a:stretch>
@@ -9484,7 +9564,7 @@
           <w:i/>
           <w:sz w:val="20"/>
         </w:rPr>
-        <w:t>Figure 9: CVSS v3.1 scoring system logo</w:t>
+        <w:t>Figure 10: CVSS v3.1 scoring system logo</w:t>
       </w:r>
     </w:p>
     <w:p>
@@ -10391,7 +10471,7 @@
         <w:drawing>
           <wp:inline xmlns:a="http://schemas.openxmlformats.org/drawingml/2006/main" xmlns:pic="http://schemas.openxmlformats.org/drawingml/2006/picture">
             <wp:extent cx="2880000" cy="2880000"/>
-            <wp:docPr id="10" name="Picture 10"/>
+            <wp:docPr id="11" name="Picture 11"/>
             <wp:cNvGraphicFramePr>
               <a:graphicFrameLocks noChangeAspect="1"/>
             </wp:cNvGraphicFramePr>
@@ -10400,84 +10480,6 @@
                 <pic:pic>
                   <pic:nvPicPr>
                     <pic:cNvPr id="0" name="nmap_logo.png"/>
-                    <pic:cNvPicPr/>
-                  </pic:nvPicPr>
-                  <pic:blipFill>
-                    <a:blip r:embed="rId18"/>
-                    <a:stretch>
-                      <a:fillRect/>
-                    </a:stretch>
-                  </pic:blipFill>
-                  <pic:spPr>
-                    <a:xfrm>
-                      <a:off x="0" y="0"/>
-                      <a:ext cx="2880000" cy="2880000"/>
-                    </a:xfrm>
-                    <a:prstGeom prst="rect"/>
-                  </pic:spPr>
-                </pic:pic>
-              </a:graphicData>
-            </a:graphic>
-          </wp:inline>
-        </w:drawing>
-      </w:r>
-    </w:p>
-    <w:p>
-      <w:pPr>
-        <w:spacing w:after="240"/>
-        <w:ind w:firstLine="0"/>
-        <w:jc w:val="center"/>
-      </w:pPr>
-      <w:r>
-        <w:rPr>
-          <w:rFonts w:ascii="Times New Roman" w:hAnsi="Times New Roman"/>
-          <w:b w:val="0"/>
-          <w:i/>
-          <w:sz w:val="20"/>
-        </w:rPr>
-        <w:t>Figure 10: Nmap network scanner logo</w:t>
-      </w:r>
-    </w:p>
-    <w:p>
-      <w:pPr>
-        <w:spacing w:line="360" w:lineRule="auto" w:after="120"/>
-        <w:ind w:firstLine="720"/>
-        <w:jc w:val="both"/>
-      </w:pPr>
-      <w:r>
-        <w:rPr>
-          <w:rFonts w:ascii="Times New Roman" w:hAnsi="Times New Roman"/>
-          <w:b/>
-          <w:sz w:val="24"/>
-        </w:rPr>
-        <w:t>Nmap</w:t>
-      </w:r>
-      <w:r>
-        <w:rPr>
-          <w:rFonts w:ascii="Times New Roman" w:hAnsi="Times New Roman"/>
-          <w:sz w:val="24"/>
-        </w:rPr>
-        <w:t xml:space="preserve"> (Network Mapper) is the industry-standard open-source tool for network discovery and service fingerprinting. A full TCP scan with service version detection against the origin server revealed that 103.16.xx.xxx had 23 ports open and reachable from the public internet — including administrative interfaces that should never be exposed. This single scan produced the evidence base for Critical findings N-001, N-002, N-013, and N-014.</w:t>
-      </w:r>
-    </w:p>
-    <w:p>
-      <w:pPr>
-        <w:ind w:firstLine="0"/>
-        <w:jc w:val="center"/>
-      </w:pPr>
-      <w:r>
-        <w:drawing>
-          <wp:inline xmlns:a="http://schemas.openxmlformats.org/drawingml/2006/main" xmlns:pic="http://schemas.openxmlformats.org/drawingml/2006/picture">
-            <wp:extent cx="2880000" cy="2880000"/>
-            <wp:docPr id="11" name="Picture 11"/>
-            <wp:cNvGraphicFramePr>
-              <a:graphicFrameLocks noChangeAspect="1"/>
-            </wp:cNvGraphicFramePr>
-            <a:graphic>
-              <a:graphicData uri="http://schemas.openxmlformats.org/drawingml/2006/picture">
-                <pic:pic>
-                  <pic:nvPicPr>
-                    <pic:cNvPr id="0" name="nikto_logo_fixed.png"/>
                     <pic:cNvPicPr/>
                   </pic:nvPicPr>
                   <pic:blipFill>
@@ -10513,7 +10515,7 @@
           <w:i/>
           <w:sz w:val="20"/>
         </w:rPr>
-        <w:t>Figure 11: Nikto web server scanner logo</w:t>
+        <w:t>Figure 11: Nmap network scanner logo</w:t>
       </w:r>
     </w:p>
     <w:p>
@@ -10528,6 +10530,84 @@
           <w:b/>
           <w:sz w:val="24"/>
         </w:rPr>
+        <w:t>Nmap</w:t>
+      </w:r>
+      <w:r>
+        <w:rPr>
+          <w:rFonts w:ascii="Times New Roman" w:hAnsi="Times New Roman"/>
+          <w:sz w:val="24"/>
+        </w:rPr>
+        <w:t xml:space="preserve"> (Network Mapper) is the industry-standard open-source tool for network discovery and service fingerprinting. A full TCP scan with service version detection against the origin server revealed that 103.16.xx.xxx had 23 ports open and reachable from the public internet — including administrative interfaces that should never be exposed. This single scan produced the evidence base for Critical findings N-001, N-002, N-013, and N-014.</w:t>
+      </w:r>
+    </w:p>
+    <w:p>
+      <w:pPr>
+        <w:ind w:firstLine="0"/>
+        <w:jc w:val="center"/>
+      </w:pPr>
+      <w:r>
+        <w:drawing>
+          <wp:inline xmlns:a="http://schemas.openxmlformats.org/drawingml/2006/main" xmlns:pic="http://schemas.openxmlformats.org/drawingml/2006/picture">
+            <wp:extent cx="2880000" cy="2880000"/>
+            <wp:docPr id="12" name="Picture 12"/>
+            <wp:cNvGraphicFramePr>
+              <a:graphicFrameLocks noChangeAspect="1"/>
+            </wp:cNvGraphicFramePr>
+            <a:graphic>
+              <a:graphicData uri="http://schemas.openxmlformats.org/drawingml/2006/picture">
+                <pic:pic>
+                  <pic:nvPicPr>
+                    <pic:cNvPr id="0" name="nikto_logo_fixed.png"/>
+                    <pic:cNvPicPr/>
+                  </pic:nvPicPr>
+                  <pic:blipFill>
+                    <a:blip r:embed="rId20"/>
+                    <a:stretch>
+                      <a:fillRect/>
+                    </a:stretch>
+                  </pic:blipFill>
+                  <pic:spPr>
+                    <a:xfrm>
+                      <a:off x="0" y="0"/>
+                      <a:ext cx="2880000" cy="2880000"/>
+                    </a:xfrm>
+                    <a:prstGeom prst="rect"/>
+                  </pic:spPr>
+                </pic:pic>
+              </a:graphicData>
+            </a:graphic>
+          </wp:inline>
+        </w:drawing>
+      </w:r>
+    </w:p>
+    <w:p>
+      <w:pPr>
+        <w:spacing w:after="240"/>
+        <w:ind w:firstLine="0"/>
+        <w:jc w:val="center"/>
+      </w:pPr>
+      <w:r>
+        <w:rPr>
+          <w:rFonts w:ascii="Times New Roman" w:hAnsi="Times New Roman"/>
+          <w:b w:val="0"/>
+          <w:i/>
+          <w:sz w:val="20"/>
+        </w:rPr>
+        <w:t>Figure 12: Nikto web server scanner logo</w:t>
+      </w:r>
+    </w:p>
+    <w:p>
+      <w:pPr>
+        <w:spacing w:line="360" w:lineRule="auto" w:after="120"/>
+        <w:ind w:firstLine="720"/>
+        <w:jc w:val="both"/>
+      </w:pPr>
+      <w:r>
+        <w:rPr>
+          <w:rFonts w:ascii="Times New Roman" w:hAnsi="Times New Roman"/>
+          <w:b/>
+          <w:sz w:val="24"/>
+        </w:rPr>
         <w:t>Nikto</w:t>
       </w:r>
       <w:r>
@@ -10547,7 +10627,7 @@
         <w:drawing>
           <wp:inline xmlns:a="http://schemas.openxmlformats.org/drawingml/2006/main" xmlns:pic="http://schemas.openxmlformats.org/drawingml/2006/picture">
             <wp:extent cx="2880000" cy="853554"/>
-            <wp:docPr id="12" name="Picture 12"/>
+            <wp:docPr id="13" name="Picture 13"/>
             <wp:cNvGraphicFramePr>
               <a:graphicFrameLocks noChangeAspect="1"/>
             </wp:cNvGraphicFramePr>
@@ -10559,7 +10639,7 @@
                     <pic:cNvPicPr/>
                   </pic:nvPicPr>
                   <pic:blipFill>
-                    <a:blip r:embed="rId20"/>
+                    <a:blip r:embed="rId21"/>
                     <a:stretch>
                       <a:fillRect/>
                     </a:stretch>
@@ -10591,7 +10671,7 @@
           <w:i/>
           <w:sz w:val="20"/>
         </w:rPr>
-        <w:t>Figure 12: Shodan internet-connected device search engine logo</w:t>
+        <w:t>Figure 13: Shodan internet-connected device search engine logo</w:t>
       </w:r>
     </w:p>
     <w:p>
@@ -11147,7 +11227,7 @@
         <w:drawing>
           <wp:inline xmlns:a="http://schemas.openxmlformats.org/drawingml/2006/main" xmlns:pic="http://schemas.openxmlformats.org/drawingml/2006/picture">
             <wp:extent cx="2880000" cy="1444543"/>
-            <wp:docPr id="13" name="Picture 13"/>
+            <wp:docPr id="14" name="Picture 14"/>
             <wp:cNvGraphicFramePr>
               <a:graphicFrameLocks noChangeAspect="1"/>
             </wp:cNvGraphicFramePr>
@@ -11159,7 +11239,7 @@
                     <pic:cNvPicPr/>
                   </pic:nvPicPr>
                   <pic:blipFill>
-                    <a:blip r:embed="rId21"/>
+                    <a:blip r:embed="rId22"/>
                     <a:stretch>
                       <a:fillRect/>
                     </a:stretch>
@@ -11191,7 +11271,7 @@
           <w:i/>
           <w:sz w:val="20"/>
         </w:rPr>
-        <w:t>Figure 13: Burp Suite Community Edition logo</w:t>
+        <w:t>Figure 14: Burp Suite Community Edition logo</w:t>
       </w:r>
     </w:p>
     <w:p>
@@ -11225,7 +11305,7 @@
         <w:drawing>
           <wp:inline xmlns:a="http://schemas.openxmlformats.org/drawingml/2006/main" xmlns:pic="http://schemas.openxmlformats.org/drawingml/2006/picture">
             <wp:extent cx="2880000" cy="1237333"/>
-            <wp:docPr id="14" name="Picture 14"/>
+            <wp:docPr id="15" name="Picture 15"/>
             <wp:cNvGraphicFramePr>
               <a:graphicFrameLocks noChangeAspect="1"/>
             </wp:cNvGraphicFramePr>
@@ -11237,7 +11317,7 @@
                     <pic:cNvPicPr/>
                   </pic:nvPicPr>
                   <pic:blipFill>
-                    <a:blip r:embed="rId22"/>
+                    <a:blip r:embed="rId23"/>
                     <a:stretch>
                       <a:fillRect/>
                     </a:stretch>
@@ -11269,7 +11349,7 @@
           <w:i/>
           <w:sz w:val="20"/>
         </w:rPr>
-        <w:t>Figure 14: CyberChef data analysis tool logo</w:t>
+        <w:t>Figure 15: CyberChef data analysis tool logo</w:t>
       </w:r>
     </w:p>
     <w:p>
@@ -11346,7 +11426,7 @@
         <w:drawing>
           <wp:inline xmlns:a="http://schemas.openxmlformats.org/drawingml/2006/main" xmlns:pic="http://schemas.openxmlformats.org/drawingml/2006/picture">
             <wp:extent cx="2880000" cy="617567"/>
-            <wp:docPr id="15" name="Picture 15"/>
+            <wp:docPr id="16" name="Picture 16"/>
             <wp:cNvGraphicFramePr>
               <a:graphicFrameLocks noChangeAspect="1"/>
             </wp:cNvGraphicFramePr>
@@ -11358,7 +11438,7 @@
                     <pic:cNvPicPr/>
                   </pic:nvPicPr>
                   <pic:blipFill>
-                    <a:blip r:embed="rId23"/>
+                    <a:blip r:embed="rId24"/>
                     <a:stretch>
                       <a:fillRect/>
                     </a:stretch>
@@ -11390,7 +11470,7 @@
           <w:i/>
           <w:sz w:val="20"/>
         </w:rPr>
-        <w:t>Figure 15: Claude (Anthropic) AI assistant logo</w:t>
+        <w:t>Figure 16: Claude (Anthropic) AI assistant logo</w:t>
       </w:r>
     </w:p>
     <w:p>
@@ -12006,7 +12086,7 @@
         <w:drawing>
           <wp:inline xmlns:a="http://schemas.openxmlformats.org/drawingml/2006/main" xmlns:pic="http://schemas.openxmlformats.org/drawingml/2006/picture">
             <wp:extent cx="5040000" cy="2834611"/>
-            <wp:docPr id="16" name="Picture 16"/>
+            <wp:docPr id="17" name="Picture 17"/>
             <wp:cNvGraphicFramePr>
               <a:graphicFrameLocks noChangeAspect="1"/>
             </wp:cNvGraphicFramePr>
@@ -12018,7 +12098,7 @@
                     <pic:cNvPicPr/>
                   </pic:nvPicPr>
                   <pic:blipFill>
-                    <a:blip r:embed="rId24"/>
+                    <a:blip r:embed="rId25"/>
                     <a:stretch>
                       <a:fillRect/>
                     </a:stretch>
@@ -12125,7 +12205,7 @@
         <w:drawing>
           <wp:inline xmlns:a="http://schemas.openxmlformats.org/drawingml/2006/main" xmlns:pic="http://schemas.openxmlformats.org/drawingml/2006/picture">
             <wp:extent cx="5040000" cy="2074577"/>
-            <wp:docPr id="17" name="Picture 17"/>
+            <wp:docPr id="18" name="Picture 18"/>
             <wp:cNvGraphicFramePr>
               <a:graphicFrameLocks noChangeAspect="1"/>
             </wp:cNvGraphicFramePr>
@@ -12137,7 +12217,7 @@
                     <pic:cNvPicPr/>
                   </pic:nvPicPr>
                   <pic:blipFill>
-                    <a:blip r:embed="rId25"/>
+                    <a:blip r:embed="rId26"/>
                     <a:stretch>
                       <a:fillRect/>
                     </a:stretch>
@@ -12266,7 +12346,7 @@
         <w:drawing>
           <wp:inline xmlns:a="http://schemas.openxmlformats.org/drawingml/2006/main" xmlns:pic="http://schemas.openxmlformats.org/drawingml/2006/picture">
             <wp:extent cx="5040000" cy="1442824"/>
-            <wp:docPr id="18" name="Picture 18"/>
+            <wp:docPr id="19" name="Picture 19"/>
             <wp:cNvGraphicFramePr>
               <a:graphicFrameLocks noChangeAspect="1"/>
             </wp:cNvGraphicFramePr>
@@ -12278,7 +12358,7 @@
                     <pic:cNvPicPr/>
                   </pic:nvPicPr>
                   <pic:blipFill>
-                    <a:blip r:embed="rId26"/>
+                    <a:blip r:embed="rId27"/>
                     <a:stretch>
                       <a:fillRect/>
                     </a:stretch>
@@ -12359,7 +12439,7 @@
         <w:drawing>
           <wp:inline xmlns:a="http://schemas.openxmlformats.org/drawingml/2006/main" xmlns:pic="http://schemas.openxmlformats.org/drawingml/2006/picture">
             <wp:extent cx="5040000" cy="2644151"/>
-            <wp:docPr id="19" name="Picture 19"/>
+            <wp:docPr id="20" name="Picture 20"/>
             <wp:cNvGraphicFramePr>
               <a:graphicFrameLocks noChangeAspect="1"/>
             </wp:cNvGraphicFramePr>
@@ -12371,7 +12451,7 @@
                     <pic:cNvPicPr/>
                   </pic:nvPicPr>
                   <pic:blipFill>
-                    <a:blip r:embed="rId27"/>
+                    <a:blip r:embed="rId28"/>
                     <a:stretch>
                       <a:fillRect/>
                     </a:stretch>
@@ -13296,7 +13376,7 @@
         <w:drawing>
           <wp:inline xmlns:a="http://schemas.openxmlformats.org/drawingml/2006/main" xmlns:pic="http://schemas.openxmlformats.org/drawingml/2006/picture">
             <wp:extent cx="5040000" cy="3081560"/>
-            <wp:docPr id="20" name="Picture 20"/>
+            <wp:docPr id="21" name="Picture 21"/>
             <wp:cNvGraphicFramePr>
               <a:graphicFrameLocks noChangeAspect="1"/>
             </wp:cNvGraphicFramePr>
@@ -13308,7 +13388,7 @@
                     <pic:cNvPicPr/>
                   </pic:nvPicPr>
                   <pic:blipFill>
-                    <a:blip r:embed="rId28"/>
+                    <a:blip r:embed="rId29"/>
                     <a:stretch>
                       <a:fillRect/>
                     </a:stretch>
@@ -13426,7 +13506,7 @@
         <w:drawing>
           <wp:inline xmlns:a="http://schemas.openxmlformats.org/drawingml/2006/main" xmlns:pic="http://schemas.openxmlformats.org/drawingml/2006/picture">
             <wp:extent cx="5040000" cy="5693333"/>
-            <wp:docPr id="21" name="Picture 21"/>
+            <wp:docPr id="22" name="Picture 22"/>
             <wp:cNvGraphicFramePr>
               <a:graphicFrameLocks noChangeAspect="1"/>
             </wp:cNvGraphicFramePr>
@@ -13438,7 +13518,7 @@
                     <pic:cNvPicPr/>
                   </pic:nvPicPr>
                   <pic:blipFill>
-                    <a:blip r:embed="rId29"/>
+                    <a:blip r:embed="rId30"/>
                     <a:stretch>
                       <a:fillRect/>
                     </a:stretch>
@@ -13543,7 +13623,7 @@
         <w:drawing>
           <wp:inline xmlns:a="http://schemas.openxmlformats.org/drawingml/2006/main" xmlns:pic="http://schemas.openxmlformats.org/drawingml/2006/picture">
             <wp:extent cx="5040000" cy="1859568"/>
-            <wp:docPr id="22" name="Picture 22"/>
+            <wp:docPr id="23" name="Picture 23"/>
             <wp:cNvGraphicFramePr>
               <a:graphicFrameLocks noChangeAspect="1"/>
             </wp:cNvGraphicFramePr>
@@ -13555,7 +13635,7 @@
                     <pic:cNvPicPr/>
                   </pic:nvPicPr>
                   <pic:blipFill>
-                    <a:blip r:embed="rId30"/>
+                    <a:blip r:embed="rId31"/>
                     <a:stretch>
                       <a:fillRect/>
                     </a:stretch>
@@ -13641,7 +13721,7 @@
         <w:drawing>
           <wp:inline xmlns:a="http://schemas.openxmlformats.org/drawingml/2006/main" xmlns:pic="http://schemas.openxmlformats.org/drawingml/2006/picture">
             <wp:extent cx="5040000" cy="806400"/>
-            <wp:docPr id="23" name="Picture 23"/>
+            <wp:docPr id="24" name="Picture 24"/>
             <wp:cNvGraphicFramePr>
               <a:graphicFrameLocks noChangeAspect="1"/>
             </wp:cNvGraphicFramePr>
@@ -13653,7 +13733,7 @@
                     <pic:cNvPicPr/>
                   </pic:nvPicPr>
                   <pic:blipFill>
-                    <a:blip r:embed="rId31"/>
+                    <a:blip r:embed="rId32"/>
                     <a:stretch>
                       <a:fillRect/>
                     </a:stretch>
@@ -13991,7 +14071,7 @@
         <w:drawing>
           <wp:inline xmlns:a="http://schemas.openxmlformats.org/drawingml/2006/main" xmlns:pic="http://schemas.openxmlformats.org/drawingml/2006/picture">
             <wp:extent cx="5040000" cy="3908898"/>
-            <wp:docPr id="24" name="Picture 24"/>
+            <wp:docPr id="25" name="Picture 25"/>
             <wp:cNvGraphicFramePr>
               <a:graphicFrameLocks noChangeAspect="1"/>
             </wp:cNvGraphicFramePr>
@@ -14003,7 +14083,7 @@
                     <pic:cNvPicPr/>
                   </pic:nvPicPr>
                   <pic:blipFill>
-                    <a:blip r:embed="rId32"/>
+                    <a:blip r:embed="rId33"/>
                     <a:stretch>
                       <a:fillRect/>
                     </a:stretch>
@@ -14190,7 +14270,7 @@
         <w:drawing>
           <wp:inline xmlns:a="http://schemas.openxmlformats.org/drawingml/2006/main" xmlns:pic="http://schemas.openxmlformats.org/drawingml/2006/picture">
             <wp:extent cx="5040000" cy="597736"/>
-            <wp:docPr id="25" name="Picture 25"/>
+            <wp:docPr id="26" name="Picture 26"/>
             <wp:cNvGraphicFramePr>
               <a:graphicFrameLocks noChangeAspect="1"/>
             </wp:cNvGraphicFramePr>
@@ -14202,7 +14282,7 @@
                     <pic:cNvPicPr/>
                   </pic:nvPicPr>
                   <pic:blipFill>
-                    <a:blip r:embed="rId33"/>
+                    <a:blip r:embed="rId34"/>
                     <a:stretch>
                       <a:fillRect/>
                     </a:stretch>
@@ -14246,7 +14326,7 @@
         <w:drawing>
           <wp:inline xmlns:a="http://schemas.openxmlformats.org/drawingml/2006/main" xmlns:pic="http://schemas.openxmlformats.org/drawingml/2006/picture">
             <wp:extent cx="5040000" cy="1315624"/>
-            <wp:docPr id="26" name="Picture 26"/>
+            <wp:docPr id="27" name="Picture 27"/>
             <wp:cNvGraphicFramePr>
               <a:graphicFrameLocks noChangeAspect="1"/>
             </wp:cNvGraphicFramePr>
@@ -14258,7 +14338,7 @@
                     <pic:cNvPicPr/>
                   </pic:nvPicPr>
                   <pic:blipFill>
-                    <a:blip r:embed="rId34"/>
+                    <a:blip r:embed="rId35"/>
                     <a:stretch>
                       <a:fillRect/>
                     </a:stretch>
@@ -14330,7 +14410,7 @@
         <w:drawing>
           <wp:inline xmlns:a="http://schemas.openxmlformats.org/drawingml/2006/main" xmlns:pic="http://schemas.openxmlformats.org/drawingml/2006/picture">
             <wp:extent cx="5040000" cy="1747470"/>
-            <wp:docPr id="27" name="Picture 27"/>
+            <wp:docPr id="28" name="Picture 28"/>
             <wp:cNvGraphicFramePr>
               <a:graphicFrameLocks noChangeAspect="1"/>
             </wp:cNvGraphicFramePr>
@@ -14342,7 +14422,7 @@
                     <pic:cNvPicPr/>
                   </pic:nvPicPr>
                   <pic:blipFill>
-                    <a:blip r:embed="rId35"/>
+                    <a:blip r:embed="rId36"/>
                     <a:stretch>
                       <a:fillRect/>
                     </a:stretch>
@@ -14456,7 +14536,7 @@
         <w:drawing>
           <wp:inline xmlns:a="http://schemas.openxmlformats.org/drawingml/2006/main" xmlns:pic="http://schemas.openxmlformats.org/drawingml/2006/picture">
             <wp:extent cx="5040000" cy="1240276"/>
-            <wp:docPr id="28" name="Picture 28"/>
+            <wp:docPr id="29" name="Picture 29"/>
             <wp:cNvGraphicFramePr>
               <a:graphicFrameLocks noChangeAspect="1"/>
             </wp:cNvGraphicFramePr>
@@ -14468,7 +14548,7 @@
                     <pic:cNvPicPr/>
                   </pic:nvPicPr>
                   <pic:blipFill>
-                    <a:blip r:embed="rId36"/>
+                    <a:blip r:embed="rId37"/>
                     <a:stretch>
                       <a:fillRect/>
                     </a:stretch>
@@ -15317,7 +15397,7 @@
         <w:drawing>
           <wp:inline xmlns:a="http://schemas.openxmlformats.org/drawingml/2006/main" xmlns:pic="http://schemas.openxmlformats.org/drawingml/2006/picture">
             <wp:extent cx="5040000" cy="2665321"/>
-            <wp:docPr id="29" name="Picture 29"/>
+            <wp:docPr id="30" name="Picture 30"/>
             <wp:cNvGraphicFramePr>
               <a:graphicFrameLocks noChangeAspect="1"/>
             </wp:cNvGraphicFramePr>
@@ -15329,7 +15409,7 @@
                     <pic:cNvPicPr/>
                   </pic:nvPicPr>
                   <pic:blipFill>
-                    <a:blip r:embed="rId37"/>
+                    <a:blip r:embed="rId38"/>
                     <a:stretch>
                       <a:fillRect/>
                     </a:stretch>
@@ -15765,7 +15845,7 @@
         <w:drawing>
           <wp:inline xmlns:a="http://schemas.openxmlformats.org/drawingml/2006/main" xmlns:pic="http://schemas.openxmlformats.org/drawingml/2006/picture">
             <wp:extent cx="5040000" cy="2168250"/>
-            <wp:docPr id="30" name="Picture 30"/>
+            <wp:docPr id="31" name="Picture 31"/>
             <wp:cNvGraphicFramePr>
               <a:graphicFrameLocks noChangeAspect="1"/>
             </wp:cNvGraphicFramePr>
@@ -15777,7 +15857,7 @@
                     <pic:cNvPicPr/>
                   </pic:nvPicPr>
                   <pic:blipFill>
-                    <a:blip r:embed="rId38"/>
+                    <a:blip r:embed="rId39"/>
                     <a:stretch>
                       <a:fillRect/>
                     </a:stretch>
@@ -15919,7 +15999,7 @@
         <w:drawing>
           <wp:inline xmlns:a="http://schemas.openxmlformats.org/drawingml/2006/main" xmlns:pic="http://schemas.openxmlformats.org/drawingml/2006/picture">
             <wp:extent cx="5040000" cy="998595"/>
-            <wp:docPr id="31" name="Picture 31"/>
+            <wp:docPr id="32" name="Picture 32"/>
             <wp:cNvGraphicFramePr>
               <a:graphicFrameLocks noChangeAspect="1"/>
             </wp:cNvGraphicFramePr>
@@ -15931,7 +16011,7 @@
                     <pic:cNvPicPr/>
                   </pic:nvPicPr>
                   <pic:blipFill>
-                    <a:blip r:embed="rId39"/>
+                    <a:blip r:embed="rId40"/>
                     <a:stretch>
                       <a:fillRect/>
                     </a:stretch>
@@ -16740,7 +16820,7 @@
         <w:drawing>
           <wp:inline xmlns:a="http://schemas.openxmlformats.org/drawingml/2006/main" xmlns:pic="http://schemas.openxmlformats.org/drawingml/2006/picture">
             <wp:extent cx="5040000" cy="2651937"/>
-            <wp:docPr id="32" name="Picture 32"/>
+            <wp:docPr id="33" name="Picture 33"/>
             <wp:cNvGraphicFramePr>
               <a:graphicFrameLocks noChangeAspect="1"/>
             </wp:cNvGraphicFramePr>
@@ -16752,7 +16832,7 @@
                     <pic:cNvPicPr/>
                   </pic:nvPicPr>
                   <pic:blipFill>
-                    <a:blip r:embed="rId40"/>
+                    <a:blip r:embed="rId41"/>
                     <a:stretch>
                       <a:fillRect/>
                     </a:stretch>
@@ -16853,7 +16933,7 @@
         <w:drawing>
           <wp:inline xmlns:a="http://schemas.openxmlformats.org/drawingml/2006/main" xmlns:pic="http://schemas.openxmlformats.org/drawingml/2006/picture">
             <wp:extent cx="5040000" cy="2633487"/>
-            <wp:docPr id="33" name="Picture 33"/>
+            <wp:docPr id="34" name="Picture 34"/>
             <wp:cNvGraphicFramePr>
               <a:graphicFrameLocks noChangeAspect="1"/>
             </wp:cNvGraphicFramePr>
@@ -16865,7 +16945,7 @@
                     <pic:cNvPicPr/>
                   </pic:nvPicPr>
                   <pic:blipFill>
-                    <a:blip r:embed="rId41"/>
+                    <a:blip r:embed="rId42"/>
                     <a:stretch>
                       <a:fillRect/>
                     </a:stretch>
@@ -16967,7 +17047,7 @@
         <w:drawing>
           <wp:inline xmlns:a="http://schemas.openxmlformats.org/drawingml/2006/main" xmlns:pic="http://schemas.openxmlformats.org/drawingml/2006/picture">
             <wp:extent cx="5040000" cy="889412"/>
-            <wp:docPr id="34" name="Picture 34"/>
+            <wp:docPr id="35" name="Picture 35"/>
             <wp:cNvGraphicFramePr>
               <a:graphicFrameLocks noChangeAspect="1"/>
             </wp:cNvGraphicFramePr>
@@ -16979,7 +17059,7 @@
                     <pic:cNvPicPr/>
                   </pic:nvPicPr>
                   <pic:blipFill>
-                    <a:blip r:embed="rId42"/>
+                    <a:blip r:embed="rId43"/>
                     <a:stretch>
                       <a:fillRect/>
                     </a:stretch>
@@ -17066,7 +17146,7 @@
         <w:drawing>
           <wp:inline xmlns:a="http://schemas.openxmlformats.org/drawingml/2006/main" xmlns:pic="http://schemas.openxmlformats.org/drawingml/2006/picture">
             <wp:extent cx="5040000" cy="2583063"/>
-            <wp:docPr id="35" name="Picture 35"/>
+            <wp:docPr id="36" name="Picture 36"/>
             <wp:cNvGraphicFramePr>
               <a:graphicFrameLocks noChangeAspect="1"/>
             </wp:cNvGraphicFramePr>
@@ -17078,7 +17158,7 @@
                     <pic:cNvPicPr/>
                   </pic:nvPicPr>
                   <pic:blipFill>
-                    <a:blip r:embed="rId43"/>
+                    <a:blip r:embed="rId44"/>
                     <a:stretch>
                       <a:fillRect/>
                     </a:stretch>
@@ -17122,7 +17202,7 @@
         <w:drawing>
           <wp:inline xmlns:a="http://schemas.openxmlformats.org/drawingml/2006/main" xmlns:pic="http://schemas.openxmlformats.org/drawingml/2006/picture">
             <wp:extent cx="5040000" cy="2313134"/>
-            <wp:docPr id="36" name="Picture 36"/>
+            <wp:docPr id="37" name="Picture 37"/>
             <wp:cNvGraphicFramePr>
               <a:graphicFrameLocks noChangeAspect="1"/>
             </wp:cNvGraphicFramePr>
@@ -17134,7 +17214,7 @@
                     <pic:cNvPicPr/>
                   </pic:nvPicPr>
                   <pic:blipFill>
-                    <a:blip r:embed="rId44"/>
+                    <a:blip r:embed="rId45"/>
                     <a:stretch>
                       <a:fillRect/>
                     </a:stretch>
@@ -17207,7 +17287,7 @@
         <w:drawing>
           <wp:inline xmlns:a="http://schemas.openxmlformats.org/drawingml/2006/main" xmlns:pic="http://schemas.openxmlformats.org/drawingml/2006/picture">
             <wp:extent cx="5040000" cy="2503926"/>
-            <wp:docPr id="37" name="Picture 37"/>
+            <wp:docPr id="38" name="Picture 38"/>
             <wp:cNvGraphicFramePr>
               <a:graphicFrameLocks noChangeAspect="1"/>
             </wp:cNvGraphicFramePr>
@@ -17219,7 +17299,7 @@
                     <pic:cNvPicPr/>
                   </pic:nvPicPr>
                   <pic:blipFill>
-                    <a:blip r:embed="rId45"/>
+                    <a:blip r:embed="rId46"/>
                     <a:stretch>
                       <a:fillRect/>
                     </a:stretch>
@@ -26230,7 +26310,7 @@
         <w:drawing>
           <wp:inline xmlns:a="http://schemas.openxmlformats.org/drawingml/2006/main" xmlns:pic="http://schemas.openxmlformats.org/drawingml/2006/picture">
             <wp:extent cx="5040000" cy="2503926"/>
-            <wp:docPr id="38" name="Picture 38"/>
+            <wp:docPr id="39" name="Picture 39"/>
             <wp:cNvGraphicFramePr>
               <a:graphicFrameLocks noChangeAspect="1"/>
             </wp:cNvGraphicFramePr>
@@ -26242,7 +26322,7 @@
                     <pic:cNvPicPr/>
                   </pic:nvPicPr>
                   <pic:blipFill>
-                    <a:blip r:embed="rId45"/>
+                    <a:blip r:embed="rId46"/>
                     <a:stretch>
                       <a:fillRect/>
                     </a:stretch>
@@ -28786,7 +28866,7 @@
         <w:drawing>
           <wp:inline xmlns:a="http://schemas.openxmlformats.org/drawingml/2006/main" xmlns:pic="http://schemas.openxmlformats.org/drawingml/2006/picture">
             <wp:extent cx="5040000" cy="4421977"/>
-            <wp:docPr id="39" name="Picture 39"/>
+            <wp:docPr id="40" name="Picture 40"/>
             <wp:cNvGraphicFramePr>
               <a:graphicFrameLocks noChangeAspect="1"/>
             </wp:cNvGraphicFramePr>
@@ -28798,7 +28878,7 @@
                     <pic:cNvPicPr/>
                   </pic:nvPicPr>
                   <pic:blipFill>
-                    <a:blip r:embed="rId46"/>
+                    <a:blip r:embed="rId47"/>
                     <a:stretch>
                       <a:fillRect/>
                     </a:stretch>
@@ -30965,7 +31045,7 @@
         <w:drawing>
           <wp:inline xmlns:a="http://schemas.openxmlformats.org/drawingml/2006/main" xmlns:pic="http://schemas.openxmlformats.org/drawingml/2006/picture">
             <wp:extent cx="5040000" cy="3908898"/>
-            <wp:docPr id="40" name="Picture 40"/>
+            <wp:docPr id="41" name="Picture 41"/>
             <wp:cNvGraphicFramePr>
               <a:graphicFrameLocks noChangeAspect="1"/>
             </wp:cNvGraphicFramePr>
@@ -30977,7 +31057,7 @@
                     <pic:cNvPicPr/>
                   </pic:nvPicPr>
                   <pic:blipFill>
-                    <a:blip r:embed="rId32"/>
+                    <a:blip r:embed="rId33"/>
                     <a:stretch>
                       <a:fillRect/>
                     </a:stretch>
@@ -31050,7 +31130,7 @@
         <w:drawing>
           <wp:inline xmlns:a="http://schemas.openxmlformats.org/drawingml/2006/main" xmlns:pic="http://schemas.openxmlformats.org/drawingml/2006/picture">
             <wp:extent cx="5040000" cy="959680"/>
-            <wp:docPr id="41" name="Picture 41"/>
+            <wp:docPr id="42" name="Picture 42"/>
             <wp:cNvGraphicFramePr>
               <a:graphicFrameLocks noChangeAspect="1"/>
             </wp:cNvGraphicFramePr>
@@ -31062,7 +31142,7 @@
                     <pic:cNvPicPr/>
                   </pic:nvPicPr>
                   <pic:blipFill>
-                    <a:blip r:embed="rId47"/>
+                    <a:blip r:embed="rId48"/>
                     <a:stretch>
                       <a:fillRect/>
                     </a:stretch>
@@ -31135,7 +31215,7 @@
         <w:drawing>
           <wp:inline xmlns:a="http://schemas.openxmlformats.org/drawingml/2006/main" xmlns:pic="http://schemas.openxmlformats.org/drawingml/2006/picture">
             <wp:extent cx="5040000" cy="2583063"/>
-            <wp:docPr id="42" name="Picture 42"/>
+            <wp:docPr id="43" name="Picture 43"/>
             <wp:cNvGraphicFramePr>
               <a:graphicFrameLocks noChangeAspect="1"/>
             </wp:cNvGraphicFramePr>
@@ -31147,7 +31227,7 @@
                     <pic:cNvPicPr/>
                   </pic:nvPicPr>
                   <pic:blipFill>
-                    <a:blip r:embed="rId43"/>
+                    <a:blip r:embed="rId44"/>
                     <a:stretch>
                       <a:fillRect/>
                     </a:stretch>
@@ -31191,7 +31271,7 @@
         <w:drawing>
           <wp:inline xmlns:a="http://schemas.openxmlformats.org/drawingml/2006/main" xmlns:pic="http://schemas.openxmlformats.org/drawingml/2006/picture">
             <wp:extent cx="5040000" cy="2168250"/>
-            <wp:docPr id="43" name="Picture 43"/>
+            <wp:docPr id="44" name="Picture 44"/>
             <wp:cNvGraphicFramePr>
               <a:graphicFrameLocks noChangeAspect="1"/>
             </wp:cNvGraphicFramePr>
@@ -31203,7 +31283,7 @@
                     <pic:cNvPicPr/>
                   </pic:nvPicPr>
                   <pic:blipFill>
-                    <a:blip r:embed="rId38"/>
+                    <a:blip r:embed="rId39"/>
                     <a:stretch>
                       <a:fillRect/>
                     </a:stretch>
@@ -31276,7 +31356,7 @@
         <w:drawing>
           <wp:inline xmlns:a="http://schemas.openxmlformats.org/drawingml/2006/main" xmlns:pic="http://schemas.openxmlformats.org/drawingml/2006/picture">
             <wp:extent cx="5040000" cy="2313134"/>
-            <wp:docPr id="44" name="Picture 44"/>
+            <wp:docPr id="45" name="Picture 45"/>
             <wp:cNvGraphicFramePr>
               <a:graphicFrameLocks noChangeAspect="1"/>
             </wp:cNvGraphicFramePr>
@@ -31288,7 +31368,7 @@
                     <pic:cNvPicPr/>
                   </pic:nvPicPr>
                   <pic:blipFill>
-                    <a:blip r:embed="rId44"/>
+                    <a:blip r:embed="rId45"/>
                     <a:stretch>
                       <a:fillRect/>
                     </a:stretch>
@@ -31332,7 +31412,7 @@
         <w:drawing>
           <wp:inline xmlns:a="http://schemas.openxmlformats.org/drawingml/2006/main" xmlns:pic="http://schemas.openxmlformats.org/drawingml/2006/picture">
             <wp:extent cx="5040000" cy="533199"/>
-            <wp:docPr id="45" name="Picture 45"/>
+            <wp:docPr id="46" name="Picture 46"/>
             <wp:cNvGraphicFramePr>
               <a:graphicFrameLocks noChangeAspect="1"/>
             </wp:cNvGraphicFramePr>
@@ -31344,7 +31424,7 @@
                     <pic:cNvPicPr/>
                   </pic:nvPicPr>
                   <pic:blipFill>
-                    <a:blip r:embed="rId48"/>
+                    <a:blip r:embed="rId49"/>
                     <a:stretch>
                       <a:fillRect/>
                     </a:stretch>
@@ -31388,7 +31468,7 @@
         <w:drawing>
           <wp:inline xmlns:a="http://schemas.openxmlformats.org/drawingml/2006/main" xmlns:pic="http://schemas.openxmlformats.org/drawingml/2006/picture">
             <wp:extent cx="5040000" cy="998595"/>
-            <wp:docPr id="46" name="Picture 46"/>
+            <wp:docPr id="47" name="Picture 47"/>
             <wp:cNvGraphicFramePr>
               <a:graphicFrameLocks noChangeAspect="1"/>
             </wp:cNvGraphicFramePr>
@@ -31400,7 +31480,7 @@
                     <pic:cNvPicPr/>
                   </pic:nvPicPr>
                   <pic:blipFill>
-                    <a:blip r:embed="rId39"/>
+                    <a:blip r:embed="rId40"/>
                     <a:stretch>
                       <a:fillRect/>
                     </a:stretch>
@@ -31473,7 +31553,7 @@
         <w:drawing>
           <wp:inline xmlns:a="http://schemas.openxmlformats.org/drawingml/2006/main" xmlns:pic="http://schemas.openxmlformats.org/drawingml/2006/picture">
             <wp:extent cx="5040000" cy="2651937"/>
-            <wp:docPr id="47" name="Picture 47"/>
+            <wp:docPr id="48" name="Picture 48"/>
             <wp:cNvGraphicFramePr>
               <a:graphicFrameLocks noChangeAspect="1"/>
             </wp:cNvGraphicFramePr>
@@ -31485,7 +31565,7 @@
                     <pic:cNvPicPr/>
                   </pic:nvPicPr>
                   <pic:blipFill>
-                    <a:blip r:embed="rId40"/>
+                    <a:blip r:embed="rId41"/>
                     <a:stretch>
                       <a:fillRect/>
                     </a:stretch>
@@ -31529,7 +31609,7 @@
         <w:drawing>
           <wp:inline xmlns:a="http://schemas.openxmlformats.org/drawingml/2006/main" xmlns:pic="http://schemas.openxmlformats.org/drawingml/2006/picture">
             <wp:extent cx="5040000" cy="2633487"/>
-            <wp:docPr id="48" name="Picture 48"/>
+            <wp:docPr id="49" name="Picture 49"/>
             <wp:cNvGraphicFramePr>
               <a:graphicFrameLocks noChangeAspect="1"/>
             </wp:cNvGraphicFramePr>
@@ -31541,7 +31621,7 @@
                     <pic:cNvPicPr/>
                   </pic:nvPicPr>
                   <pic:blipFill>
-                    <a:blip r:embed="rId41"/>
+                    <a:blip r:embed="rId42"/>
                     <a:stretch>
                       <a:fillRect/>
                     </a:stretch>
@@ -31585,7 +31665,7 @@
         <w:drawing>
           <wp:inline xmlns:a="http://schemas.openxmlformats.org/drawingml/2006/main" xmlns:pic="http://schemas.openxmlformats.org/drawingml/2006/picture">
             <wp:extent cx="5040000" cy="889412"/>
-            <wp:docPr id="49" name="Picture 49"/>
+            <wp:docPr id="50" name="Picture 50"/>
             <wp:cNvGraphicFramePr>
               <a:graphicFrameLocks noChangeAspect="1"/>
             </wp:cNvGraphicFramePr>
@@ -31597,7 +31677,7 @@
                     <pic:cNvPicPr/>
                   </pic:nvPicPr>
                   <pic:blipFill>
-                    <a:blip r:embed="rId42"/>
+                    <a:blip r:embed="rId43"/>
                     <a:stretch>
                       <a:fillRect/>
                     </a:stretch>
@@ -31647,7 +31727,7 @@
       </w:r>
     </w:p>
     <w:sectPr>
-      <w:footerReference w:type="default" r:id="rId50"/>
+      <w:footerReference w:type="default" r:id="rId51"/>
       <w:pgSz w:w="11906" w:h="16838"/>
       <w:pgMar w:top="1134" w:right="1134" w:bottom="1134" w:left="1701" w:header="720" w:footer="720" w:gutter="0"/>
       <w:cols w:space="720"/>

</xml_diff>

<commit_message>
Fix contact info not rendering — remove Address/Email/Website/Telephone from skip filter
</commit_message>
<xml_diff>
--- a/THESIS_VAPT_WORD.docx
+++ b/THESIS_VAPT_WORD.docx
@@ -7872,6 +7872,94 @@
           <w:sz w:val="20"/>
         </w:rPr>
         <w:t>Figure 3: Prestige Alliance office location</w:t>
+      </w:r>
+    </w:p>
+    <w:p>
+      <w:pPr>
+        <w:spacing w:line="360" w:lineRule="auto" w:after="120"/>
+        <w:ind w:firstLine="720"/>
+        <w:jc w:val="both"/>
+      </w:pPr>
+      <w:r>
+        <w:rPr>
+          <w:rFonts w:ascii="Times New Roman" w:hAnsi="Times New Roman"/>
+          <w:b/>
+          <w:sz w:val="24"/>
+        </w:rPr>
+        <w:t>Email:</w:t>
+      </w:r>
+      <w:r>
+        <w:rPr>
+          <w:rFonts w:ascii="Times New Roman" w:hAnsi="Times New Roman"/>
+          <w:sz w:val="24"/>
+        </w:rPr>
+        <w:t xml:space="preserve"> info@prestigealliance.co</w:t>
+      </w:r>
+    </w:p>
+    <w:p>
+      <w:pPr>
+        <w:spacing w:line="360" w:lineRule="auto" w:after="120"/>
+        <w:ind w:firstLine="720"/>
+        <w:jc w:val="both"/>
+      </w:pPr>
+      <w:r>
+        <w:rPr>
+          <w:rFonts w:ascii="Times New Roman" w:hAnsi="Times New Roman"/>
+          <w:b/>
+          <w:sz w:val="24"/>
+        </w:rPr>
+        <w:t>Website:</w:t>
+      </w:r>
+      <w:r>
+        <w:rPr>
+          <w:rFonts w:ascii="Times New Roman" w:hAnsi="Times New Roman"/>
+          <w:sz w:val="24"/>
+        </w:rPr>
+        <w:t xml:space="preserve"> https://www.prestigealliance.co/</w:t>
+      </w:r>
+    </w:p>
+    <w:p>
+      <w:pPr>
+        <w:spacing w:line="360" w:lineRule="auto" w:after="120"/>
+        <w:ind w:firstLine="720"/>
+        <w:jc w:val="both"/>
+      </w:pPr>
+      <w:r>
+        <w:rPr>
+          <w:rFonts w:ascii="Times New Roman" w:hAnsi="Times New Roman"/>
+          <w:b/>
+          <w:sz w:val="24"/>
+        </w:rPr>
+        <w:t>Telephone:</w:t>
+      </w:r>
+      <w:r>
+        <w:rPr>
+          <w:rFonts w:ascii="Times New Roman" w:hAnsi="Times New Roman"/>
+          <w:sz w:val="24"/>
+        </w:rPr>
+        <w:t xml:space="preserve"> +855-88-288-2289</w:t>
+      </w:r>
+    </w:p>
+    <w:p>
+      <w:pPr>
+        <w:spacing w:line="360" w:lineRule="auto" w:after="120"/>
+        <w:ind w:firstLine="720"/>
+        <w:jc w:val="both"/>
+      </w:pPr>
+      <w:r>
+        <w:rPr>
+          <w:rFonts w:ascii="Times New Roman" w:hAnsi="Times New Roman"/>
+          <w:b/>
+          <w:sz w:val="24"/>
+        </w:rPr>
+        <w:t>Address:</w:t>
+      </w:r>
+      <w:r>
+        <w:rPr>
+          <w:rFonts w:ascii="Times New Roman" w:hAnsi="Times New Roman"/>
+          <w:sz w:val="24"/>
+        </w:rPr>
+        <w:t xml:space="preserve"> #29A 29B, Street 112, Khan Tuol Kork, Phnom Penh, Cambodia</w:t>
       </w:r>
     </w:p>
     <w:p>

</xml_diff>

<commit_message>
Enlarge diagrams: org chart and pentest flow to 15cm, map to 14cm
</commit_message>
<xml_diff>
--- a/THESIS_VAPT_WORD.docx
+++ b/THESIS_VAPT_WORD.docx
@@ -7770,7 +7770,7 @@
       <w:r>
         <w:drawing>
           <wp:inline xmlns:a="http://schemas.openxmlformats.org/drawingml/2006/main" xmlns:pic="http://schemas.openxmlformats.org/drawingml/2006/picture">
-            <wp:extent cx="2880000" cy="1647653"/>
+            <wp:extent cx="5400000" cy="3089350"/>
             <wp:docPr id="2" name="Picture 2"/>
             <wp:cNvGraphicFramePr>
               <a:graphicFrameLocks noChangeAspect="1"/>
@@ -7791,7 +7791,7 @@
                   <pic:spPr>
                     <a:xfrm>
                       <a:off x="0" y="0"/>
-                      <a:ext cx="2880000" cy="1647653"/>
+                      <a:ext cx="5400000" cy="3089350"/>
                     </a:xfrm>
                     <a:prstGeom prst="rect"/>
                   </pic:spPr>
@@ -7826,7 +7826,7 @@
       <w:r>
         <w:drawing>
           <wp:inline xmlns:a="http://schemas.openxmlformats.org/drawingml/2006/main" xmlns:pic="http://schemas.openxmlformats.org/drawingml/2006/picture">
-            <wp:extent cx="2880000" cy="1289953"/>
+            <wp:extent cx="5040000" cy="2257418"/>
             <wp:docPr id="3" name="Picture 3"/>
             <wp:cNvGraphicFramePr>
               <a:graphicFrameLocks noChangeAspect="1"/>
@@ -7847,7 +7847,7 @@
                   <pic:spPr>
                     <a:xfrm>
                       <a:off x="0" y="0"/>
-                      <a:ext cx="2880000" cy="1289953"/>
+                      <a:ext cx="5040000" cy="2257418"/>
                     </a:xfrm>
                     <a:prstGeom prst="rect"/>
                   </pic:spPr>
@@ -8457,7 +8457,7 @@
       <w:r>
         <w:drawing>
           <wp:inline xmlns:a="http://schemas.openxmlformats.org/drawingml/2006/main" xmlns:pic="http://schemas.openxmlformats.org/drawingml/2006/picture">
-            <wp:extent cx="2880000" cy="1346264"/>
+            <wp:extent cx="5400000" cy="2524245"/>
             <wp:docPr id="7" name="Picture 7"/>
             <wp:cNvGraphicFramePr>
               <a:graphicFrameLocks noChangeAspect="1"/>
@@ -8478,7 +8478,7 @@
                   <pic:spPr>
                     <a:xfrm>
                       <a:off x="0" y="0"/>
-                      <a:ext cx="2880000" cy="1346264"/>
+                      <a:ext cx="5400000" cy="2524245"/>
                     </a:xfrm>
                     <a:prstGeom prst="rect"/>
                   </pic:spPr>

</xml_diff>

<commit_message>
Generate full-width diagrams: org chart, pentest flow, recommended architecture
</commit_message>
<xml_diff>
--- a/THESIS_VAPT_WORD.docx
+++ b/THESIS_VAPT_WORD.docx
@@ -7770,7 +7770,7 @@
       <w:r>
         <w:drawing>
           <wp:inline xmlns:a="http://schemas.openxmlformats.org/drawingml/2006/main" xmlns:pic="http://schemas.openxmlformats.org/drawingml/2006/picture">
-            <wp:extent cx="5400000" cy="3089350"/>
+            <wp:extent cx="5400000" cy="2314286"/>
             <wp:docPr id="2" name="Picture 2"/>
             <wp:cNvGraphicFramePr>
               <a:graphicFrameLocks noChangeAspect="1"/>
@@ -7779,7 +7779,7 @@
               <a:graphicData uri="http://schemas.openxmlformats.org/drawingml/2006/picture">
                 <pic:pic>
                   <pic:nvPicPr>
-                    <pic:cNvPr id="0" name="PrestigeAlliance_OrgChart.png"/>
+                    <pic:cNvPr id="0" name="org_chart_new.png"/>
                     <pic:cNvPicPr/>
                   </pic:nvPicPr>
                   <pic:blipFill>
@@ -7791,7 +7791,7 @@
                   <pic:spPr>
                     <a:xfrm>
                       <a:off x="0" y="0"/>
-                      <a:ext cx="5400000" cy="3089350"/>
+                      <a:ext cx="5400000" cy="2314286"/>
                     </a:xfrm>
                     <a:prstGeom prst="rect"/>
                   </pic:spPr>
@@ -8457,7 +8457,7 @@
       <w:r>
         <w:drawing>
           <wp:inline xmlns:a="http://schemas.openxmlformats.org/drawingml/2006/main" xmlns:pic="http://schemas.openxmlformats.org/drawingml/2006/picture">
-            <wp:extent cx="5400000" cy="2524245"/>
+            <wp:extent cx="5400000" cy="1294286"/>
             <wp:docPr id="7" name="Picture 7"/>
             <wp:cNvGraphicFramePr>
               <a:graphicFrameLocks noChangeAspect="1"/>
@@ -8466,7 +8466,7 @@
               <a:graphicData uri="http://schemas.openxmlformats.org/drawingml/2006/picture">
                 <pic:pic>
                   <pic:nvPicPr>
-                    <pic:cNvPr id="0" name="pentest_flow.drawio.png"/>
+                    <pic:cNvPr id="0" name="pentest_flow_new.png"/>
                     <pic:cNvPicPr/>
                   </pic:nvPicPr>
                   <pic:blipFill>
@@ -8478,7 +8478,7 @@
                   <pic:spPr>
                     <a:xfrm>
                       <a:off x="0" y="0"/>
-                      <a:ext cx="5400000" cy="2524245"/>
+                      <a:ext cx="5400000" cy="1294286"/>
                     </a:xfrm>
                     <a:prstGeom prst="rect"/>
                   </pic:spPr>
@@ -28953,7 +28953,7 @@
       <w:r>
         <w:drawing>
           <wp:inline xmlns:a="http://schemas.openxmlformats.org/drawingml/2006/main" xmlns:pic="http://schemas.openxmlformats.org/drawingml/2006/picture">
-            <wp:extent cx="5040000" cy="4421977"/>
+            <wp:extent cx="5040000" cy="1768000"/>
             <wp:docPr id="40" name="Picture 40"/>
             <wp:cNvGraphicFramePr>
               <a:graphicFrameLocks noChangeAspect="1"/>
@@ -28962,7 +28962,7 @@
               <a:graphicData uri="http://schemas.openxmlformats.org/drawingml/2006/picture">
                 <pic:pic>
                   <pic:nvPicPr>
-                    <pic:cNvPr id="0" name="recommended_architecture.png"/>
+                    <pic:cNvPr id="0" name="recommended_architecture_new.png"/>
                     <pic:cNvPicPr/>
                   </pic:nvPicPr>
                   <pic:blipFill>
@@ -28974,7 +28974,7 @@
                   <pic:spPr>
                     <a:xfrm>
                       <a:off x="0" y="0"/>
-                      <a:ext cx="5040000" cy="4421977"/>
+                      <a:ext cx="5040000" cy="1768000"/>
                     </a:xfrm>
                     <a:prstGeom prst="rect"/>
                   </pic:spPr>

</xml_diff>

<commit_message>
Revert to original diagrams, set all diagram figures to 15cm full width
</commit_message>
<xml_diff>
--- a/THESIS_VAPT_WORD.docx
+++ b/THESIS_VAPT_WORD.docx
@@ -7770,7 +7770,7 @@
       <w:r>
         <w:drawing>
           <wp:inline xmlns:a="http://schemas.openxmlformats.org/drawingml/2006/main" xmlns:pic="http://schemas.openxmlformats.org/drawingml/2006/picture">
-            <wp:extent cx="5400000" cy="2314286"/>
+            <wp:extent cx="5400000" cy="3089350"/>
             <wp:docPr id="2" name="Picture 2"/>
             <wp:cNvGraphicFramePr>
               <a:graphicFrameLocks noChangeAspect="1"/>
@@ -7779,7 +7779,7 @@
               <a:graphicData uri="http://schemas.openxmlformats.org/drawingml/2006/picture">
                 <pic:pic>
                   <pic:nvPicPr>
-                    <pic:cNvPr id="0" name="org_chart_new.png"/>
+                    <pic:cNvPr id="0" name="PrestigeAlliance_OrgChart.png"/>
                     <pic:cNvPicPr/>
                   </pic:nvPicPr>
                   <pic:blipFill>
@@ -7791,7 +7791,7 @@
                   <pic:spPr>
                     <a:xfrm>
                       <a:off x="0" y="0"/>
-                      <a:ext cx="5400000" cy="2314286"/>
+                      <a:ext cx="5400000" cy="3089350"/>
                     </a:xfrm>
                     <a:prstGeom prst="rect"/>
                   </pic:spPr>
@@ -7826,7 +7826,7 @@
       <w:r>
         <w:drawing>
           <wp:inline xmlns:a="http://schemas.openxmlformats.org/drawingml/2006/main" xmlns:pic="http://schemas.openxmlformats.org/drawingml/2006/picture">
-            <wp:extent cx="5040000" cy="2257418"/>
+            <wp:extent cx="5400000" cy="2418663"/>
             <wp:docPr id="3" name="Picture 3"/>
             <wp:cNvGraphicFramePr>
               <a:graphicFrameLocks noChangeAspect="1"/>
@@ -7847,7 +7847,7 @@
                   <pic:spPr>
                     <a:xfrm>
                       <a:off x="0" y="0"/>
-                      <a:ext cx="5040000" cy="2257418"/>
+                      <a:ext cx="5400000" cy="2418663"/>
                     </a:xfrm>
                     <a:prstGeom prst="rect"/>
                   </pic:spPr>
@@ -8457,7 +8457,7 @@
       <w:r>
         <w:drawing>
           <wp:inline xmlns:a="http://schemas.openxmlformats.org/drawingml/2006/main" xmlns:pic="http://schemas.openxmlformats.org/drawingml/2006/picture">
-            <wp:extent cx="5400000" cy="1294286"/>
+            <wp:extent cx="5400000" cy="2524245"/>
             <wp:docPr id="7" name="Picture 7"/>
             <wp:cNvGraphicFramePr>
               <a:graphicFrameLocks noChangeAspect="1"/>
@@ -8466,7 +8466,7 @@
               <a:graphicData uri="http://schemas.openxmlformats.org/drawingml/2006/picture">
                 <pic:pic>
                   <pic:nvPicPr>
-                    <pic:cNvPr id="0" name="pentest_flow_new.png"/>
+                    <pic:cNvPr id="0" name="pentest_flow.drawio.png"/>
                     <pic:cNvPicPr/>
                   </pic:nvPicPr>
                   <pic:blipFill>
@@ -8478,7 +8478,7 @@
                   <pic:spPr>
                     <a:xfrm>
                       <a:off x="0" y="0"/>
-                      <a:ext cx="5400000" cy="1294286"/>
+                      <a:ext cx="5400000" cy="2524245"/>
                     </a:xfrm>
                     <a:prstGeom prst="rect"/>
                   </pic:spPr>
@@ -28953,7 +28953,7 @@
       <w:r>
         <w:drawing>
           <wp:inline xmlns:a="http://schemas.openxmlformats.org/drawingml/2006/main" xmlns:pic="http://schemas.openxmlformats.org/drawingml/2006/picture">
-            <wp:extent cx="5040000" cy="1768000"/>
+            <wp:extent cx="5400000" cy="4737833"/>
             <wp:docPr id="40" name="Picture 40"/>
             <wp:cNvGraphicFramePr>
               <a:graphicFrameLocks noChangeAspect="1"/>
@@ -28962,7 +28962,7 @@
               <a:graphicData uri="http://schemas.openxmlformats.org/drawingml/2006/picture">
                 <pic:pic>
                   <pic:nvPicPr>
-                    <pic:cNvPr id="0" name="recommended_architecture_new.png"/>
+                    <pic:cNvPr id="0" name="recommended_architecture.png"/>
                     <pic:cNvPicPr/>
                   </pic:nvPicPr>
                   <pic:blipFill>
@@ -28974,7 +28974,7 @@
                   <pic:spPr>
                     <a:xfrm>
                       <a:off x="0" y="0"/>
-                      <a:ext cx="5040000" cy="1768000"/>
+                      <a:ext cx="5400000" cy="4737833"/>
                     </a:xfrm>
                     <a:prstGeom prst="rect"/>
                   </pic:spPr>

</xml_diff>

<commit_message>
Replace pentest flow diagram with pentest_process.png (converted WEBP→PNG)
</commit_message>
<xml_diff>
--- a/THESIS_VAPT_WORD.docx
+++ b/THESIS_VAPT_WORD.docx
@@ -8457,7 +8457,7 @@
       <w:r>
         <w:drawing>
           <wp:inline xmlns:a="http://schemas.openxmlformats.org/drawingml/2006/main" xmlns:pic="http://schemas.openxmlformats.org/drawingml/2006/picture">
-            <wp:extent cx="5400000" cy="2524245"/>
+            <wp:extent cx="5400000" cy="3602436"/>
             <wp:docPr id="7" name="Picture 7"/>
             <wp:cNvGraphicFramePr>
               <a:graphicFrameLocks noChangeAspect="1"/>
@@ -8466,7 +8466,7 @@
               <a:graphicData uri="http://schemas.openxmlformats.org/drawingml/2006/picture">
                 <pic:pic>
                   <pic:nvPicPr>
-                    <pic:cNvPr id="0" name="pentest_flow.drawio.png"/>
+                    <pic:cNvPr id="0" name="pentest_process.png"/>
                     <pic:cNvPicPr/>
                   </pic:nvPicPr>
                   <pic:blipFill>
@@ -8478,7 +8478,7 @@
                   <pic:spPr>
                     <a:xfrm>
                       <a:off x="0" y="0"/>
-                      <a:ext cx="5400000" cy="2524245"/>
+                      <a:ext cx="5400000" cy="3602436"/>
                     </a:xfrm>
                     <a:prstGeom prst="rect"/>
                   </pic:spPr>

</xml_diff>

<commit_message>
Redact sensitive origin IP and tester IP from all screenshots and markdown text
Applied black-box redaction to 16 screenshots covering origin IP (103.16.62.xxx),
tester IP (58.97.216.xxx), and infrastructure IPs. Updated markdown code block and
prose to use [REDACTED] placeholder. Rebuilt docx with redacted content.
</commit_message>
<xml_diff>
--- a/THESIS_VAPT_WORD.docx
+++ b/THESIS_VAPT_WORD.docx
@@ -17109,7 +17109,7 @@
         </w:rPr>
         <w:t>mysql -h 103.16.xx.xxx -P 3306 -u root 2&gt;&amp;1</w:t>
         <w:br/>
-        <w:t># ERROR 1045 (28000): Access denied for user 'root'@'58.97.216.203' (using password: NO)</w:t>
+        <w:t># ERROR 1045 (28000): Access denied for user 'root'@'[REDACTED]' (using password: NO)</w:t>
       </w:r>
     </w:p>
     <w:p>
@@ -17123,7 +17123,7 @@
           <w:rFonts w:ascii="Times New Roman" w:hAnsi="Times New Roman"/>
           <w:sz w:val="24"/>
         </w:rPr>
-        <w:t>The error message itself is the critical evidence: it reveals the tester's public IP address (58.97.216.203), confirming that the MySQL server performed a full TCP connection and authentication handshake with an external internet host. The server is not passively listening — it actively engages with every connection attempt from anywhere on the internet.</w:t>
+        <w:t>The error message itself is the critical evidence: it reveals the tester's public IP address (redacted for privacy), confirming that the MySQL server performed a full TCP connection and authentication handshake with an external internet host. The server is not passively listening — it actively engages with every connection attempt from anywhere on the internet.</w:t>
       </w:r>
     </w:p>
     <w:p>

</xml_diff>